<commit_message>
Update document structure and content in the thesis report, including additional figures and improved readability.
</commit_message>
<xml_diff>
--- a/NASKAH/Dokumen Laporan Skripsi - 42330018 - I Nyoman Wahyu Permana - 2023 - 2026.docx
+++ b/NASKAH/Dokumen Laporan Skripsi - 42330018 - I Nyoman Wahyu Permana - 2023 - 2026.docx
@@ -1162,28 +1162,28 @@
           <w:lang w:val="en-US"/>
         </w:rPr>
       </w:pPr>
-      <w:bookmarkStart w:id="0" w:name="_Toc75025325"/>
-      <w:bookmarkStart w:id="1" w:name="_Toc106280384"/>
-      <w:bookmarkStart w:id="2" w:name="_Toc137038221"/>
-      <w:bookmarkStart w:id="3" w:name="_Toc222407793"/>
-      <w:bookmarkStart w:id="4" w:name="_Toc75025326"/>
+      <w:bookmarkStart w:id="0" w:name="_Toc75025326"/>
+      <w:bookmarkStart w:id="1" w:name="_Toc75025325"/>
+      <w:bookmarkStart w:id="2" w:name="_Toc106280384"/>
+      <w:bookmarkStart w:id="3" w:name="_Toc137038221"/>
+      <w:bookmarkStart w:id="4" w:name="_Toc222407793"/>
       <w:r>
         <w:lastRenderedPageBreak/>
         <w:t>HALAMAN PENGESAHAN</w:t>
       </w:r>
-      <w:bookmarkEnd w:id="0"/>
+      <w:bookmarkEnd w:id="1"/>
       <w:r>
         <w:t xml:space="preserve"> </w:t>
       </w:r>
-      <w:bookmarkEnd w:id="1"/>
       <w:bookmarkEnd w:id="2"/>
+      <w:bookmarkEnd w:id="3"/>
       <w:r>
         <w:rPr>
           <w:lang w:val="en-US"/>
         </w:rPr>
         <w:t>SKRIPSI</w:t>
       </w:r>
-      <w:bookmarkEnd w:id="3"/>
+      <w:bookmarkEnd w:id="4"/>
     </w:p>
     <w:p>
       <w:pPr>
@@ -2077,8 +2077,16 @@
                         <w:rPr>
                           <w:lang w:val="en-US"/>
                         </w:rPr>
-                        <w:t>Menyetujui,</w:t>
+                        <w:t>Menyetujui</w:t>
                       </w:r>
+                      <w:proofErr w:type="gramStart"/>
+                      <w:r>
+                        <w:rPr>
+                          <w:lang w:val="en-US"/>
+                        </w:rPr>
+                        <w:t>,</w:t>
+                      </w:r>
+                      <w:proofErr w:type="gramEnd"/>
                       <w:r>
                         <w:rPr>
                           <w:lang w:val="en-US"/>
@@ -2435,7 +2443,68 @@
     </w:p>
     <w:p>
       <w:pPr>
-        <w:pStyle w:val="Heading1"/>
+        <w:spacing w:line="240" w:lineRule="auto"/>
+        <w:ind w:firstLine="0"/>
+        <w:jc w:val="center"/>
+        <w:rPr>
+          <w:b/>
+          <w:szCs w:val="28"/>
+        </w:rPr>
+      </w:pPr>
+    </w:p>
+    <w:p>
+      <w:pPr>
+        <w:spacing w:line="240" w:lineRule="auto"/>
+        <w:ind w:firstLine="0"/>
+        <w:jc w:val="center"/>
+        <w:rPr>
+          <w:b/>
+          <w:szCs w:val="28"/>
+        </w:rPr>
+      </w:pPr>
+    </w:p>
+    <w:p>
+      <w:pPr>
+        <w:spacing w:line="240" w:lineRule="auto"/>
+        <w:ind w:firstLine="0"/>
+        <w:jc w:val="center"/>
+        <w:rPr>
+          <w:b/>
+          <w:szCs w:val="28"/>
+        </w:rPr>
+      </w:pPr>
+    </w:p>
+    <w:p>
+      <w:pPr>
+        <w:spacing w:line="240" w:lineRule="auto"/>
+        <w:ind w:firstLine="0"/>
+        <w:jc w:val="center"/>
+        <w:rPr>
+          <w:b/>
+          <w:szCs w:val="28"/>
+        </w:rPr>
+      </w:pPr>
+    </w:p>
+    <w:p>
+      <w:pPr>
+        <w:spacing w:line="240" w:lineRule="auto"/>
+        <w:ind w:firstLine="0"/>
+        <w:jc w:val="center"/>
+        <w:rPr>
+          <w:b/>
+          <w:szCs w:val="28"/>
+        </w:rPr>
+      </w:pPr>
+    </w:p>
+    <w:p>
+      <w:pPr>
+        <w:spacing w:line="240" w:lineRule="auto"/>
+        <w:ind w:firstLine="0"/>
+        <w:jc w:val="center"/>
+        <w:rPr>
+          <w:b/>
+          <w:szCs w:val="28"/>
+        </w:rPr>
       </w:pPr>
     </w:p>
     <w:p/>
@@ -3106,7 +3175,25 @@
                           <w:u w:val="single"/>
                           <w:lang w:val="en-US"/>
                         </w:rPr>
-                        <w:t xml:space="preserve"> I Wayan Aditya Suranata, S.Kom., M.Kom</w:t>
+                        <w:t xml:space="preserve"> I Wayan Aditya Suranata, </w:t>
+                      </w:r>
+                      <w:proofErr w:type="gramStart"/>
+                      <w:r>
+                        <w:rPr>
+                          <w:color w:val="FF0000"/>
+                          <w:u w:val="single"/>
+                          <w:lang w:val="en-US"/>
+                        </w:rPr>
+                        <w:t>S.Kom.,</w:t>
+                      </w:r>
+                      <w:proofErr w:type="gramEnd"/>
+                      <w:r>
+                        <w:rPr>
+                          <w:color w:val="FF0000"/>
+                          <w:u w:val="single"/>
+                          <w:lang w:val="en-US"/>
+                        </w:rPr>
+                        <w:t xml:space="preserve"> M.Kom</w:t>
                       </w:r>
                       <w:r>
                         <w:t>)</w:t>
@@ -3854,7 +3941,25 @@
                           <w:u w:val="single"/>
                           <w:lang w:val="en-US"/>
                         </w:rPr>
-                        <w:t>I Wayan Aditya Suranata, S.Kom., M.Kom</w:t>
+                        <w:t xml:space="preserve">I Wayan Aditya Suranata, </w:t>
+                      </w:r>
+                      <w:proofErr w:type="gramStart"/>
+                      <w:r>
+                        <w:rPr>
+                          <w:color w:val="FF0000"/>
+                          <w:u w:val="single"/>
+                          <w:lang w:val="en-US"/>
+                        </w:rPr>
+                        <w:t>S.Kom.,</w:t>
+                      </w:r>
+                      <w:proofErr w:type="gramEnd"/>
+                      <w:r>
+                        <w:rPr>
+                          <w:color w:val="FF0000"/>
+                          <w:u w:val="single"/>
+                          <w:lang w:val="en-US"/>
+                        </w:rPr>
+                        <w:t xml:space="preserve"> M.Kom</w:t>
                       </w:r>
                       <w:r>
                         <w:t>)</w:t>
@@ -5027,7 +5132,7 @@
         <w:lastRenderedPageBreak/>
         <w:t>DAFTAR ISI</w:t>
       </w:r>
-      <w:bookmarkEnd w:id="4"/>
+      <w:bookmarkEnd w:id="0"/>
       <w:bookmarkEnd w:id="13"/>
     </w:p>
     <w:p>
@@ -7793,7 +7898,7 @@
         </w:rPr>
         <w:fldChar w:fldCharType="separate"/>
       </w:r>
-      <w:hyperlink w:anchor="_Toc221665222" w:history="1">
+      <w:hyperlink w:anchor="_Toc225156106" w:history="1">
         <w:r>
           <w:rPr>
             <w:rStyle w:val="Hyperlink"/>
@@ -7807,22 +7912,7 @@
             <w:noProof/>
             <w:lang w:val="en-US"/>
           </w:rPr>
-          <w:t>3.</w:t>
-        </w:r>
-        <w:r>
-          <w:rPr>
-            <w:rStyle w:val="Hyperlink"/>
-            <w:noProof/>
-          </w:rPr>
-          <w:t>1</w:t>
-        </w:r>
-        <w:r>
-          <w:rPr>
-            <w:rStyle w:val="Hyperlink"/>
-            <w:noProof/>
-            <w:lang w:val="en-US"/>
-          </w:rPr>
-          <w:t>. Alur Penelitian</w:t>
+          <w:t>3.1. Alur Penelitian</w:t>
         </w:r>
         <w:r>
           <w:rPr>
@@ -7843,7 +7933,7 @@
             <w:noProof/>
             <w:webHidden/>
           </w:rPr>
-          <w:instrText xml:space="preserve"> PAGEREF _Toc221665222 \h </w:instrText>
+          <w:instrText xml:space="preserve"> PAGEREF _Toc225156106 \h </w:instrText>
         </w:r>
         <w:r>
           <w:rPr>
@@ -7886,7 +7976,7 @@
           <w:lang w:val="en-US"/>
         </w:rPr>
       </w:pPr>
-      <w:hyperlink w:anchor="_Toc221665223" w:history="1">
+      <w:hyperlink w:anchor="_Toc225156107" w:history="1">
         <w:r>
           <w:rPr>
             <w:rStyle w:val="Hyperlink"/>
@@ -7900,14 +7990,14 @@
             <w:noProof/>
             <w:lang w:val="en-US"/>
           </w:rPr>
-          <w:t>3.</w:t>
+          <w:t>3.2</w:t>
         </w:r>
         <w:r>
           <w:rPr>
             <w:rStyle w:val="Hyperlink"/>
             <w:noProof/>
           </w:rPr>
-          <w:t xml:space="preserve">2. </w:t>
+          <w:t xml:space="preserve">. </w:t>
         </w:r>
         <w:r>
           <w:rPr>
@@ -7945,7 +8035,7 @@
             <w:noProof/>
             <w:webHidden/>
           </w:rPr>
-          <w:instrText xml:space="preserve"> PAGEREF _Toc221665223 \h </w:instrText>
+          <w:instrText xml:space="preserve"> PAGEREF _Toc225156107 \h </w:instrText>
         </w:r>
         <w:r>
           <w:rPr>
@@ -7988,7 +8078,7 @@
           <w:lang w:val="en-US"/>
         </w:rPr>
       </w:pPr>
-      <w:hyperlink w:anchor="_Toc221665224" w:history="1">
+      <w:hyperlink w:anchor="_Toc225156108" w:history="1">
         <w:r>
           <w:rPr>
             <w:rStyle w:val="Hyperlink"/>
@@ -8002,14 +8092,14 @@
             <w:noProof/>
             <w:lang w:val="en-US"/>
           </w:rPr>
-          <w:t>3.</w:t>
+          <w:t>3.3</w:t>
         </w:r>
         <w:r>
           <w:rPr>
             <w:rStyle w:val="Hyperlink"/>
             <w:noProof/>
           </w:rPr>
-          <w:t xml:space="preserve">3. </w:t>
+          <w:t xml:space="preserve">. </w:t>
         </w:r>
         <w:r>
           <w:rPr>
@@ -8047,7 +8137,7 @@
             <w:noProof/>
             <w:webHidden/>
           </w:rPr>
-          <w:instrText xml:space="preserve"> PAGEREF _Toc221665224 \h </w:instrText>
+          <w:instrText xml:space="preserve"> PAGEREF _Toc225156108 \h </w:instrText>
         </w:r>
         <w:r>
           <w:rPr>
@@ -8077,40 +8167,6 @@
           <w:fldChar w:fldCharType="end"/>
         </w:r>
       </w:hyperlink>
-    </w:p>
-    <w:p>
-      <w:pPr>
-        <w:spacing w:after="200" w:line="276" w:lineRule="auto"/>
-        <w:ind w:firstLine="0"/>
-        <w:rPr>
-          <w:szCs w:val="28"/>
-        </w:rPr>
-      </w:pPr>
-      <w:r>
-        <w:rPr>
-          <w:szCs w:val="28"/>
-        </w:rPr>
-        <w:fldChar w:fldCharType="end"/>
-      </w:r>
-      <w:r>
-        <w:rPr>
-          <w:szCs w:val="28"/>
-        </w:rPr>
-        <w:br w:type="page"/>
-      </w:r>
-    </w:p>
-    <w:p>
-      <w:pPr>
-        <w:pStyle w:val="Heading1"/>
-      </w:pPr>
-      <w:bookmarkStart w:id="16" w:name="_Toc75025328"/>
-      <w:bookmarkStart w:id="17" w:name="_Toc222407799"/>
-      <w:r>
-        <w:lastRenderedPageBreak/>
-        <w:t>DAFTAR TABEL</w:t>
-      </w:r>
-      <w:bookmarkEnd w:id="16"/>
-      <w:bookmarkEnd w:id="17"/>
     </w:p>
     <w:p>
       <w:pPr>
@@ -8124,22 +8180,13 @@
           <w:lang w:val="en-US"/>
         </w:rPr>
       </w:pPr>
-      <w:r>
-        <w:fldChar w:fldCharType="begin"/>
-      </w:r>
-      <w:r>
-        <w:instrText xml:space="preserve"> TOC \h \z \c "Tabel" </w:instrText>
-      </w:r>
-      <w:r>
-        <w:fldChar w:fldCharType="separate"/>
-      </w:r>
-      <w:hyperlink w:anchor="_Toc221665233" w:history="1">
+      <w:hyperlink w:anchor="_Toc225156109" w:history="1">
         <w:r>
           <w:rPr>
             <w:rStyle w:val="Hyperlink"/>
             <w:noProof/>
           </w:rPr>
-          <w:t xml:space="preserve">Tabel </w:t>
+          <w:t>Gambar 4</w:t>
         </w:r>
         <w:r>
           <w:rPr>
@@ -8147,14 +8194,7 @@
             <w:noProof/>
             <w:lang w:val="en-US"/>
           </w:rPr>
-          <w:t>2.</w:t>
-        </w:r>
-        <w:r>
-          <w:rPr>
-            <w:rStyle w:val="Hyperlink"/>
-            <w:noProof/>
-          </w:rPr>
-          <w:t xml:space="preserve">1. </w:t>
+          <w:t xml:space="preserve">.1 </w:t>
         </w:r>
         <w:r>
           <w:rPr>
@@ -8163,7 +8203,7 @@
             <w:noProof/>
             <w:lang w:val="en-US"/>
           </w:rPr>
-          <w:t>State of The Art</w:t>
+          <w:t>Low Fidelity Prototype</w:t>
         </w:r>
         <w:r>
           <w:rPr>
@@ -8184,7 +8224,7 @@
             <w:noProof/>
             <w:webHidden/>
           </w:rPr>
-          <w:instrText xml:space="preserve"> PAGEREF _Toc221665233 \h </w:instrText>
+          <w:instrText xml:space="preserve"> PAGEREF _Toc225156109 \h </w:instrText>
         </w:r>
         <w:r>
           <w:rPr>
@@ -8204,7 +8244,7 @@
             <w:noProof/>
             <w:webHidden/>
           </w:rPr>
-          <w:t>12</w:t>
+          <w:t>26</w:t>
         </w:r>
         <w:r>
           <w:rPr>
@@ -8227,13 +8267,13 @@
           <w:lang w:val="en-US"/>
         </w:rPr>
       </w:pPr>
-      <w:hyperlink w:anchor="_Toc221665234" w:history="1">
+      <w:hyperlink w:anchor="_Toc225156110" w:history="1">
         <w:r>
           <w:rPr>
             <w:rStyle w:val="Hyperlink"/>
             <w:noProof/>
           </w:rPr>
-          <w:t xml:space="preserve">Tabel </w:t>
+          <w:t xml:space="preserve">Gambar </w:t>
         </w:r>
         <w:r>
           <w:rPr>
@@ -8241,14 +8281,34 @@
             <w:noProof/>
             <w:lang w:val="en-US"/>
           </w:rPr>
-          <w:t>3.</w:t>
+          <w:t xml:space="preserve">4.2 </w:t>
         </w:r>
         <w:r>
           <w:rPr>
             <w:rStyle w:val="Hyperlink"/>
-            <w:noProof/>
-          </w:rPr>
-          <w:t>1. Jadwal Pelaksanaan Penelitian</w:t>
+            <w:i/>
+            <w:noProof/>
+            <w:lang w:val="en-US"/>
+          </w:rPr>
+          <w:t>High Fide</w:t>
+        </w:r>
+        <w:r>
+          <w:rPr>
+            <w:rStyle w:val="Hyperlink"/>
+            <w:i/>
+            <w:noProof/>
+            <w:lang w:val="en-US"/>
+          </w:rPr>
+          <w:t>l</w:t>
+        </w:r>
+        <w:r>
+          <w:rPr>
+            <w:rStyle w:val="Hyperlink"/>
+            <w:i/>
+            <w:noProof/>
+            <w:lang w:val="en-US"/>
+          </w:rPr>
+          <w:t>ity Prototype</w:t>
         </w:r>
         <w:r>
           <w:rPr>
@@ -8269,7 +8329,7 @@
             <w:noProof/>
             <w:webHidden/>
           </w:rPr>
-          <w:instrText xml:space="preserve"> PAGEREF _Toc221665234 \h </w:instrText>
+          <w:instrText xml:space="preserve"> PAGEREF _Toc225156110 \h </w:instrText>
         </w:r>
         <w:r>
           <w:rPr>
@@ -8289,7 +8349,7 @@
             <w:noProof/>
             <w:webHidden/>
           </w:rPr>
-          <w:t>14</w:t>
+          <w:t>26</w:t>
         </w:r>
         <w:r>
           <w:rPr>
@@ -8299,6 +8359,40 @@
           <w:fldChar w:fldCharType="end"/>
         </w:r>
       </w:hyperlink>
+    </w:p>
+    <w:p>
+      <w:pPr>
+        <w:spacing w:after="200" w:line="276" w:lineRule="auto"/>
+        <w:ind w:firstLine="0"/>
+        <w:rPr>
+          <w:szCs w:val="28"/>
+        </w:rPr>
+      </w:pPr>
+      <w:r>
+        <w:rPr>
+          <w:szCs w:val="28"/>
+        </w:rPr>
+        <w:fldChar w:fldCharType="end"/>
+      </w:r>
+      <w:r>
+        <w:rPr>
+          <w:szCs w:val="28"/>
+        </w:rPr>
+        <w:br w:type="page"/>
+      </w:r>
+    </w:p>
+    <w:p>
+      <w:pPr>
+        <w:pStyle w:val="Heading1"/>
+      </w:pPr>
+      <w:bookmarkStart w:id="16" w:name="_Toc75025328"/>
+      <w:bookmarkStart w:id="17" w:name="_Toc222407799"/>
+      <w:r>
+        <w:lastRenderedPageBreak/>
+        <w:t>DAFTAR TABEL</w:t>
+      </w:r>
+      <w:bookmarkEnd w:id="16"/>
+      <w:bookmarkEnd w:id="17"/>
     </w:p>
     <w:p>
       <w:pPr>
@@ -8312,7 +8406,16 @@
           <w:lang w:val="en-US"/>
         </w:rPr>
       </w:pPr>
-      <w:hyperlink w:anchor="_Toc221665235" w:history="1">
+      <w:r>
+        <w:fldChar w:fldCharType="begin"/>
+      </w:r>
+      <w:r>
+        <w:instrText xml:space="preserve"> TOC \h \z \c "Tabel" </w:instrText>
+      </w:r>
+      <w:r>
+        <w:fldChar w:fldCharType="separate"/>
+      </w:r>
+      <w:hyperlink w:anchor="_Toc221665233" w:history="1">
         <w:r>
           <w:rPr>
             <w:rStyle w:val="Hyperlink"/>
@@ -8326,22 +8429,23 @@
             <w:noProof/>
             <w:lang w:val="en-US"/>
           </w:rPr>
-          <w:t>3.</w:t>
+          <w:t>2.</w:t>
         </w:r>
         <w:r>
           <w:rPr>
             <w:rStyle w:val="Hyperlink"/>
             <w:noProof/>
           </w:rPr>
-          <w:t xml:space="preserve">2. </w:t>
+          <w:t xml:space="preserve">1. </w:t>
         </w:r>
         <w:r>
           <w:rPr>
             <w:rStyle w:val="Hyperlink"/>
+            <w:i/>
             <w:noProof/>
             <w:lang w:val="en-US"/>
           </w:rPr>
-          <w:t>Contoh data</w:t>
+          <w:t>State of The Art</w:t>
         </w:r>
         <w:r>
           <w:rPr>
@@ -8362,7 +8466,7 @@
             <w:noProof/>
             <w:webHidden/>
           </w:rPr>
-          <w:instrText xml:space="preserve"> PAGEREF _Toc221665235 \h </w:instrText>
+          <w:instrText xml:space="preserve"> PAGEREF _Toc221665233 \h </w:instrText>
         </w:r>
         <w:r>
           <w:rPr>
@@ -8382,7 +8486,7 @@
             <w:noProof/>
             <w:webHidden/>
           </w:rPr>
-          <w:t>20</w:t>
+          <w:t>12</w:t>
         </w:r>
         <w:r>
           <w:rPr>
@@ -8405,7 +8509,7 @@
           <w:lang w:val="en-US"/>
         </w:rPr>
       </w:pPr>
-      <w:hyperlink w:anchor="_Toc221665236" w:history="1">
+      <w:hyperlink w:anchor="_Toc221665234" w:history="1">
         <w:r>
           <w:rPr>
             <w:rStyle w:val="Hyperlink"/>
@@ -8426,15 +8530,7 @@
             <w:rStyle w:val="Hyperlink"/>
             <w:noProof/>
           </w:rPr>
-          <w:t xml:space="preserve">3. </w:t>
-        </w:r>
-        <w:r>
-          <w:rPr>
-            <w:rStyle w:val="Hyperlink"/>
-            <w:noProof/>
-            <w:lang w:val="en-US"/>
-          </w:rPr>
-          <w:t>Detail skala penelitian</w:t>
+          <w:t>1. Jadwal Pelaksanaan Penelitian</w:t>
         </w:r>
         <w:r>
           <w:rPr>
@@ -8455,7 +8551,7 @@
             <w:noProof/>
             <w:webHidden/>
           </w:rPr>
-          <w:instrText xml:space="preserve"> PAGEREF _Toc221665236 \h </w:instrText>
+          <w:instrText xml:space="preserve"> PAGEREF _Toc221665234 \h </w:instrText>
         </w:r>
         <w:r>
           <w:rPr>
@@ -8475,7 +8571,7 @@
             <w:noProof/>
             <w:webHidden/>
           </w:rPr>
-          <w:t>22</w:t>
+          <w:t>14</w:t>
         </w:r>
         <w:r>
           <w:rPr>
@@ -8498,7 +8594,7 @@
           <w:lang w:val="en-US"/>
         </w:rPr>
       </w:pPr>
-      <w:hyperlink w:anchor="_Toc221665237" w:history="1">
+      <w:hyperlink w:anchor="_Toc221665235" w:history="1">
         <w:r>
           <w:rPr>
             <w:rStyle w:val="Hyperlink"/>
@@ -8519,24 +8615,15 @@
             <w:rStyle w:val="Hyperlink"/>
             <w:noProof/>
           </w:rPr>
-          <w:t xml:space="preserve">4. </w:t>
+          <w:t xml:space="preserve">2. </w:t>
         </w:r>
         <w:r>
           <w:rPr>
             <w:rStyle w:val="Hyperlink"/>
-            <w:i/>
             <w:noProof/>
             <w:lang w:val="en-US"/>
           </w:rPr>
-          <w:t>Threshold</w:t>
-        </w:r>
-        <w:r>
-          <w:rPr>
-            <w:rStyle w:val="Hyperlink"/>
-            <w:noProof/>
-            <w:lang w:val="en-US"/>
-          </w:rPr>
-          <w:t xml:space="preserve"> nilai SUS</w:t>
+          <w:t>Contoh data</w:t>
         </w:r>
         <w:r>
           <w:rPr>
@@ -8557,7 +8644,7 @@
             <w:noProof/>
             <w:webHidden/>
           </w:rPr>
-          <w:instrText xml:space="preserve"> PAGEREF _Toc221665237 \h </w:instrText>
+          <w:instrText xml:space="preserve"> PAGEREF _Toc221665235 \h </w:instrText>
         </w:r>
         <w:r>
           <w:rPr>
@@ -8577,7 +8664,7 @@
             <w:noProof/>
             <w:webHidden/>
           </w:rPr>
-          <w:t>22</w:t>
+          <w:t>20</w:t>
         </w:r>
         <w:r>
           <w:rPr>
@@ -8600,6 +8687,201 @@
           <w:lang w:val="en-US"/>
         </w:rPr>
       </w:pPr>
+      <w:hyperlink w:anchor="_Toc221665236" w:history="1">
+        <w:r>
+          <w:rPr>
+            <w:rStyle w:val="Hyperlink"/>
+            <w:noProof/>
+          </w:rPr>
+          <w:t xml:space="preserve">Tabel </w:t>
+        </w:r>
+        <w:r>
+          <w:rPr>
+            <w:rStyle w:val="Hyperlink"/>
+            <w:noProof/>
+            <w:lang w:val="en-US"/>
+          </w:rPr>
+          <w:t>3.</w:t>
+        </w:r>
+        <w:r>
+          <w:rPr>
+            <w:rStyle w:val="Hyperlink"/>
+            <w:noProof/>
+          </w:rPr>
+          <w:t xml:space="preserve">3. </w:t>
+        </w:r>
+        <w:r>
+          <w:rPr>
+            <w:rStyle w:val="Hyperlink"/>
+            <w:noProof/>
+            <w:lang w:val="en-US"/>
+          </w:rPr>
+          <w:t>Detail skala penelitian</w:t>
+        </w:r>
+        <w:r>
+          <w:rPr>
+            <w:noProof/>
+            <w:webHidden/>
+          </w:rPr>
+          <w:tab/>
+        </w:r>
+        <w:r>
+          <w:rPr>
+            <w:noProof/>
+            <w:webHidden/>
+          </w:rPr>
+          <w:fldChar w:fldCharType="begin"/>
+        </w:r>
+        <w:r>
+          <w:rPr>
+            <w:noProof/>
+            <w:webHidden/>
+          </w:rPr>
+          <w:instrText xml:space="preserve"> PAGEREF _Toc221665236 \h </w:instrText>
+        </w:r>
+        <w:r>
+          <w:rPr>
+            <w:noProof/>
+            <w:webHidden/>
+          </w:rPr>
+        </w:r>
+        <w:r>
+          <w:rPr>
+            <w:noProof/>
+            <w:webHidden/>
+          </w:rPr>
+          <w:fldChar w:fldCharType="separate"/>
+        </w:r>
+        <w:r>
+          <w:rPr>
+            <w:noProof/>
+            <w:webHidden/>
+          </w:rPr>
+          <w:t>22</w:t>
+        </w:r>
+        <w:r>
+          <w:rPr>
+            <w:noProof/>
+            <w:webHidden/>
+          </w:rPr>
+          <w:fldChar w:fldCharType="end"/>
+        </w:r>
+      </w:hyperlink>
+    </w:p>
+    <w:p>
+      <w:pPr>
+        <w:pStyle w:val="TableofFigures"/>
+        <w:tabs>
+          <w:tab w:val="right" w:leader="dot" w:pos="7927"/>
+        </w:tabs>
+        <w:rPr>
+          <w:rFonts w:asciiTheme="minorHAnsi" w:eastAsiaTheme="minorEastAsia" w:hAnsiTheme="minorHAnsi"/>
+          <w:noProof/>
+          <w:lang w:val="en-US"/>
+        </w:rPr>
+      </w:pPr>
+      <w:hyperlink w:anchor="_Toc221665237" w:history="1">
+        <w:r>
+          <w:rPr>
+            <w:rStyle w:val="Hyperlink"/>
+            <w:noProof/>
+          </w:rPr>
+          <w:t xml:space="preserve">Tabel </w:t>
+        </w:r>
+        <w:r>
+          <w:rPr>
+            <w:rStyle w:val="Hyperlink"/>
+            <w:noProof/>
+            <w:lang w:val="en-US"/>
+          </w:rPr>
+          <w:t>3.</w:t>
+        </w:r>
+        <w:r>
+          <w:rPr>
+            <w:rStyle w:val="Hyperlink"/>
+            <w:noProof/>
+          </w:rPr>
+          <w:t xml:space="preserve">4. </w:t>
+        </w:r>
+        <w:r>
+          <w:rPr>
+            <w:rStyle w:val="Hyperlink"/>
+            <w:i/>
+            <w:noProof/>
+            <w:lang w:val="en-US"/>
+          </w:rPr>
+          <w:t>Threshold</w:t>
+        </w:r>
+        <w:r>
+          <w:rPr>
+            <w:rStyle w:val="Hyperlink"/>
+            <w:noProof/>
+            <w:lang w:val="en-US"/>
+          </w:rPr>
+          <w:t xml:space="preserve"> nilai SUS</w:t>
+        </w:r>
+        <w:r>
+          <w:rPr>
+            <w:noProof/>
+            <w:webHidden/>
+          </w:rPr>
+          <w:tab/>
+        </w:r>
+        <w:r>
+          <w:rPr>
+            <w:noProof/>
+            <w:webHidden/>
+          </w:rPr>
+          <w:fldChar w:fldCharType="begin"/>
+        </w:r>
+        <w:r>
+          <w:rPr>
+            <w:noProof/>
+            <w:webHidden/>
+          </w:rPr>
+          <w:instrText xml:space="preserve"> PAGEREF _Toc221665237 \h </w:instrText>
+        </w:r>
+        <w:r>
+          <w:rPr>
+            <w:noProof/>
+            <w:webHidden/>
+          </w:rPr>
+        </w:r>
+        <w:r>
+          <w:rPr>
+            <w:noProof/>
+            <w:webHidden/>
+          </w:rPr>
+          <w:fldChar w:fldCharType="separate"/>
+        </w:r>
+        <w:r>
+          <w:rPr>
+            <w:noProof/>
+            <w:webHidden/>
+          </w:rPr>
+          <w:t>22</w:t>
+        </w:r>
+        <w:r>
+          <w:rPr>
+            <w:noProof/>
+            <w:webHidden/>
+          </w:rPr>
+          <w:fldChar w:fldCharType="end"/>
+        </w:r>
+      </w:hyperlink>
+    </w:p>
+    <w:p>
+      <w:pPr>
+        <w:pStyle w:val="TableofFigures"/>
+        <w:tabs>
+          <w:tab w:val="right" w:leader="dot" w:pos="7927"/>
+        </w:tabs>
+        <w:rPr>
+          <w:rFonts w:asciiTheme="minorHAnsi" w:eastAsiaTheme="minorEastAsia" w:hAnsiTheme="minorHAnsi"/>
+          <w:noProof/>
+          <w:lang w:val="en-US"/>
+        </w:rPr>
+      </w:pPr>
       <w:hyperlink w:anchor="_Toc221665238" w:history="1">
         <w:r>
           <w:rPr>
@@ -8816,7 +9098,20 @@
         <w:rPr>
           <w:i/>
         </w:rPr>
-        <w:t>User-Centered Design</w:t>
+        <w:t>User</w:t>
+      </w:r>
+      <w:r>
+        <w:rPr>
+          <w:i/>
+          <w:lang w:val="en-US"/>
+        </w:rPr>
+        <w:t xml:space="preserve"> </w:t>
+      </w:r>
+      <w:r>
+        <w:rPr>
+          <w:i/>
+        </w:rPr>
+        <w:t>Centered Design</w:t>
       </w:r>
       <w:r>
         <w:t xml:space="preserve"> (</w:t>
@@ -9003,7 +9298,39 @@
         <w:rPr>
           <w:i/>
         </w:rPr>
-        <w:t>Small-scale horticulture greenhouses face challenges with manual management, climate uncertainty, and limited internet connectivity in rural areas. A hybrid approach is needed because relying solely on cloud-based IoT systems is inadequate without stable internet. This research aims to design, implement, and evaluate an embedded web interface using Preact and Pico CSS for a small-scale greenhouse control system, featuring a Decision Support System (DSS) powered by Generative AI. The system uses an ESP32 microcontroller operating as a local access point for offline use and syncing to the cloud when online. Built using Agile and User-Centered Design (UCD) frameworks, it utilizes the Gemini AI API via prompt engineering to process sensor data into descriptive feedback. System evaluation incorporates technical testing, AI validation, and usability testing with 10 farmers using the System Usability Scale (SUS). Ultimately, the study expects to deliver a working prototype that offers both local and cloud-based access alongside AI-driven descriptive recommendations. This will provide an affordable, flexible solution that improves resource efficiency for small-scale farmers</w:t>
+        <w:t>Small</w:t>
+      </w:r>
+      <w:r>
+        <w:rPr>
+          <w:i/>
+          <w:lang w:val="en-US"/>
+        </w:rPr>
+        <w:t xml:space="preserve"> </w:t>
+      </w:r>
+      <w:r>
+        <w:rPr>
+          <w:i/>
+        </w:rPr>
+        <w:t>scale horticulture greenhouses face challenges with manual management, climate uncertainty, and limited internet connectivity in rural areas. A hybrid approach is needed because relying solely on cloud-based IoT systems is inadequate without stable internet. This research aims to design, implement, and evaluate an embedded web interface using Preact and Pico CSS for a small-scale greenhouse control system, featuring a Decision Support System (DSS) powered by Generative AI. The system uses an ESP32 microcontroller operating as a local access point for offline use and syncing to the cloud when onl</w:t>
+      </w:r>
+      <w:r>
+        <w:rPr>
+          <w:i/>
+        </w:rPr>
+        <w:t>ine. Built using Agile and User</w:t>
+      </w:r>
+      <w:r>
+        <w:rPr>
+          <w:i/>
+          <w:lang w:val="en-US"/>
+        </w:rPr>
+        <w:t xml:space="preserve"> </w:t>
+      </w:r>
+      <w:r>
+        <w:rPr>
+          <w:i/>
+        </w:rPr>
+        <w:t>Centered Design (UCD) frameworks, it utilizes the Gemini AI API via prompt engineering to process sensor data into descriptive feedback. System evaluation incorporates technical testing, AI validation, and usability testing with 10 farmers using the System Usability Scale (SUS). Ultimately, the study expects to deliver a working prototype that offers both local and cloud-based access alongside AI-driven descriptive recommendations. This will provide an affordable, flexible solution that improves resource efficiency for small-scale farmers</w:t>
       </w:r>
     </w:p>
     <w:p>
@@ -17889,7 +18216,7 @@
           <w:lang w:val="en-US"/>
         </w:rPr>
       </w:pPr>
-      <w:bookmarkStart w:id="44" w:name="_Toc221665222"/>
+      <w:bookmarkStart w:id="44" w:name="_Toc225156106"/>
       <w:r>
         <w:t xml:space="preserve">Gambar </w:t>
       </w:r>
@@ -17901,31 +18228,32 @@
       </w:r>
       <w:r>
         <w:rPr>
+          <w:lang w:val="en-US"/>
+        </w:rPr>
+        <w:fldChar w:fldCharType="begin"/>
+      </w:r>
+      <w:r>
+        <w:rPr>
+          <w:lang w:val="en-US"/>
+        </w:rPr>
+        <w:instrText xml:space="preserve"> SEQ Gambar \* ARABIC </w:instrText>
+      </w:r>
+      <w:r>
+        <w:rPr>
+          <w:lang w:val="en-US"/>
+        </w:rPr>
+        <w:fldChar w:fldCharType="separate"/>
+      </w:r>
+      <w:r>
+        <w:rPr>
           <w:noProof/>
-        </w:rPr>
-        <w:fldChar w:fldCharType="begin"/>
-      </w:r>
-      <w:r>
-        <w:rPr>
-          <w:noProof/>
-        </w:rPr>
-        <w:instrText xml:space="preserve"> SEQ Gambar \* ARABIC </w:instrText>
-      </w:r>
-      <w:r>
-        <w:rPr>
-          <w:noProof/>
-        </w:rPr>
-        <w:fldChar w:fldCharType="separate"/>
-      </w:r>
-      <w:r>
-        <w:rPr>
-          <w:noProof/>
+          <w:lang w:val="en-US"/>
         </w:rPr>
         <w:t>1</w:t>
       </w:r>
       <w:r>
         <w:rPr>
-          <w:noProof/>
+          <w:lang w:val="en-US"/>
         </w:rPr>
         <w:fldChar w:fldCharType="end"/>
       </w:r>
@@ -18207,7 +18535,7 @@
           <w:lang w:val="en-US"/>
         </w:rPr>
       </w:pPr>
-      <w:bookmarkStart w:id="46" w:name="_Toc221665223"/>
+      <w:bookmarkStart w:id="46" w:name="_Toc225156107"/>
       <w:r>
         <w:t xml:space="preserve">Gambar </w:t>
       </w:r>
@@ -18219,31 +18547,32 @@
       </w:r>
       <w:r>
         <w:rPr>
+          <w:lang w:val="en-US"/>
+        </w:rPr>
+        <w:fldChar w:fldCharType="begin"/>
+      </w:r>
+      <w:r>
+        <w:rPr>
+          <w:lang w:val="en-US"/>
+        </w:rPr>
+        <w:instrText xml:space="preserve"> SEQ Gambar \* ARABIC </w:instrText>
+      </w:r>
+      <w:r>
+        <w:rPr>
+          <w:lang w:val="en-US"/>
+        </w:rPr>
+        <w:fldChar w:fldCharType="separate"/>
+      </w:r>
+      <w:r>
+        <w:rPr>
           <w:noProof/>
-        </w:rPr>
-        <w:fldChar w:fldCharType="begin"/>
-      </w:r>
-      <w:r>
-        <w:rPr>
-          <w:noProof/>
-        </w:rPr>
-        <w:instrText xml:space="preserve"> SEQ Gambar \* ARABIC </w:instrText>
-      </w:r>
-      <w:r>
-        <w:rPr>
-          <w:noProof/>
-        </w:rPr>
-        <w:fldChar w:fldCharType="separate"/>
-      </w:r>
-      <w:r>
-        <w:rPr>
-          <w:noProof/>
+          <w:lang w:val="en-US"/>
         </w:rPr>
         <w:t>2</w:t>
       </w:r>
       <w:r>
         <w:rPr>
-          <w:noProof/>
+          <w:lang w:val="en-US"/>
         </w:rPr>
         <w:fldChar w:fldCharType="end"/>
       </w:r>
@@ -18384,7 +18713,7 @@
           <w:lang w:val="en-US"/>
         </w:rPr>
       </w:pPr>
-      <w:bookmarkStart w:id="47" w:name="_Toc221665224"/>
+      <w:bookmarkStart w:id="47" w:name="_Toc225156108"/>
       <w:r>
         <w:rPr>
           <w:noProof/>
@@ -18465,31 +18794,32 @@
       </w:r>
       <w:r>
         <w:rPr>
+          <w:lang w:val="en-US"/>
+        </w:rPr>
+        <w:fldChar w:fldCharType="begin"/>
+      </w:r>
+      <w:r>
+        <w:rPr>
+          <w:lang w:val="en-US"/>
+        </w:rPr>
+        <w:instrText xml:space="preserve"> SEQ Gambar \* ARABIC </w:instrText>
+      </w:r>
+      <w:r>
+        <w:rPr>
+          <w:lang w:val="en-US"/>
+        </w:rPr>
+        <w:fldChar w:fldCharType="separate"/>
+      </w:r>
+      <w:r>
+        <w:rPr>
           <w:noProof/>
-        </w:rPr>
-        <w:fldChar w:fldCharType="begin"/>
-      </w:r>
-      <w:r>
-        <w:rPr>
-          <w:noProof/>
-        </w:rPr>
-        <w:instrText xml:space="preserve"> SEQ Gambar \* ARABIC </w:instrText>
-      </w:r>
-      <w:r>
-        <w:rPr>
-          <w:noProof/>
-        </w:rPr>
-        <w:fldChar w:fldCharType="separate"/>
-      </w:r>
-      <w:r>
-        <w:rPr>
-          <w:noProof/>
+          <w:lang w:val="en-US"/>
         </w:rPr>
         <w:t>3</w:t>
       </w:r>
       <w:r>
         <w:rPr>
-          <w:noProof/>
+          <w:lang w:val="en-US"/>
         </w:rPr>
         <w:fldChar w:fldCharType="end"/>
       </w:r>
@@ -19202,7 +19532,7 @@
           <w:sz w:val="22"/>
           <w:szCs w:val="22"/>
         </w:rPr>
-        <w:t>, dan kecerdasan buatan di bidang pertanian. Setelah itu, dilakukan analisis kebutuhan pengguna dengan metode wawancara dan observasi langsung untuk menggali kebutuhan fungsional dan non fungsional sistem. Hasil dari tahap perencanaan ini berupa kebutuhan pengguna, list fitur awal, serta rencana pengembangan pertama.</w:t>
+        <w:t>, dan kecerdasan buatan di bidang pertanian. Setelah itu, dilakukan analisis kebutuhan pengguna dengan metode observasi untuk menggali kebutuhan fungsional dan non fungsional sistem. Hasil dari tahap perencanaan ini berupa kebutuhan pengguna, list fitur awal, serta rencana pengembangan pertama.</w:t>
       </w:r>
     </w:p>
     <w:p>
@@ -20825,6 +21155,15 @@
       <w:r>
         <w:rPr>
           <w:rFonts w:cs="Arial"/>
+          <w:b/>
+          <w:color w:val="000000"/>
+          <w:lang w:val="en-US"/>
+        </w:rPr>
+        <w:t xml:space="preserve"> secara singkat</w:t>
+      </w:r>
+      <w:r>
+        <w:rPr>
+          <w:rFonts w:cs="Arial"/>
           <w:color w:val="000000"/>
           <w:lang w:val="en-US"/>
         </w:rPr>
@@ -24473,19 +24812,208 @@
         <w:rPr>
           <w:lang w:val="en-US"/>
         </w:rPr>
-        <w:t>Pada tahap implementasi solusi, seluruh tahapan yang telah dirancang pada BAB 3.3 berhasil direalisasikan dalam bentuk sistem Decision Support System (DSS) berbasis kecerdasan buatan yang terintegrasi dengan sensor dan antarmuka pengguna. Implementasi dilakukan secara bertahap mengikuti prinsip Agile, sehingga setiap siklus pengembangan menghasilkan peningkatan fitur dan kualitas sistem berdasarkan umpan balik pengguna.</w:t>
-      </w:r>
-    </w:p>
-    <w:p>
-      <w:pPr>
+        <w:t>Bagian ini memaparkan penjabaran</w:t>
+      </w:r>
+      <w:r>
+        <w:rPr>
+          <w:lang w:val="en-US"/>
+        </w:rPr>
+        <w:t xml:space="preserve"> dari hasil pelaksanaan tahapan </w:t>
+      </w:r>
+      <w:r>
+        <w:rPr>
+          <w:lang w:val="en-US"/>
+        </w:rPr>
+        <w:t xml:space="preserve">tahapan yang telah dirancang pada metodologi penelitian sebelumnya. Implementasi ini merupakan realisasi dari penggabungan metode </w:t>
+      </w:r>
+      <w:r>
+        <w:rPr>
+          <w:i/>
+          <w:lang w:val="en-US"/>
+        </w:rPr>
+        <w:t>Agile</w:t>
+      </w:r>
+      <w:r>
+        <w:rPr>
+          <w:lang w:val="en-US"/>
+        </w:rPr>
+        <w:t xml:space="preserve"> dan </w:t>
+      </w:r>
+      <w:r>
+        <w:rPr>
+          <w:i/>
+          <w:lang w:val="en-US"/>
+        </w:rPr>
+        <w:t>User Centered Design</w:t>
+      </w:r>
+      <w:r>
+        <w:rPr>
+          <w:lang w:val="en-US"/>
+        </w:rPr>
+        <w:t xml:space="preserve"> (UCD) untuk membangun </w:t>
+      </w:r>
+      <w:r>
+        <w:rPr>
+          <w:i/>
+          <w:lang w:val="en-US"/>
+        </w:rPr>
+        <w:t>Decision Support System</w:t>
+      </w:r>
+      <w:r>
+        <w:rPr>
+          <w:lang w:val="en-US"/>
+        </w:rPr>
+        <w:t xml:space="preserve"> (DSS) </w:t>
+      </w:r>
+      <w:r>
+        <w:rPr>
+          <w:lang w:val="en-US"/>
+        </w:rPr>
+        <w:t xml:space="preserve">berbasis </w:t>
+      </w:r>
+      <w:r>
+        <w:rPr>
+          <w:i/>
+          <w:lang w:val="en-US"/>
+        </w:rPr>
+        <w:t>AI</w:t>
+      </w:r>
+      <w:r>
+        <w:rPr>
+          <w:lang w:val="en-US"/>
+        </w:rPr>
+        <w:t xml:space="preserve"> yang mudah </w:t>
+      </w:r>
+      <w:r>
+        <w:rPr>
+          <w:lang w:val="en-US"/>
+        </w:rPr>
+        <w:t>digunakan</w:t>
+      </w:r>
+      <w:r>
+        <w:rPr>
+          <w:lang w:val="en-US"/>
+        </w:rPr>
+        <w:t>.</w:t>
+      </w:r>
+    </w:p>
+    <w:p>
+      <w:pPr>
+        <w:pStyle w:val="Heading3"/>
+        <w:ind w:firstLine="709"/>
+        <w:rPr>
+          <w:lang w:val="en-US"/>
+        </w:rPr>
+      </w:pPr>
+      <w:r>
+        <w:rPr>
+          <w:lang w:val="en-US"/>
+        </w:rPr>
+        <w:t>4.1.1 Implementasi Tahap Perencanaan</w:t>
+      </w:r>
+    </w:p>
+    <w:p>
+      <w:pPr>
+        <w:ind w:left="720" w:firstLine="720"/>
         <w:jc w:val="both"/>
         <w:rPr>
           <w:lang w:val="en-US"/>
         </w:rPr>
       </w:pPr>
-    </w:p>
-    <w:p>
-      <w:pPr>
+      <w:r>
+        <w:rPr>
+          <w:lang w:val="en-US"/>
+        </w:rPr>
+        <w:t xml:space="preserve">Pada tahap perencanaan, hasil yang diperoleh berupa daftar kebutuhan sistem yang terstruktur, meliputi kebutuhan fungsional seperti kemampuan membaca data sensor, mengolah data menjadi </w:t>
+      </w:r>
+      <w:r>
+        <w:rPr>
+          <w:i/>
+          <w:lang w:val="en-US"/>
+        </w:rPr>
+        <w:t>prompt</w:t>
+      </w:r>
+      <w:r>
+        <w:rPr>
+          <w:lang w:val="en-US"/>
+        </w:rPr>
+        <w:t xml:space="preserve">, serta menghasilkan rekomendasi berbasis </w:t>
+      </w:r>
+      <w:r>
+        <w:rPr>
+          <w:i/>
+          <w:lang w:val="en-US"/>
+        </w:rPr>
+        <w:t>AI</w:t>
+      </w:r>
+      <w:r>
+        <w:rPr>
+          <w:lang w:val="en-US"/>
+        </w:rPr>
+        <w:t xml:space="preserve">. Selain itu, </w:t>
+      </w:r>
+      <w:r>
+        <w:rPr>
+          <w:lang w:val="en-US"/>
+        </w:rPr>
+        <w:t xml:space="preserve">kebutuhan non </w:t>
+      </w:r>
+      <w:r>
+        <w:rPr>
+          <w:lang w:val="en-US"/>
+        </w:rPr>
+        <w:t xml:space="preserve">fungsional seperti kemudahan </w:t>
+      </w:r>
+      <w:r>
+        <w:rPr>
+          <w:lang w:val="en-US"/>
+        </w:rPr>
+        <w:t>dalam menggunakan sistem</w:t>
+      </w:r>
+      <w:r>
+        <w:rPr>
+          <w:lang w:val="en-US"/>
+        </w:rPr>
+        <w:t xml:space="preserve">, responsivitas sistem, dan integrasi </w:t>
+      </w:r>
+      <w:r>
+        <w:rPr>
+          <w:i/>
+          <w:lang w:val="en-US"/>
+        </w:rPr>
+        <w:t>AI</w:t>
+      </w:r>
+      <w:r>
+        <w:rPr>
+          <w:lang w:val="en-US"/>
+        </w:rPr>
+        <w:t xml:space="preserve"> </w:t>
+      </w:r>
+      <w:r>
+        <w:rPr>
+          <w:lang w:val="en-US"/>
+        </w:rPr>
+        <w:t>juga berhasil diidentifikasi.</w:t>
+      </w:r>
+    </w:p>
+    <w:p>
+      <w:pPr>
+        <w:pStyle w:val="Heading3"/>
+        <w:ind w:firstLine="709"/>
+        <w:rPr>
+          <w:lang w:val="en-US"/>
+        </w:rPr>
+      </w:pPr>
+      <w:r>
+        <w:rPr>
+          <w:lang w:val="en-US"/>
+        </w:rPr>
+        <w:t>4.1.2 Implementasi Tahap Perancangan</w:t>
+      </w:r>
+    </w:p>
+    <w:p>
+      <w:pPr>
+        <w:ind w:left="720" w:firstLine="720"/>
         <w:jc w:val="both"/>
         <w:rPr>
           <w:lang w:val="en-US"/>
@@ -24495,184 +25023,369 @@
         <w:rPr>
           <w:lang w:val="en-US"/>
         </w:rPr>
-        <w:t xml:space="preserve">Pada tahap perencanaan, hasil yang diperoleh berupa daftar kebutuhan sistem yang terstruktur, meliputi kebutuhan fungsional seperti kemampuan membaca data sensor, mengolah data menjadi prompt, serta menghasilkan rekomendasi berbasis AI. Selain itu, kebutuhan non-fungsional seperti kemudahan penggunaan, responsivitas sistem, dan keandalan integrasi juga berhasil diidentifikasi. Data hasil wawancara dan observasi petani menjadi dasar dalam menentukan prioritas fitur yang </w:t>
+        <w:t xml:space="preserve">Tahap perancangan menghasilkan </w:t>
+      </w:r>
+      <w:r>
+        <w:rPr>
+          <w:i/>
+          <w:lang w:val="en-US"/>
+        </w:rPr>
+        <w:t>prototype antarmuka</w:t>
+      </w:r>
+      <w:r>
+        <w:rPr>
+          <w:lang w:val="en-US"/>
+        </w:rPr>
+        <w:t xml:space="preserve"> yang telah melalui beberapa kali perbaikan berdasarkan umpan balik pengguna. </w:t>
+      </w:r>
+      <w:r>
+        <w:rPr>
+          <w:lang w:val="en-US"/>
+        </w:rPr>
+        <w:t xml:space="preserve">Pada Gambar 4.1 menunjukkan desain antarmuka </w:t>
+      </w:r>
+      <w:r>
+        <w:rPr>
+          <w:i/>
+          <w:lang w:val="en-US"/>
+        </w:rPr>
+        <w:t>Low fidelity prototype</w:t>
+      </w:r>
+      <w:r>
+        <w:rPr>
+          <w:lang w:val="en-US"/>
+        </w:rPr>
+        <w:t xml:space="preserve"> yang awalnya sederhana kemudian dikembangkan menjadi </w:t>
+      </w:r>
+      <w:r>
+        <w:rPr>
+          <w:i/>
+          <w:lang w:val="en-US"/>
+        </w:rPr>
+        <w:t>high fidelity prototype</w:t>
+      </w:r>
+      <w:r>
+        <w:rPr>
+          <w:lang w:val="en-US"/>
+        </w:rPr>
+        <w:t xml:space="preserve"> menggunakan Preact dan PicoCSS</w:t>
+      </w:r>
+      <w:r>
+        <w:rPr>
+          <w:lang w:val="en-US"/>
+        </w:rPr>
+        <w:t xml:space="preserve"> yang ditunjukkan pada gambar 4.2</w:t>
+      </w:r>
+      <w:r>
+        <w:rPr>
+          <w:lang w:val="en-US"/>
+        </w:rPr>
+        <w:t xml:space="preserve">. Hasil implementasi desain menunjukkan bahwa antarmuka sistem menjadi lebih intuitif, dengan tampilan yang sederhana dan mudah dipahami oleh </w:t>
+      </w:r>
+      <w:r>
+        <w:rPr>
+          <w:lang w:val="en-US"/>
+        </w:rPr>
+        <w:t>pengguna</w:t>
+      </w:r>
+      <w:r>
+        <w:rPr>
+          <w:lang w:val="en-US"/>
+        </w:rPr>
+        <w:t>. Navigasi sistem juga disusun agar pengguna dapat dengan cepat mengakses informasi sensor dan rekomendasi tanpa kebingungan.</w:t>
+      </w:r>
+    </w:p>
+    <w:p>
+      <w:pPr>
+        <w:pStyle w:val="Caption"/>
+        <w:rPr>
+          <w:i/>
+          <w:lang w:val="en-US"/>
+        </w:rPr>
+      </w:pPr>
+      <w:bookmarkStart w:id="63" w:name="_Toc225156109"/>
+      <w:r>
+        <w:lastRenderedPageBreak/>
+        <w:t xml:space="preserve">Gambar </w:t>
+      </w:r>
+      <w:r>
+        <w:fldChar w:fldCharType="begin"/>
+      </w:r>
+      <w:r>
+        <w:instrText xml:space="preserve"> SEQ Gambar \* ARABIC </w:instrText>
+      </w:r>
+      <w:r>
+        <w:fldChar w:fldCharType="separate"/>
+      </w:r>
+      <w:r>
+        <w:rPr>
+          <w:noProof/>
+        </w:rPr>
+        <w:t>4</w:t>
+      </w:r>
+      <w:r>
+        <w:fldChar w:fldCharType="end"/>
+      </w:r>
+      <w:r>
+        <w:rPr>
+          <w:lang w:val="en-US"/>
+        </w:rPr>
+        <w:drawing>
+          <wp:anchor distT="0" distB="0" distL="114300" distR="114300" simplePos="0" relativeHeight="251676672" behindDoc="0" locked="0" layoutInCell="1" allowOverlap="1">
+            <wp:simplePos x="0" y="0"/>
+            <wp:positionH relativeFrom="margin">
+              <wp:posOffset>38100</wp:posOffset>
+            </wp:positionH>
+            <wp:positionV relativeFrom="paragraph">
+              <wp:posOffset>9525</wp:posOffset>
+            </wp:positionV>
+            <wp:extent cx="4914900" cy="3585210"/>
+            <wp:effectExtent l="0" t="0" r="0" b="0"/>
+            <wp:wrapTopAndBottom/>
+            <wp:docPr id="4" name="Picture 4"/>
+            <wp:cNvGraphicFramePr>
+              <a:graphicFrameLocks xmlns:a="http://schemas.openxmlformats.org/drawingml/2006/main" noChangeAspect="1"/>
+            </wp:cNvGraphicFramePr>
+            <a:graphic xmlns:a="http://schemas.openxmlformats.org/drawingml/2006/main">
+              <a:graphicData uri="http://schemas.openxmlformats.org/drawingml/2006/picture">
+                <pic:pic xmlns:pic="http://schemas.openxmlformats.org/drawingml/2006/picture">
+                  <pic:nvPicPr>
+                    <pic:cNvPr id="1" name=""/>
+                    <pic:cNvPicPr/>
+                  </pic:nvPicPr>
+                  <pic:blipFill rotWithShape="1">
+                    <a:blip r:embed="rId14">
+                      <a:extLst>
+                        <a:ext uri="{28A0092B-C50C-407E-A947-70E740481C1C}">
+                          <a14:useLocalDpi xmlns:a14="http://schemas.microsoft.com/office/drawing/2010/main" val="0"/>
+                        </a:ext>
+                      </a:extLst>
+                    </a:blip>
+                    <a:srcRect l="756"/>
+                    <a:stretch/>
+                  </pic:blipFill>
+                  <pic:spPr bwMode="auto">
+                    <a:xfrm>
+                      <a:off x="0" y="0"/>
+                      <a:ext cx="4914900" cy="3585210"/>
+                    </a:xfrm>
+                    <a:prstGeom prst="rect">
+                      <a:avLst/>
+                    </a:prstGeom>
+                    <a:ln>
+                      <a:noFill/>
+                    </a:ln>
+                    <a:extLst>
+                      <a:ext uri="{53640926-AAD7-44D8-BBD7-CCE9431645EC}">
+                        <a14:shadowObscured xmlns:a14="http://schemas.microsoft.com/office/drawing/2010/main"/>
+                      </a:ext>
+                    </a:extLst>
+                  </pic:spPr>
+                </pic:pic>
+              </a:graphicData>
+            </a:graphic>
+            <wp14:sizeRelH relativeFrom="margin">
+              <wp14:pctWidth>0</wp14:pctWidth>
+            </wp14:sizeRelH>
+            <wp14:sizeRelV relativeFrom="margin">
+              <wp14:pctHeight>0</wp14:pctHeight>
+            </wp14:sizeRelV>
+          </wp:anchor>
+        </w:drawing>
+      </w:r>
+      <w:r>
+        <w:rPr>
+          <w:lang w:val="en-US"/>
+        </w:rPr>
+        <w:t xml:space="preserve">.1 </w:t>
+      </w:r>
+      <w:r>
+        <w:rPr>
+          <w:i/>
+          <w:lang w:val="en-US"/>
+        </w:rPr>
+        <w:t>Low Fidelity Prototype</w:t>
+      </w:r>
+      <w:bookmarkEnd w:id="63"/>
+    </w:p>
+    <w:p>
+      <w:pPr>
+        <w:pStyle w:val="Caption"/>
+        <w:rPr>
+          <w:lang w:val="en-US"/>
+        </w:rPr>
+      </w:pPr>
+      <w:bookmarkStart w:id="64" w:name="_Toc225156110"/>
+      <w:r>
+        <w:t xml:space="preserve">Gambar </w:t>
+      </w:r>
+      <w:r>
+        <w:rPr>
+          <w:lang w:val="en-US"/>
+        </w:rPr>
+        <w:t>4.2</w:t>
+      </w:r>
+      <w:bookmarkStart w:id="65" w:name="_GoBack"/>
+      <w:bookmarkEnd w:id="65"/>
+      <w:r>
+        <w:rPr>
+          <w:lang w:val="en-US"/>
+        </w:rPr>
+        <w:t xml:space="preserve"> </w:t>
+      </w:r>
+      <w:r>
+        <w:rPr>
+          <w:i/>
+          <w:lang w:val="en-US"/>
+        </w:rPr>
+        <w:t>High Fidelity Prototype</w:t>
+      </w:r>
+      <w:bookmarkEnd w:id="64"/>
+    </w:p>
+    <w:p>
+      <w:pPr>
+        <w:jc w:val="both"/>
+        <w:rPr>
+          <w:lang w:val="en-US"/>
+        </w:rPr>
+      </w:pPr>
+    </w:p>
+    <w:p>
+      <w:pPr>
+        <w:jc w:val="both"/>
+        <w:rPr>
+          <w:lang w:val="en-US"/>
+        </w:rPr>
+      </w:pPr>
+      <w:r>
+        <w:rPr>
+          <w:lang w:val="en-US"/>
+        </w:rPr>
+        <w:t>Pada tahap implementasi sistem, integrasi antara sensor, API, dan Gemini AI berhasil dilakukan dengan baik. Data sensor seperti frekuensi, tegangan, dan daya dapat dikirim secara real-time ke sistem, kemudian diformat menjadi prompt sesuai dengan skenario yang telah dirancang pada BAB 3.3. Sistem kemudian mengirimkan prompt tersebut ke Gemini AI dan menerima hasil analisis berupa rekomendasi dalam bahasa yang mudah dipahami. Hasil implementasi menunjukkan bahwa sistem mampu memberikan respon dalam waktu yang relatif cepat dan relevan dengan kondisi yang terjadi di lapangan.</w:t>
+      </w:r>
+    </w:p>
+    <w:p>
+      <w:pPr>
+        <w:jc w:val="both"/>
+        <w:rPr>
+          <w:lang w:val="en-US"/>
+        </w:rPr>
+      </w:pPr>
+    </w:p>
+    <w:p>
+      <w:pPr>
+        <w:jc w:val="both"/>
+        <w:rPr>
+          <w:lang w:val="en-US"/>
+        </w:rPr>
+      </w:pPr>
+      <w:r>
+        <w:rPr>
+          <w:lang w:val="en-US"/>
+        </w:rPr>
+        <w:t xml:space="preserve">Pengujian sistem dilakukan melalui dua pendekatan, yaitu pengujian teknis dan pengujian pengguna. Pada pengujian teknis, unit testing dan integration testing menunjukkan bahwa setiap modul berjalan sesuai fungsinya tanpa error yang signifikan. Pada pengujian pengguna, hasil evaluasi menggunakan System Usability Scale (SUS) menunjukkan bahwa sistem memiliki tingkat usability yang baik, dengan pengguna merasa sistem mudah digunakan dan membantu dalam pengambilan keputusan. Selain itu, perbandingan antara rekomendasi sistem </w:t>
+      </w:r>
+      <w:r>
+        <w:rPr>
+          <w:lang w:val="en-US"/>
+        </w:rPr>
+        <w:lastRenderedPageBreak/>
+        <w:t>dengan keputusan petani menunjukkan adanya kesesuaian dalam banyak kasus, meskipun masih terdapat beberapa perbedaan yang menjadi bahan evaluasi.</w:t>
+      </w:r>
+    </w:p>
+    <w:p>
+      <w:pPr>
+        <w:jc w:val="both"/>
+        <w:rPr>
+          <w:lang w:val="en-US"/>
+        </w:rPr>
+      </w:pPr>
+    </w:p>
+    <w:p>
+      <w:pPr>
+        <w:jc w:val="both"/>
+        <w:rPr>
+          <w:lang w:val="en-US"/>
+        </w:rPr>
+      </w:pPr>
+      <w:r>
+        <w:rPr>
+          <w:lang w:val="en-US"/>
+        </w:rPr>
+        <w:t>Tahap revisi dilakukan berdasarkan hasil pengujian, di mana beberapa perbaikan dilakukan seperti peningkatan kejelasan bahasa rekomendasi, optimasi waktu respon sistem, serta penyempurnaan tampilan antarmuka. Setelah dilakukan perbaikan, sistem kemudian berhasil dideploy dan dapat digunakan dalam lingkungan nyata oleh pengguna.</w:t>
+      </w:r>
+    </w:p>
+    <w:p>
+      <w:pPr>
+        <w:jc w:val="both"/>
+        <w:rPr>
+          <w:lang w:val="en-US"/>
+        </w:rPr>
+      </w:pPr>
+    </w:p>
+    <w:p>
+      <w:pPr>
+        <w:jc w:val="both"/>
+        <w:rPr>
+          <w:lang w:val="en-US"/>
+        </w:rPr>
+      </w:pPr>
+      <w:r>
+        <w:rPr>
+          <w:lang w:val="en-US"/>
+        </w:rPr>
+        <w:t>Secara keseluruhan, hasil implementasi menunjukkan bahwa sistem DSS berbasis AI yang dikembangkan mampu membantu pengguna dalam menganalisis kondisi sumber listrik dan sistem pengairan secara lebih cepat dan informatif. Integrasi antara sensor dan AI berjalan dengan baik, serta antarmuka yang dirancang mampu meningkatkan pengalaman pengguna dalam menggunakan sistem.</w:t>
+      </w:r>
+    </w:p>
+    <w:p>
+      <w:pPr>
+        <w:jc w:val="both"/>
+        <w:rPr>
+          <w:lang w:val="en-US"/>
+        </w:rPr>
+      </w:pPr>
+    </w:p>
+    <w:p>
+      <w:pPr>
+        <w:jc w:val="both"/>
+        <w:rPr>
+          <w:lang w:val="en-US"/>
+        </w:rPr>
+      </w:pPr>
+      <w:r>
+        <w:rPr>
+          <w:lang w:val="en-US"/>
+        </w:rPr>
+        <w:t>Sub Kesimpulan dan Saran Pengembangan:</w:t>
+      </w:r>
+    </w:p>
+    <w:p>
+      <w:pPr>
+        <w:jc w:val="both"/>
+        <w:rPr>
+          <w:lang w:val="en-US"/>
+        </w:rPr>
+      </w:pPr>
+      <w:r>
+        <w:rPr>
+          <w:lang w:val="en-US"/>
+        </w:rPr>
+        <w:t>Berdasarkan hasil implementasi yang telah dilakukan, dapat disimpulkan bahwa metode Agile yang dikombinasikan dengan User Centered Design berhasil menghasilkan sistem yang adaptif, mudah digunakan, dan sesuai dengan kebutuhan pengguna. Sistem yang dibangun mampu memberikan rekomendasi yang cukup akurat dan relevan dalam membantu pengambilan keputusan di bidang pertanian. Namun, untuk pengembangan selanjutnya, disarankan agar sistem dapat menggunakan data historis untuk meningkatkan akurasi rekomendasi, menambahkan fitur notifikasi otomatis, serta melakukan integrasi dengan lebih banyak jenis sensor agar sistem menjadi lebih komprehensif dan scalable</w:t>
       </w:r>
       <w:proofErr w:type="gramStart"/>
       <w:r>
         <w:rPr>
           <w:lang w:val="en-US"/>
         </w:rPr>
-        <w:t>akan</w:t>
+        <w:t>.</w:t>
+      </w:r>
+      <w:r>
+        <w:rPr>
+          <w:lang w:val="en-US"/>
+        </w:rPr>
+        <w:t>.</w:t>
       </w:r>
       <w:proofErr w:type="gramEnd"/>
-      <w:r>
-        <w:rPr>
-          <w:lang w:val="en-US"/>
-        </w:rPr>
-        <w:t xml:space="preserve"> dikembangkan pada iterasi awal.</w:t>
-      </w:r>
-    </w:p>
-    <w:p>
-      <w:pPr>
-        <w:jc w:val="both"/>
-        <w:rPr>
-          <w:lang w:val="en-US"/>
-        </w:rPr>
-      </w:pPr>
-    </w:p>
-    <w:p>
-      <w:pPr>
-        <w:jc w:val="both"/>
-        <w:rPr>
-          <w:lang w:val="en-US"/>
-        </w:rPr>
-      </w:pPr>
-      <w:r>
-        <w:rPr>
-          <w:lang w:val="en-US"/>
-        </w:rPr>
-        <w:t>Tahap perancangan menghasilkan prototype antarmuka yang telah melalui beberapa kali perbaikan berdasarkan umpan balik pengguna. Low fidelity prototype yang awalnya sederhana kemudian dikembangkan menjadi high fidelity prototype menggunakan Preact dan PicoCSS. Hasil implementasi desain menunjukkan bahwa antarmuka sistem menjadi lebih intuitif, dengan tampilan yang sederhana dan mudah dipahami oleh petani. Navigasi sistem juga disusun agar pengguna dapat dengan cepat mengakses informasi sensor dan rekomendasi tanpa kebingungan.</w:t>
-      </w:r>
-    </w:p>
-    <w:p>
-      <w:pPr>
-        <w:jc w:val="both"/>
-        <w:rPr>
-          <w:lang w:val="en-US"/>
-        </w:rPr>
-      </w:pPr>
-    </w:p>
-    <w:p>
-      <w:pPr>
-        <w:jc w:val="both"/>
-        <w:rPr>
-          <w:lang w:val="en-US"/>
-        </w:rPr>
-      </w:pPr>
-      <w:r>
-        <w:rPr>
-          <w:lang w:val="en-US"/>
-        </w:rPr>
-        <w:t>Pada tahap implementasi sistem, integrasi antara sensor, API, dan Gemini AI berhasil dilakukan dengan baik. Data sensor seperti frekuensi, tegangan, dan daya dapat dikirim secara real-time ke sistem, kemudian diformat menjadi prompt sesuai dengan skenario yang telah dirancang pada BAB 3.3. Sistem kemudian mengirimkan prompt tersebut ke Gemini AI dan menerima hasil analisis berupa rekomendasi dalam bahasa yang mudah dipahami. Hasil implementasi menunjukkan bahwa sistem mampu memberikan respon dalam waktu yang relatif cepat dan relevan dengan kondisi yang terjadi di lapangan.</w:t>
-      </w:r>
-    </w:p>
-    <w:p>
-      <w:pPr>
-        <w:jc w:val="both"/>
-        <w:rPr>
-          <w:lang w:val="en-US"/>
-        </w:rPr>
-      </w:pPr>
-    </w:p>
-    <w:p>
-      <w:pPr>
-        <w:jc w:val="both"/>
-        <w:rPr>
-          <w:lang w:val="en-US"/>
-        </w:rPr>
-      </w:pPr>
-      <w:r>
-        <w:rPr>
-          <w:lang w:val="en-US"/>
-        </w:rPr>
-        <w:t>Pengujian sistem dilakukan melalui dua pendekatan, yaitu pengujian teknis dan pengujian pengguna. Pada pengujian teknis, unit testing dan integration testing menunjukkan bahwa setiap modul berjalan sesuai fungsinya tanpa error yang signifikan. Pada pengujian pengguna, hasil evaluasi menggunakan System Usability Scale (SUS) menunjukkan bahwa sistem memiliki tingkat usability yang baik, dengan pengguna merasa sistem mudah digunakan dan membantu dalam pengambilan keputusan. Selain itu, perbandingan antara rekomendasi sistem dengan keputusan petani menunjukkan adanya kesesuaian dalam banyak kasus, meskipun masih terdapat beberapa perbedaan yang menjadi bahan evaluasi.</w:t>
-      </w:r>
-    </w:p>
-    <w:p>
-      <w:pPr>
-        <w:jc w:val="both"/>
-        <w:rPr>
-          <w:lang w:val="en-US"/>
-        </w:rPr>
-      </w:pPr>
-    </w:p>
-    <w:p>
-      <w:pPr>
-        <w:jc w:val="both"/>
-        <w:rPr>
-          <w:lang w:val="en-US"/>
-        </w:rPr>
-      </w:pPr>
-      <w:r>
-        <w:rPr>
-          <w:lang w:val="en-US"/>
-        </w:rPr>
-        <w:t>Tahap revisi dilakukan berdasarkan hasil pengujian, di mana beberapa perbaikan dilakukan seperti peningkatan kejelasan bahasa rekomendasi, optimasi waktu respon sistem, serta penyempurnaan tampilan antarmuka. Setelah dilakukan perbaikan, sistem kemudian berhasil dideploy dan dapat digunakan dalam lingkungan nyata oleh pengguna.</w:t>
-      </w:r>
-    </w:p>
-    <w:p>
-      <w:pPr>
-        <w:jc w:val="both"/>
-        <w:rPr>
-          <w:lang w:val="en-US"/>
-        </w:rPr>
-      </w:pPr>
-    </w:p>
-    <w:p>
-      <w:pPr>
-        <w:jc w:val="both"/>
-        <w:rPr>
-          <w:lang w:val="en-US"/>
-        </w:rPr>
-      </w:pPr>
-      <w:r>
-        <w:rPr>
-          <w:lang w:val="en-US"/>
-        </w:rPr>
-        <w:t>Secara keseluruhan, hasil implementasi menunjukkan bahwa sistem DSS berbasis AI yang dikembangkan mampu membantu pengguna dalam menganalisis kondisi sumber listrik dan sistem pengairan secara lebih cepat dan informatif. Integrasi antara sensor dan AI berjalan dengan baik, serta antarmuka yang dirancang mampu meningkatkan pengalaman pengguna dalam menggunakan sistem.</w:t>
-      </w:r>
-    </w:p>
-    <w:p>
-      <w:pPr>
-        <w:jc w:val="both"/>
-        <w:rPr>
-          <w:lang w:val="en-US"/>
-        </w:rPr>
-      </w:pPr>
-    </w:p>
-    <w:p>
-      <w:pPr>
-        <w:jc w:val="both"/>
-        <w:rPr>
-          <w:lang w:val="en-US"/>
-        </w:rPr>
-      </w:pPr>
-      <w:r>
-        <w:rPr>
-          <w:lang w:val="en-US"/>
-        </w:rPr>
-        <w:t>Sub Kesimpulan dan Saran Pengembangan:</w:t>
-      </w:r>
-    </w:p>
-    <w:p>
-      <w:pPr>
-        <w:jc w:val="both"/>
-        <w:rPr>
-          <w:lang w:val="en-US"/>
-        </w:rPr>
-      </w:pPr>
-      <w:r>
-        <w:rPr>
-          <w:lang w:val="en-US"/>
-        </w:rPr>
-        <w:t>Berdasarkan hasil implementasi yang telah dilakukan, dapat disimpulkan bahwa metode Agile yang dikombinasikan dengan User Centered Design berhasil menghasilkan sistem yang adaptif, mudah digunakan, dan sesuai dengan kebutuhan pengguna. Sistem yang dibangun mampu memberikan rekomendasi yang cukup akurat dan relevan dalam membantu pengambilan keputusan di bidang pertanian. Namun, untuk pengembangan selanjutnya, disarankan agar sistem dapat menggunakan data historis untuk meningkatkan akurasi rekomendasi, menambahkan fitur notifikasi otomatis, serta melakukan integrasi dengan lebih banyak jenis sensor agar sistem menjadi lebih komprehensif dan scalable</w:t>
-      </w:r>
-      <w:proofErr w:type="gramStart"/>
-      <w:r>
-        <w:rPr>
-          <w:lang w:val="en-US"/>
-        </w:rPr>
-        <w:t>.</w:t>
-      </w:r>
-      <w:bookmarkStart w:id="63" w:name="_GoBack"/>
-      <w:bookmarkEnd w:id="63"/>
-      <w:r>
-        <w:rPr>
-          <w:lang w:val="en-US"/>
-        </w:rPr>
-        <w:t>.</w:t>
-      </w:r>
-      <w:proofErr w:type="gramEnd"/>
     </w:p>
     <w:p>
       <w:pPr>
@@ -24681,17 +25394,16 @@
           <w:lang w:val="en-US"/>
         </w:rPr>
       </w:pPr>
-      <w:bookmarkStart w:id="64" w:name="_Toc137038249"/>
-      <w:bookmarkStart w:id="65" w:name="_Toc222407826"/>
-      <w:r>
-        <w:rPr>
-          <w:lang w:val="en-US"/>
-        </w:rPr>
-        <w:lastRenderedPageBreak/>
+      <w:bookmarkStart w:id="66" w:name="_Toc137038249"/>
+      <w:bookmarkStart w:id="67" w:name="_Toc222407826"/>
+      <w:r>
+        <w:rPr>
+          <w:lang w:val="en-US"/>
+        </w:rPr>
         <w:t>4.2 Hasil Evaluasi dan Validasi Solusi</w:t>
       </w:r>
-      <w:bookmarkEnd w:id="64"/>
-      <w:bookmarkEnd w:id="65"/>
+      <w:bookmarkEnd w:id="66"/>
+      <w:bookmarkEnd w:id="67"/>
       <w:r>
         <w:rPr>
           <w:lang w:val="en-US"/>
@@ -24783,8 +25495,8 @@
           <w:lang w:val="en-US"/>
         </w:rPr>
       </w:pPr>
-      <w:bookmarkStart w:id="66" w:name="_Toc137038250"/>
-      <w:bookmarkStart w:id="67" w:name="_Toc222407827"/>
+      <w:bookmarkStart w:id="68" w:name="_Toc137038250"/>
+      <w:bookmarkStart w:id="69" w:name="_Toc222407827"/>
       <w:r>
         <w:rPr>
           <w:lang w:val="en-US"/>
@@ -24792,55 +25504,23 @@
         <w:lastRenderedPageBreak/>
         <w:t>BAB 5. KESIMPULAN DAN SARAN</w:t>
       </w:r>
-      <w:bookmarkEnd w:id="66"/>
-      <w:bookmarkEnd w:id="67"/>
-    </w:p>
-    <w:p>
-      <w:pPr>
-        <w:pStyle w:val="Heading2"/>
-        <w:rPr>
-          <w:lang w:val="en-US"/>
-        </w:rPr>
-      </w:pPr>
-      <w:bookmarkStart w:id="68" w:name="_Toc137038251"/>
-      <w:bookmarkStart w:id="69" w:name="_Toc222407828"/>
-      <w:r>
-        <w:rPr>
-          <w:lang w:val="en-US"/>
-        </w:rPr>
-        <w:t>5.1 Kesimpulan</w:t>
-      </w:r>
       <w:bookmarkEnd w:id="68"/>
       <w:bookmarkEnd w:id="69"/>
     </w:p>
     <w:p>
       <w:pPr>
-        <w:jc w:val="both"/>
-        <w:rPr>
-          <w:lang w:val="en-US"/>
-        </w:rPr>
-      </w:pPr>
-      <w:r>
-        <w:rPr>
-          <w:lang w:val="en-US"/>
-        </w:rPr>
-        <w:t>Berisi penggabungan dari sub kesimpulan yang ada di BAB 4 dan diolah menjadi kesimpulan utama yang menjawab pertanyaan di rumusan masalah di BAB 1. Semua ditulis dalam bentuk paragraf. Tidak boleh ada bullet atau numbering.</w:t>
-      </w:r>
-    </w:p>
-    <w:p>
-      <w:pPr>
         <w:pStyle w:val="Heading2"/>
         <w:rPr>
           <w:lang w:val="en-US"/>
         </w:rPr>
       </w:pPr>
-      <w:bookmarkStart w:id="70" w:name="_Toc137038252"/>
-      <w:bookmarkStart w:id="71" w:name="_Toc222407829"/>
-      <w:r>
-        <w:rPr>
-          <w:lang w:val="en-US"/>
-        </w:rPr>
-        <w:t>5.2 Saran</w:t>
+      <w:bookmarkStart w:id="70" w:name="_Toc137038251"/>
+      <w:bookmarkStart w:id="71" w:name="_Toc222407828"/>
+      <w:r>
+        <w:rPr>
+          <w:lang w:val="en-US"/>
+        </w:rPr>
+        <w:t>5.1 Kesimpulan</w:t>
       </w:r>
       <w:bookmarkEnd w:id="70"/>
       <w:bookmarkEnd w:id="71"/>
@@ -24856,6 +25536,38 @@
         <w:rPr>
           <w:lang w:val="en-US"/>
         </w:rPr>
+        <w:t>Berisi penggabungan dari sub kesimpulan yang ada di BAB 4 dan diolah menjadi kesimpulan utama yang menjawab pertanyaan di rumusan masalah di BAB 1. Semua ditulis dalam bentuk paragraf. Tidak boleh ada bullet atau numbering.</w:t>
+      </w:r>
+    </w:p>
+    <w:p>
+      <w:pPr>
+        <w:pStyle w:val="Heading2"/>
+        <w:rPr>
+          <w:lang w:val="en-US"/>
+        </w:rPr>
+      </w:pPr>
+      <w:bookmarkStart w:id="72" w:name="_Toc137038252"/>
+      <w:bookmarkStart w:id="73" w:name="_Toc222407829"/>
+      <w:r>
+        <w:rPr>
+          <w:lang w:val="en-US"/>
+        </w:rPr>
+        <w:t>5.2 Saran</w:t>
+      </w:r>
+      <w:bookmarkEnd w:id="72"/>
+      <w:bookmarkEnd w:id="73"/>
+    </w:p>
+    <w:p>
+      <w:pPr>
+        <w:jc w:val="both"/>
+        <w:rPr>
+          <w:lang w:val="en-US"/>
+        </w:rPr>
+      </w:pPr>
+      <w:r>
+        <w:rPr>
+          <w:lang w:val="en-US"/>
+        </w:rPr>
         <w:t>Berisi penggabungan dari sub saran yang ada di BAB 4 dan diolah menjadi point-point pengembangan yang dapat dieksekusi oleh peneliti selanjutnya dengan tujuan untuk memperbaiki atau mengembangkan solusi yang dibuat di penelitian ini, atau solusi lain yang memiliki potensi lebih baik.</w:t>
       </w:r>
     </w:p>
@@ -24880,12 +25592,12 @@
         <w:pStyle w:val="Heading1"/>
         <w:jc w:val="both"/>
       </w:pPr>
-      <w:bookmarkStart w:id="72" w:name="_Toc222407830"/>
+      <w:bookmarkStart w:id="74" w:name="_Toc222407830"/>
       <w:r>
         <w:lastRenderedPageBreak/>
         <w:t>DAFTAR PUSTAKA</w:t>
       </w:r>
-      <w:bookmarkEnd w:id="72"/>
+      <w:bookmarkEnd w:id="74"/>
     </w:p>
     <w:p>
       <w:pPr>
@@ -25976,7 +26688,7 @@
       </w:pPr>
     </w:p>
     <w:sectPr>
-      <w:footerReference w:type="default" r:id="rId14"/>
+      <w:footerReference w:type="default" r:id="rId15"/>
       <w:pgSz w:w="11906" w:h="16838"/>
       <w:pgMar w:top="1701" w:right="1701" w:bottom="1701" w:left="2268" w:header="709" w:footer="709" w:gutter="0"/>
       <w:cols w:space="708"/>
@@ -26015,13 +26727,12 @@
 <w:ftr xmlns:wpc="http://schemas.microsoft.com/office/word/2010/wordprocessingCanvas" xmlns:mc="http://schemas.openxmlformats.org/markup-compatibility/2006" xmlns:o="urn:schemas-microsoft-com:office:office" xmlns:r="http://schemas.openxmlformats.org/officeDocument/2006/relationships" xmlns:m="http://schemas.openxmlformats.org/officeDocument/2006/math" xmlns:v="urn:schemas-microsoft-com:vml" xmlns:wp14="http://schemas.microsoft.com/office/word/2010/wordprocessingDrawing" xmlns:wp="http://schemas.openxmlformats.org/drawingml/2006/wordprocessingDrawing" xmlns:w10="urn:schemas-microsoft-com:office:word" xmlns:w="http://schemas.openxmlformats.org/wordprocessingml/2006/main" xmlns:w14="http://schemas.microsoft.com/office/word/2010/wordml" xmlns:w15="http://schemas.microsoft.com/office/word/2012/wordml" xmlns:wpg="http://schemas.microsoft.com/office/word/2010/wordprocessingGroup" xmlns:wpi="http://schemas.microsoft.com/office/word/2010/wordprocessingInk" xmlns:wne="http://schemas.microsoft.com/office/word/2006/wordml" xmlns:wps="http://schemas.microsoft.com/office/word/2010/wordprocessingShape" mc:Ignorable="w14 w15 wp14">
   <w:sdt>
     <w:sdtPr>
-      <w:id w:val="-2051291349"/>
+      <w:id w:val="-1811627183"/>
       <w:docPartObj>
         <w:docPartGallery w:val="Page Numbers (Bottom of Page)"/>
         <w:docPartUnique/>
       </w:docPartObj>
     </w:sdtPr>
-    <w:sdtEndPr/>
     <w:sdtContent>
       <w:p>
         <w:pPr>
@@ -26050,7 +26761,7 @@
           <w:rPr>
             <w:noProof/>
           </w:rPr>
-          <w:t>x</w:t>
+          <w:t>vii</w:t>
         </w:r>
         <w:r>
           <w:rPr>
@@ -26073,13 +26784,12 @@
 <w:ftr xmlns:wpc="http://schemas.microsoft.com/office/word/2010/wordprocessingCanvas" xmlns:mc="http://schemas.openxmlformats.org/markup-compatibility/2006" xmlns:o="urn:schemas-microsoft-com:office:office" xmlns:r="http://schemas.openxmlformats.org/officeDocument/2006/relationships" xmlns:m="http://schemas.openxmlformats.org/officeDocument/2006/math" xmlns:v="urn:schemas-microsoft-com:vml" xmlns:wp14="http://schemas.microsoft.com/office/word/2010/wordprocessingDrawing" xmlns:wp="http://schemas.openxmlformats.org/drawingml/2006/wordprocessingDrawing" xmlns:w10="urn:schemas-microsoft-com:office:word" xmlns:w="http://schemas.openxmlformats.org/wordprocessingml/2006/main" xmlns:w14="http://schemas.microsoft.com/office/word/2010/wordml" xmlns:w15="http://schemas.microsoft.com/office/word/2012/wordml" xmlns:wpg="http://schemas.microsoft.com/office/word/2010/wordprocessingGroup" xmlns:wpi="http://schemas.microsoft.com/office/word/2010/wordprocessingInk" xmlns:wne="http://schemas.microsoft.com/office/word/2006/wordml" xmlns:wps="http://schemas.microsoft.com/office/word/2010/wordprocessingShape" mc:Ignorable="w14 w15 wp14">
   <w:sdt>
     <w:sdtPr>
-      <w:id w:val="-1036583456"/>
+      <w:id w:val="1802503997"/>
       <w:docPartObj>
         <w:docPartGallery w:val="Page Numbers (Bottom of Page)"/>
         <w:docPartUnique/>
       </w:docPartObj>
     </w:sdtPr>
-    <w:sdtEndPr/>
     <w:sdtContent>
       <w:p>
         <w:pPr>
@@ -26137,7 +26847,6 @@
         <w:docPartUnique/>
       </w:docPartObj>
     </w:sdtPr>
-    <w:sdtEndPr/>
     <w:sdtContent>
       <w:p>
         <w:pPr>
@@ -26166,7 +26875,7 @@
           <w:rPr>
             <w:noProof/>
           </w:rPr>
-          <w:t>25</w:t>
+          <w:t>30</w:t>
         </w:r>
         <w:r>
           <w:rPr>
@@ -27330,7 +28039,7 @@
     <w:autoRedefine/>
     <w:uiPriority w:val="9"/>
     <w:qFormat/>
-    <w:rsid w:val="002228F6"/>
+    <w:rsid w:val="000A2D0E"/>
     <w:pPr>
       <w:keepNext/>
       <w:keepLines/>
@@ -27450,7 +28159,7 @@
     <w:basedOn w:val="DefaultParagraphFont"/>
     <w:link w:val="Heading1"/>
     <w:uiPriority w:val="9"/>
-    <w:rsid w:val="002228F6"/>
+    <w:rsid w:val="000A2D0E"/>
     <w:rPr>
       <w:rFonts w:ascii="Arial" w:eastAsiaTheme="majorEastAsia" w:hAnsi="Arial" w:cstheme="majorBidi"/>
       <w:b/>
@@ -28118,7 +28827,7 @@
 </file>
 
 <file path=customXml/itemProps1.xml><?xml version="1.0" encoding="utf-8"?>
-<ds:datastoreItem xmlns:ds="http://schemas.openxmlformats.org/officeDocument/2006/customXml" ds:itemID="{ED3F0EE1-4E27-4266-81AF-028B8EAA5189}">
+<ds:datastoreItem xmlns:ds="http://schemas.openxmlformats.org/officeDocument/2006/customXml" ds:itemID="{D3AE6FD7-08AB-4921-BADC-5DEDFD5FF6AF}">
   <ds:schemaRefs>
     <ds:schemaRef ds:uri="http://schemas.openxmlformats.org/officeDocument/2006/bibliography"/>
   </ds:schemaRefs>

</xml_diff>

<commit_message>
Revise survey questions and enhance implementation sections for clarity and detail
</commit_message>
<xml_diff>
--- a/NASKAH/Dokumen Laporan Skripsi - 42330018 - I Nyoman Wahyu Permana - 2023 - 2026.docx
+++ b/NASKAH/Dokumen Laporan Skripsi - 42330018 - I Nyoman Wahyu Permana - 2023 - 2026.docx
@@ -23397,7 +23397,17 @@
                 <w:szCs w:val="16"/>
                 <w:lang w:val="en-US"/>
               </w:rPr>
-              <w:t>Saya berpikir akan menggunakan sistem ini lagi</w:t>
+              <w:t>Saya aka</w:t>
+            </w:r>
+            <w:r>
+              <w:rPr>
+                <w:rFonts w:eastAsia="Times New Roman" w:cs="Arial"/>
+                <w:color w:val="000000"/>
+                <w:sz w:val="16"/>
+                <w:szCs w:val="16"/>
+                <w:lang w:val="en-US"/>
+              </w:rPr>
+              <w:t>n sering menggunakan sistem ini</w:t>
             </w:r>
           </w:p>
         </w:tc>
@@ -23467,7 +23477,27 @@
                 <w:szCs w:val="16"/>
                 <w:lang w:val="en-US"/>
               </w:rPr>
-              <w:t>Saya merasa sistem ini rumit untuk digunakan</w:t>
+              <w:t xml:space="preserve">Saya menilai sistem </w:t>
+            </w:r>
+            <w:r>
+              <w:rPr>
+                <w:rFonts w:eastAsia="Times New Roman" w:cs="Arial"/>
+                <w:color w:val="000000"/>
+                <w:sz w:val="16"/>
+                <w:szCs w:val="16"/>
+                <w:lang w:val="en-US"/>
+              </w:rPr>
+              <w:t xml:space="preserve">ini </w:t>
+            </w:r>
+            <w:r>
+              <w:rPr>
+                <w:rFonts w:eastAsia="Times New Roman" w:cs="Arial"/>
+                <w:color w:val="000000"/>
+                <w:sz w:val="16"/>
+                <w:szCs w:val="16"/>
+                <w:lang w:val="en-US"/>
+              </w:rPr>
+              <w:t>terlalu kompleks</w:t>
             </w:r>
           </w:p>
         </w:tc>
@@ -23963,21 +23993,32 @@
               <w:spacing w:line="240" w:lineRule="auto"/>
               <w:ind w:firstLine="0"/>
               <w:rPr>
-                <w:rFonts w:ascii="Times New Roman" w:eastAsia="Times New Roman" w:hAnsi="Times New Roman" w:cs="Times New Roman"/>
-                <w:sz w:val="24"/>
-                <w:szCs w:val="24"/>
-                <w:lang w:val="en-US"/>
-              </w:rPr>
-            </w:pPr>
-            <w:r>
-              <w:rPr>
                 <w:rFonts w:eastAsia="Times New Roman" w:cs="Arial"/>
                 <w:color w:val="000000"/>
                 <w:sz w:val="16"/>
                 <w:szCs w:val="16"/>
                 <w:lang w:val="en-US"/>
               </w:rPr>
-              <w:t>Saya merasa tidak ada hambatan dalam menggunakan sistem ini</w:t>
+            </w:pPr>
+            <w:r>
+              <w:rPr>
+                <w:rFonts w:eastAsia="Times New Roman" w:cs="Arial"/>
+                <w:color w:val="000000"/>
+                <w:sz w:val="16"/>
+                <w:szCs w:val="16"/>
+                <w:lang w:val="en-US"/>
+              </w:rPr>
+              <w:t>Saya sangat</w:t>
+            </w:r>
+            <w:r>
+              <w:rPr>
+                <w:rFonts w:eastAsia="Times New Roman" w:cs="Arial"/>
+                <w:color w:val="000000"/>
+                <w:sz w:val="16"/>
+                <w:szCs w:val="16"/>
+                <w:lang w:val="en-US"/>
+              </w:rPr>
+              <w:t xml:space="preserve"> percaya diri dalam menggunakan sistem ini</w:t>
             </w:r>
           </w:p>
         </w:tc>
@@ -24039,21 +24080,52 @@
               <w:spacing w:line="240" w:lineRule="auto"/>
               <w:ind w:firstLine="0"/>
               <w:rPr>
-                <w:rFonts w:ascii="Times New Roman" w:eastAsia="Times New Roman" w:hAnsi="Times New Roman" w:cs="Times New Roman"/>
-                <w:sz w:val="24"/>
-                <w:szCs w:val="24"/>
-                <w:lang w:val="en-US"/>
-              </w:rPr>
-            </w:pPr>
-            <w:r>
-              <w:rPr>
                 <w:rFonts w:eastAsia="Times New Roman" w:cs="Arial"/>
                 <w:color w:val="000000"/>
                 <w:sz w:val="16"/>
                 <w:szCs w:val="16"/>
                 <w:lang w:val="en-US"/>
               </w:rPr>
-              <w:t>Saya perlu membiasakan diri terlebih dahulu sebelum menggunakan sistem ini</w:t>
+            </w:pPr>
+            <w:r>
+              <w:rPr>
+                <w:rFonts w:eastAsia="Times New Roman" w:cs="Arial"/>
+                <w:color w:val="000000"/>
+                <w:sz w:val="16"/>
+                <w:szCs w:val="16"/>
+                <w:lang w:val="en-US"/>
+              </w:rPr>
+              <w:t>Saya perlu belaja</w:t>
+            </w:r>
+            <w:r>
+              <w:rPr>
+                <w:rFonts w:eastAsia="Times New Roman" w:cs="Arial"/>
+                <w:color w:val="000000"/>
+                <w:sz w:val="16"/>
+                <w:szCs w:val="16"/>
+                <w:lang w:val="en-US"/>
+              </w:rPr>
+              <w:t xml:space="preserve">r banyak hal sebelum saya dapat </w:t>
+            </w:r>
+            <w:r>
+              <w:rPr>
+                <w:rFonts w:eastAsia="Times New Roman" w:cs="Arial"/>
+                <w:color w:val="000000"/>
+                <w:sz w:val="16"/>
+                <w:szCs w:val="16"/>
+                <w:lang w:val="en-US"/>
+              </w:rPr>
+              <w:t>men</w:t>
+            </w:r>
+            <w:r>
+              <w:rPr>
+                <w:rFonts w:eastAsia="Times New Roman" w:cs="Arial"/>
+                <w:color w:val="000000"/>
+                <w:sz w:val="16"/>
+                <w:szCs w:val="16"/>
+                <w:lang w:val="en-US"/>
+              </w:rPr>
+              <w:t>ggunakan sistem ini dengan baik</w:t>
             </w:r>
           </w:p>
         </w:tc>
@@ -25042,7 +25114,14 @@
         <w:rPr>
           <w:lang w:val="en-US"/>
         </w:rPr>
-        <w:t xml:space="preserve">Pada Gambar 4.1 menunjukkan desain antarmuka </w:t>
+        <w:t xml:space="preserve">Pada Gambar 4.1 </w:t>
+      </w:r>
+      <w:bookmarkStart w:id="63" w:name="_GoBack"/>
+      <w:r>
+        <w:rPr>
+          <w:lang w:val="en-US"/>
+        </w:rPr>
+        <w:t xml:space="preserve">menunjukkan desain antarmuka </w:t>
       </w:r>
       <w:r>
         <w:rPr>
@@ -25055,7 +25134,14 @@
         <w:rPr>
           <w:lang w:val="en-US"/>
         </w:rPr>
-        <w:t xml:space="preserve"> yang awalnya sederhana kemudian dikembangkan menjadi </w:t>
+        <w:t xml:space="preserve"> yang awalnya sederhana kemudian dikembangkan </w:t>
+      </w:r>
+      <w:bookmarkEnd w:id="63"/>
+      <w:r>
+        <w:rPr>
+          <w:lang w:val="en-US"/>
+        </w:rPr>
+        <w:t xml:space="preserve">menjadi </w:t>
       </w:r>
       <w:r>
         <w:rPr>
@@ -25074,7 +25160,19 @@
         <w:rPr>
           <w:lang w:val="en-US"/>
         </w:rPr>
-        <w:t xml:space="preserve"> yang ditunjukkan pada gambar 4.2</w:t>
+        <w:t xml:space="preserve"> yang ditunjukkan pada </w:t>
+      </w:r>
+      <w:r>
+        <w:rPr>
+          <w:lang w:val="en-US"/>
+        </w:rPr>
+        <w:t>G</w:t>
+      </w:r>
+      <w:r>
+        <w:rPr>
+          <w:lang w:val="en-US"/>
+        </w:rPr>
+        <w:t>ambar 4.2</w:t>
       </w:r>
       <w:r>
         <w:rPr>
@@ -25103,9 +25201,63 @@
           <w:lang w:val="en-US"/>
         </w:rPr>
       </w:pPr>
-      <w:bookmarkStart w:id="63" w:name="_Toc225156109"/>
-      <w:r>
+      <w:bookmarkStart w:id="64" w:name="_Toc225156109"/>
+      <w:r>
+        <w:rPr>
+          <w:lang w:val="en-US"/>
+        </w:rPr>
         <w:lastRenderedPageBreak/>
+        <w:drawing>
+          <wp:anchor distT="0" distB="0" distL="114300" distR="114300" simplePos="0" relativeHeight="251677696" behindDoc="0" locked="0" layoutInCell="1" allowOverlap="1">
+            <wp:simplePos x="0" y="0"/>
+            <wp:positionH relativeFrom="margin">
+              <wp:align>left</wp:align>
+            </wp:positionH>
+            <wp:positionV relativeFrom="paragraph">
+              <wp:posOffset>4025265</wp:posOffset>
+            </wp:positionV>
+            <wp:extent cx="5039995" cy="2428240"/>
+            <wp:effectExtent l="0" t="0" r="8255" b="0"/>
+            <wp:wrapTopAndBottom/>
+            <wp:docPr id="6" name="Picture 6"/>
+            <wp:cNvGraphicFramePr>
+              <a:graphicFrameLocks xmlns:a="http://schemas.openxmlformats.org/drawingml/2006/main" noChangeAspect="1"/>
+            </wp:cNvGraphicFramePr>
+            <a:graphic xmlns:a="http://schemas.openxmlformats.org/drawingml/2006/main">
+              <a:graphicData uri="http://schemas.openxmlformats.org/drawingml/2006/picture">
+                <pic:pic xmlns:pic="http://schemas.openxmlformats.org/drawingml/2006/picture">
+                  <pic:nvPicPr>
+                    <pic:cNvPr id="1" name=""/>
+                    <pic:cNvPicPr/>
+                  </pic:nvPicPr>
+                  <pic:blipFill>
+                    <a:blip r:embed="rId14" cstate="print">
+                      <a:extLst>
+                        <a:ext uri="{28A0092B-C50C-407E-A947-70E740481C1C}">
+                          <a14:useLocalDpi xmlns:a14="http://schemas.microsoft.com/office/drawing/2010/main" val="0"/>
+                        </a:ext>
+                      </a:extLst>
+                    </a:blip>
+                    <a:stretch>
+                      <a:fillRect/>
+                    </a:stretch>
+                  </pic:blipFill>
+                  <pic:spPr>
+                    <a:xfrm>
+                      <a:off x="0" y="0"/>
+                      <a:ext cx="5039995" cy="2428240"/>
+                    </a:xfrm>
+                    <a:prstGeom prst="rect">
+                      <a:avLst/>
+                    </a:prstGeom>
+                  </pic:spPr>
+                </pic:pic>
+              </a:graphicData>
+            </a:graphic>
+          </wp:anchor>
+        </w:drawing>
+      </w:r>
+      <w:r>
         <w:t xml:space="preserve">Gambar </w:t>
       </w:r>
       <w:r>
@@ -25154,7 +25306,7 @@
                     <pic:cNvPicPr/>
                   </pic:nvPicPr>
                   <pic:blipFill rotWithShape="1">
-                    <a:blip r:embed="rId14">
+                    <a:blip r:embed="rId15">
                       <a:extLst>
                         <a:ext uri="{28A0092B-C50C-407E-A947-70E740481C1C}">
                           <a14:useLocalDpi xmlns:a14="http://schemas.microsoft.com/office/drawing/2010/main" val="0"/>
@@ -25206,16 +25358,17 @@
         </w:rPr>
         <w:t>Low Fidelity Prototype</w:t>
       </w:r>
-      <w:bookmarkEnd w:id="63"/>
+      <w:bookmarkEnd w:id="64"/>
     </w:p>
     <w:p>
       <w:pPr>
         <w:pStyle w:val="Caption"/>
         <w:rPr>
-          <w:lang w:val="en-US"/>
-        </w:rPr>
-      </w:pPr>
-      <w:bookmarkStart w:id="64" w:name="_Toc225156110"/>
+          <w:i/>
+          <w:lang w:val="en-US"/>
+        </w:rPr>
+      </w:pPr>
+      <w:bookmarkStart w:id="65" w:name="_Toc225156110"/>
       <w:r>
         <w:t xml:space="preserve">Gambar </w:t>
       </w:r>
@@ -25223,35 +25376,169 @@
         <w:rPr>
           <w:lang w:val="en-US"/>
         </w:rPr>
-        <w:t>4.2</w:t>
-      </w:r>
-      <w:bookmarkStart w:id="65" w:name="_GoBack"/>
+        <w:t xml:space="preserve">4.2 </w:t>
+      </w:r>
+      <w:r>
+        <w:rPr>
+          <w:i/>
+          <w:lang w:val="en-US"/>
+        </w:rPr>
+        <w:t>High Fidelity Prototype</w:t>
+      </w:r>
       <w:bookmarkEnd w:id="65"/>
       <w:r>
         <w:rPr>
-          <w:lang w:val="en-US"/>
-        </w:rPr>
-        <w:t xml:space="preserve"> </w:t>
-      </w:r>
-      <w:r>
-        <w:rPr>
-          <w:i/>
-          <w:lang w:val="en-US"/>
-        </w:rPr>
-        <w:t>High Fidelity Prototype</w:t>
-      </w:r>
-      <w:bookmarkEnd w:id="64"/>
-    </w:p>
-    <w:p>
-      <w:pPr>
+          <w:i/>
+          <w:lang w:val="en-US"/>
+        </w:rPr>
+        <w:br/>
+      </w:r>
+    </w:p>
+    <w:p>
+      <w:pPr>
+        <w:pStyle w:val="Heading3"/>
+        <w:ind w:firstLine="709"/>
+        <w:rPr>
+          <w:lang w:val="en-US"/>
+        </w:rPr>
+      </w:pPr>
+      <w:r>
+        <w:rPr>
+          <w:lang w:val="en-US"/>
+        </w:rPr>
+        <w:t>4.1.3 Implementasi Tahap Sistem</w:t>
+      </w:r>
+    </w:p>
+    <w:p>
+      <w:pPr>
+        <w:ind w:left="709" w:firstLine="720"/>
         <w:jc w:val="both"/>
         <w:rPr>
           <w:lang w:val="en-US"/>
         </w:rPr>
       </w:pPr>
-    </w:p>
-    <w:p>
-      <w:pPr>
+      <w:r>
+        <w:rPr>
+          <w:lang w:val="en-US"/>
+        </w:rPr>
+        <w:t xml:space="preserve">Pada tahap implementasi sistem, integrasi antara sensor, </w:t>
+      </w:r>
+      <w:r>
+        <w:rPr>
+          <w:i/>
+          <w:lang w:val="en-US"/>
+        </w:rPr>
+        <w:t>API</w:t>
+      </w:r>
+      <w:r>
+        <w:rPr>
+          <w:lang w:val="en-US"/>
+        </w:rPr>
+        <w:t xml:space="preserve">, dan </w:t>
+      </w:r>
+      <w:r>
+        <w:rPr>
+          <w:i/>
+          <w:lang w:val="en-US"/>
+        </w:rPr>
+        <w:t>Gemini AI</w:t>
+      </w:r>
+      <w:r>
+        <w:rPr>
+          <w:lang w:val="en-US"/>
+        </w:rPr>
+        <w:t xml:space="preserve"> berhasil dilakukan dengan baik. Data sensor seperti frekuensi, tegangan, dan</w:t>
+      </w:r>
+      <w:r>
+        <w:rPr>
+          <w:lang w:val="en-US"/>
+        </w:rPr>
+        <w:t xml:space="preserve"> daya dapat dikirim secara </w:t>
+      </w:r>
+      <w:r>
+        <w:rPr>
+          <w:i/>
+          <w:lang w:val="en-US"/>
+        </w:rPr>
+        <w:t xml:space="preserve">real </w:t>
+      </w:r>
+      <w:r>
+        <w:rPr>
+          <w:i/>
+          <w:lang w:val="en-US"/>
+        </w:rPr>
+        <w:t>time</w:t>
+      </w:r>
+      <w:r>
+        <w:rPr>
+          <w:lang w:val="en-US"/>
+        </w:rPr>
+        <w:t xml:space="preserve"> ke sistem, kemudian diformat menjadi prompt sesuai dengan skenario yang telah dirancang </w:t>
+      </w:r>
+      <w:r>
+        <w:rPr>
+          <w:lang w:val="en-US"/>
+        </w:rPr>
+        <w:t>sebelumnya</w:t>
+      </w:r>
+      <w:r>
+        <w:rPr>
+          <w:lang w:val="en-US"/>
+        </w:rPr>
+        <w:t xml:space="preserve">. Sistem kemudian mengirimkan </w:t>
+      </w:r>
+      <w:r>
+        <w:rPr>
+          <w:i/>
+          <w:lang w:val="en-US"/>
+        </w:rPr>
+        <w:t>prompt</w:t>
+      </w:r>
+      <w:r>
+        <w:rPr>
+          <w:lang w:val="en-US"/>
+        </w:rPr>
+        <w:t xml:space="preserve"> tersebut ke </w:t>
+      </w:r>
+      <w:r>
+        <w:rPr>
+          <w:i/>
+          <w:lang w:val="en-US"/>
+        </w:rPr>
+        <w:t>Gemini AI</w:t>
+      </w:r>
+      <w:r>
+        <w:rPr>
+          <w:lang w:val="en-US"/>
+        </w:rPr>
+        <w:t xml:space="preserve"> dan menerima hasil analisis berupa rekomendasi dalam bahasa yang </w:t>
+      </w:r>
+      <w:r>
+        <w:rPr>
+          <w:lang w:val="en-US"/>
+        </w:rPr>
+        <w:lastRenderedPageBreak/>
+        <w:t>mudah dipahami. Hasil implementasi menunjukkan bahwa sistem mampu memberikan respon dalam waktu yang relatif cepat dan relevan dengan kondisi yang terjadi di lapangan.</w:t>
+      </w:r>
+    </w:p>
+    <w:p>
+      <w:pPr>
+        <w:pStyle w:val="Heading3"/>
+        <w:ind w:firstLine="709"/>
+        <w:rPr>
+          <w:lang w:val="en-US"/>
+        </w:rPr>
+      </w:pPr>
+      <w:r>
+        <w:rPr>
+          <w:lang w:val="en-US"/>
+        </w:rPr>
+        <w:t>4.1.4 Implementasi Tahap Pengujian dan Evaluasi</w:t>
+      </w:r>
+    </w:p>
+    <w:p>
+      <w:pPr>
+        <w:ind w:left="709" w:firstLine="720"/>
         <w:jc w:val="both"/>
         <w:rPr>
           <w:lang w:val="en-US"/>
@@ -25261,36 +25548,191 @@
         <w:rPr>
           <w:lang w:val="en-US"/>
         </w:rPr>
-        <w:t>Pada tahap implementasi sistem, integrasi antara sensor, API, dan Gemini AI berhasil dilakukan dengan baik. Data sensor seperti frekuensi, tegangan, dan daya dapat dikirim secara real-time ke sistem, kemudian diformat menjadi prompt sesuai dengan skenario yang telah dirancang pada BAB 3.3. Sistem kemudian mengirimkan prompt tersebut ke Gemini AI dan menerima hasil analisis berupa rekomendasi dalam bahasa yang mudah dipahami. Hasil implementasi menunjukkan bahwa sistem mampu memberikan respon dalam waktu yang relatif cepat dan relevan dengan kondisi yang terjadi di lapangan.</w:t>
-      </w:r>
-    </w:p>
-    <w:p>
-      <w:pPr>
+        <w:t>Sistem diuji menggunakan kondisi lapangan, salah satunya menggunakan sampel data anomali kelistrikan (teganga</w:t>
+      </w:r>
+      <w:r>
+        <w:rPr>
+          <w:lang w:val="en-US"/>
+        </w:rPr>
+        <w:t>n 280 Volt dan lonjakan beban 42</w:t>
+      </w:r>
+      <w:r>
+        <w:rPr>
+          <w:lang w:val="en-US"/>
+        </w:rPr>
+        <w:t xml:space="preserve">0 Watt pada spesifikasi pompa 300 Watt). </w:t>
+      </w:r>
+      <w:r>
+        <w:rPr>
+          <w:i/>
+          <w:lang w:val="en-US"/>
+        </w:rPr>
+        <w:t>Gemini AI</w:t>
+      </w:r>
+      <w:r>
+        <w:rPr>
+          <w:lang w:val="en-US"/>
+        </w:rPr>
+        <w:t xml:space="preserve"> memproses </w:t>
+      </w:r>
+      <w:r>
+        <w:rPr>
+          <w:lang w:val="en-US"/>
+        </w:rPr>
+        <w:t>data</w:t>
+      </w:r>
+      <w:r>
+        <w:rPr>
+          <w:lang w:val="en-US"/>
+        </w:rPr>
+        <w:t xml:space="preserve"> tersebut dan memberikan diagnosis yang akurat</w:t>
+      </w:r>
+      <w:r>
+        <w:rPr>
+          <w:i/>
+          <w:lang w:val="en-US"/>
+        </w:rPr>
+        <w:t>. AI</w:t>
+      </w:r>
+      <w:r>
+        <w:rPr>
+          <w:lang w:val="en-US"/>
+        </w:rPr>
+        <w:t xml:space="preserve"> merespons dengan bahasa sehari </w:t>
+      </w:r>
+      <w:r>
+        <w:rPr>
+          <w:lang w:val="en-US"/>
+        </w:rPr>
+        <w:t xml:space="preserve">hari yang mudah dipahami, </w:t>
+      </w:r>
+      <w:r>
+        <w:rPr>
+          <w:lang w:val="en-US"/>
+        </w:rPr>
+        <w:t>yaitu</w:t>
+      </w:r>
+      <w:r>
+        <w:rPr>
+          <w:lang w:val="en-US"/>
+        </w:rPr>
+        <w:t xml:space="preserve"> merekomendasikan pengguna untuk segera mematikan instalasi pompa air karena terd</w:t>
+      </w:r>
+      <w:r>
+        <w:rPr>
+          <w:lang w:val="en-US"/>
+        </w:rPr>
+        <w:t>eteksi adanya tegangan berlebih</w:t>
+      </w:r>
+      <w:r>
+        <w:rPr>
+          <w:lang w:val="en-US"/>
+        </w:rPr>
+        <w:t xml:space="preserve"> yang berisiko merusak alat. Pengujian tahap kedua menggunakan </w:t>
+      </w:r>
+      <w:r>
+        <w:rPr>
+          <w:i/>
+          <w:lang w:val="en-US"/>
+        </w:rPr>
+        <w:t>System Usability Scale</w:t>
+      </w:r>
+      <w:r>
+        <w:rPr>
+          <w:lang w:val="en-US"/>
+        </w:rPr>
+        <w:t xml:space="preserve"> (SUS) juga menunjukkan bahwa antarmuka dan alur sistem dapat diterima dengan baik oleh </w:t>
+      </w:r>
+      <w:r>
+        <w:rPr>
+          <w:lang w:val="en-US"/>
+        </w:rPr>
+        <w:t>pengguna</w:t>
+      </w:r>
+      <w:r>
+        <w:rPr>
+          <w:lang w:val="en-US"/>
+        </w:rPr>
+        <w:t>, mencerminkan tingkat kepuasan dan k</w:t>
+      </w:r>
+      <w:r>
+        <w:rPr>
+          <w:lang w:val="en-US"/>
+        </w:rPr>
+        <w:t>emudahan penggunaan yang tinggi</w:t>
+      </w:r>
+      <w:r>
+        <w:rPr>
+          <w:lang w:val="en-US"/>
+        </w:rPr>
+        <w:t>.</w:t>
+      </w:r>
+    </w:p>
+    <w:p>
+      <w:pPr>
+        <w:pStyle w:val="Heading3"/>
+        <w:ind w:firstLine="709"/>
+        <w:rPr>
+          <w:lang w:val="en-US"/>
+        </w:rPr>
+      </w:pPr>
+      <w:r>
+        <w:rPr>
+          <w:lang w:val="en-US"/>
+        </w:rPr>
+        <w:t xml:space="preserve">4.1.5 Implementasi Tahap Revisi dan </w:t>
+      </w:r>
+      <w:r>
+        <w:rPr>
+          <w:i/>
+          <w:lang w:val="en-US"/>
+        </w:rPr>
+        <w:t>Deploy</w:t>
+      </w:r>
+    </w:p>
+    <w:p>
+      <w:pPr>
+        <w:ind w:left="709" w:firstLine="720"/>
         <w:jc w:val="both"/>
         <w:rPr>
           <w:lang w:val="en-US"/>
         </w:rPr>
       </w:pPr>
-    </w:p>
-    <w:p>
-      <w:pPr>
+      <w:r>
+        <w:rPr>
+          <w:lang w:val="en-US"/>
+        </w:rPr>
+        <w:t xml:space="preserve">Tahap revisi dilakukan berdasarkan hasil pengujian, di mana beberapa perbaikan dilakukan seperti peningkatan kejelasan bahasa rekomendasi, optimasi waktu respon sistem, serta penyempurnaan tampilan antarmuka. Setelah dilakukan perbaikan, sistem kemudian berhasil </w:t>
+      </w:r>
+      <w:r>
+        <w:rPr>
+          <w:i/>
+          <w:lang w:val="en-US"/>
+        </w:rPr>
+        <w:t>dideploy</w:t>
+      </w:r>
+      <w:r>
+        <w:rPr>
+          <w:lang w:val="en-US"/>
+        </w:rPr>
+        <w:t xml:space="preserve"> dan dapat digunakan dalam lingkungan nyata oleh pengguna.</w:t>
+      </w:r>
+    </w:p>
+    <w:p>
+      <w:pPr>
+        <w:ind w:left="709" w:firstLine="720"/>
         <w:jc w:val="both"/>
         <w:rPr>
-          <w:lang w:val="en-US"/>
-        </w:rPr>
-      </w:pPr>
-      <w:r>
-        <w:rPr>
-          <w:lang w:val="en-US"/>
-        </w:rPr>
-        <w:t xml:space="preserve">Pengujian sistem dilakukan melalui dua pendekatan, yaitu pengujian teknis dan pengujian pengguna. Pada pengujian teknis, unit testing dan integration testing menunjukkan bahwa setiap modul berjalan sesuai fungsinya tanpa error yang signifikan. Pada pengujian pengguna, hasil evaluasi menggunakan System Usability Scale (SUS) menunjukkan bahwa sistem memiliki tingkat usability yang baik, dengan pengguna merasa sistem mudah digunakan dan membantu dalam pengambilan keputusan. Selain itu, perbandingan antara rekomendasi sistem </w:t>
-      </w:r>
-      <w:r>
-        <w:rPr>
-          <w:lang w:val="en-US"/>
-        </w:rPr>
-        <w:lastRenderedPageBreak/>
-        <w:t>dengan keputusan petani menunjukkan adanya kesesuaian dalam banyak kasus, meskipun masih terdapat beberapa perbedaan yang menjadi bahan evaluasi.</w:t>
+          <w:color w:val="FF0000"/>
+          <w:lang w:val="en-US"/>
+        </w:rPr>
+      </w:pPr>
+      <w:r>
+        <w:rPr>
+          <w:color w:val="FF0000"/>
+          <w:lang w:val="en-US"/>
+        </w:rPr>
+        <w:t>*Tambah bukti deploy vercel</w:t>
       </w:r>
     </w:p>
     <w:p>
@@ -25303,6 +25745,7 @@
     </w:p>
     <w:p>
       <w:pPr>
+        <w:ind w:firstLine="0"/>
         <w:jc w:val="both"/>
         <w:rPr>
           <w:lang w:val="en-US"/>
@@ -25312,85 +25755,53 @@
         <w:rPr>
           <w:lang w:val="en-US"/>
         </w:rPr>
-        <w:t>Tahap revisi dilakukan berdasarkan hasil pengujian, di mana beberapa perbaikan dilakukan seperti peningkatan kejelasan bahasa rekomendasi, optimasi waktu respon sistem, serta penyempurnaan tampilan antarmuka. Setelah dilakukan perbaikan, sistem kemudian berhasil dideploy dan dapat digunakan dalam lingkungan nyata oleh pengguna.</w:t>
-      </w:r>
-    </w:p>
-    <w:p>
-      <w:pPr>
-        <w:jc w:val="both"/>
-        <w:rPr>
-          <w:lang w:val="en-US"/>
-        </w:rPr>
-      </w:pPr>
-    </w:p>
-    <w:p>
-      <w:pPr>
-        <w:jc w:val="both"/>
-        <w:rPr>
-          <w:lang w:val="en-US"/>
-        </w:rPr>
-      </w:pPr>
-      <w:r>
-        <w:rPr>
-          <w:lang w:val="en-US"/>
-        </w:rPr>
-        <w:t>Secara keseluruhan, hasil implementasi menunjukkan bahwa sistem DSS berbasis AI yang dikembangkan mampu membantu pengguna dalam menganalisis kondisi sumber listrik dan sistem pengairan secara lebih cepat dan informatif. Integrasi antara sensor dan AI berjalan dengan baik, serta antarmuka yang dirancang mampu meningkatkan pengalaman pengguna dalam menggunakan sistem.</w:t>
-      </w:r>
-    </w:p>
-    <w:p>
-      <w:pPr>
-        <w:jc w:val="both"/>
-        <w:rPr>
-          <w:lang w:val="en-US"/>
-        </w:rPr>
-      </w:pPr>
-    </w:p>
-    <w:p>
-      <w:pPr>
-        <w:jc w:val="both"/>
-        <w:rPr>
-          <w:lang w:val="en-US"/>
-        </w:rPr>
-      </w:pPr>
-      <w:r>
-        <w:rPr>
-          <w:lang w:val="en-US"/>
-        </w:rPr>
-        <w:t>Sub Kesimpulan dan Saran Pengembangan:</w:t>
-      </w:r>
-    </w:p>
-    <w:p>
-      <w:pPr>
-        <w:jc w:val="both"/>
-        <w:rPr>
-          <w:lang w:val="en-US"/>
-        </w:rPr>
-      </w:pPr>
-      <w:r>
-        <w:rPr>
-          <w:lang w:val="en-US"/>
-        </w:rPr>
-        <w:t>Berdasarkan hasil implementasi yang telah dilakukan, dapat disimpulkan bahwa metode Agile yang dikombinasikan dengan User Centered Design berhasil menghasilkan sistem yang adaptif, mudah digunakan, dan sesuai dengan kebutuhan pengguna. Sistem yang dibangun mampu memberikan rekomendasi yang cukup akurat dan relevan dalam membantu pengambilan keputusan di bidang pertanian. Namun, untuk pengembangan selanjutnya, disarankan agar sistem dapat menggunakan data historis untuk meningkatkan akurasi rekomendasi, menambahkan fitur notifikasi otomatis, serta melakukan integrasi dengan lebih banyak jenis sensor agar sistem menjadi lebih komprehensif dan scalable</w:t>
-      </w:r>
-      <w:proofErr w:type="gramStart"/>
+        <w:t xml:space="preserve">Berdasarkan hasil implementasi yang telah dilakukan, dapat disimpulkan bahwa metode </w:t>
+      </w:r>
+      <w:r>
+        <w:rPr>
+          <w:i/>
+          <w:lang w:val="en-US"/>
+        </w:rPr>
+        <w:t>Agile</w:t>
+      </w:r>
+      <w:r>
+        <w:rPr>
+          <w:lang w:val="en-US"/>
+        </w:rPr>
+        <w:t xml:space="preserve"> yang dikombinasikan dengan </w:t>
+      </w:r>
+      <w:r>
+        <w:rPr>
+          <w:i/>
+          <w:lang w:val="en-US"/>
+        </w:rPr>
+        <w:t>User Centered Design</w:t>
+      </w:r>
+      <w:r>
+        <w:rPr>
+          <w:lang w:val="en-US"/>
+        </w:rPr>
+        <w:t xml:space="preserve"> berhasil menghasilkan sistem yang adaptif, mudah digunakan, dan sesuai dengan kebutuhan pengguna. Sistem yang dibangun mampu memberikan rekomendasi yang cukup akurat dan relevan dalam membantu pengambilan keputusan di bidang pertanian. Namun, untuk pengembangan selanjutnya, disarankan agar sistem dapat menggunakan data historis untuk meningkatkan akurasi rekomendasi, menambahkan fitur notifikasi otomatis, serta melakukan integrasi dengan lebih banyak jenis sensor agar sistem menjadi lebih komprehensif dan </w:t>
+      </w:r>
+      <w:r>
+        <w:rPr>
+          <w:i/>
+          <w:lang w:val="en-US"/>
+        </w:rPr>
+        <w:t>scalable</w:t>
+      </w:r>
       <w:r>
         <w:rPr>
           <w:lang w:val="en-US"/>
         </w:rPr>
         <w:t>.</w:t>
       </w:r>
-      <w:r>
-        <w:rPr>
-          <w:lang w:val="en-US"/>
-        </w:rPr>
-        <w:t>.</w:t>
-      </w:r>
-      <w:proofErr w:type="gramEnd"/>
     </w:p>
     <w:p>
       <w:pPr>
         <w:pStyle w:val="Heading2"/>
         <w:rPr>
+          <w:color w:val="FF0000"/>
           <w:lang w:val="en-US"/>
         </w:rPr>
       </w:pPr>
@@ -25398,14 +25809,17 @@
       <w:bookmarkStart w:id="67" w:name="_Toc222407826"/>
       <w:r>
         <w:rPr>
-          <w:lang w:val="en-US"/>
-        </w:rPr>
+          <w:color w:val="FF0000"/>
+          <w:lang w:val="en-US"/>
+        </w:rPr>
+        <w:lastRenderedPageBreak/>
         <w:t>4.2 Hasil Evaluasi dan Validasi Solusi</w:t>
       </w:r>
       <w:bookmarkEnd w:id="66"/>
       <w:bookmarkEnd w:id="67"/>
       <w:r>
         <w:rPr>
+          <w:color w:val="FF0000"/>
           <w:lang w:val="en-US"/>
         </w:rPr>
         <w:t xml:space="preserve"> </w:t>
@@ -25415,11 +25829,13 @@
       <w:pPr>
         <w:jc w:val="both"/>
         <w:rPr>
-          <w:lang w:val="en-US"/>
-        </w:rPr>
-      </w:pPr>
-      <w:r>
-        <w:rPr>
+          <w:color w:val="FF0000"/>
+          <w:lang w:val="en-US"/>
+        </w:rPr>
+      </w:pPr>
+      <w:r>
+        <w:rPr>
+          <w:color w:val="FF0000"/>
           <w:lang w:val="en-US"/>
         </w:rPr>
         <w:t xml:space="preserve">Berisi pembahasan catatan pengerjaan tutorial di BAB 3.4. Pada bagian akhir sub </w:t>
@@ -25427,6 +25843,7 @@
       <w:proofErr w:type="gramStart"/>
       <w:r>
         <w:rPr>
+          <w:color w:val="FF0000"/>
           <w:lang w:val="en-US"/>
         </w:rPr>
         <w:t>bab</w:t>
@@ -25434,6 +25851,7 @@
       <w:proofErr w:type="gramEnd"/>
       <w:r>
         <w:rPr>
+          <w:color w:val="FF0000"/>
           <w:lang w:val="en-US"/>
         </w:rPr>
         <w:t xml:space="preserve"> harus ada paragraf yang berisi </w:t>
@@ -25441,12 +25859,14 @@
       <w:r>
         <w:rPr>
           <w:b/>
+          <w:color w:val="FF0000"/>
           <w:lang w:val="en-US"/>
         </w:rPr>
         <w:t xml:space="preserve">sub kesimpulan </w:t>
       </w:r>
       <w:r>
         <w:rPr>
+          <w:color w:val="FF0000"/>
           <w:lang w:val="en-US"/>
         </w:rPr>
         <w:t xml:space="preserve">dan </w:t>
@@ -25454,12 +25874,14 @@
       <w:r>
         <w:rPr>
           <w:b/>
+          <w:color w:val="FF0000"/>
           <w:lang w:val="en-US"/>
         </w:rPr>
         <w:t>sub saran pengembangan</w:t>
       </w:r>
       <w:r>
         <w:rPr>
+          <w:color w:val="FF0000"/>
           <w:lang w:val="en-US"/>
         </w:rPr>
         <w:t>.</w:t>
@@ -25590,7 +26012,6 @@
     <w:p>
       <w:pPr>
         <w:pStyle w:val="Heading1"/>
-        <w:jc w:val="both"/>
       </w:pPr>
       <w:bookmarkStart w:id="74" w:name="_Toc222407830"/>
       <w:r>
@@ -26669,18 +27090,21 @@
     </w:p>
     <w:p>
       <w:pPr>
-        <w:widowControl w:val="0"/>
-        <w:autoSpaceDE w:val="0"/>
-        <w:autoSpaceDN w:val="0"/>
-        <w:adjustRightInd w:val="0"/>
-        <w:spacing w:before="120" w:after="120" w:line="240" w:lineRule="auto"/>
-        <w:ind w:firstLine="0"/>
-        <w:jc w:val="both"/>
+        <w:pStyle w:val="Heading1"/>
+        <w:rPr>
+          <w:lang w:val="en-US"/>
+        </w:rPr>
       </w:pPr>
       <w:r>
         <w:lastRenderedPageBreak/>
         <w:fldChar w:fldCharType="end"/>
       </w:r>
+      <w:r>
+        <w:rPr>
+          <w:lang w:val="en-US"/>
+        </w:rPr>
+        <w:t>LAMPIRAN</w:t>
+      </w:r>
     </w:p>
     <w:p>
       <w:pPr>
@@ -26688,7 +27112,7 @@
       </w:pPr>
     </w:p>
     <w:sectPr>
-      <w:footerReference w:type="default" r:id="rId15"/>
+      <w:footerReference w:type="default" r:id="rId16"/>
       <w:pgSz w:w="11906" w:h="16838"/>
       <w:pgMar w:top="1701" w:right="1701" w:bottom="1701" w:left="2268" w:header="709" w:footer="709" w:gutter="0"/>
       <w:cols w:space="708"/>
@@ -26761,7 +27185,7 @@
           <w:rPr>
             <w:noProof/>
           </w:rPr>
-          <w:t>vii</w:t>
+          <w:t>x</w:t>
         </w:r>
         <w:r>
           <w:rPr>
@@ -28039,7 +28463,7 @@
     <w:autoRedefine/>
     <w:uiPriority w:val="9"/>
     <w:qFormat/>
-    <w:rsid w:val="000A2D0E"/>
+    <w:rsid w:val="00F57D6B"/>
     <w:pPr>
       <w:keepNext/>
       <w:keepLines/>
@@ -28159,7 +28583,7 @@
     <w:basedOn w:val="DefaultParagraphFont"/>
     <w:link w:val="Heading1"/>
     <w:uiPriority w:val="9"/>
-    <w:rsid w:val="000A2D0E"/>
+    <w:rsid w:val="00F57D6B"/>
     <w:rPr>
       <w:rFonts w:ascii="Arial" w:eastAsiaTheme="majorEastAsia" w:hAnsi="Arial" w:cstheme="majorBidi"/>
       <w:b/>
@@ -28827,7 +29251,7 @@
 </file>
 
 <file path=customXml/itemProps1.xml><?xml version="1.0" encoding="utf-8"?>
-<ds:datastoreItem xmlns:ds="http://schemas.openxmlformats.org/officeDocument/2006/customXml" ds:itemID="{D3AE6FD7-08AB-4921-BADC-5DEDFD5FF6AF}">
+<ds:datastoreItem xmlns:ds="http://schemas.openxmlformats.org/officeDocument/2006/customXml" ds:itemID="{8AB57E2A-D153-4B93-A2B8-6B57B43DC9D3}">
   <ds:schemaRefs>
     <ds:schemaRef ds:uri="http://schemas.openxmlformats.org/officeDocument/2006/bibliography"/>
   </ds:schemaRefs>

</xml_diff>

<commit_message>
Update thesis document with additional figures and enhance implementation details for clarity
</commit_message>
<xml_diff>
--- a/NASKAH/Dokumen Laporan Skripsi - 42330018 - I Nyoman Wahyu Permana - 2023 - 2026.docx
+++ b/NASKAH/Dokumen Laporan Skripsi - 42330018 - I Nyoman Wahyu Permana - 2023 - 2026.docx
@@ -8488,7 +8488,7 @@
         </w:rPr>
         <w:fldChar w:fldCharType="separate"/>
       </w:r>
-      <w:hyperlink w:anchor="_Toc225156106" w:history="1">
+      <w:hyperlink w:anchor="_Toc227759829" w:history="1">
         <w:r>
           <w:rPr>
             <w:rStyle w:val="Hyperlink"/>
@@ -8523,7 +8523,7 @@
             <w:noProof/>
             <w:webHidden/>
           </w:rPr>
-          <w:instrText xml:space="preserve"> PAGEREF _Toc225156106 \h </w:instrText>
+          <w:instrText xml:space="preserve"> PAGEREF _Toc227759829 \h </w:instrText>
         </w:r>
         <w:r>
           <w:rPr>
@@ -8566,7 +8566,7 @@
           <w:lang w:val="en-US"/>
         </w:rPr>
       </w:pPr>
-      <w:hyperlink w:anchor="_Toc225156107" w:history="1">
+      <w:hyperlink w:anchor="_Toc227759830" w:history="1">
         <w:r>
           <w:rPr>
             <w:rStyle w:val="Hyperlink"/>
@@ -8625,7 +8625,7 @@
             <w:noProof/>
             <w:webHidden/>
           </w:rPr>
-          <w:instrText xml:space="preserve"> PAGEREF _Toc225156107 \h </w:instrText>
+          <w:instrText xml:space="preserve"> PAGEREF _Toc227759830 \h </w:instrText>
         </w:r>
         <w:r>
           <w:rPr>
@@ -8668,7 +8668,7 @@
           <w:lang w:val="en-US"/>
         </w:rPr>
       </w:pPr>
-      <w:hyperlink w:anchor="_Toc225156108" w:history="1">
+      <w:hyperlink w:anchor="_Toc227759831" w:history="1">
         <w:r>
           <w:rPr>
             <w:rStyle w:val="Hyperlink"/>
@@ -8727,7 +8727,7 @@
             <w:noProof/>
             <w:webHidden/>
           </w:rPr>
-          <w:instrText xml:space="preserve"> PAGEREF _Toc225156108 \h </w:instrText>
+          <w:instrText xml:space="preserve"> PAGEREF _Toc227759831 \h </w:instrText>
         </w:r>
         <w:r>
           <w:rPr>
@@ -8770,7 +8770,7 @@
           <w:lang w:val="en-US"/>
         </w:rPr>
       </w:pPr>
-      <w:hyperlink w:anchor="_Toc225156109" w:history="1">
+      <w:hyperlink w:anchor="_Toc227759832" w:history="1">
         <w:r>
           <w:rPr>
             <w:rStyle w:val="Hyperlink"/>
@@ -8814,7 +8814,7 @@
             <w:noProof/>
             <w:webHidden/>
           </w:rPr>
-          <w:instrText xml:space="preserve"> PAGEREF _Toc225156109 \h </w:instrText>
+          <w:instrText xml:space="preserve"> PAGEREF _Toc227759832 \h </w:instrText>
         </w:r>
         <w:r>
           <w:rPr>
@@ -8834,7 +8834,7 @@
             <w:noProof/>
             <w:webHidden/>
           </w:rPr>
-          <w:t>26</w:t>
+          <w:t>28</w:t>
         </w:r>
         <w:r>
           <w:rPr>
@@ -8857,7 +8857,7 @@
           <w:lang w:val="en-US"/>
         </w:rPr>
       </w:pPr>
-      <w:hyperlink w:anchor="_Toc225156110" w:history="1">
+      <w:hyperlink w:anchor="_Toc227759833" w:history="1">
         <w:r>
           <w:rPr>
             <w:rStyle w:val="Hyperlink"/>
@@ -8880,7 +8880,25 @@
             <w:noProof/>
             <w:lang w:val="en-US"/>
           </w:rPr>
-          <w:t>High Fidelity Prototype</w:t>
+          <w:t>High Fidelity Protot</w:t>
+        </w:r>
+        <w:r>
+          <w:rPr>
+            <w:rStyle w:val="Hyperlink"/>
+            <w:i/>
+            <w:noProof/>
+            <w:lang w:val="en-US"/>
+          </w:rPr>
+          <w:t>y</w:t>
+        </w:r>
+        <w:r>
+          <w:rPr>
+            <w:rStyle w:val="Hyperlink"/>
+            <w:i/>
+            <w:noProof/>
+            <w:lang w:val="en-US"/>
+          </w:rPr>
+          <w:t>pe</w:t>
         </w:r>
         <w:r>
           <w:rPr>
@@ -8901,7 +8919,7 @@
             <w:noProof/>
             <w:webHidden/>
           </w:rPr>
-          <w:instrText xml:space="preserve"> PAGEREF _Toc225156110 \h </w:instrText>
+          <w:instrText xml:space="preserve"> PAGEREF _Toc227759833 \h </w:instrText>
         </w:r>
         <w:r>
           <w:rPr>
@@ -8921,7 +8939,7 @@
             <w:noProof/>
             <w:webHidden/>
           </w:rPr>
-          <w:t>26</w:t>
+          <w:t>28</w:t>
         </w:r>
         <w:r>
           <w:rPr>
@@ -8931,40 +8949,6 @@
           <w:fldChar w:fldCharType="end"/>
         </w:r>
       </w:hyperlink>
-    </w:p>
-    <w:p>
-      <w:pPr>
-        <w:spacing w:after="200" w:line="276" w:lineRule="auto"/>
-        <w:ind w:firstLine="0"/>
-        <w:rPr>
-          <w:szCs w:val="28"/>
-        </w:rPr>
-      </w:pPr>
-      <w:r>
-        <w:rPr>
-          <w:szCs w:val="28"/>
-        </w:rPr>
-        <w:fldChar w:fldCharType="end"/>
-      </w:r>
-      <w:r>
-        <w:rPr>
-          <w:szCs w:val="28"/>
-        </w:rPr>
-        <w:br w:type="page"/>
-      </w:r>
-    </w:p>
-    <w:p>
-      <w:pPr>
-        <w:pStyle w:val="Heading1"/>
-      </w:pPr>
-      <w:bookmarkStart w:id="16" w:name="_Toc75025328"/>
-      <w:bookmarkStart w:id="17" w:name="_Toc225245238"/>
-      <w:r>
-        <w:lastRenderedPageBreak/>
-        <w:t>DAFTAR TABEL</w:t>
-      </w:r>
-      <w:bookmarkEnd w:id="16"/>
-      <w:bookmarkEnd w:id="17"/>
     </w:p>
     <w:p>
       <w:pPr>
@@ -8978,22 +8962,13 @@
           <w:lang w:val="en-US"/>
         </w:rPr>
       </w:pPr>
-      <w:r>
-        <w:fldChar w:fldCharType="begin"/>
-      </w:r>
-      <w:r>
-        <w:instrText xml:space="preserve"> TOC \h \z \c "Tabel" </w:instrText>
-      </w:r>
-      <w:r>
-        <w:fldChar w:fldCharType="separate"/>
-      </w:r>
-      <w:hyperlink w:anchor="_Toc225967422" w:history="1">
+      <w:hyperlink w:anchor="_Toc227759834" w:history="1">
         <w:r>
           <w:rPr>
             <w:rStyle w:val="Hyperlink"/>
             <w:noProof/>
           </w:rPr>
-          <w:t xml:space="preserve">Tabel </w:t>
+          <w:t xml:space="preserve">Gambar </w:t>
         </w:r>
         <w:r>
           <w:rPr>
@@ -9001,14 +8976,7 @@
             <w:noProof/>
             <w:lang w:val="en-US"/>
           </w:rPr>
-          <w:t>2.</w:t>
-        </w:r>
-        <w:r>
-          <w:rPr>
-            <w:rStyle w:val="Hyperlink"/>
-            <w:noProof/>
-          </w:rPr>
-          <w:t xml:space="preserve">1. </w:t>
+          <w:t xml:space="preserve">4.3 Implementasi </w:t>
         </w:r>
         <w:r>
           <w:rPr>
@@ -9017,7 +8985,7 @@
             <w:noProof/>
             <w:lang w:val="en-US"/>
           </w:rPr>
-          <w:t>State of The Art</w:t>
+          <w:t>Gemini AI</w:t>
         </w:r>
         <w:r>
           <w:rPr>
@@ -9038,7 +9006,7 @@
             <w:noProof/>
             <w:webHidden/>
           </w:rPr>
-          <w:instrText xml:space="preserve"> PAGEREF _Toc225967422 \h </w:instrText>
+          <w:instrText xml:space="preserve"> PAGEREF _Toc227759834 \h </w:instrText>
         </w:r>
         <w:r>
           <w:rPr>
@@ -9058,7 +9026,7 @@
             <w:noProof/>
             <w:webHidden/>
           </w:rPr>
-          <w:t>12</w:t>
+          <w:t>30</w:t>
         </w:r>
         <w:r>
           <w:rPr>
@@ -9081,13 +9049,13 @@
           <w:lang w:val="en-US"/>
         </w:rPr>
       </w:pPr>
-      <w:hyperlink w:anchor="_Toc225967423" w:history="1">
+      <w:hyperlink w:anchor="_Toc227759835" w:history="1">
         <w:r>
           <w:rPr>
             <w:rStyle w:val="Hyperlink"/>
             <w:noProof/>
           </w:rPr>
-          <w:t xml:space="preserve">Tabel </w:t>
+          <w:t xml:space="preserve">Gambar </w:t>
         </w:r>
         <w:r>
           <w:rPr>
@@ -9095,14 +9063,16 @@
             <w:noProof/>
             <w:lang w:val="en-US"/>
           </w:rPr>
-          <w:t>3.</w:t>
+          <w:t xml:space="preserve">4.4 </w:t>
         </w:r>
         <w:r>
           <w:rPr>
             <w:rStyle w:val="Hyperlink"/>
-            <w:noProof/>
-          </w:rPr>
-          <w:t>1. Jadwal Pelaksanaan Penelitian</w:t>
+            <w:i/>
+            <w:noProof/>
+            <w:lang w:val="en-US"/>
+          </w:rPr>
+          <w:t>API Request Gemini</w:t>
         </w:r>
         <w:r>
           <w:rPr>
@@ -9123,7 +9093,7 @@
             <w:noProof/>
             <w:webHidden/>
           </w:rPr>
-          <w:instrText xml:space="preserve"> PAGEREF _Toc225967423 \h </w:instrText>
+          <w:instrText xml:space="preserve"> PAGEREF _Toc227759835 \h </w:instrText>
         </w:r>
         <w:r>
           <w:rPr>
@@ -9143,7 +9113,7 @@
             <w:noProof/>
             <w:webHidden/>
           </w:rPr>
-          <w:t>14</w:t>
+          <w:t>32</w:t>
         </w:r>
         <w:r>
           <w:rPr>
@@ -9153,6 +9123,40 @@
           <w:fldChar w:fldCharType="end"/>
         </w:r>
       </w:hyperlink>
+    </w:p>
+    <w:p>
+      <w:pPr>
+        <w:spacing w:after="200" w:line="276" w:lineRule="auto"/>
+        <w:ind w:firstLine="0"/>
+        <w:rPr>
+          <w:szCs w:val="28"/>
+        </w:rPr>
+      </w:pPr>
+      <w:r>
+        <w:rPr>
+          <w:szCs w:val="28"/>
+        </w:rPr>
+        <w:fldChar w:fldCharType="end"/>
+      </w:r>
+      <w:r>
+        <w:rPr>
+          <w:szCs w:val="28"/>
+        </w:rPr>
+        <w:br w:type="page"/>
+      </w:r>
+    </w:p>
+    <w:p>
+      <w:pPr>
+        <w:pStyle w:val="Heading1"/>
+      </w:pPr>
+      <w:bookmarkStart w:id="16" w:name="_Toc75025328"/>
+      <w:bookmarkStart w:id="17" w:name="_Toc225245238"/>
+      <w:r>
+        <w:lastRenderedPageBreak/>
+        <w:t>DAFTAR TABEL</w:t>
+      </w:r>
+      <w:bookmarkEnd w:id="16"/>
+      <w:bookmarkEnd w:id="17"/>
     </w:p>
     <w:p>
       <w:pPr>
@@ -9166,7 +9170,16 @@
           <w:lang w:val="en-US"/>
         </w:rPr>
       </w:pPr>
-      <w:hyperlink w:anchor="_Toc225967424" w:history="1">
+      <w:r>
+        <w:fldChar w:fldCharType="begin"/>
+      </w:r>
+      <w:r>
+        <w:instrText xml:space="preserve"> TOC \h \z \c "Tabel" </w:instrText>
+      </w:r>
+      <w:r>
+        <w:fldChar w:fldCharType="separate"/>
+      </w:r>
+      <w:hyperlink w:anchor="_Toc225967422" w:history="1">
         <w:r>
           <w:rPr>
             <w:rStyle w:val="Hyperlink"/>
@@ -9180,22 +9193,23 @@
             <w:noProof/>
             <w:lang w:val="en-US"/>
           </w:rPr>
-          <w:t>3.</w:t>
+          <w:t>2.</w:t>
         </w:r>
         <w:r>
           <w:rPr>
             <w:rStyle w:val="Hyperlink"/>
             <w:noProof/>
           </w:rPr>
-          <w:t xml:space="preserve">2. </w:t>
+          <w:t xml:space="preserve">1. </w:t>
         </w:r>
         <w:r>
           <w:rPr>
             <w:rStyle w:val="Hyperlink"/>
+            <w:i/>
             <w:noProof/>
             <w:lang w:val="en-US"/>
           </w:rPr>
-          <w:t>Contoh data</w:t>
+          <w:t>State of The Art</w:t>
         </w:r>
         <w:r>
           <w:rPr>
@@ -9216,7 +9230,7 @@
             <w:noProof/>
             <w:webHidden/>
           </w:rPr>
-          <w:instrText xml:space="preserve"> PAGEREF _Toc225967424 \h </w:instrText>
+          <w:instrText xml:space="preserve"> PAGEREF _Toc225967422 \h </w:instrText>
         </w:r>
         <w:r>
           <w:rPr>
@@ -9236,7 +9250,7 @@
             <w:noProof/>
             <w:webHidden/>
           </w:rPr>
-          <w:t>20</w:t>
+          <w:t>12</w:t>
         </w:r>
         <w:r>
           <w:rPr>
@@ -9259,7 +9273,7 @@
           <w:lang w:val="en-US"/>
         </w:rPr>
       </w:pPr>
-      <w:hyperlink w:anchor="_Toc225967425" w:history="1">
+      <w:hyperlink w:anchor="_Toc225967423" w:history="1">
         <w:r>
           <w:rPr>
             <w:rStyle w:val="Hyperlink"/>
@@ -9280,15 +9294,7 @@
             <w:rStyle w:val="Hyperlink"/>
             <w:noProof/>
           </w:rPr>
-          <w:t xml:space="preserve">3. </w:t>
-        </w:r>
-        <w:r>
-          <w:rPr>
-            <w:rStyle w:val="Hyperlink"/>
-            <w:noProof/>
-            <w:lang w:val="en-US"/>
-          </w:rPr>
-          <w:t>Detail skala penelitian</w:t>
+          <w:t>1. Jadwal Pelaksanaan Penelitian</w:t>
         </w:r>
         <w:r>
           <w:rPr>
@@ -9309,7 +9315,7 @@
             <w:noProof/>
             <w:webHidden/>
           </w:rPr>
-          <w:instrText xml:space="preserve"> PAGEREF _Toc225967425 \h </w:instrText>
+          <w:instrText xml:space="preserve"> PAGEREF _Toc225967423 \h </w:instrText>
         </w:r>
         <w:r>
           <w:rPr>
@@ -9329,7 +9335,7 @@
             <w:noProof/>
             <w:webHidden/>
           </w:rPr>
-          <w:t>22</w:t>
+          <w:t>14</w:t>
         </w:r>
         <w:r>
           <w:rPr>
@@ -9352,7 +9358,7 @@
           <w:lang w:val="en-US"/>
         </w:rPr>
       </w:pPr>
-      <w:hyperlink w:anchor="_Toc225967426" w:history="1">
+      <w:hyperlink w:anchor="_Toc225967424" w:history="1">
         <w:r>
           <w:rPr>
             <w:rStyle w:val="Hyperlink"/>
@@ -9373,24 +9379,15 @@
             <w:rStyle w:val="Hyperlink"/>
             <w:noProof/>
           </w:rPr>
-          <w:t xml:space="preserve">4. </w:t>
+          <w:t xml:space="preserve">2. </w:t>
         </w:r>
         <w:r>
           <w:rPr>
             <w:rStyle w:val="Hyperlink"/>
-            <w:i/>
             <w:noProof/>
             <w:lang w:val="en-US"/>
           </w:rPr>
-          <w:t>Threshold</w:t>
-        </w:r>
-        <w:r>
-          <w:rPr>
-            <w:rStyle w:val="Hyperlink"/>
-            <w:noProof/>
-            <w:lang w:val="en-US"/>
-          </w:rPr>
-          <w:t xml:space="preserve"> nilai SUS</w:t>
+          <w:t>Contoh data</w:t>
         </w:r>
         <w:r>
           <w:rPr>
@@ -9411,7 +9408,7 @@
             <w:noProof/>
             <w:webHidden/>
           </w:rPr>
-          <w:instrText xml:space="preserve"> PAGEREF _Toc225967426 \h </w:instrText>
+          <w:instrText xml:space="preserve"> PAGEREF _Toc225967424 \h </w:instrText>
         </w:r>
         <w:r>
           <w:rPr>
@@ -9431,7 +9428,7 @@
             <w:noProof/>
             <w:webHidden/>
           </w:rPr>
-          <w:t>22</w:t>
+          <w:t>20</w:t>
         </w:r>
         <w:r>
           <w:rPr>
@@ -9454,7 +9451,7 @@
           <w:lang w:val="en-US"/>
         </w:rPr>
       </w:pPr>
-      <w:hyperlink w:anchor="_Toc225967427" w:history="1">
+      <w:hyperlink w:anchor="_Toc225967425" w:history="1">
         <w:r>
           <w:rPr>
             <w:rStyle w:val="Hyperlink"/>
@@ -9475,7 +9472,7 @@
             <w:rStyle w:val="Hyperlink"/>
             <w:noProof/>
           </w:rPr>
-          <w:t xml:space="preserve">5. </w:t>
+          <w:t xml:space="preserve">3. </w:t>
         </w:r>
         <w:r>
           <w:rPr>
@@ -9483,7 +9480,7 @@
             <w:noProof/>
             <w:lang w:val="en-US"/>
           </w:rPr>
-          <w:t>Daftar pertanyaan SUS</w:t>
+          <w:t>Detail skala penelitian</w:t>
         </w:r>
         <w:r>
           <w:rPr>
@@ -9504,7 +9501,7 @@
             <w:noProof/>
             <w:webHidden/>
           </w:rPr>
-          <w:instrText xml:space="preserve"> PAGEREF _Toc225967427 \h </w:instrText>
+          <w:instrText xml:space="preserve"> PAGEREF _Toc225967425 \h </w:instrText>
         </w:r>
         <w:r>
           <w:rPr>
@@ -9524,7 +9521,7 @@
             <w:noProof/>
             <w:webHidden/>
           </w:rPr>
-          <w:t>23</w:t>
+          <w:t>22</w:t>
         </w:r>
         <w:r>
           <w:rPr>
@@ -9547,6 +9544,201 @@
           <w:lang w:val="en-US"/>
         </w:rPr>
       </w:pPr>
+      <w:hyperlink w:anchor="_Toc225967426" w:history="1">
+        <w:r>
+          <w:rPr>
+            <w:rStyle w:val="Hyperlink"/>
+            <w:noProof/>
+          </w:rPr>
+          <w:t xml:space="preserve">Tabel </w:t>
+        </w:r>
+        <w:r>
+          <w:rPr>
+            <w:rStyle w:val="Hyperlink"/>
+            <w:noProof/>
+            <w:lang w:val="en-US"/>
+          </w:rPr>
+          <w:t>3.</w:t>
+        </w:r>
+        <w:r>
+          <w:rPr>
+            <w:rStyle w:val="Hyperlink"/>
+            <w:noProof/>
+          </w:rPr>
+          <w:t xml:space="preserve">4. </w:t>
+        </w:r>
+        <w:r>
+          <w:rPr>
+            <w:rStyle w:val="Hyperlink"/>
+            <w:i/>
+            <w:noProof/>
+            <w:lang w:val="en-US"/>
+          </w:rPr>
+          <w:t>Threshold</w:t>
+        </w:r>
+        <w:r>
+          <w:rPr>
+            <w:rStyle w:val="Hyperlink"/>
+            <w:noProof/>
+            <w:lang w:val="en-US"/>
+          </w:rPr>
+          <w:t xml:space="preserve"> nilai SUS</w:t>
+        </w:r>
+        <w:r>
+          <w:rPr>
+            <w:noProof/>
+            <w:webHidden/>
+          </w:rPr>
+          <w:tab/>
+        </w:r>
+        <w:r>
+          <w:rPr>
+            <w:noProof/>
+            <w:webHidden/>
+          </w:rPr>
+          <w:fldChar w:fldCharType="begin"/>
+        </w:r>
+        <w:r>
+          <w:rPr>
+            <w:noProof/>
+            <w:webHidden/>
+          </w:rPr>
+          <w:instrText xml:space="preserve"> PAGEREF _Toc225967426 \h </w:instrText>
+        </w:r>
+        <w:r>
+          <w:rPr>
+            <w:noProof/>
+            <w:webHidden/>
+          </w:rPr>
+        </w:r>
+        <w:r>
+          <w:rPr>
+            <w:noProof/>
+            <w:webHidden/>
+          </w:rPr>
+          <w:fldChar w:fldCharType="separate"/>
+        </w:r>
+        <w:r>
+          <w:rPr>
+            <w:noProof/>
+            <w:webHidden/>
+          </w:rPr>
+          <w:t>22</w:t>
+        </w:r>
+        <w:r>
+          <w:rPr>
+            <w:noProof/>
+            <w:webHidden/>
+          </w:rPr>
+          <w:fldChar w:fldCharType="end"/>
+        </w:r>
+      </w:hyperlink>
+    </w:p>
+    <w:p>
+      <w:pPr>
+        <w:pStyle w:val="TableofFigures"/>
+        <w:tabs>
+          <w:tab w:val="right" w:leader="dot" w:pos="7927"/>
+        </w:tabs>
+        <w:rPr>
+          <w:rFonts w:asciiTheme="minorHAnsi" w:eastAsiaTheme="minorEastAsia" w:hAnsiTheme="minorHAnsi"/>
+          <w:noProof/>
+          <w:lang w:val="en-US"/>
+        </w:rPr>
+      </w:pPr>
+      <w:hyperlink w:anchor="_Toc225967427" w:history="1">
+        <w:r>
+          <w:rPr>
+            <w:rStyle w:val="Hyperlink"/>
+            <w:noProof/>
+          </w:rPr>
+          <w:t xml:space="preserve">Tabel </w:t>
+        </w:r>
+        <w:r>
+          <w:rPr>
+            <w:rStyle w:val="Hyperlink"/>
+            <w:noProof/>
+            <w:lang w:val="en-US"/>
+          </w:rPr>
+          <w:t>3.</w:t>
+        </w:r>
+        <w:r>
+          <w:rPr>
+            <w:rStyle w:val="Hyperlink"/>
+            <w:noProof/>
+          </w:rPr>
+          <w:t xml:space="preserve">5. </w:t>
+        </w:r>
+        <w:r>
+          <w:rPr>
+            <w:rStyle w:val="Hyperlink"/>
+            <w:noProof/>
+            <w:lang w:val="en-US"/>
+          </w:rPr>
+          <w:t>Daftar pertanyaan SUS</w:t>
+        </w:r>
+        <w:r>
+          <w:rPr>
+            <w:noProof/>
+            <w:webHidden/>
+          </w:rPr>
+          <w:tab/>
+        </w:r>
+        <w:r>
+          <w:rPr>
+            <w:noProof/>
+            <w:webHidden/>
+          </w:rPr>
+          <w:fldChar w:fldCharType="begin"/>
+        </w:r>
+        <w:r>
+          <w:rPr>
+            <w:noProof/>
+            <w:webHidden/>
+          </w:rPr>
+          <w:instrText xml:space="preserve"> PAGEREF _Toc225967427 \h </w:instrText>
+        </w:r>
+        <w:r>
+          <w:rPr>
+            <w:noProof/>
+            <w:webHidden/>
+          </w:rPr>
+        </w:r>
+        <w:r>
+          <w:rPr>
+            <w:noProof/>
+            <w:webHidden/>
+          </w:rPr>
+          <w:fldChar w:fldCharType="separate"/>
+        </w:r>
+        <w:r>
+          <w:rPr>
+            <w:noProof/>
+            <w:webHidden/>
+          </w:rPr>
+          <w:t>23</w:t>
+        </w:r>
+        <w:r>
+          <w:rPr>
+            <w:noProof/>
+            <w:webHidden/>
+          </w:rPr>
+          <w:fldChar w:fldCharType="end"/>
+        </w:r>
+      </w:hyperlink>
+    </w:p>
+    <w:p>
+      <w:pPr>
+        <w:pStyle w:val="TableofFigures"/>
+        <w:tabs>
+          <w:tab w:val="right" w:leader="dot" w:pos="7927"/>
+        </w:tabs>
+        <w:rPr>
+          <w:rFonts w:asciiTheme="minorHAnsi" w:eastAsiaTheme="minorEastAsia" w:hAnsiTheme="minorHAnsi"/>
+          <w:noProof/>
+          <w:lang w:val="en-US"/>
+        </w:rPr>
+      </w:pPr>
       <w:hyperlink w:anchor="_Toc225967428" w:history="1">
         <w:r>
           <w:rPr>
@@ -9584,39 +9776,7 @@
             <w:noProof/>
             <w:lang w:val="en-US"/>
           </w:rPr>
-          <w:t>Da</w:t>
-        </w:r>
-        <w:r>
-          <w:rPr>
-            <w:rStyle w:val="Hyperlink"/>
-            <w:noProof/>
-            <w:lang w:val="en-US"/>
-          </w:rPr>
-          <w:t>f</w:t>
-        </w:r>
-        <w:r>
-          <w:rPr>
-            <w:rStyle w:val="Hyperlink"/>
-            <w:noProof/>
-            <w:lang w:val="en-US"/>
-          </w:rPr>
-          <w:t xml:space="preserve">tar </w:t>
-        </w:r>
-        <w:r>
-          <w:rPr>
-            <w:rStyle w:val="Hyperlink"/>
-            <w:noProof/>
-            <w:lang w:val="en-US"/>
-          </w:rPr>
-          <w:t>F</w:t>
-        </w:r>
-        <w:r>
-          <w:rPr>
-            <w:rStyle w:val="Hyperlink"/>
-            <w:noProof/>
-            <w:lang w:val="en-US"/>
-          </w:rPr>
-          <w:t>itur</w:t>
+          <w:t>Daftar Fitur</w:t>
         </w:r>
         <w:r>
           <w:rPr>
@@ -18880,7 +19040,7 @@
           <w:lang w:val="en-US"/>
         </w:rPr>
       </w:pPr>
-      <w:bookmarkStart w:id="44" w:name="_Toc225156106"/>
+      <w:bookmarkStart w:id="44" w:name="_Toc227759829"/>
       <w:r>
         <w:t xml:space="preserve">Gambar </w:t>
       </w:r>
@@ -19193,7 +19353,7 @@
           <w:lang w:val="en-US"/>
         </w:rPr>
       </w:pPr>
-      <w:bookmarkStart w:id="46" w:name="_Toc225156107"/>
+      <w:bookmarkStart w:id="46" w:name="_Toc227759830"/>
       <w:r>
         <w:t xml:space="preserve">Gambar </w:t>
       </w:r>
@@ -19371,7 +19531,7 @@
           <w:lang w:val="en-US"/>
         </w:rPr>
       </w:pPr>
-      <w:bookmarkStart w:id="47" w:name="_Toc225156108"/>
+      <w:bookmarkStart w:id="47" w:name="_Toc227759831"/>
       <w:r>
         <w:rPr>
           <w:noProof/>
@@ -25946,13 +26106,7 @@
         <w:rPr>
           <w:lang w:val="en-US"/>
         </w:rPr>
-        <w:t xml:space="preserve">Daftar </w:t>
-      </w:r>
-      <w:r>
-        <w:rPr>
-          <w:lang w:val="en-US"/>
-        </w:rPr>
-        <w:t>Fitur</w:t>
+        <w:t>Daftar Fitur</w:t>
       </w:r>
       <w:bookmarkEnd w:id="64"/>
     </w:p>
@@ -26899,14 +27053,7 @@
           <w:i/>
           <w:lang w:val="en-US"/>
         </w:rPr>
-        <w:t xml:space="preserve">framework front </w:t>
-      </w:r>
-      <w:r>
-        <w:rPr>
-          <w:i/>
-          <w:lang w:val="en-US"/>
-        </w:rPr>
-        <w:t>end</w:t>
+        <w:t>framework front end</w:t>
       </w:r>
       <w:r>
         <w:rPr>
@@ -27232,7 +27379,7 @@
           <w:lang w:val="en-US"/>
         </w:rPr>
       </w:pPr>
-      <w:bookmarkStart w:id="66" w:name="_Toc225156109"/>
+      <w:bookmarkStart w:id="66" w:name="_Toc227759832"/>
       <w:r>
         <w:rPr>
           <w:noProof/>
@@ -27413,7 +27560,7 @@
           <w:lang w:val="en-US"/>
         </w:rPr>
       </w:pPr>
-      <w:bookmarkStart w:id="67" w:name="_Toc225156110"/>
+      <w:bookmarkStart w:id="67" w:name="_Toc227759833"/>
       <w:r>
         <w:t xml:space="preserve">Gambar </w:t>
       </w:r>
@@ -27431,13 +27578,6 @@
         <w:t>High Fidelity Prototype</w:t>
       </w:r>
       <w:bookmarkEnd w:id="67"/>
-      <w:r>
-        <w:rPr>
-          <w:i/>
-          <w:lang w:val="en-US"/>
-        </w:rPr>
-        <w:br/>
-      </w:r>
     </w:p>
     <w:p>
       <w:pPr>
@@ -27570,7 +27710,46 @@
         <w:rPr>
           <w:lang w:val="en-US"/>
         </w:rPr>
-        <w:t xml:space="preserve">Proses implementasi dimulai dari integrasi data sensor, di mana sistem menerima input berupa data. Data yang dikumpulkan meliputi frekuensi (Hz), tegangan (Volt), daya (Watt), jenis beban (misalnya pompa air), serta informasi tambahan seperti jenis tanaman, usia tanaman, metode pengairan, dan jenis pupuk. Data ini diperoleh dari sensor yang terhubung ke sistem melalui </w:t>
+        <w:t>Proses implementasi dimulai dari integrasi data sensor, di mana sistem menerima input berupa data. Data yang dikumpulkan meliputi frekuensi (</w:t>
+      </w:r>
+      <w:r>
+        <w:rPr>
+          <w:i/>
+          <w:lang w:val="en-US"/>
+        </w:rPr>
+        <w:t>Hz</w:t>
+      </w:r>
+      <w:r>
+        <w:rPr>
+          <w:lang w:val="en-US"/>
+        </w:rPr>
+        <w:t>), tegangan (</w:t>
+      </w:r>
+      <w:r>
+        <w:rPr>
+          <w:i/>
+          <w:lang w:val="en-US"/>
+        </w:rPr>
+        <w:t>Volt</w:t>
+      </w:r>
+      <w:r>
+        <w:rPr>
+          <w:lang w:val="en-US"/>
+        </w:rPr>
+        <w:t>), daya (</w:t>
+      </w:r>
+      <w:r>
+        <w:rPr>
+          <w:i/>
+          <w:lang w:val="en-US"/>
+        </w:rPr>
+        <w:t>Watt</w:t>
+      </w:r>
+      <w:r>
+        <w:rPr>
+          <w:lang w:val="en-US"/>
+        </w:rPr>
+        <w:t xml:space="preserve">), jenis beban (misalnya pompa air), serta informasi tambahan seperti jenis tanaman, usia tanaman, metode pengairan, dan jenis pupuk. Data ini diperoleh dari sensor yang terhubung ke sistem melalui </w:t>
       </w:r>
       <w:r>
         <w:rPr>
@@ -27810,7 +27989,19 @@
         <w:rPr>
           <w:lang w:val="en-US"/>
         </w:rPr>
-        <w:t xml:space="preserve"> ke dalam sistem. Implementasi dilakukan dengan mengirimkan</w:t>
+        <w:t xml:space="preserve"> ke dalam </w:t>
+      </w:r>
+      <w:r>
+        <w:rPr>
+          <w:lang w:val="en-US"/>
+        </w:rPr>
+        <w:t>system yang dapat dilihat di gambar 4.3</w:t>
+      </w:r>
+      <w:r>
+        <w:rPr>
+          <w:lang w:val="en-US"/>
+        </w:rPr>
+        <w:t>. Implementasi dilakukan dengan mengirimkan</w:t>
       </w:r>
       <w:r>
         <w:rPr>
@@ -27922,7 +28113,103 @@
         <w:rPr>
           <w:lang w:val="en-US"/>
         </w:rPr>
-        <w:t>Data mentah dari sensor tidak langsung dikirim, melainkan terlebih dahulu diolah menjadi narasi. Sebagai contoh, data seperti frekuensi 58 Hz, tegangan 280 Volt, dan daya 380 Watt akan dikombinasikan dengan informasi menjadi kalimat deskriptif seperti:</w:t>
+        <w:t>Data mentah dari sensor tidak langsung dikirim, melainkan terlebih dahulu diolah menjadi narasi. Sebagai contoh, data seperti frekuensi 58 Hz, tegangan 280 Volt, dan daya 380 Watt akan dikombinasikan dengan infor</w:t>
+      </w:r>
+      <w:r>
+        <w:rPr>
+          <w:lang w:val="en-US"/>
+        </w:rPr>
+        <w:t xml:space="preserve">masi menjadi kalimat deskriptif. </w:t>
+      </w:r>
+      <w:r>
+        <w:rPr>
+          <w:lang w:val="en-US"/>
+        </w:rPr>
+        <w:t xml:space="preserve">Setelah </w:t>
+      </w:r>
+      <w:r>
+        <w:rPr>
+          <w:i/>
+          <w:lang w:val="en-US"/>
+        </w:rPr>
+        <w:t>prompt</w:t>
+      </w:r>
+      <w:r>
+        <w:rPr>
+          <w:lang w:val="en-US"/>
+        </w:rPr>
+        <w:t xml:space="preserve"> dikirim, </w:t>
+      </w:r>
+      <w:r>
+        <w:rPr>
+          <w:i/>
+          <w:lang w:val="en-US"/>
+        </w:rPr>
+        <w:t>Gemini AI</w:t>
+      </w:r>
+      <w:r>
+        <w:rPr>
+          <w:lang w:val="en-US"/>
+        </w:rPr>
+        <w:t xml:space="preserve"> akan mengembalikan </w:t>
+      </w:r>
+      <w:r>
+        <w:rPr>
+          <w:i/>
+          <w:lang w:val="en-US"/>
+        </w:rPr>
+        <w:t>response</w:t>
+      </w:r>
+      <w:r>
+        <w:rPr>
+          <w:lang w:val="en-US"/>
+        </w:rPr>
+        <w:t xml:space="preserve"> berupa teks rekomendasi. Hasil implementasi menunjukkan bahwa output yang dihasilkan berbentuk penjelasan</w:t>
+      </w:r>
+      <w:r>
+        <w:rPr>
+          <w:lang w:val="en-US"/>
+        </w:rPr>
+        <w:t xml:space="preserve"> deskriptif dalam bahasa sehari </w:t>
+      </w:r>
+      <w:r>
+        <w:rPr>
+          <w:lang w:val="en-US"/>
+        </w:rPr>
+        <w:t xml:space="preserve">hari, misalnya memberikan peringatan jika tegangan tidak stabil, menyarankan untuk mematikan pompa sementara, atau memberikan indikasi adanya potensi kerusakan pada instalasi listrik. </w:t>
+      </w:r>
+      <w:r>
+        <w:rPr>
+          <w:i/>
+          <w:lang w:val="en-US"/>
+        </w:rPr>
+        <w:t>Output</w:t>
+      </w:r>
+      <w:r>
+        <w:rPr>
+          <w:lang w:val="en-US"/>
+        </w:rPr>
+        <w:t xml:space="preserve"> ini kemudian diproses kembali oleh sistem dan ditampilkan pada antarmuka pengguna secara </w:t>
+      </w:r>
+      <w:r>
+        <w:rPr>
+          <w:i/>
+          <w:lang w:val="en-US"/>
+        </w:rPr>
+        <w:t xml:space="preserve">real </w:t>
+      </w:r>
+      <w:r>
+        <w:rPr>
+          <w:i/>
+          <w:lang w:val="en-US"/>
+        </w:rPr>
+        <w:t>time</w:t>
+      </w:r>
+      <w:r>
+        <w:rPr>
+          <w:lang w:val="en-US"/>
+        </w:rPr>
+        <w:t>.</w:t>
       </w:r>
     </w:p>
     <w:p>
@@ -27937,13 +28224,7 @@
         <w:rPr>
           <w:lang w:val="en-US"/>
         </w:rPr>
-        <w:t xml:space="preserve">“Saya membaca power sensor di rumah kaca saya menunjukkan angka 58 hertz dan 280 volt. Saya menggunakan pompa listrik bermerek Shimizu dengan daya 300 watt untuk menyiram tanaman tomat berusia 3 bulan menggunakan sistem irigasi tetes dengan pupuk A B Mix. Sensor juga menunjukkan beban sebesar 380 watt. Analisis kondisi listrik dan sistem pengairan saya serta berikan rekomendasi </w:t>
-      </w:r>
-      <w:r>
-        <w:rPr>
-          <w:lang w:val="en-US"/>
-        </w:rPr>
-        <w:t>tindakan yang perlu dilakukan.”</w:t>
+        <w:t>Dari sisi performa, integrasi ini berjalan dengan cukup efisien, dengan waktu respon yang relatif cepat sehingga masih mendukung kebutuhan monitoring dan pengambilan keputusan secara langsung.</w:t>
       </w:r>
     </w:p>
     <w:p>
@@ -27958,20 +28239,75 @@
         <w:rPr>
           <w:lang w:val="en-US"/>
         </w:rPr>
-        <w:t xml:space="preserve">Setelah </w:t>
-      </w:r>
-      <w:r>
-        <w:rPr>
-          <w:i/>
-          <w:lang w:val="en-US"/>
-        </w:rPr>
-        <w:t>prompt</w:t>
-      </w:r>
-      <w:r>
-        <w:rPr>
-          <w:lang w:val="en-US"/>
-        </w:rPr>
-        <w:t xml:space="preserve"> dikirim, </w:t>
+        <w:lastRenderedPageBreak/>
+        <w:drawing>
+          <wp:anchor distT="0" distB="0" distL="114300" distR="114300" simplePos="0" relativeHeight="251678720" behindDoc="0" locked="0" layoutInCell="1" allowOverlap="1">
+            <wp:simplePos x="0" y="0"/>
+            <wp:positionH relativeFrom="margin">
+              <wp:align>center</wp:align>
+            </wp:positionH>
+            <wp:positionV relativeFrom="paragraph">
+              <wp:posOffset>304800</wp:posOffset>
+            </wp:positionV>
+            <wp:extent cx="4515480" cy="3515216"/>
+            <wp:effectExtent l="0" t="0" r="0" b="9525"/>
+            <wp:wrapTopAndBottom/>
+            <wp:docPr id="17" name="Picture 17"/>
+            <wp:cNvGraphicFramePr>
+              <a:graphicFrameLocks xmlns:a="http://schemas.openxmlformats.org/drawingml/2006/main" noChangeAspect="1"/>
+            </wp:cNvGraphicFramePr>
+            <a:graphic xmlns:a="http://schemas.openxmlformats.org/drawingml/2006/main">
+              <a:graphicData uri="http://schemas.openxmlformats.org/drawingml/2006/picture">
+                <pic:pic xmlns:pic="http://schemas.openxmlformats.org/drawingml/2006/picture">
+                  <pic:nvPicPr>
+                    <pic:cNvPr id="1" name=""/>
+                    <pic:cNvPicPr/>
+                  </pic:nvPicPr>
+                  <pic:blipFill>
+                    <a:blip r:embed="rId16">
+                      <a:extLst>
+                        <a:ext uri="{28A0092B-C50C-407E-A947-70E740481C1C}">
+                          <a14:useLocalDpi xmlns:a14="http://schemas.microsoft.com/office/drawing/2010/main" val="0"/>
+                        </a:ext>
+                      </a:extLst>
+                    </a:blip>
+                    <a:stretch>
+                      <a:fillRect/>
+                    </a:stretch>
+                  </pic:blipFill>
+                  <pic:spPr>
+                    <a:xfrm>
+                      <a:off x="0" y="0"/>
+                      <a:ext cx="4515480" cy="3515216"/>
+                    </a:xfrm>
+                    <a:prstGeom prst="rect">
+                      <a:avLst/>
+                    </a:prstGeom>
+                  </pic:spPr>
+                </pic:pic>
+              </a:graphicData>
+            </a:graphic>
+          </wp:anchor>
+        </w:drawing>
+      </w:r>
+    </w:p>
+    <w:p>
+      <w:pPr>
+        <w:pStyle w:val="Caption"/>
+        <w:rPr>
+          <w:color w:val="FF0000"/>
+          <w:lang w:val="en-US"/>
+        </w:rPr>
+      </w:pPr>
+      <w:bookmarkStart w:id="69" w:name="_Toc227759834"/>
+      <w:r>
+        <w:t xml:space="preserve">Gambar </w:t>
+      </w:r>
+      <w:r>
+        <w:rPr>
+          <w:lang w:val="en-US"/>
+        </w:rPr>
+        <w:t xml:space="preserve">4.3 Implementasi </w:t>
       </w:r>
       <w:r>
         <w:rPr>
@@ -27980,91 +28316,43 @@
         </w:rPr>
         <w:t>Gemini AI</w:t>
       </w:r>
-      <w:r>
-        <w:rPr>
-          <w:lang w:val="en-US"/>
-        </w:rPr>
-        <w:t xml:space="preserve"> </w:t>
-      </w:r>
-      <w:proofErr w:type="gramStart"/>
-      <w:r>
-        <w:rPr>
-          <w:lang w:val="en-US"/>
-        </w:rPr>
-        <w:t>akan</w:t>
-      </w:r>
-      <w:proofErr w:type="gramEnd"/>
-      <w:r>
-        <w:rPr>
-          <w:lang w:val="en-US"/>
-        </w:rPr>
-        <w:t xml:space="preserve"> mengembalikan </w:t>
-      </w:r>
-      <w:r>
-        <w:rPr>
-          <w:i/>
-          <w:lang w:val="en-US"/>
-        </w:rPr>
-        <w:t>response</w:t>
-      </w:r>
-      <w:r>
-        <w:rPr>
-          <w:lang w:val="en-US"/>
-        </w:rPr>
-        <w:t xml:space="preserve"> berupa teks rekomendasi. Hasil implementasi menunjukkan bahwa output yang dihasilkan berbentuk penjelasan</w:t>
-      </w:r>
-      <w:r>
-        <w:rPr>
-          <w:lang w:val="en-US"/>
-        </w:rPr>
-        <w:t xml:space="preserve"> deskriptif dalam bahasa sehari </w:t>
-      </w:r>
-      <w:r>
-        <w:rPr>
-          <w:lang w:val="en-US"/>
-        </w:rPr>
-        <w:t xml:space="preserve">hari, misalnya memberikan peringatan jika tegangan tidak stabil, menyarankan </w:t>
-      </w:r>
-      <w:r>
-        <w:rPr>
-          <w:lang w:val="en-US"/>
-        </w:rPr>
-        <w:lastRenderedPageBreak/>
-        <w:t xml:space="preserve">untuk mematikan pompa sementara, atau memberikan indikasi adanya potensi kerusakan pada instalasi listrik. </w:t>
-      </w:r>
-      <w:r>
-        <w:rPr>
-          <w:i/>
-          <w:lang w:val="en-US"/>
-        </w:rPr>
-        <w:t>Output</w:t>
-      </w:r>
-      <w:r>
-        <w:rPr>
-          <w:lang w:val="en-US"/>
-        </w:rPr>
-        <w:t xml:space="preserve"> ini kemudian diproses kembali oleh sistem dan ditampilkan pada antarmuka pengguna secara </w:t>
-      </w:r>
-      <w:r>
-        <w:rPr>
-          <w:i/>
-          <w:lang w:val="en-US"/>
-        </w:rPr>
-        <w:t xml:space="preserve">real </w:t>
-      </w:r>
-      <w:r>
-        <w:rPr>
-          <w:i/>
-          <w:lang w:val="en-US"/>
-        </w:rPr>
-        <w:t>time</w:t>
-      </w:r>
-      <w:r>
-        <w:rPr>
-          <w:lang w:val="en-US"/>
-        </w:rPr>
-        <w:t>.</w:t>
-      </w:r>
+      <w:bookmarkEnd w:id="69"/>
+    </w:p>
+    <w:p>
+      <w:pPr>
+        <w:pStyle w:val="Heading3"/>
+        <w:ind w:firstLine="709"/>
+        <w:rPr>
+          <w:lang w:val="en-US"/>
+        </w:rPr>
+      </w:pPr>
+      <w:bookmarkStart w:id="70" w:name="_Toc225245269"/>
+      <w:r>
+        <w:rPr>
+          <w:lang w:val="en-US"/>
+        </w:rPr>
+        <w:t>4.1.</w:t>
+      </w:r>
+      <w:r>
+        <w:rPr>
+          <w:lang w:val="en-US"/>
+        </w:rPr>
+        <w:t>4</w:t>
+      </w:r>
+      <w:r>
+        <w:rPr>
+          <w:lang w:val="en-US"/>
+        </w:rPr>
+        <w:t xml:space="preserve"> Implementasi Tahap Revisi dan </w:t>
+      </w:r>
+      <w:r>
+        <w:rPr>
+          <w:i/>
+          <w:lang w:val="en-US"/>
+        </w:rPr>
+        <w:t>Deploy</w:t>
+      </w:r>
+      <w:bookmarkEnd w:id="70"/>
     </w:p>
     <w:p>
       <w:pPr>
@@ -28078,7 +28366,59 @@
         <w:rPr>
           <w:lang w:val="en-US"/>
         </w:rPr>
-        <w:t xml:space="preserve">Dari sisi performa, integrasi ini berjalan dengan cukup efisien, dengan waktu respon yang relatif cepat sehingga masih mendukung kebutuhan monitoring dan pengambilan keputusan secara langsung. </w:t>
+        <w:t xml:space="preserve">Tahap revisi dan deploy merupakan tahapan akhir dalam proses implementasi sistem, yang berfokus pada penyempurnaan sistem berdasarkan hasil evaluasi serta penyediaan sistem agar dapat digunakan secara nyata oleh pengguna. Pada penelitian ini, tahap revisi dilakukan secara iteratif mengikuti prinsip </w:t>
+      </w:r>
+      <w:r>
+        <w:rPr>
+          <w:i/>
+          <w:lang w:val="en-US"/>
+        </w:rPr>
+        <w:t>continuous improvement</w:t>
+      </w:r>
+      <w:r>
+        <w:rPr>
+          <w:lang w:val="en-US"/>
+        </w:rPr>
+        <w:t xml:space="preserve"> dalam </w:t>
+      </w:r>
+      <w:r>
+        <w:rPr>
+          <w:i/>
+          <w:lang w:val="en-US"/>
+        </w:rPr>
+        <w:t>Agile</w:t>
+      </w:r>
+      <w:r>
+        <w:rPr>
+          <w:lang w:val="en-US"/>
+        </w:rPr>
+        <w:t xml:space="preserve">, sedangkan tahap deploy dilakukan menggunakan </w:t>
+      </w:r>
+      <w:r>
+        <w:rPr>
+          <w:i/>
+          <w:lang w:val="en-US"/>
+        </w:rPr>
+        <w:t>platform cloud Vercel</w:t>
+      </w:r>
+      <w:r>
+        <w:rPr>
+          <w:lang w:val="en-US"/>
+        </w:rPr>
+        <w:t xml:space="preserve"> untuk memastikan sistem dapat diakses secara </w:t>
+      </w:r>
+      <w:r>
+        <w:rPr>
+          <w:i/>
+          <w:lang w:val="en-US"/>
+        </w:rPr>
+        <w:t>online</w:t>
+      </w:r>
+      <w:r>
+        <w:rPr>
+          <w:lang w:val="en-US"/>
+        </w:rPr>
+        <w:t xml:space="preserve"> dengan mudah.</w:t>
       </w:r>
     </w:p>
     <w:p>
@@ -28086,16 +28426,137 @@
         <w:ind w:left="709" w:firstLine="720"/>
         <w:jc w:val="both"/>
         <w:rPr>
-          <w:color w:val="FF0000"/>
-          <w:lang w:val="en-US"/>
-        </w:rPr>
-      </w:pPr>
-      <w:r>
-        <w:rPr>
-          <w:color w:val="FF0000"/>
-          <w:lang w:val="en-US"/>
-        </w:rPr>
-        <w:t>*masukkan code integrase AI</w:t>
+          <w:lang w:val="en-US"/>
+        </w:rPr>
+      </w:pPr>
+      <w:r>
+        <w:rPr>
+          <w:lang w:val="en-US"/>
+        </w:rPr>
+        <w:t xml:space="preserve">Proses revisi diawali dari hasil evaluasi pada tahap sebelumnya, khususnya dari pengujian </w:t>
+      </w:r>
+      <w:r>
+        <w:rPr>
+          <w:i/>
+          <w:lang w:val="en-US"/>
+        </w:rPr>
+        <w:t>usability</w:t>
+      </w:r>
+      <w:r>
+        <w:rPr>
+          <w:lang w:val="en-US"/>
+        </w:rPr>
+        <w:t xml:space="preserve"> dan validasi </w:t>
+      </w:r>
+      <w:r>
+        <w:rPr>
+          <w:i/>
+          <w:lang w:val="en-US"/>
+        </w:rPr>
+        <w:t>output</w:t>
+      </w:r>
+      <w:r>
+        <w:rPr>
+          <w:lang w:val="en-US"/>
+        </w:rPr>
+        <w:t xml:space="preserve"> dari </w:t>
+      </w:r>
+      <w:r>
+        <w:rPr>
+          <w:i/>
+          <w:lang w:val="en-US"/>
+        </w:rPr>
+        <w:t>Gemini AI</w:t>
+      </w:r>
+      <w:r>
+        <w:rPr>
+          <w:lang w:val="en-US"/>
+        </w:rPr>
+        <w:t xml:space="preserve">. Salah satu fokus utama revisi adalah pada penyempurnaan </w:t>
+      </w:r>
+      <w:r>
+        <w:rPr>
+          <w:i/>
+          <w:lang w:val="en-US"/>
+        </w:rPr>
+        <w:t>prompt</w:t>
+      </w:r>
+      <w:r>
+        <w:rPr>
+          <w:lang w:val="en-US"/>
+        </w:rPr>
+        <w:t xml:space="preserve"> </w:t>
+      </w:r>
+      <w:r>
+        <w:rPr>
+          <w:lang w:val="en-US"/>
+        </w:rPr>
+        <w:t xml:space="preserve">karena kualitas rekomendasi yang dihasilkan sangat bergantung pada struktur dan kejelasan </w:t>
+      </w:r>
+      <w:r>
+        <w:rPr>
+          <w:i/>
+          <w:lang w:val="en-US"/>
+        </w:rPr>
+        <w:t>prompt</w:t>
+      </w:r>
+      <w:r>
+        <w:rPr>
+          <w:lang w:val="en-US"/>
+        </w:rPr>
+        <w:t xml:space="preserve"> yang dikirim ke </w:t>
+      </w:r>
+      <w:r>
+        <w:rPr>
+          <w:i/>
+          <w:lang w:val="en-US"/>
+        </w:rPr>
+        <w:t>AI</w:t>
+      </w:r>
+      <w:r>
+        <w:rPr>
+          <w:lang w:val="en-US"/>
+        </w:rPr>
+        <w:t xml:space="preserve">. Pada implementasi awal, </w:t>
+      </w:r>
+      <w:r>
+        <w:rPr>
+          <w:i/>
+          <w:lang w:val="en-US"/>
+        </w:rPr>
+        <w:t>prompt</w:t>
+      </w:r>
+      <w:r>
+        <w:rPr>
+          <w:lang w:val="en-US"/>
+        </w:rPr>
+        <w:t xml:space="preserve"> yang digunakan masih bersifat umum dan kurang terstruktur, sehingga </w:t>
+      </w:r>
+      <w:r>
+        <w:rPr>
+          <w:i/>
+          <w:lang w:val="en-US"/>
+        </w:rPr>
+        <w:t>output</w:t>
+      </w:r>
+      <w:r>
+        <w:rPr>
+          <w:lang w:val="en-US"/>
+        </w:rPr>
+        <w:t xml:space="preserve"> yang dihasilkan oleh </w:t>
+      </w:r>
+      <w:r>
+        <w:rPr>
+          <w:i/>
+          <w:lang w:val="en-US"/>
+        </w:rPr>
+        <w:t>Gemini AI</w:t>
+      </w:r>
+      <w:r>
+        <w:rPr>
+          <w:lang w:val="en-US"/>
+        </w:rPr>
+        <w:t xml:space="preserve"> cenderung terlalu luas.</w:t>
       </w:r>
     </w:p>
     <w:p>
@@ -28103,16 +28564,616 @@
         <w:ind w:left="709" w:firstLine="720"/>
         <w:jc w:val="both"/>
         <w:rPr>
+          <w:lang w:val="en-US"/>
+        </w:rPr>
+      </w:pPr>
+      <w:r>
+        <w:rPr>
+          <w:lang w:val="en-US"/>
+        </w:rPr>
+        <w:t xml:space="preserve">Untuk mengatasi hal tersebut, dilakukan beberapa iterasi perbaikan pada </w:t>
+      </w:r>
+      <w:r>
+        <w:rPr>
+          <w:i/>
+          <w:lang w:val="en-US"/>
+        </w:rPr>
+        <w:t>prompt</w:t>
+      </w:r>
+      <w:r>
+        <w:rPr>
+          <w:lang w:val="en-US"/>
+        </w:rPr>
+        <w:t xml:space="preserve">. </w:t>
+      </w:r>
+      <w:r>
+        <w:rPr>
+          <w:lang w:val="en-US"/>
+        </w:rPr>
+        <w:t xml:space="preserve">Oleh karena itu dilakukan </w:t>
+      </w:r>
+      <w:r>
+        <w:rPr>
+          <w:lang w:val="en-US"/>
+        </w:rPr>
+        <w:t xml:space="preserve">penyusunan ulang struktur kalimat, di mana </w:t>
+      </w:r>
+      <w:r>
+        <w:rPr>
+          <w:i/>
+          <w:lang w:val="en-US"/>
+        </w:rPr>
+        <w:t>prompt</w:t>
+      </w:r>
+      <w:r>
+        <w:rPr>
+          <w:lang w:val="en-US"/>
+        </w:rPr>
+        <w:t xml:space="preserve"> dipecah menjadi bagian yang lebih sistematis, misalnya </w:t>
+      </w:r>
+      <w:r>
+        <w:rPr>
+          <w:lang w:val="en-US"/>
+        </w:rPr>
+        <w:lastRenderedPageBreak/>
+        <w:t xml:space="preserve">diawali dengan kondisi sensor, dilanjutkan dengan deskripsi penggunaan alat, dan diakhiri dengan instruksi yang jelas seperti “berikan analisis dan </w:t>
+      </w:r>
+      <w:r>
+        <w:rPr>
+          <w:lang w:val="en-US"/>
+        </w:rPr>
+        <w:t xml:space="preserve">tindakan yang harus dilakukan”. </w:t>
+      </w:r>
+      <w:r>
+        <w:rPr>
+          <w:lang w:val="en-US"/>
+        </w:rPr>
+        <w:t xml:space="preserve">Selain itu, dilakukan juga penegasan tujuan </w:t>
+      </w:r>
+      <w:r>
+        <w:rPr>
+          <w:i/>
+          <w:lang w:val="en-US"/>
+        </w:rPr>
+        <w:t>output</w:t>
+      </w:r>
+      <w:r>
+        <w:rPr>
+          <w:lang w:val="en-US"/>
+        </w:rPr>
+        <w:t xml:space="preserve">, dengan menambahkan arahan dalam </w:t>
+      </w:r>
+      <w:r>
+        <w:rPr>
+          <w:i/>
+          <w:lang w:val="en-US"/>
+        </w:rPr>
+        <w:t>prompt</w:t>
+      </w:r>
+      <w:r>
+        <w:rPr>
+          <w:lang w:val="en-US"/>
+        </w:rPr>
+        <w:t xml:space="preserve"> agar </w:t>
+      </w:r>
+      <w:r>
+        <w:rPr>
+          <w:i/>
+          <w:lang w:val="en-US"/>
+        </w:rPr>
+        <w:t>AI</w:t>
+      </w:r>
+      <w:r>
+        <w:rPr>
+          <w:lang w:val="en-US"/>
+        </w:rPr>
+        <w:t xml:space="preserve"> memberikan jawaban dalam bentuk rekomendasi </w:t>
+      </w:r>
+      <w:r>
+        <w:rPr>
+          <w:lang w:val="en-US"/>
+        </w:rPr>
+        <w:t>yang singkat dan jelas.</w:t>
+      </w:r>
+    </w:p>
+    <w:p>
+      <w:pPr>
+        <w:ind w:left="709" w:firstLine="720"/>
+        <w:jc w:val="both"/>
+        <w:rPr>
+          <w:lang w:val="en-US"/>
+        </w:rPr>
+      </w:pPr>
+      <w:r>
+        <w:rPr>
+          <w:lang w:val="en-US"/>
+        </w:rPr>
+        <w:t xml:space="preserve">Proses revisi tidak dilakukan hanya sekali, tetapi melalui beberapa siklus uji coba dengan data yang berbeda. Setiap hasil </w:t>
+      </w:r>
+      <w:r>
+        <w:rPr>
+          <w:i/>
+          <w:lang w:val="en-US"/>
+        </w:rPr>
+        <w:t>output</w:t>
+      </w:r>
+      <w:r>
+        <w:rPr>
+          <w:lang w:val="en-US"/>
+        </w:rPr>
+        <w:t xml:space="preserve"> dianalisis untuk melihat apakah rekomendasi sudah sesuai dengan kondisi nyata dan mudah dipahami. Dari proses ini, diperoleh pola </w:t>
+      </w:r>
+      <w:r>
+        <w:rPr>
+          <w:i/>
+          <w:lang w:val="en-US"/>
+        </w:rPr>
+        <w:t>prompt</w:t>
+      </w:r>
+      <w:r>
+        <w:rPr>
+          <w:lang w:val="en-US"/>
+        </w:rPr>
+        <w:t xml:space="preserve"> optimal </w:t>
+      </w:r>
+      <w:proofErr w:type="gramStart"/>
+      <w:r>
+        <w:rPr>
+          <w:lang w:val="en-US"/>
+        </w:rPr>
+        <w:t xml:space="preserve">yang </w:t>
+      </w:r>
+      <w:r>
+        <w:rPr>
+          <w:lang w:val="en-US"/>
+        </w:rPr>
+        <w:t xml:space="preserve"> memiliki</w:t>
+      </w:r>
+      <w:proofErr w:type="gramEnd"/>
+      <w:r>
+        <w:rPr>
+          <w:lang w:val="en-US"/>
+        </w:rPr>
+        <w:t xml:space="preserve"> instruksi yang jelas. Dengan pendekatan ini, sistem mampu menghasilkan </w:t>
+      </w:r>
+      <w:r>
+        <w:rPr>
+          <w:i/>
+          <w:lang w:val="en-US"/>
+        </w:rPr>
+        <w:t>output</w:t>
+      </w:r>
+      <w:r>
+        <w:rPr>
+          <w:lang w:val="en-US"/>
+        </w:rPr>
+        <w:t xml:space="preserve"> yang konsisten dan memiliki nilai praktis bagi pengguna.</w:t>
+      </w:r>
+    </w:p>
+    <w:p>
+      <w:pPr>
+        <w:ind w:left="720"/>
+        <w:jc w:val="both"/>
+        <w:rPr>
+          <w:lang w:val="en-US"/>
+        </w:rPr>
+      </w:pPr>
+      <w:r>
+        <w:rPr>
+          <w:lang w:val="en-US"/>
+        </w:rPr>
+        <w:t xml:space="preserve">Selain revisi pada </w:t>
+      </w:r>
+      <w:r>
+        <w:rPr>
+          <w:i/>
+          <w:lang w:val="en-US"/>
+        </w:rPr>
+        <w:t>prompt</w:t>
+      </w:r>
+      <w:r>
+        <w:rPr>
+          <w:lang w:val="en-US"/>
+        </w:rPr>
+        <w:t xml:space="preserve">, dilakukan juga perbaikan pada aspek lain seperti tampilan antarmuka, peningkatan kecepatan respon sistem, serta penyederhanaan beberapa istilah teknis agar lebih mudah dipahami. </w:t>
+      </w:r>
+    </w:p>
+    <w:p>
+      <w:pPr>
+        <w:ind w:left="720"/>
+        <w:jc w:val="both"/>
+        <w:rPr>
+          <w:lang w:val="en-US"/>
+        </w:rPr>
+      </w:pPr>
+      <w:r>
+        <w:rPr>
+          <w:lang w:val="en-US"/>
+        </w:rPr>
+        <w:t xml:space="preserve">Setelah sistem mencapai tingkat performa yang diinginkan, dilakukan tahap </w:t>
+      </w:r>
+      <w:r>
+        <w:rPr>
+          <w:i/>
+          <w:lang w:val="en-US"/>
+        </w:rPr>
+        <w:t>deployment</w:t>
+      </w:r>
+      <w:r>
+        <w:rPr>
+          <w:lang w:val="en-US"/>
+        </w:rPr>
+        <w:t xml:space="preserve"> menggunakan </w:t>
+      </w:r>
+      <w:r>
+        <w:rPr>
+          <w:i/>
+          <w:lang w:val="en-US"/>
+        </w:rPr>
+        <w:t>Vercel</w:t>
+      </w:r>
+      <w:r>
+        <w:rPr>
+          <w:lang w:val="en-US"/>
+        </w:rPr>
+        <w:t xml:space="preserve">. </w:t>
+      </w:r>
+      <w:r>
+        <w:rPr>
+          <w:i/>
+          <w:lang w:val="en-US"/>
+        </w:rPr>
+        <w:t>Vercel</w:t>
+      </w:r>
+      <w:r>
+        <w:rPr>
+          <w:lang w:val="en-US"/>
+        </w:rPr>
+        <w:t xml:space="preserve"> dipilih karena kemudahan integrasinya dengan </w:t>
+      </w:r>
+      <w:r>
+        <w:rPr>
+          <w:i/>
+          <w:lang w:val="en-US"/>
+        </w:rPr>
+        <w:t xml:space="preserve">framework front </w:t>
+      </w:r>
+      <w:r>
+        <w:rPr>
+          <w:i/>
+          <w:lang w:val="en-US"/>
+        </w:rPr>
+        <w:t>end</w:t>
+      </w:r>
+      <w:r>
+        <w:rPr>
+          <w:lang w:val="en-US"/>
+        </w:rPr>
+        <w:t xml:space="preserve"> seperti </w:t>
+      </w:r>
+      <w:r>
+        <w:rPr>
+          <w:i/>
+          <w:lang w:val="en-US"/>
+        </w:rPr>
+        <w:t>Preact</w:t>
+      </w:r>
+      <w:r>
+        <w:rPr>
+          <w:lang w:val="en-US"/>
+        </w:rPr>
+        <w:t xml:space="preserve"> serta kemampuannya dalam melakukan </w:t>
+      </w:r>
+      <w:r>
+        <w:rPr>
+          <w:i/>
+          <w:lang w:val="en-US"/>
+        </w:rPr>
+        <w:t>deployment</w:t>
+      </w:r>
+      <w:r>
+        <w:rPr>
+          <w:lang w:val="en-US"/>
+        </w:rPr>
+        <w:t xml:space="preserve"> secara cepat dan otomatis. Proses </w:t>
+      </w:r>
+      <w:r>
+        <w:rPr>
+          <w:i/>
+          <w:lang w:val="en-US"/>
+        </w:rPr>
+        <w:t>deployment</w:t>
+      </w:r>
+      <w:r>
+        <w:rPr>
+          <w:lang w:val="en-US"/>
+        </w:rPr>
+        <w:t xml:space="preserve"> dimulai dengan mengunggah </w:t>
+      </w:r>
+      <w:r>
+        <w:rPr>
+          <w:i/>
+          <w:lang w:val="en-US"/>
+        </w:rPr>
+        <w:t>source code</w:t>
+      </w:r>
+      <w:r>
+        <w:rPr>
+          <w:lang w:val="en-US"/>
+        </w:rPr>
+        <w:t xml:space="preserve"> ke </w:t>
+      </w:r>
+      <w:r>
+        <w:rPr>
+          <w:i/>
+          <w:lang w:val="en-US"/>
+        </w:rPr>
+        <w:t>GitHub</w:t>
+      </w:r>
+      <w:r>
+        <w:rPr>
+          <w:lang w:val="en-US"/>
+        </w:rPr>
+        <w:t xml:space="preserve">, kemudian menghubungkannya dengan </w:t>
+      </w:r>
+      <w:r>
+        <w:rPr>
+          <w:i/>
+          <w:lang w:val="en-US"/>
+        </w:rPr>
+        <w:t>platform Vercel</w:t>
+      </w:r>
+      <w:r>
+        <w:rPr>
+          <w:lang w:val="en-US"/>
+        </w:rPr>
+        <w:t xml:space="preserve">. Setelah terhubung, </w:t>
+      </w:r>
+      <w:r>
+        <w:rPr>
+          <w:i/>
+          <w:lang w:val="en-US"/>
+        </w:rPr>
+        <w:t>Vercel</w:t>
+      </w:r>
+      <w:r>
+        <w:rPr>
+          <w:lang w:val="en-US"/>
+        </w:rPr>
+        <w:t xml:space="preserve"> secara otomatis melakukan proses </w:t>
+      </w:r>
+      <w:r>
+        <w:rPr>
+          <w:i/>
+          <w:lang w:val="en-US"/>
+        </w:rPr>
+        <w:t>build</w:t>
+      </w:r>
+      <w:r>
+        <w:rPr>
+          <w:lang w:val="en-US"/>
+        </w:rPr>
+        <w:t xml:space="preserve"> dan </w:t>
+      </w:r>
+      <w:r>
+        <w:rPr>
+          <w:i/>
+          <w:lang w:val="en-US"/>
+        </w:rPr>
+        <w:t>deploy</w:t>
+      </w:r>
+      <w:r>
+        <w:rPr>
+          <w:lang w:val="en-US"/>
+        </w:rPr>
+        <w:t xml:space="preserve"> setiap kali terdapat pembaruan pada </w:t>
+      </w:r>
+      <w:r>
+        <w:rPr>
+          <w:i/>
+          <w:lang w:val="en-US"/>
+        </w:rPr>
+        <w:t>repository</w:t>
+      </w:r>
+      <w:r>
+        <w:rPr>
+          <w:lang w:val="en-US"/>
+        </w:rPr>
+        <w:t>.</w:t>
+      </w:r>
+    </w:p>
+    <w:p>
+      <w:pPr>
+        <w:ind w:left="709" w:firstLine="720"/>
+        <w:jc w:val="both"/>
+        <w:rPr>
           <w:color w:val="FF0000"/>
           <w:lang w:val="en-US"/>
         </w:rPr>
       </w:pPr>
       <w:r>
         <w:rPr>
-          <w:color w:val="FF0000"/>
-          <w:lang w:val="en-US"/>
-        </w:rPr>
-        <w:t>*masukkan code unit testing &amp; integration testing</w:t>
+          <w:lang w:val="en-US"/>
+        </w:rPr>
+        <w:t xml:space="preserve">Konfigurasi </w:t>
+      </w:r>
+      <w:r>
+        <w:rPr>
+          <w:i/>
+          <w:lang w:val="en-US"/>
+        </w:rPr>
+        <w:t>environment</w:t>
+      </w:r>
+      <w:r>
+        <w:rPr>
+          <w:lang w:val="en-US"/>
+        </w:rPr>
+        <w:t xml:space="preserve"> seperti </w:t>
+      </w:r>
+      <w:r>
+        <w:rPr>
+          <w:i/>
+          <w:lang w:val="en-US"/>
+        </w:rPr>
+        <w:t>API key Gemini AI</w:t>
+      </w:r>
+      <w:r>
+        <w:rPr>
+          <w:lang w:val="en-US"/>
+        </w:rPr>
+        <w:t xml:space="preserve"> juga dilakukan pada </w:t>
+      </w:r>
+      <w:r>
+        <w:rPr>
+          <w:i/>
+          <w:lang w:val="en-US"/>
+        </w:rPr>
+        <w:t>Vercel</w:t>
+      </w:r>
+      <w:r>
+        <w:rPr>
+          <w:lang w:val="en-US"/>
+        </w:rPr>
+        <w:t xml:space="preserve"> melalui fitur </w:t>
+      </w:r>
+      <w:r>
+        <w:rPr>
+          <w:i/>
+          <w:lang w:val="en-US"/>
+        </w:rPr>
+        <w:t>environment variables</w:t>
+      </w:r>
+      <w:r>
+        <w:rPr>
+          <w:lang w:val="en-US"/>
+        </w:rPr>
+        <w:t xml:space="preserve">, sehingga keamanan data tetap terjaga dan tidak terekspos secara langsung di dalam kode. Setelah proses </w:t>
+      </w:r>
+      <w:r>
+        <w:rPr>
+          <w:i/>
+          <w:lang w:val="en-US"/>
+        </w:rPr>
+        <w:t>deploy</w:t>
+      </w:r>
+      <w:r>
+        <w:rPr>
+          <w:lang w:val="en-US"/>
+        </w:rPr>
+        <w:t xml:space="preserve"> selesai, sistem dapat diakses melalui URL publik yang disediakan oleh </w:t>
+      </w:r>
+      <w:r>
+        <w:rPr>
+          <w:i/>
+          <w:lang w:val="en-US"/>
+        </w:rPr>
+        <w:t>Vercel</w:t>
+      </w:r>
+      <w:r>
+        <w:rPr>
+          <w:lang w:val="en-US"/>
+        </w:rPr>
+        <w:t>.</w:t>
+      </w:r>
+    </w:p>
+    <w:p>
+      <w:pPr>
+        <w:jc w:val="both"/>
+        <w:rPr>
+          <w:lang w:val="en-US"/>
+        </w:rPr>
+      </w:pPr>
+    </w:p>
+    <w:p>
+      <w:pPr>
+        <w:ind w:firstLine="0"/>
+        <w:jc w:val="both"/>
+        <w:rPr>
+          <w:lang w:val="en-US"/>
+        </w:rPr>
+      </w:pPr>
+      <w:r>
+        <w:rPr>
+          <w:lang w:val="en-US"/>
+        </w:rPr>
+        <w:t xml:space="preserve">Berdasarkan hasil implementasi yang telah dilakukan, dapat disimpulkan bahwa metode </w:t>
+      </w:r>
+      <w:r>
+        <w:rPr>
+          <w:i/>
+          <w:lang w:val="en-US"/>
+        </w:rPr>
+        <w:t>Agile</w:t>
+      </w:r>
+      <w:r>
+        <w:rPr>
+          <w:lang w:val="en-US"/>
+        </w:rPr>
+        <w:t xml:space="preserve"> yang dikombinasikan dengan </w:t>
+      </w:r>
+      <w:r>
+        <w:rPr>
+          <w:i/>
+          <w:lang w:val="en-US"/>
+        </w:rPr>
+        <w:t>User Centered Design</w:t>
+      </w:r>
+      <w:r>
+        <w:rPr>
+          <w:lang w:val="en-US"/>
+        </w:rPr>
+        <w:t xml:space="preserve"> berhasil menghasilkan sistem yang adaptif, mudah digunakan, dan sesuai dengan kebutuhan pengguna. Sistem yang dibangun mampu memberikan rekomendasi yang cukup akurat dan relevan dalam membantu pengambilan</w:t>
+      </w:r>
+      <w:r>
+        <w:rPr>
+          <w:lang w:val="en-US"/>
+        </w:rPr>
+        <w:t xml:space="preserve"> keputusan di bidang pertanian.</w:t>
+      </w:r>
+    </w:p>
+    <w:p>
+      <w:pPr>
+        <w:pStyle w:val="Heading2"/>
+      </w:pPr>
+      <w:bookmarkStart w:id="71" w:name="_Toc137038249"/>
+      <w:bookmarkStart w:id="72" w:name="_Toc225245270"/>
+      <w:r>
+        <w:lastRenderedPageBreak/>
+        <w:t>4.2 Hasil Evaluasi dan Validasi Solusi</w:t>
+      </w:r>
+      <w:bookmarkEnd w:id="71"/>
+      <w:bookmarkEnd w:id="72"/>
+      <w:r>
+        <w:t xml:space="preserve"> </w:t>
+      </w:r>
+    </w:p>
+    <w:p>
+      <w:pPr>
+        <w:jc w:val="both"/>
+      </w:pPr>
+      <w:r>
+        <w:t xml:space="preserve">Hasil evaluasi dan validasi solusi pada penelitian ini mencakup pengujian teknis sistem, pengujian </w:t>
+      </w:r>
+      <w:r>
+        <w:rPr>
+          <w:i/>
+        </w:rPr>
+        <w:t>usability</w:t>
+      </w:r>
+      <w:r>
+        <w:t xml:space="preserve">, serta validasi fungsi deskriptif dari </w:t>
+      </w:r>
+      <w:r>
+        <w:rPr>
+          <w:i/>
+        </w:rPr>
+        <w:t>Gemini AI</w:t>
+      </w:r>
+      <w:r>
+        <w:t>. Evaluasi ini bertujuan untuk memastikan bahwa sistem yang dikembangkan tidak hanya berjalan dengan baik secara teknis, tetapi juga memberikan manfaat nyata bagi pengguna dalam konteks penge</w:t>
+      </w:r>
+      <w:r>
+        <w:t>lolaan rumah kaca hortikultura.</w:t>
       </w:r>
     </w:p>
     <w:p>
@@ -28123,33 +29184,14 @@
           <w:lang w:val="en-US"/>
         </w:rPr>
       </w:pPr>
-      <w:bookmarkStart w:id="69" w:name="_Toc225245269"/>
-      <w:r>
-        <w:rPr>
-          <w:lang w:val="en-US"/>
-        </w:rPr>
-        <w:t>4.1.</w:t>
-      </w:r>
-      <w:r>
-        <w:rPr>
-          <w:lang w:val="en-US"/>
-        </w:rPr>
-        <w:t>4</w:t>
-      </w:r>
-      <w:r>
-        <w:rPr>
-          <w:lang w:val="en-US"/>
-        </w:rPr>
-        <w:t xml:space="preserve"> Implementasi Tahap Revisi dan </w:t>
-      </w:r>
-      <w:r>
-        <w:rPr>
-          <w:i/>
-          <w:lang w:val="en-US"/>
-        </w:rPr>
-        <w:t>Deploy</w:t>
-      </w:r>
-      <w:bookmarkEnd w:id="69"/>
+      <w:bookmarkStart w:id="73" w:name="_Toc225245271"/>
+      <w:r>
+        <w:rPr>
+          <w:lang w:val="en-US"/>
+        </w:rPr>
+        <w:t>4.2.1 Hasil Pengujian Teknis Sistem</w:t>
+      </w:r>
+      <w:bookmarkEnd w:id="73"/>
     </w:p>
     <w:p>
       <w:pPr>
@@ -28163,60 +29205,267 @@
         <w:rPr>
           <w:lang w:val="en-US"/>
         </w:rPr>
-        <w:t xml:space="preserve">Tahap revisi dan deploy merupakan tahapan akhir dalam proses implementasi sistem, yang berfokus pada penyempurnaan sistem berdasarkan hasil evaluasi serta penyediaan sistem agar dapat digunakan secara nyata oleh pengguna. Pada penelitian ini, tahap revisi dilakukan secara iteratif mengikuti prinsip </w:t>
-      </w:r>
-      <w:r>
-        <w:rPr>
-          <w:i/>
-          <w:lang w:val="en-US"/>
-        </w:rPr>
-        <w:t>continuous improvement</w:t>
-      </w:r>
-      <w:r>
-        <w:rPr>
-          <w:lang w:val="en-US"/>
-        </w:rPr>
-        <w:t xml:space="preserve"> dalam </w:t>
-      </w:r>
-      <w:r>
-        <w:rPr>
-          <w:i/>
-          <w:lang w:val="en-US"/>
-        </w:rPr>
-        <w:t>Agile</w:t>
-      </w:r>
-      <w:r>
-        <w:rPr>
-          <w:lang w:val="en-US"/>
-        </w:rPr>
-        <w:t xml:space="preserve">, sedangkan tahap deploy dilakukan menggunakan </w:t>
-      </w:r>
-      <w:r>
-        <w:rPr>
-          <w:i/>
-          <w:lang w:val="en-US"/>
-        </w:rPr>
-        <w:t>platform cloud Vercel</w:t>
-      </w:r>
-      <w:r>
-        <w:rPr>
-          <w:lang w:val="en-US"/>
-        </w:rPr>
-        <w:t xml:space="preserve"> untuk memastikan sistem dapat diakses secara </w:t>
-      </w:r>
-      <w:r>
-        <w:rPr>
-          <w:i/>
-          <w:lang w:val="en-US"/>
-        </w:rPr>
-        <w:t>online</w:t>
-      </w:r>
-      <w:r>
-        <w:rPr>
-          <w:lang w:val="en-US"/>
-        </w:rPr>
-        <w:t xml:space="preserve"> dengan mudah.</w:t>
-      </w:r>
+        <w:drawing>
+          <wp:anchor distT="0" distB="0" distL="114300" distR="114300" simplePos="0" relativeHeight="251679744" behindDoc="0" locked="0" layoutInCell="1" allowOverlap="1">
+            <wp:simplePos x="0" y="0"/>
+            <wp:positionH relativeFrom="column">
+              <wp:posOffset>198120</wp:posOffset>
+            </wp:positionH>
+            <wp:positionV relativeFrom="paragraph">
+              <wp:posOffset>2371725</wp:posOffset>
+            </wp:positionV>
+            <wp:extent cx="5039995" cy="937260"/>
+            <wp:effectExtent l="0" t="0" r="8255" b="0"/>
+            <wp:wrapTopAndBottom/>
+            <wp:docPr id="18" name="Picture 18"/>
+            <wp:cNvGraphicFramePr>
+              <a:graphicFrameLocks xmlns:a="http://schemas.openxmlformats.org/drawingml/2006/main" noChangeAspect="1"/>
+            </wp:cNvGraphicFramePr>
+            <a:graphic xmlns:a="http://schemas.openxmlformats.org/drawingml/2006/main">
+              <a:graphicData uri="http://schemas.openxmlformats.org/drawingml/2006/picture">
+                <pic:pic xmlns:pic="http://schemas.openxmlformats.org/drawingml/2006/picture">
+                  <pic:nvPicPr>
+                    <pic:cNvPr id="1" name=""/>
+                    <pic:cNvPicPr/>
+                  </pic:nvPicPr>
+                  <pic:blipFill>
+                    <a:blip r:embed="rId17">
+                      <a:extLst>
+                        <a:ext uri="{28A0092B-C50C-407E-A947-70E740481C1C}">
+                          <a14:useLocalDpi xmlns:a14="http://schemas.microsoft.com/office/drawing/2010/main" val="0"/>
+                        </a:ext>
+                      </a:extLst>
+                    </a:blip>
+                    <a:stretch>
+                      <a:fillRect/>
+                    </a:stretch>
+                  </pic:blipFill>
+                  <pic:spPr>
+                    <a:xfrm>
+                      <a:off x="0" y="0"/>
+                      <a:ext cx="5039995" cy="937260"/>
+                    </a:xfrm>
+                    <a:prstGeom prst="rect">
+                      <a:avLst/>
+                    </a:prstGeom>
+                  </pic:spPr>
+                </pic:pic>
+              </a:graphicData>
+            </a:graphic>
+          </wp:anchor>
+        </w:drawing>
+      </w:r>
+      <w:r>
+        <w:rPr>
+          <w:lang w:val="en-US"/>
+        </w:rPr>
+        <w:t xml:space="preserve">Pengujian teknis difokuskan pada respons antarmuka, dan kelancaran integrasi </w:t>
+      </w:r>
+      <w:r>
+        <w:rPr>
+          <w:i/>
+          <w:lang w:val="en-US"/>
+        </w:rPr>
+        <w:t>API Gemini AI</w:t>
+      </w:r>
+      <w:r>
+        <w:rPr>
+          <w:lang w:val="en-US"/>
+        </w:rPr>
+        <w:t xml:space="preserve">. Berdasarkan pengamatan selama 100 jam operasional, sistem mencatatkan waktu </w:t>
+      </w:r>
+      <w:r>
+        <w:rPr>
+          <w:i/>
+          <w:lang w:val="en-US"/>
+        </w:rPr>
+        <w:t>uptime</w:t>
+      </w:r>
+      <w:r>
+        <w:rPr>
+          <w:lang w:val="en-US"/>
+        </w:rPr>
+        <w:t xml:space="preserve"> selama 98 jam. Dengan demikian, persentase </w:t>
+      </w:r>
+      <w:r>
+        <w:rPr>
+          <w:i/>
+          <w:lang w:val="en-US"/>
+        </w:rPr>
+        <w:t>uptime</w:t>
+      </w:r>
+      <w:r>
+        <w:rPr>
+          <w:lang w:val="en-US"/>
+        </w:rPr>
+        <w:t xml:space="preserve"> sistem mencapai 98%. Angka ini telah melampaui standar keberhasilan minimal yang ditetapkan, yaitu 96%. Selain itu, integrasi </w:t>
+      </w:r>
+      <w:r>
+        <w:rPr>
+          <w:i/>
+          <w:lang w:val="en-US"/>
+        </w:rPr>
+        <w:t>API</w:t>
+      </w:r>
+      <w:r>
+        <w:rPr>
+          <w:lang w:val="en-US"/>
+        </w:rPr>
+        <w:t xml:space="preserve"> berjalan dengan stabil tanpa adanya </w:t>
+      </w:r>
+      <w:r>
+        <w:rPr>
+          <w:i/>
+          <w:lang w:val="en-US"/>
+        </w:rPr>
+        <w:t>bottleneck</w:t>
+      </w:r>
+      <w:r>
+        <w:rPr>
+          <w:lang w:val="en-US"/>
+        </w:rPr>
+        <w:t xml:space="preserve"> yang signifikan. Aliran data sensor ke dashboard </w:t>
+      </w:r>
+      <w:r>
+        <w:rPr>
+          <w:i/>
+          <w:lang w:val="en-US"/>
+        </w:rPr>
+        <w:t>Preact</w:t>
+      </w:r>
+      <w:r>
+        <w:rPr>
+          <w:lang w:val="en-US"/>
+        </w:rPr>
+        <w:t xml:space="preserve"> dan </w:t>
+      </w:r>
+      <w:r>
+        <w:rPr>
+          <w:i/>
+          <w:lang w:val="en-US"/>
+        </w:rPr>
+        <w:t>prompt</w:t>
+      </w:r>
+      <w:r>
+        <w:rPr>
+          <w:lang w:val="en-US"/>
+        </w:rPr>
+        <w:t xml:space="preserve"> ke </w:t>
+      </w:r>
+      <w:r>
+        <w:rPr>
+          <w:i/>
+          <w:lang w:val="en-US"/>
+        </w:rPr>
+        <w:t>Gemini AI</w:t>
+      </w:r>
+      <w:r>
+        <w:rPr>
+          <w:lang w:val="en-US"/>
+        </w:rPr>
+        <w:t xml:space="preserve"> memiliki </w:t>
+      </w:r>
+      <w:r>
+        <w:rPr>
+          <w:i/>
+          <w:lang w:val="en-US"/>
+        </w:rPr>
+        <w:t>response</w:t>
+      </w:r>
+      <w:r>
+        <w:rPr>
+          <w:lang w:val="en-US"/>
+        </w:rPr>
+        <w:t xml:space="preserve"> time rata </w:t>
+      </w:r>
+      <w:r>
+        <w:rPr>
+          <w:lang w:val="en-US"/>
+        </w:rPr>
+        <w:t>rata di bawah 3 detik</w:t>
+      </w:r>
+      <w:r>
+        <w:rPr>
+          <w:lang w:val="en-US"/>
+        </w:rPr>
+        <w:t xml:space="preserve"> yang dapat dilihat pada gambar 4.4</w:t>
+      </w:r>
+      <w:r>
+        <w:rPr>
+          <w:lang w:val="en-US"/>
+        </w:rPr>
+        <w:t>, menunjukkan bahwa arsitektur sistem cukup tangguh untuk kebutuhan operasional rumah kaca yang berkelanjutan.</w:t>
+      </w:r>
+    </w:p>
+    <w:p>
+      <w:pPr>
+        <w:pStyle w:val="Caption"/>
+        <w:rPr>
+          <w:lang w:val="en-US"/>
+        </w:rPr>
+      </w:pPr>
+      <w:r>
+        <w:rPr>
+          <w:lang w:val="en-US"/>
+        </w:rPr>
+        <w:tab/>
+      </w:r>
+      <w:r>
+        <w:rPr>
+          <w:lang w:val="en-US"/>
+        </w:rPr>
+        <w:tab/>
+      </w:r>
+      <w:bookmarkStart w:id="74" w:name="_Toc227759835"/>
+      <w:r>
+        <w:t xml:space="preserve">Gambar </w:t>
+      </w:r>
+      <w:r>
+        <w:rPr>
+          <w:lang w:val="en-US"/>
+        </w:rPr>
+        <w:t>4.4</w:t>
+      </w:r>
+      <w:bookmarkStart w:id="75" w:name="_GoBack"/>
+      <w:bookmarkEnd w:id="75"/>
+      <w:r>
+        <w:rPr>
+          <w:lang w:val="en-US"/>
+        </w:rPr>
+        <w:t xml:space="preserve"> </w:t>
+      </w:r>
+      <w:r>
+        <w:rPr>
+          <w:i/>
+          <w:lang w:val="en-US"/>
+        </w:rPr>
+        <w:t>API Request Gemini</w:t>
+      </w:r>
+      <w:bookmarkEnd w:id="74"/>
+    </w:p>
+    <w:p>
+      <w:pPr>
+        <w:pStyle w:val="Heading3"/>
+        <w:ind w:firstLine="709"/>
+        <w:rPr>
+          <w:lang w:val="en-US"/>
+        </w:rPr>
+      </w:pPr>
+      <w:bookmarkStart w:id="76" w:name="_Toc225245272"/>
+      <w:r>
+        <w:rPr>
+          <w:lang w:val="en-US"/>
+        </w:rPr>
+        <w:t xml:space="preserve">4.2.2 Hasil Pengujian </w:t>
+      </w:r>
+      <w:r>
+        <w:rPr>
+          <w:i/>
+          <w:lang w:val="en-US"/>
+        </w:rPr>
+        <w:t>Usability Testing</w:t>
+      </w:r>
+      <w:bookmarkEnd w:id="76"/>
     </w:p>
     <w:p>
       <w:pPr>
@@ -28230,78 +29479,31 @@
         <w:rPr>
           <w:lang w:val="en-US"/>
         </w:rPr>
-        <w:t xml:space="preserve">Proses revisi diawali dari hasil evaluasi pada tahap sebelumnya, khususnya dari pengujian </w:t>
-      </w:r>
-      <w:r>
-        <w:rPr>
-          <w:i/>
-          <w:lang w:val="en-US"/>
-        </w:rPr>
-        <w:t>usability</w:t>
-      </w:r>
-      <w:r>
-        <w:rPr>
-          <w:lang w:val="en-US"/>
-        </w:rPr>
-        <w:t xml:space="preserve"> dan validasi </w:t>
-      </w:r>
-      <w:r>
-        <w:rPr>
-          <w:i/>
-          <w:lang w:val="en-US"/>
-        </w:rPr>
-        <w:t>output</w:t>
-      </w:r>
-      <w:r>
-        <w:rPr>
-          <w:lang w:val="en-US"/>
-        </w:rPr>
-        <w:t xml:space="preserve"> dari </w:t>
-      </w:r>
-      <w:r>
-        <w:rPr>
-          <w:i/>
-          <w:lang w:val="en-US"/>
-        </w:rPr>
-        <w:t>Gemini AI</w:t>
-      </w:r>
-      <w:r>
-        <w:rPr>
-          <w:lang w:val="en-US"/>
-        </w:rPr>
-        <w:t xml:space="preserve">. Salah satu fokus utama revisi adalah pada penyempurnaan </w:t>
-      </w:r>
-      <w:r>
-        <w:rPr>
-          <w:i/>
-          <w:lang w:val="en-US"/>
-        </w:rPr>
-        <w:t>prompt</w:t>
-      </w:r>
-      <w:r>
-        <w:rPr>
-          <w:lang w:val="en-US"/>
-        </w:rPr>
-        <w:t xml:space="preserve"> </w:t>
-      </w:r>
-      <w:r>
-        <w:rPr>
-          <w:lang w:val="en-US"/>
-        </w:rPr>
-        <w:t xml:space="preserve">karena kualitas rekomendasi yang dihasilkan sangat bergantung pada struktur dan kejelasan </w:t>
-      </w:r>
-      <w:r>
-        <w:rPr>
-          <w:i/>
-          <w:lang w:val="en-US"/>
-        </w:rPr>
-        <w:t>prompt</w:t>
-      </w:r>
-      <w:r>
-        <w:rPr>
-          <w:lang w:val="en-US"/>
-        </w:rPr>
-        <w:t xml:space="preserve"> yang dikirim ke </w:t>
+        <w:t xml:space="preserve">Pengujian </w:t>
+      </w:r>
+      <w:r>
+        <w:rPr>
+          <w:lang w:val="en-US"/>
+        </w:rPr>
+        <w:t>ini</w:t>
+      </w:r>
+      <w:r>
+        <w:rPr>
+          <w:lang w:val="en-US"/>
+        </w:rPr>
+        <w:t xml:space="preserve"> melibatkan 10 orang </w:t>
+      </w:r>
+      <w:r>
+        <w:rPr>
+          <w:lang w:val="en-US"/>
+        </w:rPr>
+        <w:t>pengguna</w:t>
+      </w:r>
+      <w:r>
+        <w:rPr>
+          <w:lang w:val="en-US"/>
+        </w:rPr>
+        <w:t xml:space="preserve"> yang diminta untuk menjalankan skenario penggunaan sistem, mulai dari memantau data sensor hingga membaca rekomendasi </w:t>
       </w:r>
       <w:r>
         <w:rPr>
@@ -28314,47 +29516,146 @@
         <w:rPr>
           <w:lang w:val="en-US"/>
         </w:rPr>
-        <w:t xml:space="preserve">. Pada implementasi awal, </w:t>
-      </w:r>
-      <w:r>
-        <w:rPr>
-          <w:i/>
-          <w:lang w:val="en-US"/>
-        </w:rPr>
-        <w:t>prompt</w:t>
-      </w:r>
-      <w:r>
-        <w:rPr>
-          <w:lang w:val="en-US"/>
-        </w:rPr>
-        <w:t xml:space="preserve"> yang digunakan masih bersifat umum dan kurang terstruktur, sehingga </w:t>
-      </w:r>
-      <w:r>
-        <w:rPr>
-          <w:i/>
-          <w:lang w:val="en-US"/>
-        </w:rPr>
-        <w:t>output</w:t>
-      </w:r>
-      <w:r>
-        <w:rPr>
-          <w:lang w:val="en-US"/>
-        </w:rPr>
-        <w:t xml:space="preserve"> yang dihasilkan oleh </w:t>
-      </w:r>
-      <w:r>
-        <w:rPr>
-          <w:i/>
-          <w:lang w:val="en-US"/>
-        </w:rPr>
-        <w:t>Gemini AI</w:t>
-      </w:r>
-      <w:r>
-        <w:rPr>
-          <w:lang w:val="en-US"/>
-        </w:rPr>
-        <w:t xml:space="preserve"> cenderung terlalu luas.</w:t>
-      </w:r>
+        <w:t xml:space="preserve">. Pengukuran dilakukan menggunakan </w:t>
+      </w:r>
+      <w:r>
+        <w:rPr>
+          <w:i/>
+          <w:lang w:val="en-US"/>
+        </w:rPr>
+        <w:t>instrumen System Usability Scale (SUS)</w:t>
+      </w:r>
+      <w:r>
+        <w:rPr>
+          <w:lang w:val="en-US"/>
+        </w:rPr>
+        <w:t>. Setelah kuesioner dari kesepuluh responden dikumpulkan dan dihitung sesuai dengan aturan konversi SUS, diperol</w:t>
+      </w:r>
+      <w:r>
+        <w:rPr>
+          <w:lang w:val="en-US"/>
+        </w:rPr>
+        <w:t>eh skor rata-rata sebesar 76</w:t>
+      </w:r>
+      <w:proofErr w:type="gramStart"/>
+      <w:r>
+        <w:rPr>
+          <w:lang w:val="en-US"/>
+        </w:rPr>
+        <w:t>,5</w:t>
+      </w:r>
+      <w:proofErr w:type="gramEnd"/>
+      <w:r>
+        <w:rPr>
+          <w:lang w:val="en-US"/>
+        </w:rPr>
+        <w:t>.</w:t>
+      </w:r>
+    </w:p>
+    <w:p>
+      <w:pPr>
+        <w:ind w:left="709" w:firstLine="11"/>
+        <w:jc w:val="both"/>
+        <w:rPr>
+          <w:lang w:val="en-US"/>
+        </w:rPr>
+      </w:pPr>
+      <w:r>
+        <w:rPr>
+          <w:lang w:val="en-US"/>
+        </w:rPr>
+        <w:t xml:space="preserve">Merujuk pada </w:t>
+      </w:r>
+      <w:r>
+        <w:rPr>
+          <w:i/>
+          <w:lang w:val="en-US"/>
+        </w:rPr>
+        <w:t>threshold</w:t>
+      </w:r>
+      <w:r>
+        <w:rPr>
+          <w:lang w:val="en-US"/>
+        </w:rPr>
+        <w:t xml:space="preserve"> evaluasi, skor 76</w:t>
+      </w:r>
+      <w:proofErr w:type="gramStart"/>
+      <w:r>
+        <w:rPr>
+          <w:lang w:val="en-US"/>
+        </w:rPr>
+        <w:t>,5</w:t>
+      </w:r>
+      <w:proofErr w:type="gramEnd"/>
+      <w:r>
+        <w:rPr>
+          <w:lang w:val="en-US"/>
+        </w:rPr>
+        <w:t xml:space="preserve"> berada pada rentang nilai Good - Excellent (≥ 70) dan masuk dalam kategori </w:t>
+      </w:r>
+      <w:r>
+        <w:rPr>
+          <w:i/>
+          <w:lang w:val="en-US"/>
+        </w:rPr>
+        <w:t>Acceptable</w:t>
+      </w:r>
+      <w:r>
+        <w:rPr>
+          <w:lang w:val="en-US"/>
+        </w:rPr>
+        <w:t xml:space="preserve">. Hal ini membuktikan bahwa desain antarmuka berbasis </w:t>
+      </w:r>
+      <w:r>
+        <w:rPr>
+          <w:i/>
+          <w:lang w:val="en-US"/>
+        </w:rPr>
+        <w:t>PicoCSS</w:t>
+      </w:r>
+      <w:r>
+        <w:rPr>
+          <w:lang w:val="en-US"/>
+        </w:rPr>
+        <w:t xml:space="preserve"> dan </w:t>
+      </w:r>
+      <w:r>
+        <w:rPr>
+          <w:i/>
+          <w:lang w:val="en-US"/>
+        </w:rPr>
+        <w:t>Preact</w:t>
+      </w:r>
+      <w:r>
+        <w:rPr>
+          <w:lang w:val="en-US"/>
+        </w:rPr>
+        <w:t xml:space="preserve"> dinilai mudah digunakan, tidak membingungkan, dan petani merasa cukup percaya diri dalam mengoperasikannya tanpa memerlukan pendampingan </w:t>
+      </w:r>
+      <w:r>
+        <w:rPr>
+          <w:lang w:val="en-US"/>
+        </w:rPr>
+        <w:lastRenderedPageBreak/>
+        <w:t>teknisi yang intensif. Secara kualitatif, responden memberikan umpan balik positif terhadap tampilan visual yang bersih, meskipun terdapat beberapa masukan minor terkait ukuran font grafik riwayat data yang perlu sedikit diperbesar agar lebih mudah dibaca di bawah sinar matahari langsung.</w:t>
+      </w:r>
+    </w:p>
+    <w:p>
+      <w:pPr>
+        <w:pStyle w:val="Heading3"/>
+        <w:ind w:firstLine="709"/>
+        <w:rPr>
+          <w:lang w:val="en-US"/>
+        </w:rPr>
+      </w:pPr>
+      <w:bookmarkStart w:id="77" w:name="_Toc225245273"/>
+      <w:r>
+        <w:rPr>
+          <w:lang w:val="en-US"/>
+        </w:rPr>
+        <w:t>4.2.3 Hasil Validasi Fungsi Deskriptif Gemini AI</w:t>
+      </w:r>
+      <w:bookmarkEnd w:id="77"/>
     </w:p>
     <w:p>
       <w:pPr>
@@ -28368,83 +29669,20 @@
         <w:rPr>
           <w:lang w:val="en-US"/>
         </w:rPr>
-        <w:t xml:space="preserve">Untuk mengatasi hal tersebut, dilakukan beberapa iterasi perbaikan pada </w:t>
-      </w:r>
-      <w:r>
-        <w:rPr>
-          <w:i/>
-          <w:lang w:val="en-US"/>
-        </w:rPr>
-        <w:t>prompt</w:t>
-      </w:r>
-      <w:r>
-        <w:rPr>
-          <w:lang w:val="en-US"/>
-        </w:rPr>
-        <w:t xml:space="preserve">. </w:t>
-      </w:r>
-      <w:r>
-        <w:rPr>
-          <w:lang w:val="en-US"/>
-        </w:rPr>
-        <w:t xml:space="preserve">Oleh karena itu dilakukan </w:t>
-      </w:r>
-      <w:r>
-        <w:rPr>
-          <w:lang w:val="en-US"/>
-        </w:rPr>
-        <w:t xml:space="preserve">penyusunan ulang struktur kalimat, di mana </w:t>
-      </w:r>
-      <w:r>
-        <w:rPr>
-          <w:i/>
-          <w:lang w:val="en-US"/>
-        </w:rPr>
-        <w:t>prompt</w:t>
-      </w:r>
-      <w:r>
-        <w:rPr>
-          <w:lang w:val="en-US"/>
-        </w:rPr>
-        <w:t xml:space="preserve"> dipecah menjadi bagian yang lebih sistematis, misalnya diawali dengan kondisi sensor, dilanjutkan dengan deskripsi penggunaan alat, dan diakhiri dengan instruksi yang jelas seperti “berikan analisis dan </w:t>
-      </w:r>
-      <w:r>
-        <w:rPr>
-          <w:lang w:val="en-US"/>
-        </w:rPr>
-        <w:t xml:space="preserve">tindakan yang harus dilakukan”. </w:t>
-      </w:r>
-      <w:r>
-        <w:rPr>
-          <w:lang w:val="en-US"/>
-        </w:rPr>
-        <w:t xml:space="preserve">Selain itu, dilakukan juga penegasan tujuan </w:t>
-      </w:r>
-      <w:r>
-        <w:rPr>
-          <w:i/>
-          <w:lang w:val="en-US"/>
-        </w:rPr>
-        <w:t>output</w:t>
-      </w:r>
-      <w:r>
-        <w:rPr>
-          <w:lang w:val="en-US"/>
-        </w:rPr>
-        <w:t xml:space="preserve">, dengan menambahkan arahan dalam </w:t>
-      </w:r>
-      <w:r>
-        <w:rPr>
-          <w:i/>
-          <w:lang w:val="en-US"/>
-        </w:rPr>
-        <w:t>prompt</w:t>
-      </w:r>
-      <w:r>
-        <w:rPr>
-          <w:lang w:val="en-US"/>
-        </w:rPr>
-        <w:t xml:space="preserve"> agar </w:t>
+        <w:t xml:space="preserve">Validasi tahap akhir dilakukan untuk mengukur akurasi dan kebermanfaatan saran yang dihasilkan oleh </w:t>
+      </w:r>
+      <w:r>
+        <w:rPr>
+          <w:i/>
+          <w:lang w:val="en-US"/>
+        </w:rPr>
+        <w:t>Gemini AI</w:t>
+      </w:r>
+      <w:r>
+        <w:rPr>
+          <w:lang w:val="en-US"/>
+        </w:rPr>
+        <w:t xml:space="preserve">. Pengujian dilakukan sebanyak 50 kali percobaan menggunakan berbagai variasi data sensor (kondisi normal maupun anomali). </w:t>
       </w:r>
       <w:r>
         <w:rPr>
@@ -28457,443 +29695,52 @@
         <w:rPr>
           <w:lang w:val="en-US"/>
         </w:rPr>
-        <w:t xml:space="preserve"> memberikan jawaban dalam bentuk rekomendasi </w:t>
-      </w:r>
-      <w:r>
-        <w:rPr>
-          <w:lang w:val="en-US"/>
-        </w:rPr>
-        <w:t>yang singkat dan jelas.</w:t>
-      </w:r>
-    </w:p>
-    <w:p>
-      <w:pPr>
-        <w:ind w:left="709" w:firstLine="720"/>
+        <w:t xml:space="preserve"> diminta memberikan rekomendasi, yang kemudian divalidasi silang dengan standar budidaya hortikultura dan penilaian petani. Dari total percobaan tersebut, sebanyak 43 saran dinilai valid, akurat, dan dapat langsung d</w:t>
+      </w:r>
+      <w:r>
+        <w:rPr>
+          <w:lang w:val="en-US"/>
+        </w:rPr>
+        <w:t>iterapkan di lapangan. Berdasarkan perhitungan menggunakan rumus persentase keberhasilan</w:t>
+      </w:r>
+      <w:r>
+        <w:rPr>
+          <w:lang w:val="en-US"/>
+        </w:rPr>
+        <w:t xml:space="preserve"> (n/m * 100%), diperoleh tingkat keberhasilan integrasi </w:t>
+      </w:r>
+      <w:r>
+        <w:rPr>
+          <w:i/>
+          <w:lang w:val="en-US"/>
+        </w:rPr>
+        <w:t>AI</w:t>
+      </w:r>
+      <w:r>
+        <w:rPr>
+          <w:lang w:val="en-US"/>
+        </w:rPr>
+        <w:t xml:space="preserve"> sebesar 86%. Hasil ini telah memenuhi dan melampaui standar minimal akurasi yang ditetapkan pada penelitian ini, yaitu 80%. Para responden juga mencatat bahwa bahasa yang digunakan oleh </w:t>
+      </w:r>
+      <w:r>
+        <w:rPr>
+          <w:i/>
+          <w:lang w:val="en-US"/>
+        </w:rPr>
+        <w:t>AI</w:t>
+      </w:r>
+      <w:r>
+        <w:rPr>
+          <w:lang w:val="en-US"/>
+        </w:rPr>
+        <w:t>, mudah dipahami, dan relevan dengan konteks pertanian keseharian mereka, sehingga sangat membantu dalam pengambilan keputusan taktis di lapangan.</w:t>
+      </w:r>
+    </w:p>
+    <w:p>
+      <w:pPr>
         <w:jc w:val="both"/>
         <w:rPr>
-          <w:lang w:val="en-US"/>
-        </w:rPr>
-      </w:pPr>
-      <w:r>
-        <w:rPr>
-          <w:lang w:val="en-US"/>
-        </w:rPr>
-        <w:t xml:space="preserve">Proses revisi tidak dilakukan hanya sekali, tetapi melalui beberapa siklus uji coba dengan data yang berbeda. Setiap hasil </w:t>
-      </w:r>
-      <w:r>
-        <w:rPr>
-          <w:i/>
-          <w:lang w:val="en-US"/>
-        </w:rPr>
-        <w:t>output</w:t>
-      </w:r>
-      <w:r>
-        <w:rPr>
-          <w:lang w:val="en-US"/>
-        </w:rPr>
-        <w:t xml:space="preserve"> dianalisis untuk melihat apakah rekomendasi sudah sesuai dengan kondisi nyata dan </w:t>
-      </w:r>
-      <w:r>
-        <w:rPr>
-          <w:lang w:val="en-US"/>
-        </w:rPr>
-        <w:lastRenderedPageBreak/>
-        <w:t xml:space="preserve">mudah dipahami. Dari proses ini, diperoleh pola </w:t>
-      </w:r>
-      <w:r>
-        <w:rPr>
-          <w:i/>
-          <w:lang w:val="en-US"/>
-        </w:rPr>
-        <w:t>prompt</w:t>
-      </w:r>
-      <w:r>
-        <w:rPr>
-          <w:lang w:val="en-US"/>
-        </w:rPr>
-        <w:t xml:space="preserve"> optimal </w:t>
-      </w:r>
-      <w:proofErr w:type="gramStart"/>
-      <w:r>
-        <w:rPr>
-          <w:lang w:val="en-US"/>
-        </w:rPr>
-        <w:t xml:space="preserve">yang </w:t>
-      </w:r>
-      <w:r>
-        <w:rPr>
-          <w:lang w:val="en-US"/>
-        </w:rPr>
-        <w:t xml:space="preserve"> memiliki</w:t>
-      </w:r>
-      <w:proofErr w:type="gramEnd"/>
-      <w:r>
-        <w:rPr>
-          <w:lang w:val="en-US"/>
-        </w:rPr>
-        <w:t xml:space="preserve"> instruksi yang jelas. Dengan pendekatan ini, sistem mampu menghasilkan </w:t>
-      </w:r>
-      <w:r>
-        <w:rPr>
-          <w:i/>
-          <w:lang w:val="en-US"/>
-        </w:rPr>
-        <w:t>output</w:t>
-      </w:r>
-      <w:r>
-        <w:rPr>
-          <w:lang w:val="en-US"/>
-        </w:rPr>
-        <w:t xml:space="preserve"> yang konsisten dan memiliki nilai praktis bagi pengguna.</w:t>
-      </w:r>
-    </w:p>
-    <w:p>
-      <w:pPr>
-        <w:ind w:left="720"/>
-        <w:jc w:val="both"/>
-        <w:rPr>
-          <w:lang w:val="en-US"/>
-        </w:rPr>
-      </w:pPr>
-      <w:r>
-        <w:rPr>
-          <w:lang w:val="en-US"/>
-        </w:rPr>
-        <w:t xml:space="preserve">Selain revisi pada </w:t>
-      </w:r>
-      <w:r>
-        <w:rPr>
-          <w:i/>
-          <w:lang w:val="en-US"/>
-        </w:rPr>
-        <w:t>prompt</w:t>
-      </w:r>
-      <w:r>
-        <w:rPr>
-          <w:lang w:val="en-US"/>
-        </w:rPr>
-        <w:t xml:space="preserve">, dilakukan juga perbaikan pada aspek lain seperti tampilan antarmuka, peningkatan kecepatan respon sistem, serta penyederhanaan beberapa istilah teknis agar lebih mudah dipahami. </w:t>
-      </w:r>
-    </w:p>
-    <w:p>
-      <w:pPr>
-        <w:ind w:left="720"/>
-        <w:jc w:val="both"/>
-        <w:rPr>
-          <w:lang w:val="en-US"/>
-        </w:rPr>
-      </w:pPr>
-      <w:r>
-        <w:rPr>
-          <w:lang w:val="en-US"/>
-        </w:rPr>
-        <w:t xml:space="preserve">Setelah sistem mencapai tingkat performa yang diinginkan, dilakukan tahap </w:t>
-      </w:r>
-      <w:r>
-        <w:rPr>
-          <w:i/>
-          <w:lang w:val="en-US"/>
-        </w:rPr>
-        <w:t>deployment</w:t>
-      </w:r>
-      <w:r>
-        <w:rPr>
-          <w:lang w:val="en-US"/>
-        </w:rPr>
-        <w:t xml:space="preserve"> menggunakan </w:t>
-      </w:r>
-      <w:r>
-        <w:rPr>
-          <w:i/>
-          <w:lang w:val="en-US"/>
-        </w:rPr>
-        <w:t>Vercel</w:t>
-      </w:r>
-      <w:r>
-        <w:rPr>
-          <w:lang w:val="en-US"/>
-        </w:rPr>
-        <w:t xml:space="preserve">. </w:t>
-      </w:r>
-      <w:r>
-        <w:rPr>
-          <w:i/>
-          <w:lang w:val="en-US"/>
-        </w:rPr>
-        <w:t>Vercel</w:t>
-      </w:r>
-      <w:r>
-        <w:rPr>
-          <w:lang w:val="en-US"/>
-        </w:rPr>
-        <w:t xml:space="preserve"> dipilih karena kemudahan integrasinya dengan </w:t>
-      </w:r>
-      <w:r>
-        <w:rPr>
-          <w:i/>
-          <w:lang w:val="en-US"/>
-        </w:rPr>
-        <w:t xml:space="preserve">framework front </w:t>
-      </w:r>
-      <w:r>
-        <w:rPr>
-          <w:i/>
-          <w:lang w:val="en-US"/>
-        </w:rPr>
-        <w:t>end</w:t>
-      </w:r>
-      <w:r>
-        <w:rPr>
-          <w:lang w:val="en-US"/>
-        </w:rPr>
-        <w:t xml:space="preserve"> seperti </w:t>
-      </w:r>
-      <w:r>
-        <w:rPr>
-          <w:i/>
-          <w:lang w:val="en-US"/>
-        </w:rPr>
-        <w:t>Preact</w:t>
-      </w:r>
-      <w:r>
-        <w:rPr>
-          <w:lang w:val="en-US"/>
-        </w:rPr>
-        <w:t xml:space="preserve"> serta kemampuannya dalam melakukan </w:t>
-      </w:r>
-      <w:r>
-        <w:rPr>
-          <w:i/>
-          <w:lang w:val="en-US"/>
-        </w:rPr>
-        <w:t>deployment</w:t>
-      </w:r>
-      <w:r>
-        <w:rPr>
-          <w:lang w:val="en-US"/>
-        </w:rPr>
-        <w:t xml:space="preserve"> secara cepat dan otomatis. Proses </w:t>
-      </w:r>
-      <w:r>
-        <w:rPr>
-          <w:i/>
-          <w:lang w:val="en-US"/>
-        </w:rPr>
-        <w:t>deployment</w:t>
-      </w:r>
-      <w:r>
-        <w:rPr>
-          <w:lang w:val="en-US"/>
-        </w:rPr>
-        <w:t xml:space="preserve"> dimulai dengan mengunggah </w:t>
-      </w:r>
-      <w:r>
-        <w:rPr>
-          <w:i/>
-          <w:lang w:val="en-US"/>
-        </w:rPr>
-        <w:t>source code</w:t>
-      </w:r>
-      <w:r>
-        <w:rPr>
-          <w:lang w:val="en-US"/>
-        </w:rPr>
-        <w:t xml:space="preserve"> ke </w:t>
-      </w:r>
-      <w:r>
-        <w:rPr>
-          <w:i/>
-          <w:lang w:val="en-US"/>
-        </w:rPr>
-        <w:t>GitHub</w:t>
-      </w:r>
-      <w:r>
-        <w:rPr>
-          <w:lang w:val="en-US"/>
-        </w:rPr>
-        <w:t xml:space="preserve">, kemudian menghubungkannya dengan </w:t>
-      </w:r>
-      <w:r>
-        <w:rPr>
-          <w:i/>
-          <w:lang w:val="en-US"/>
-        </w:rPr>
-        <w:t>platform Vercel</w:t>
-      </w:r>
-      <w:r>
-        <w:rPr>
-          <w:lang w:val="en-US"/>
-        </w:rPr>
-        <w:t xml:space="preserve">. Setelah terhubung, </w:t>
-      </w:r>
-      <w:r>
-        <w:rPr>
-          <w:i/>
-          <w:lang w:val="en-US"/>
-        </w:rPr>
-        <w:t>Vercel</w:t>
-      </w:r>
-      <w:r>
-        <w:rPr>
-          <w:lang w:val="en-US"/>
-        </w:rPr>
-        <w:t xml:space="preserve"> secara otomatis melakukan proses </w:t>
-      </w:r>
-      <w:r>
-        <w:rPr>
-          <w:i/>
-          <w:lang w:val="en-US"/>
-        </w:rPr>
-        <w:t>build</w:t>
-      </w:r>
-      <w:r>
-        <w:rPr>
-          <w:lang w:val="en-US"/>
-        </w:rPr>
-        <w:t xml:space="preserve"> dan </w:t>
-      </w:r>
-      <w:r>
-        <w:rPr>
-          <w:i/>
-          <w:lang w:val="en-US"/>
-        </w:rPr>
-        <w:t>deploy</w:t>
-      </w:r>
-      <w:r>
-        <w:rPr>
-          <w:lang w:val="en-US"/>
-        </w:rPr>
-        <w:t xml:space="preserve"> setiap kali terdapat pembaruan pada </w:t>
-      </w:r>
-      <w:r>
-        <w:rPr>
-          <w:i/>
-          <w:lang w:val="en-US"/>
-        </w:rPr>
-        <w:t>repository</w:t>
-      </w:r>
-      <w:r>
-        <w:rPr>
-          <w:lang w:val="en-US"/>
-        </w:rPr>
-        <w:t>.</w:t>
-      </w:r>
-    </w:p>
-    <w:p>
-      <w:pPr>
-        <w:ind w:left="709" w:firstLine="720"/>
-        <w:jc w:val="both"/>
-        <w:rPr>
-          <w:lang w:val="en-US"/>
-        </w:rPr>
-      </w:pPr>
-      <w:r>
-        <w:rPr>
-          <w:lang w:val="en-US"/>
-        </w:rPr>
-        <w:t xml:space="preserve">Konfigurasi </w:t>
-      </w:r>
-      <w:r>
-        <w:rPr>
-          <w:i/>
-          <w:lang w:val="en-US"/>
-        </w:rPr>
-        <w:t>environment</w:t>
-      </w:r>
-      <w:r>
-        <w:rPr>
-          <w:lang w:val="en-US"/>
-        </w:rPr>
-        <w:t xml:space="preserve"> seperti </w:t>
-      </w:r>
-      <w:r>
-        <w:rPr>
-          <w:i/>
-          <w:lang w:val="en-US"/>
-        </w:rPr>
-        <w:t>API key Gemini AI</w:t>
-      </w:r>
-      <w:r>
-        <w:rPr>
-          <w:lang w:val="en-US"/>
-        </w:rPr>
-        <w:t xml:space="preserve"> juga dilakukan pada </w:t>
-      </w:r>
-      <w:r>
-        <w:rPr>
-          <w:i/>
-          <w:lang w:val="en-US"/>
-        </w:rPr>
-        <w:t>Vercel</w:t>
-      </w:r>
-      <w:r>
-        <w:rPr>
-          <w:lang w:val="en-US"/>
-        </w:rPr>
-        <w:t xml:space="preserve"> melalui fitur </w:t>
-      </w:r>
-      <w:r>
-        <w:rPr>
-          <w:i/>
-          <w:lang w:val="en-US"/>
-        </w:rPr>
-        <w:t>environment variables</w:t>
-      </w:r>
-      <w:r>
-        <w:rPr>
-          <w:lang w:val="en-US"/>
-        </w:rPr>
-        <w:t xml:space="preserve">, sehingga keamanan data tetap terjaga dan tidak terekspos secara langsung di dalam kode. Setelah proses </w:t>
-      </w:r>
-      <w:r>
-        <w:rPr>
-          <w:i/>
-          <w:lang w:val="en-US"/>
-        </w:rPr>
-        <w:t>deploy</w:t>
-      </w:r>
-      <w:r>
-        <w:rPr>
-          <w:lang w:val="en-US"/>
-        </w:rPr>
-        <w:t xml:space="preserve"> selesai, sistem dapat diakses melalui URL publik yang disediakan oleh </w:t>
-      </w:r>
-      <w:r>
-        <w:rPr>
-          <w:i/>
-          <w:lang w:val="en-US"/>
-        </w:rPr>
-        <w:t>Vercel</w:t>
-      </w:r>
-      <w:r>
-        <w:rPr>
-          <w:lang w:val="en-US"/>
-        </w:rPr>
-        <w:t>.</w:t>
-      </w:r>
-    </w:p>
-    <w:p>
-      <w:pPr>
-        <w:jc w:val="both"/>
-        <w:rPr>
           <w:color w:val="FF0000"/>
-          <w:lang w:val="en-US"/>
-        </w:rPr>
-      </w:pPr>
-      <w:bookmarkStart w:id="70" w:name="_GoBack"/>
-      <w:bookmarkEnd w:id="70"/>
-      <w:r>
-        <w:rPr>
-          <w:color w:val="FF0000"/>
-          <w:lang w:val="en-US"/>
-        </w:rPr>
-        <w:t>*Tambah bukti deploy vercel</w:t>
-      </w:r>
-    </w:p>
-    <w:p>
-      <w:pPr>
-        <w:jc w:val="both"/>
-        <w:rPr>
           <w:lang w:val="en-US"/>
         </w:rPr>
       </w:pPr>
@@ -28910,326 +29757,46 @@
         <w:rPr>
           <w:lang w:val="en-US"/>
         </w:rPr>
-        <w:t xml:space="preserve">Berdasarkan hasil implementasi yang telah dilakukan, dapat disimpulkan bahwa metode </w:t>
-      </w:r>
-      <w:r>
-        <w:rPr>
-          <w:i/>
-          <w:lang w:val="en-US"/>
-        </w:rPr>
-        <w:t>Agile</w:t>
-      </w:r>
-      <w:r>
-        <w:rPr>
-          <w:lang w:val="en-US"/>
-        </w:rPr>
-        <w:t xml:space="preserve"> yang dikombinasikan dengan </w:t>
-      </w:r>
-      <w:r>
-        <w:rPr>
-          <w:i/>
-          <w:lang w:val="en-US"/>
-        </w:rPr>
-        <w:t>User Centered Design</w:t>
-      </w:r>
-      <w:r>
-        <w:rPr>
-          <w:lang w:val="en-US"/>
-        </w:rPr>
-        <w:t xml:space="preserve"> berhasil menghasilkan sistem yang adaptif, mudah digunakan, dan sesuai dengan kebutuhan pengguna. Sistem yang dibangun mampu memberikan rekomendasi yang cukup akurat dan relevan dalam membantu pengambilan</w:t>
-      </w:r>
-      <w:r>
-        <w:rPr>
-          <w:lang w:val="en-US"/>
-        </w:rPr>
-        <w:t xml:space="preserve"> keputusan di bidang pertanian.</w:t>
-      </w:r>
-    </w:p>
-    <w:p>
-      <w:pPr>
-        <w:pStyle w:val="Heading2"/>
-      </w:pPr>
-      <w:bookmarkStart w:id="71" w:name="_Toc137038249"/>
-      <w:bookmarkStart w:id="72" w:name="_Toc225245270"/>
-      <w:r>
-        <w:t>4.2 Hasil Evaluasi dan Validasi Solusi</w:t>
-      </w:r>
-      <w:bookmarkEnd w:id="71"/>
-      <w:bookmarkEnd w:id="72"/>
-      <w:r>
+        <w:t xml:space="preserve">Berdasarkan hasil evaluasi dari ketiga tahapan tersebut, dapat disimpulkan bahwa sistem rumah kaca yang dikembangkan telah memenuhi standar kelayakan teknis dan fungsional. Sistem terbukti memiliki tingkat </w:t>
+      </w:r>
+      <w:r>
+        <w:rPr>
+          <w:i/>
+          <w:lang w:val="en-US"/>
+        </w:rPr>
+        <w:t>uptime</w:t>
+      </w:r>
+      <w:r>
+        <w:rPr>
+          <w:lang w:val="en-US"/>
+        </w:rPr>
+        <w:t xml:space="preserve"> yang tinggi sebesar 98%, skor </w:t>
+      </w:r>
+      <w:r>
+        <w:rPr>
+          <w:i/>
+          <w:lang w:val="en-US"/>
+        </w:rPr>
+        <w:t>usability</w:t>
+      </w:r>
+      <w:r>
+        <w:rPr>
+          <w:lang w:val="en-US"/>
+        </w:rPr>
         <w:t xml:space="preserve"> </w:t>
       </w:r>
-    </w:p>
-    <w:p>
-      <w:pPr>
-        <w:jc w:val="both"/>
-      </w:pPr>
-      <w:r>
-        <w:t xml:space="preserve">Hasil evaluasi dan validasi solusi pada penelitian ini mencakup pengujian teknis sistem, pengujian </w:t>
-      </w:r>
-      <w:r>
-        <w:rPr>
-          <w:i/>
-        </w:rPr>
-        <w:t>usability</w:t>
-      </w:r>
-      <w:r>
-        <w:t xml:space="preserve">, serta validasi fungsi deskriptif dari </w:t>
-      </w:r>
-      <w:r>
-        <w:rPr>
-          <w:i/>
-        </w:rPr>
-        <w:t>Gemini AI</w:t>
-      </w:r>
-      <w:r>
-        <w:t>. Evaluasi ini bertujuan untuk memastikan bahwa sistem yang dikembangkan tidak hanya berjalan dengan baik secara teknis, tetapi juga memberikan manfaat nyata bagi pengguna dalam konteks penge</w:t>
-      </w:r>
-      <w:r>
-        <w:t>lolaan rumah kaca hortikultura.</w:t>
-      </w:r>
-    </w:p>
-    <w:p>
-      <w:pPr>
-        <w:pStyle w:val="Heading3"/>
-        <w:ind w:firstLine="709"/>
-        <w:rPr>
-          <w:lang w:val="en-US"/>
-        </w:rPr>
-      </w:pPr>
-      <w:bookmarkStart w:id="73" w:name="_Toc225245271"/>
-      <w:r>
-        <w:rPr>
-          <w:lang w:val="en-US"/>
-        </w:rPr>
-        <w:lastRenderedPageBreak/>
-        <w:t>4.2.1 Hasil Pengujian Teknis Sistem</w:t>
-      </w:r>
-      <w:bookmarkEnd w:id="73"/>
-    </w:p>
-    <w:p>
-      <w:pPr>
-        <w:ind w:left="709" w:firstLine="720"/>
-        <w:jc w:val="both"/>
-        <w:rPr>
-          <w:lang w:val="en-US"/>
-        </w:rPr>
-      </w:pPr>
-      <w:r>
-        <w:rPr>
-          <w:lang w:val="en-US"/>
-        </w:rPr>
-        <w:t xml:space="preserve">Pengujian teknis difokuskan pada respons antarmuka, dan kelancaran integrasi </w:t>
-      </w:r>
-      <w:r>
-        <w:rPr>
-          <w:i/>
-          <w:lang w:val="en-US"/>
-        </w:rPr>
-        <w:t>API Gemini AI</w:t>
-      </w:r>
-      <w:r>
-        <w:rPr>
-          <w:lang w:val="en-US"/>
-        </w:rPr>
-        <w:t xml:space="preserve">. Berdasarkan pengamatan selama 100 jam operasional, sistem mencatatkan waktu </w:t>
-      </w:r>
-      <w:r>
-        <w:rPr>
-          <w:i/>
-          <w:lang w:val="en-US"/>
-        </w:rPr>
-        <w:t>uptime</w:t>
-      </w:r>
-      <w:r>
-        <w:rPr>
-          <w:lang w:val="en-US"/>
-        </w:rPr>
-        <w:t xml:space="preserve"> selama 98 jam. Dengan demikian, persentase </w:t>
-      </w:r>
-      <w:r>
-        <w:rPr>
-          <w:i/>
-          <w:lang w:val="en-US"/>
-        </w:rPr>
-        <w:t>uptime</w:t>
-      </w:r>
-      <w:r>
-        <w:rPr>
-          <w:lang w:val="en-US"/>
-        </w:rPr>
-        <w:t xml:space="preserve"> sistem mencapai 98%. Angka ini telah melampaui standar keberhasilan minimal yang ditetapkan, yaitu 96%. Selain itu, integrasi </w:t>
-      </w:r>
-      <w:r>
-        <w:rPr>
-          <w:i/>
-          <w:lang w:val="en-US"/>
-        </w:rPr>
-        <w:t>API</w:t>
-      </w:r>
-      <w:r>
-        <w:rPr>
-          <w:lang w:val="en-US"/>
-        </w:rPr>
-        <w:t xml:space="preserve"> berjalan dengan stabil tanpa adanya </w:t>
-      </w:r>
-      <w:r>
-        <w:rPr>
-          <w:i/>
-          <w:lang w:val="en-US"/>
-        </w:rPr>
-        <w:t>bottleneck</w:t>
-      </w:r>
-      <w:r>
-        <w:rPr>
-          <w:lang w:val="en-US"/>
-        </w:rPr>
-        <w:t xml:space="preserve"> yang signifikan. Aliran data sensor ke dashboard </w:t>
-      </w:r>
-      <w:r>
-        <w:rPr>
-          <w:i/>
-          <w:lang w:val="en-US"/>
-        </w:rPr>
-        <w:t>Preact</w:t>
-      </w:r>
-      <w:r>
-        <w:rPr>
-          <w:lang w:val="en-US"/>
-        </w:rPr>
-        <w:t xml:space="preserve"> dan </w:t>
-      </w:r>
-      <w:r>
-        <w:rPr>
-          <w:i/>
-          <w:lang w:val="en-US"/>
-        </w:rPr>
-        <w:t>prompt</w:t>
-      </w:r>
-      <w:r>
-        <w:rPr>
-          <w:lang w:val="en-US"/>
-        </w:rPr>
-        <w:t xml:space="preserve"> ke </w:t>
-      </w:r>
-      <w:r>
-        <w:rPr>
-          <w:i/>
-          <w:lang w:val="en-US"/>
-        </w:rPr>
-        <w:t>Gemini AI</w:t>
-      </w:r>
-      <w:r>
-        <w:rPr>
-          <w:lang w:val="en-US"/>
-        </w:rPr>
-        <w:t xml:space="preserve"> memiliki </w:t>
-      </w:r>
-      <w:r>
-        <w:rPr>
-          <w:i/>
-          <w:lang w:val="en-US"/>
-        </w:rPr>
-        <w:t>response</w:t>
-      </w:r>
-      <w:r>
-        <w:rPr>
-          <w:lang w:val="en-US"/>
-        </w:rPr>
-        <w:t xml:space="preserve"> time rata </w:t>
-      </w:r>
-      <w:r>
-        <w:rPr>
-          <w:lang w:val="en-US"/>
-        </w:rPr>
-        <w:t>rata di bawah 3 detik, menunjukkan bahwa arsitektur sistem cukup tangguh untuk kebutuhan operasional rumah kaca yang berkelanjutan.</w:t>
-      </w:r>
-    </w:p>
-    <w:p>
-      <w:pPr>
-        <w:ind w:left="709" w:firstLine="720"/>
-        <w:jc w:val="both"/>
-        <w:rPr>
-          <w:color w:val="FF0000"/>
-          <w:lang w:val="en-US"/>
-        </w:rPr>
-      </w:pPr>
-      <w:r>
-        <w:rPr>
-          <w:color w:val="FF0000"/>
-          <w:lang w:val="en-US"/>
-        </w:rPr>
-        <w:t>*screenshot devtools network tab</w:t>
-      </w:r>
-      <w:r>
-        <w:rPr>
-          <w:color w:val="FF0000"/>
-          <w:lang w:val="en-US"/>
-        </w:rPr>
-        <w:t xml:space="preserve"> &amp; dashboard vercel</w:t>
-      </w:r>
-    </w:p>
-    <w:p>
-      <w:pPr>
-        <w:pStyle w:val="Heading3"/>
-        <w:ind w:firstLine="709"/>
-        <w:rPr>
-          <w:lang w:val="en-US"/>
-        </w:rPr>
-      </w:pPr>
-      <w:bookmarkStart w:id="74" w:name="_Toc225245272"/>
-      <w:r>
-        <w:rPr>
-          <w:lang w:val="en-US"/>
-        </w:rPr>
-        <w:t xml:space="preserve">4.2.2 Hasil Pengujian </w:t>
-      </w:r>
-      <w:r>
-        <w:rPr>
-          <w:i/>
-          <w:lang w:val="en-US"/>
-        </w:rPr>
-        <w:t>Usability Testing</w:t>
-      </w:r>
-      <w:bookmarkEnd w:id="74"/>
-    </w:p>
-    <w:p>
-      <w:pPr>
-        <w:ind w:left="709" w:firstLine="720"/>
-        <w:jc w:val="both"/>
-        <w:rPr>
-          <w:lang w:val="en-US"/>
-        </w:rPr>
-      </w:pPr>
-      <w:r>
-        <w:rPr>
-          <w:lang w:val="en-US"/>
-        </w:rPr>
-        <w:t xml:space="preserve">Pengujian </w:t>
-      </w:r>
-      <w:r>
-        <w:rPr>
-          <w:lang w:val="en-US"/>
-        </w:rPr>
-        <w:t>ini</w:t>
-      </w:r>
-      <w:r>
-        <w:rPr>
-          <w:lang w:val="en-US"/>
-        </w:rPr>
-        <w:t xml:space="preserve"> melibatkan 10 orang </w:t>
-      </w:r>
-      <w:r>
-        <w:rPr>
-          <w:lang w:val="en-US"/>
-        </w:rPr>
-        <w:t>pengguna</w:t>
-      </w:r>
-      <w:r>
-        <w:rPr>
-          <w:lang w:val="en-US"/>
-        </w:rPr>
-        <w:t xml:space="preserve"> yang diminta untuk menjalankan skenario penggunaan sistem, mulai dari memantau data sensor hingga membaca rekomendasi </w:t>
+      <w:r>
+        <w:rPr>
+          <w:i/>
+          <w:lang w:val="en-US"/>
+        </w:rPr>
+        <w:t>(SUS)</w:t>
+      </w:r>
+      <w:r>
+        <w:rPr>
+          <w:lang w:val="en-US"/>
+        </w:rPr>
+        <w:t xml:space="preserve"> sebesar 76,5 yang mengindikasikan penerimaan pengguna yang baik, serta tingkat akurasi rekomendasi </w:t>
       </w:r>
       <w:r>
         <w:rPr>
@@ -29242,268 +29809,14 @@
         <w:rPr>
           <w:lang w:val="en-US"/>
         </w:rPr>
-        <w:t xml:space="preserve">. Pengukuran dilakukan menggunakan </w:t>
-      </w:r>
-      <w:r>
-        <w:rPr>
-          <w:i/>
-          <w:lang w:val="en-US"/>
-        </w:rPr>
-        <w:t>instrumen System Usability Scale (SUS)</w:t>
-      </w:r>
-      <w:r>
-        <w:rPr>
-          <w:lang w:val="en-US"/>
-        </w:rPr>
-        <w:t>. Setelah kuesioner dari kesepuluh responden dikumpulkan dan dihitung sesuai dengan aturan konversi SUS, diperol</w:t>
-      </w:r>
-      <w:r>
-        <w:rPr>
-          <w:lang w:val="en-US"/>
-        </w:rPr>
-        <w:t>eh skor rata-rata sebesar 76</w:t>
-      </w:r>
-      <w:proofErr w:type="gramStart"/>
-      <w:r>
-        <w:rPr>
-          <w:lang w:val="en-US"/>
-        </w:rPr>
-        <w:t>,5</w:t>
-      </w:r>
-      <w:proofErr w:type="gramEnd"/>
-      <w:r>
-        <w:rPr>
-          <w:lang w:val="en-US"/>
-        </w:rPr>
-        <w:t>.</w:t>
-      </w:r>
-    </w:p>
-    <w:p>
-      <w:pPr>
-        <w:ind w:left="709" w:firstLine="11"/>
-        <w:jc w:val="both"/>
-        <w:rPr>
-          <w:lang w:val="en-US"/>
-        </w:rPr>
-      </w:pPr>
-      <w:r>
-        <w:rPr>
-          <w:lang w:val="en-US"/>
-        </w:rPr>
-        <w:t xml:space="preserve">Merujuk pada </w:t>
-      </w:r>
-      <w:r>
-        <w:rPr>
-          <w:i/>
-          <w:lang w:val="en-US"/>
-        </w:rPr>
-        <w:t>threshold</w:t>
-      </w:r>
-      <w:r>
-        <w:rPr>
-          <w:lang w:val="en-US"/>
-        </w:rPr>
-        <w:t xml:space="preserve"> evaluasi, skor 76</w:t>
-      </w:r>
-      <w:proofErr w:type="gramStart"/>
-      <w:r>
-        <w:rPr>
-          <w:lang w:val="en-US"/>
-        </w:rPr>
-        <w:t>,5</w:t>
-      </w:r>
-      <w:proofErr w:type="gramEnd"/>
-      <w:r>
-        <w:rPr>
-          <w:lang w:val="en-US"/>
-        </w:rPr>
-        <w:t xml:space="preserve"> berada pada rentang nilai Good - Excellent (≥ 70) dan masuk dalam kategori </w:t>
-      </w:r>
-      <w:r>
-        <w:rPr>
-          <w:i/>
-          <w:lang w:val="en-US"/>
-        </w:rPr>
-        <w:t>Acceptable</w:t>
-      </w:r>
-      <w:r>
-        <w:rPr>
-          <w:lang w:val="en-US"/>
-        </w:rPr>
-        <w:t xml:space="preserve">. Hal ini membuktikan bahwa desain antarmuka berbasis </w:t>
-      </w:r>
-      <w:r>
-        <w:rPr>
-          <w:i/>
-          <w:lang w:val="en-US"/>
-        </w:rPr>
-        <w:t>PicoCSS</w:t>
-      </w:r>
-      <w:r>
-        <w:rPr>
-          <w:lang w:val="en-US"/>
-        </w:rPr>
-        <w:t xml:space="preserve"> dan </w:t>
-      </w:r>
-      <w:r>
-        <w:rPr>
-          <w:i/>
-          <w:lang w:val="en-US"/>
-        </w:rPr>
-        <w:t>Preact</w:t>
-      </w:r>
-      <w:r>
-        <w:rPr>
-          <w:lang w:val="en-US"/>
-        </w:rPr>
-        <w:t xml:space="preserve"> dinilai mudah digunakan, tidak membingungkan, dan petani merasa cukup percaya diri dalam mengoperasikannya tanpa memerlukan pendampingan teknisi yang intensif. Secara kualitatif, responden memberikan umpan balik positif terhadap tampilan visual yang bersih, meskipun terdapat beberapa masukan minor terkait ukuran font grafik riwayat data yang perlu sedikit diperbesar agar lebih mudah dibaca di bawah sinar matahari langsung.</w:t>
-      </w:r>
-    </w:p>
-    <w:p>
-      <w:pPr>
-        <w:pStyle w:val="Heading3"/>
-        <w:ind w:firstLine="709"/>
-        <w:rPr>
-          <w:lang w:val="en-US"/>
-        </w:rPr>
-      </w:pPr>
-      <w:bookmarkStart w:id="75" w:name="_Toc225245273"/>
-      <w:r>
-        <w:rPr>
-          <w:lang w:val="en-US"/>
-        </w:rPr>
-        <w:t>4.2.3 Hasil Validasi Fungsi Deskriptif Gemini AI</w:t>
-      </w:r>
-      <w:bookmarkEnd w:id="75"/>
-    </w:p>
-    <w:p>
-      <w:pPr>
-        <w:ind w:left="709" w:firstLine="720"/>
-        <w:jc w:val="both"/>
-        <w:rPr>
-          <w:lang w:val="en-US"/>
-        </w:rPr>
-      </w:pPr>
-      <w:r>
-        <w:rPr>
-          <w:lang w:val="en-US"/>
-        </w:rPr>
-        <w:t xml:space="preserve">Validasi tahap akhir dilakukan untuk mengukur akurasi dan kebermanfaatan saran yang dihasilkan oleh </w:t>
-      </w:r>
-      <w:r>
-        <w:rPr>
-          <w:i/>
-          <w:lang w:val="en-US"/>
-        </w:rPr>
-        <w:t>Gemini AI</w:t>
-      </w:r>
-      <w:r>
-        <w:rPr>
-          <w:lang w:val="en-US"/>
-        </w:rPr>
-        <w:t xml:space="preserve">. Pengujian dilakukan sebanyak 50 kali percobaan menggunakan berbagai variasi data sensor (kondisi normal maupun anomali). </w:t>
-      </w:r>
-      <w:r>
-        <w:rPr>
-          <w:i/>
-          <w:lang w:val="en-US"/>
-        </w:rPr>
-        <w:t>AI</w:t>
-      </w:r>
-      <w:r>
-        <w:rPr>
-          <w:lang w:val="en-US"/>
-        </w:rPr>
-        <w:t xml:space="preserve"> diminta memberikan rekomendasi, yang kemudian divalidasi silang dengan standar budidaya </w:t>
-      </w:r>
-      <w:r>
-        <w:rPr>
-          <w:lang w:val="en-US"/>
-        </w:rPr>
-        <w:lastRenderedPageBreak/>
-        <w:t>hortikultura dan penilaian petani. Dari total percobaan tersebut, sebanyak 43 saran dinilai valid, akurat, dan dapat langsung d</w:t>
-      </w:r>
-      <w:r>
-        <w:rPr>
-          <w:lang w:val="en-US"/>
-        </w:rPr>
-        <w:t>iterapkan di lapangan. Berdasarkan perhitungan menggunakan rumus persentase keberhasilan</w:t>
-      </w:r>
-      <w:r>
-        <w:rPr>
-          <w:lang w:val="en-US"/>
-        </w:rPr>
-        <w:t xml:space="preserve"> (n/m * 100%), diperoleh tingkat keberhasilan integrasi </w:t>
-      </w:r>
-      <w:r>
-        <w:rPr>
-          <w:i/>
-          <w:lang w:val="en-US"/>
-        </w:rPr>
-        <w:t>AI</w:t>
-      </w:r>
-      <w:r>
-        <w:rPr>
-          <w:lang w:val="en-US"/>
-        </w:rPr>
-        <w:t xml:space="preserve"> sebesar 86%. Hasil ini telah memenuhi dan melampaui standar minimal akurasi yang ditetapkan pada penelitian ini, yaitu 80%. Para responden juga mencatat bahwa bahasa yang digunakan oleh </w:t>
-      </w:r>
-      <w:r>
-        <w:rPr>
-          <w:i/>
-          <w:lang w:val="en-US"/>
-        </w:rPr>
-        <w:t>AI</w:t>
-      </w:r>
-      <w:r>
-        <w:rPr>
-          <w:lang w:val="en-US"/>
-        </w:rPr>
-        <w:t>, mudah dipahami, dan relevan dengan konteks pertanian keseharian mereka, sehingga sangat membantu dalam pengambilan keputusan taktis di lapangan.</w:t>
-      </w:r>
-    </w:p>
-    <w:p>
-      <w:pPr>
-        <w:jc w:val="both"/>
-        <w:rPr>
-          <w:color w:val="FF0000"/>
-          <w:lang w:val="en-US"/>
-        </w:rPr>
-      </w:pPr>
-    </w:p>
-    <w:p>
-      <w:pPr>
-        <w:ind w:firstLine="0"/>
-        <w:jc w:val="both"/>
-        <w:rPr>
-          <w:lang w:val="en-US"/>
-        </w:rPr>
-      </w:pPr>
-      <w:r>
-        <w:rPr>
-          <w:lang w:val="en-US"/>
-        </w:rPr>
-        <w:t xml:space="preserve">Berdasarkan hasil evaluasi dari ketiga tahapan tersebut, dapat disimpulkan bahwa sistem rumah kaca yang dikembangkan telah memenuhi standar kelayakan teknis dan fungsional. Sistem terbukti memiliki tingkat </w:t>
-      </w:r>
-      <w:r>
-        <w:rPr>
-          <w:i/>
-          <w:lang w:val="en-US"/>
-        </w:rPr>
-        <w:t>uptime</w:t>
-      </w:r>
-      <w:r>
-        <w:rPr>
-          <w:lang w:val="en-US"/>
-        </w:rPr>
-        <w:t xml:space="preserve"> yang tinggi sebesar 98%, skor </w:t>
-      </w:r>
-      <w:r>
-        <w:rPr>
-          <w:i/>
-          <w:lang w:val="en-US"/>
-        </w:rPr>
-        <w:t>usability</w:t>
+        <w:t xml:space="preserve"> sebesar 86% yang relevan dengan standar hortikultura. Sebagai saran pengembangan, antarmuka sistem ke depannya dapat dilengkapi dengan </w:t>
+      </w:r>
+      <w:r>
+        <w:rPr>
+          <w:i/>
+          <w:lang w:val="en-US"/>
+        </w:rPr>
+        <w:t>mode gelap</w:t>
       </w:r>
       <w:r>
         <w:rPr>
@@ -29516,45 +29829,6 @@
           <w:i/>
           <w:lang w:val="en-US"/>
         </w:rPr>
-        <w:t>(SUS)</w:t>
-      </w:r>
-      <w:r>
-        <w:rPr>
-          <w:lang w:val="en-US"/>
-        </w:rPr>
-        <w:t xml:space="preserve"> sebesar 76,5 yang mengindikasikan penerimaan pengguna yang baik, serta tingkat akurasi rekomendasi </w:t>
-      </w:r>
-      <w:r>
-        <w:rPr>
-          <w:i/>
-          <w:lang w:val="en-US"/>
-        </w:rPr>
-        <w:t>AI</w:t>
-      </w:r>
-      <w:r>
-        <w:rPr>
-          <w:lang w:val="en-US"/>
-        </w:rPr>
-        <w:t xml:space="preserve"> sebesar 86% yang relevan dengan standar hortikultura. Sebagai saran pengembangan, antarmuka sistem ke depannya dapat dilengkapi dengan </w:t>
-      </w:r>
-      <w:r>
-        <w:rPr>
-          <w:i/>
-          <w:lang w:val="en-US"/>
-        </w:rPr>
-        <w:t>mode gelap</w:t>
-      </w:r>
-      <w:r>
-        <w:rPr>
-          <w:lang w:val="en-US"/>
-        </w:rPr>
-        <w:t xml:space="preserve"> </w:t>
-      </w:r>
-      <w:r>
-        <w:rPr>
-          <w:i/>
-          <w:lang w:val="en-US"/>
-        </w:rPr>
         <w:t>(dark mode)</w:t>
       </w:r>
       <w:r>
@@ -29583,8 +29857,8 @@
           <w:lang w:val="en-US"/>
         </w:rPr>
       </w:pPr>
-      <w:bookmarkStart w:id="76" w:name="_Toc137038250"/>
-      <w:bookmarkStart w:id="77" w:name="_Toc225245274"/>
+      <w:bookmarkStart w:id="78" w:name="_Toc137038250"/>
+      <w:bookmarkStart w:id="79" w:name="_Toc225245274"/>
       <w:r>
         <w:rPr>
           <w:lang w:val="en-US"/>
@@ -29592,311 +29866,17 @@
         <w:lastRenderedPageBreak/>
         <w:t>BAB 5. KESIMPULAN DAN SARAN</w:t>
       </w:r>
-      <w:bookmarkEnd w:id="76"/>
-      <w:bookmarkEnd w:id="77"/>
-    </w:p>
-    <w:p>
-      <w:pPr>
-        <w:pStyle w:val="Heading2"/>
-      </w:pPr>
-      <w:bookmarkStart w:id="78" w:name="_Toc137038251"/>
-      <w:bookmarkStart w:id="79" w:name="_Toc225245275"/>
-      <w:r>
-        <w:t>5.1 Kesimpulan</w:t>
-      </w:r>
       <w:bookmarkEnd w:id="78"/>
       <w:bookmarkEnd w:id="79"/>
     </w:p>
     <w:p>
       <w:pPr>
-        <w:jc w:val="both"/>
-        <w:rPr>
-          <w:lang w:val="en-US"/>
-        </w:rPr>
-      </w:pPr>
-      <w:r>
-        <w:rPr>
-          <w:lang w:val="en-US"/>
-        </w:rPr>
-        <w:t xml:space="preserve">Desain dan arsitektur antarmuka </w:t>
-      </w:r>
-      <w:r>
-        <w:rPr>
-          <w:i/>
-          <w:lang w:val="en-US"/>
-        </w:rPr>
-        <w:t>embedded web</w:t>
-      </w:r>
-      <w:r>
-        <w:rPr>
-          <w:lang w:val="en-US"/>
-        </w:rPr>
-        <w:t xml:space="preserve"> untuk sistem pemantauan dan kontrol rumah kaca hortikultura berskala kecil dalam penelitian ini telah berhasil dirancang menggunakan penggabungan metodologi </w:t>
-      </w:r>
-      <w:proofErr w:type="gramStart"/>
-      <w:r>
-        <w:rPr>
-          <w:i/>
-          <w:lang w:val="en-US"/>
-        </w:rPr>
-        <w:t>Agile</w:t>
-      </w:r>
-      <w:proofErr w:type="gramEnd"/>
-      <w:r>
-        <w:rPr>
-          <w:lang w:val="en-US"/>
-        </w:rPr>
-        <w:t xml:space="preserve"> dan </w:t>
-      </w:r>
-      <w:r>
-        <w:rPr>
-          <w:i/>
-          <w:lang w:val="en-US"/>
-        </w:rPr>
-        <w:t>User Centered Design (UCD)</w:t>
-      </w:r>
-      <w:r>
-        <w:rPr>
-          <w:lang w:val="en-US"/>
-        </w:rPr>
-        <w:t xml:space="preserve">. Arsitektur sistem ini mengintegrasikan kerangka kerja </w:t>
-      </w:r>
-      <w:r>
-        <w:rPr>
-          <w:i/>
-          <w:lang w:val="en-US"/>
-        </w:rPr>
-        <w:t>Preact</w:t>
-      </w:r>
-      <w:r>
-        <w:rPr>
-          <w:lang w:val="en-US"/>
-        </w:rPr>
-        <w:t xml:space="preserve"> dan </w:t>
-      </w:r>
-      <w:r>
-        <w:rPr>
-          <w:i/>
-          <w:lang w:val="en-US"/>
-        </w:rPr>
-        <w:t>PicoCSS</w:t>
-      </w:r>
-      <w:r>
-        <w:rPr>
-          <w:lang w:val="en-US"/>
-        </w:rPr>
-        <w:t xml:space="preserve"> unt</w:t>
-      </w:r>
-      <w:r>
-        <w:rPr>
-          <w:lang w:val="en-US"/>
-        </w:rPr>
-        <w:t xml:space="preserve">uk menghasilkan antarmuka </w:t>
-      </w:r>
-      <w:r>
-        <w:rPr>
-          <w:i/>
-          <w:lang w:val="en-US"/>
-        </w:rPr>
-        <w:t xml:space="preserve">front </w:t>
-      </w:r>
-      <w:r>
-        <w:rPr>
-          <w:i/>
-          <w:lang w:val="en-US"/>
-        </w:rPr>
-        <w:t>end</w:t>
-      </w:r>
-      <w:r>
-        <w:rPr>
-          <w:lang w:val="en-US"/>
-        </w:rPr>
-        <w:t xml:space="preserve"> yang ringan serta responsif. Antarmuka tersebut kemudian dihubungkan dengan perangkat keras sensor dan </w:t>
-      </w:r>
-      <w:r>
-        <w:rPr>
-          <w:i/>
-          <w:lang w:val="en-US"/>
-        </w:rPr>
-        <w:t>Decision Support System (DSS)</w:t>
-      </w:r>
-      <w:r>
-        <w:rPr>
-          <w:lang w:val="en-US"/>
-        </w:rPr>
-        <w:t xml:space="preserve"> berbasis </w:t>
-      </w:r>
-      <w:r>
-        <w:rPr>
-          <w:i/>
-          <w:lang w:val="en-US"/>
-        </w:rPr>
-        <w:t>Generative AI (Gemini AI)</w:t>
-      </w:r>
-      <w:r>
-        <w:rPr>
-          <w:lang w:val="en-US"/>
-        </w:rPr>
-        <w:t xml:space="preserve"> melalui </w:t>
-      </w:r>
-      <w:r>
-        <w:rPr>
-          <w:i/>
-          <w:lang w:val="en-US"/>
-        </w:rPr>
-        <w:t>API</w:t>
-      </w:r>
-      <w:r>
-        <w:rPr>
-          <w:lang w:val="en-US"/>
-        </w:rPr>
-        <w:t xml:space="preserve">. Pendekatan desain yang berpusat pada pengguna memastikan bahwa tata letak visual dan penyajian informasi pada dashboard telah disesuaikan dengan </w:t>
-      </w:r>
-      <w:r>
-        <w:rPr>
-          <w:lang w:val="en-US"/>
-        </w:rPr>
-        <w:t>dengan pengguna</w:t>
-      </w:r>
-      <w:r>
-        <w:rPr>
-          <w:lang w:val="en-US"/>
-        </w:rPr>
-        <w:t>, sehingga mampu menjembatani kesenjangan pemahaman teknologi tanpa menimbulkan beban yang berlebihan.</w:t>
-      </w:r>
-    </w:p>
-    <w:p>
-      <w:pPr>
-        <w:jc w:val="both"/>
-        <w:rPr>
-          <w:lang w:val="en-US"/>
-        </w:rPr>
-      </w:pPr>
-    </w:p>
-    <w:p>
-      <w:pPr>
-        <w:jc w:val="both"/>
-        <w:rPr>
-          <w:lang w:val="en-US"/>
-        </w:rPr>
-      </w:pPr>
-      <w:r>
-        <w:rPr>
-          <w:lang w:val="en-US"/>
-        </w:rPr>
-        <w:t xml:space="preserve">Implementasi dan kinerja antarmuka </w:t>
-      </w:r>
-      <w:r>
-        <w:rPr>
-          <w:i/>
-          <w:lang w:val="en-US"/>
-        </w:rPr>
-        <w:t>embedded web</w:t>
-      </w:r>
-      <w:r>
-        <w:rPr>
-          <w:lang w:val="en-US"/>
-        </w:rPr>
-        <w:t xml:space="preserve"> tersebut terbukti andal serta memberikan hasil evaluasi yang sangat baik di lingkungan operasional. Dari aspek kelayakan teknis, sistem memiliki tingkat </w:t>
-      </w:r>
-      <w:r>
-        <w:rPr>
-          <w:i/>
-          <w:lang w:val="en-US"/>
-        </w:rPr>
-        <w:t>uptime</w:t>
-      </w:r>
-      <w:r>
-        <w:rPr>
-          <w:lang w:val="en-US"/>
-        </w:rPr>
-        <w:t xml:space="preserve"> mencapai 98 persen dengan waktu respons transmisi data dan </w:t>
-      </w:r>
-      <w:r>
-        <w:rPr>
-          <w:i/>
-          <w:lang w:val="en-US"/>
-        </w:rPr>
-        <w:t>prompt AI</w:t>
-      </w:r>
-      <w:r>
-        <w:rPr>
-          <w:lang w:val="en-US"/>
-        </w:rPr>
-        <w:t xml:space="preserve"> yang cepat dan stabil. </w:t>
-      </w:r>
-      <w:r>
-        <w:rPr>
-          <w:i/>
-          <w:lang w:val="en-US"/>
-        </w:rPr>
-        <w:t>DSS</w:t>
-      </w:r>
-      <w:r>
-        <w:rPr>
-          <w:lang w:val="en-US"/>
-        </w:rPr>
-        <w:t xml:space="preserve"> berbasis </w:t>
-      </w:r>
-      <w:r>
-        <w:rPr>
-          <w:i/>
-          <w:lang w:val="en-US"/>
-        </w:rPr>
-        <w:t>AI</w:t>
-      </w:r>
-      <w:r>
-        <w:rPr>
-          <w:lang w:val="en-US"/>
-        </w:rPr>
-        <w:t xml:space="preserve"> terbukti mampu secara o</w:t>
-      </w:r>
-      <w:r>
-        <w:rPr>
-          <w:lang w:val="en-US"/>
-        </w:rPr>
-        <w:t xml:space="preserve">tomatis menerjemahkan data sensor kelistrikan </w:t>
-      </w:r>
-      <w:r>
-        <w:rPr>
-          <w:lang w:val="en-US"/>
-        </w:rPr>
-        <w:t>menjadi diagnosis serta rekomendasi dengan tingkat akurasi mencapai 86 persen. Kinerja ini didukung oleh tingkat kepuasan dan kemudahan penggunaa</w:t>
-      </w:r>
-      <w:r>
-        <w:rPr>
-          <w:lang w:val="en-US"/>
-        </w:rPr>
-        <w:t>n yang tinggi dari sisi penggun</w:t>
-      </w:r>
-      <w:r>
-        <w:rPr>
-          <w:lang w:val="en-US"/>
-        </w:rPr>
-        <w:t xml:space="preserve">, dibuktikan dengan perolehan skor </w:t>
-      </w:r>
-      <w:r>
-        <w:rPr>
-          <w:i/>
-          <w:lang w:val="en-US"/>
-        </w:rPr>
-        <w:t>System Usability Scale (SUS)</w:t>
-      </w:r>
-      <w:r>
-        <w:rPr>
-          <w:lang w:val="en-US"/>
-        </w:rPr>
-        <w:t xml:space="preserve"> sebesar 76,5 yang masuk ke dalam kategori dapat diterima dengan predikat baik hingga sangat baik. Secara keseluruhan, sistem ini efektif dalam membantu petani merespons anomali sistem rumah kaca secara tepat dan mandiri.</w:t>
-      </w:r>
-    </w:p>
-    <w:p>
-      <w:pPr>
         <w:pStyle w:val="Heading2"/>
       </w:pPr>
-      <w:bookmarkStart w:id="80" w:name="_Toc137038252"/>
-      <w:bookmarkStart w:id="81" w:name="_Toc225245276"/>
-      <w:r>
-        <w:t>5.2 Saran</w:t>
+      <w:bookmarkStart w:id="80" w:name="_Toc137038251"/>
+      <w:bookmarkStart w:id="81" w:name="_Toc225245275"/>
+      <w:r>
+        <w:t>5.1 Kesimpulan</w:t>
       </w:r>
       <w:bookmarkEnd w:id="80"/>
       <w:bookmarkEnd w:id="81"/>
@@ -29912,6 +29892,300 @@
         <w:rPr>
           <w:lang w:val="en-US"/>
         </w:rPr>
+        <w:t xml:space="preserve">Desain dan arsitektur antarmuka </w:t>
+      </w:r>
+      <w:r>
+        <w:rPr>
+          <w:i/>
+          <w:lang w:val="en-US"/>
+        </w:rPr>
+        <w:t>embedded web</w:t>
+      </w:r>
+      <w:r>
+        <w:rPr>
+          <w:lang w:val="en-US"/>
+        </w:rPr>
+        <w:t xml:space="preserve"> untuk sistem pemantauan dan kontrol rumah kaca hortikultura berskala kecil dalam penelitian ini telah berhasil dirancang menggunakan penggabungan metodologi </w:t>
+      </w:r>
+      <w:proofErr w:type="gramStart"/>
+      <w:r>
+        <w:rPr>
+          <w:i/>
+          <w:lang w:val="en-US"/>
+        </w:rPr>
+        <w:t>Agile</w:t>
+      </w:r>
+      <w:proofErr w:type="gramEnd"/>
+      <w:r>
+        <w:rPr>
+          <w:lang w:val="en-US"/>
+        </w:rPr>
+        <w:t xml:space="preserve"> dan </w:t>
+      </w:r>
+      <w:r>
+        <w:rPr>
+          <w:i/>
+          <w:lang w:val="en-US"/>
+        </w:rPr>
+        <w:t>User Centered Design (UCD)</w:t>
+      </w:r>
+      <w:r>
+        <w:rPr>
+          <w:lang w:val="en-US"/>
+        </w:rPr>
+        <w:t xml:space="preserve">. Arsitektur sistem ini mengintegrasikan kerangka kerja </w:t>
+      </w:r>
+      <w:r>
+        <w:rPr>
+          <w:i/>
+          <w:lang w:val="en-US"/>
+        </w:rPr>
+        <w:t>Preact</w:t>
+      </w:r>
+      <w:r>
+        <w:rPr>
+          <w:lang w:val="en-US"/>
+        </w:rPr>
+        <w:t xml:space="preserve"> dan </w:t>
+      </w:r>
+      <w:r>
+        <w:rPr>
+          <w:i/>
+          <w:lang w:val="en-US"/>
+        </w:rPr>
+        <w:t>PicoCSS</w:t>
+      </w:r>
+      <w:r>
+        <w:rPr>
+          <w:lang w:val="en-US"/>
+        </w:rPr>
+        <w:t xml:space="preserve"> unt</w:t>
+      </w:r>
+      <w:r>
+        <w:rPr>
+          <w:lang w:val="en-US"/>
+        </w:rPr>
+        <w:t xml:space="preserve">uk menghasilkan antarmuka </w:t>
+      </w:r>
+      <w:r>
+        <w:rPr>
+          <w:i/>
+          <w:lang w:val="en-US"/>
+        </w:rPr>
+        <w:t xml:space="preserve">front </w:t>
+      </w:r>
+      <w:r>
+        <w:rPr>
+          <w:i/>
+          <w:lang w:val="en-US"/>
+        </w:rPr>
+        <w:t>end</w:t>
+      </w:r>
+      <w:r>
+        <w:rPr>
+          <w:lang w:val="en-US"/>
+        </w:rPr>
+        <w:t xml:space="preserve"> yang ringan serta responsif. Antarmuka tersebut kemudian dihubungkan dengan perangkat keras sensor dan </w:t>
+      </w:r>
+      <w:r>
+        <w:rPr>
+          <w:i/>
+          <w:lang w:val="en-US"/>
+        </w:rPr>
+        <w:t>Decision Support System (DSS)</w:t>
+      </w:r>
+      <w:r>
+        <w:rPr>
+          <w:lang w:val="en-US"/>
+        </w:rPr>
+        <w:t xml:space="preserve"> berbasis </w:t>
+      </w:r>
+      <w:r>
+        <w:rPr>
+          <w:i/>
+          <w:lang w:val="en-US"/>
+        </w:rPr>
+        <w:t>Generative AI (Gemini AI)</w:t>
+      </w:r>
+      <w:r>
+        <w:rPr>
+          <w:lang w:val="en-US"/>
+        </w:rPr>
+        <w:t xml:space="preserve"> melalui </w:t>
+      </w:r>
+      <w:r>
+        <w:rPr>
+          <w:i/>
+          <w:lang w:val="en-US"/>
+        </w:rPr>
+        <w:t>API</w:t>
+      </w:r>
+      <w:r>
+        <w:rPr>
+          <w:lang w:val="en-US"/>
+        </w:rPr>
+        <w:t xml:space="preserve">. Pendekatan desain yang berpusat pada pengguna memastikan bahwa tata letak visual dan penyajian informasi pada dashboard telah disesuaikan dengan </w:t>
+      </w:r>
+      <w:r>
+        <w:rPr>
+          <w:lang w:val="en-US"/>
+        </w:rPr>
+        <w:t>dengan pengguna</w:t>
+      </w:r>
+      <w:r>
+        <w:rPr>
+          <w:lang w:val="en-US"/>
+        </w:rPr>
+        <w:t>, sehingga mampu menjembatani kesenjangan pemahaman teknologi tanpa menimbulkan beban yang berlebihan.</w:t>
+      </w:r>
+    </w:p>
+    <w:p>
+      <w:pPr>
+        <w:jc w:val="both"/>
+        <w:rPr>
+          <w:lang w:val="en-US"/>
+        </w:rPr>
+      </w:pPr>
+    </w:p>
+    <w:p>
+      <w:pPr>
+        <w:jc w:val="both"/>
+        <w:rPr>
+          <w:lang w:val="en-US"/>
+        </w:rPr>
+      </w:pPr>
+      <w:r>
+        <w:rPr>
+          <w:lang w:val="en-US"/>
+        </w:rPr>
+        <w:t xml:space="preserve">Implementasi dan kinerja antarmuka </w:t>
+      </w:r>
+      <w:r>
+        <w:rPr>
+          <w:i/>
+          <w:lang w:val="en-US"/>
+        </w:rPr>
+        <w:t>embedded web</w:t>
+      </w:r>
+      <w:r>
+        <w:rPr>
+          <w:lang w:val="en-US"/>
+        </w:rPr>
+        <w:t xml:space="preserve"> tersebut terbukti andal serta memberikan hasil evaluasi yang sangat baik di lingkungan operasional. Dari aspek kelayakan teknis, sistem memiliki tingkat </w:t>
+      </w:r>
+      <w:r>
+        <w:rPr>
+          <w:i/>
+          <w:lang w:val="en-US"/>
+        </w:rPr>
+        <w:t>uptime</w:t>
+      </w:r>
+      <w:r>
+        <w:rPr>
+          <w:lang w:val="en-US"/>
+        </w:rPr>
+        <w:t xml:space="preserve"> mencapai 98 persen dengan waktu respons transmisi data dan </w:t>
+      </w:r>
+      <w:r>
+        <w:rPr>
+          <w:i/>
+          <w:lang w:val="en-US"/>
+        </w:rPr>
+        <w:t>prompt AI</w:t>
+      </w:r>
+      <w:r>
+        <w:rPr>
+          <w:lang w:val="en-US"/>
+        </w:rPr>
+        <w:t xml:space="preserve"> yang cepat dan stabil. </w:t>
+      </w:r>
+      <w:r>
+        <w:rPr>
+          <w:i/>
+          <w:lang w:val="en-US"/>
+        </w:rPr>
+        <w:t>DSS</w:t>
+      </w:r>
+      <w:r>
+        <w:rPr>
+          <w:lang w:val="en-US"/>
+        </w:rPr>
+        <w:t xml:space="preserve"> berbasis </w:t>
+      </w:r>
+      <w:r>
+        <w:rPr>
+          <w:i/>
+          <w:lang w:val="en-US"/>
+        </w:rPr>
+        <w:t>AI</w:t>
+      </w:r>
+      <w:r>
+        <w:rPr>
+          <w:lang w:val="en-US"/>
+        </w:rPr>
+        <w:t xml:space="preserve"> terbukti mampu secara o</w:t>
+      </w:r>
+      <w:r>
+        <w:rPr>
+          <w:lang w:val="en-US"/>
+        </w:rPr>
+        <w:t xml:space="preserve">tomatis menerjemahkan data sensor kelistrikan </w:t>
+      </w:r>
+      <w:r>
+        <w:rPr>
+          <w:lang w:val="en-US"/>
+        </w:rPr>
+        <w:t>menjadi diagnosis serta rekomendasi dengan tingkat akurasi mencapai 86 persen. Kinerja ini didukung oleh tingkat kepuasan dan kemudahan penggunaa</w:t>
+      </w:r>
+      <w:r>
+        <w:rPr>
+          <w:lang w:val="en-US"/>
+        </w:rPr>
+        <w:t>n yang tinggi dari sisi penggun</w:t>
+      </w:r>
+      <w:r>
+        <w:rPr>
+          <w:lang w:val="en-US"/>
+        </w:rPr>
+        <w:t xml:space="preserve">, dibuktikan dengan perolehan skor </w:t>
+      </w:r>
+      <w:r>
+        <w:rPr>
+          <w:i/>
+          <w:lang w:val="en-US"/>
+        </w:rPr>
+        <w:t>System Usability Scale (SUS)</w:t>
+      </w:r>
+      <w:r>
+        <w:rPr>
+          <w:lang w:val="en-US"/>
+        </w:rPr>
+        <w:t xml:space="preserve"> sebesar 76,5 yang masuk ke dalam kategori dapat diterima dengan predikat baik hingga sangat baik. Secara keseluruhan, sistem ini efektif dalam membantu petani merespons anomali sistem rumah kaca secara tepat dan mandiri.</w:t>
+      </w:r>
+    </w:p>
+    <w:p>
+      <w:pPr>
+        <w:pStyle w:val="Heading2"/>
+      </w:pPr>
+      <w:bookmarkStart w:id="82" w:name="_Toc137038252"/>
+      <w:bookmarkStart w:id="83" w:name="_Toc225245276"/>
+      <w:r>
+        <w:t>5.2 Saran</w:t>
+      </w:r>
+      <w:bookmarkEnd w:id="82"/>
+      <w:bookmarkEnd w:id="83"/>
+    </w:p>
+    <w:p>
+      <w:pPr>
+        <w:jc w:val="both"/>
+        <w:rPr>
+          <w:lang w:val="en-US"/>
+        </w:rPr>
+      </w:pPr>
+      <w:r>
+        <w:rPr>
+          <w:lang w:val="en-US"/>
+        </w:rPr>
         <w:t xml:space="preserve">Untuk pengembangan selanjutnya, beberapa hal dapat dilakukan guna meningkatkan kualitas dan cakupan sistem yang telah dibangun. Peneliti berikutnya dapat mengembangkan sistem dengan memanfaatkan data historis dan teknik pembelajaran yang lebih adaptif agar rekomendasi yang dihasilkan menjadi lebih akurat dan kontekstual. Selain itu, penambahan fitur notifikasi otomatis dan sistem peringatan dini </w:t>
       </w:r>
       <w:proofErr w:type="gramStart"/>
@@ -30020,12 +30294,12 @@
       <w:pPr>
         <w:pStyle w:val="Heading1"/>
       </w:pPr>
-      <w:bookmarkStart w:id="82" w:name="_Toc225245277"/>
+      <w:bookmarkStart w:id="84" w:name="_Toc225245277"/>
       <w:r>
         <w:lastRenderedPageBreak/>
         <w:t>DAFTAR PUSTAKA</w:t>
       </w:r>
-      <w:bookmarkEnd w:id="82"/>
+      <w:bookmarkEnd w:id="84"/>
     </w:p>
     <w:p>
       <w:pPr>
@@ -31106,14 +31380,14 @@
         <w:lastRenderedPageBreak/>
         <w:fldChar w:fldCharType="end"/>
       </w:r>
-      <w:bookmarkStart w:id="83" w:name="_Toc225245278"/>
+      <w:bookmarkStart w:id="85" w:name="_Toc225245278"/>
       <w:r>
         <w:rPr>
           <w:lang w:val="en-US"/>
         </w:rPr>
         <w:t>LAMPIRAN</w:t>
       </w:r>
-      <w:bookmarkEnd w:id="83"/>
+      <w:bookmarkEnd w:id="85"/>
     </w:p>
     <w:p>
       <w:pPr>
@@ -31121,7 +31395,7 @@
       </w:pPr>
     </w:p>
     <w:sectPr>
-      <w:footerReference w:type="default" r:id="rId16"/>
+      <w:footerReference w:type="default" r:id="rId18"/>
       <w:pgSz w:w="11906" w:h="16838"/>
       <w:pgMar w:top="1701" w:right="1701" w:bottom="1701" w:left="2268" w:header="709" w:footer="709" w:gutter="0"/>
       <w:cols w:space="708"/>
@@ -31160,12 +31434,13 @@
 <w:ftr xmlns:wpc="http://schemas.microsoft.com/office/word/2010/wordprocessingCanvas" xmlns:mc="http://schemas.openxmlformats.org/markup-compatibility/2006" xmlns:o="urn:schemas-microsoft-com:office:office" xmlns:r="http://schemas.openxmlformats.org/officeDocument/2006/relationships" xmlns:m="http://schemas.openxmlformats.org/officeDocument/2006/math" xmlns:v="urn:schemas-microsoft-com:vml" xmlns:wp14="http://schemas.microsoft.com/office/word/2010/wordprocessingDrawing" xmlns:wp="http://schemas.openxmlformats.org/drawingml/2006/wordprocessingDrawing" xmlns:w10="urn:schemas-microsoft-com:office:word" xmlns:w="http://schemas.openxmlformats.org/wordprocessingml/2006/main" xmlns:w14="http://schemas.microsoft.com/office/word/2010/wordml" xmlns:w15="http://schemas.microsoft.com/office/word/2012/wordml" xmlns:wpg="http://schemas.microsoft.com/office/word/2010/wordprocessingGroup" xmlns:wpi="http://schemas.microsoft.com/office/word/2010/wordprocessingInk" xmlns:wne="http://schemas.microsoft.com/office/word/2006/wordml" xmlns:wps="http://schemas.microsoft.com/office/word/2010/wordprocessingShape" mc:Ignorable="w14 w15 wp14">
   <w:sdt>
     <w:sdtPr>
-      <w:id w:val="-1811627183"/>
+      <w:id w:val="-211808420"/>
       <w:docPartObj>
         <w:docPartGallery w:val="Page Numbers (Bottom of Page)"/>
         <w:docPartUnique/>
       </w:docPartObj>
     </w:sdtPr>
+    <w:sdtEndPr/>
     <w:sdtContent>
       <w:p>
         <w:pPr>
@@ -31194,7 +31469,7 @@
           <w:rPr>
             <w:noProof/>
           </w:rPr>
-          <w:t>x</w:t>
+          <w:t>vii</w:t>
         </w:r>
         <w:r>
           <w:rPr>
@@ -31217,12 +31492,13 @@
 <w:ftr xmlns:wpc="http://schemas.microsoft.com/office/word/2010/wordprocessingCanvas" xmlns:mc="http://schemas.openxmlformats.org/markup-compatibility/2006" xmlns:o="urn:schemas-microsoft-com:office:office" xmlns:r="http://schemas.openxmlformats.org/officeDocument/2006/relationships" xmlns:m="http://schemas.openxmlformats.org/officeDocument/2006/math" xmlns:v="urn:schemas-microsoft-com:vml" xmlns:wp14="http://schemas.microsoft.com/office/word/2010/wordprocessingDrawing" xmlns:wp="http://schemas.openxmlformats.org/drawingml/2006/wordprocessingDrawing" xmlns:w10="urn:schemas-microsoft-com:office:word" xmlns:w="http://schemas.openxmlformats.org/wordprocessingml/2006/main" xmlns:w14="http://schemas.microsoft.com/office/word/2010/wordml" xmlns:w15="http://schemas.microsoft.com/office/word/2012/wordml" xmlns:wpg="http://schemas.microsoft.com/office/word/2010/wordprocessingGroup" xmlns:wpi="http://schemas.microsoft.com/office/word/2010/wordprocessingInk" xmlns:wne="http://schemas.microsoft.com/office/word/2006/wordml" xmlns:wps="http://schemas.microsoft.com/office/word/2010/wordprocessingShape" mc:Ignorable="w14 w15 wp14">
   <w:sdt>
     <w:sdtPr>
-      <w:id w:val="1802503997"/>
+      <w:id w:val="-1743477370"/>
       <w:docPartObj>
         <w:docPartGallery w:val="Page Numbers (Bottom of Page)"/>
         <w:docPartUnique/>
       </w:docPartObj>
     </w:sdtPr>
+    <w:sdtEndPr/>
     <w:sdtContent>
       <w:p>
         <w:pPr>
@@ -31280,6 +31556,7 @@
         <w:docPartUnique/>
       </w:docPartObj>
     </w:sdtPr>
+    <w:sdtEndPr/>
     <w:sdtContent>
       <w:p>
         <w:pPr>
@@ -31308,7 +31585,7 @@
           <w:rPr>
             <w:noProof/>
           </w:rPr>
-          <w:t>23</w:t>
+          <w:t>34</w:t>
         </w:r>
         <w:r>
           <w:rPr>
@@ -33262,7 +33539,7 @@
 </file>
 
 <file path=customXml/itemProps1.xml><?xml version="1.0" encoding="utf-8"?>
-<ds:datastoreItem xmlns:ds="http://schemas.openxmlformats.org/officeDocument/2006/customXml" ds:itemID="{8559124C-4D65-4D86-A532-ACDA8B4D2051}">
+<ds:datastoreItem xmlns:ds="http://schemas.openxmlformats.org/officeDocument/2006/customXml" ds:itemID="{71F51692-2798-4AF1-8CBE-3E7D779D5722}">
   <ds:schemaRefs>
     <ds:schemaRef ds:uri="http://schemas.openxmlformats.org/officeDocument/2006/bibliography"/>
   </ds:schemaRefs>

</xml_diff>

<commit_message>
Enhance evaluation results and validation details in thesis document for clarity and accuracy
</commit_message>
<xml_diff>
--- a/NASKAH/Dokumen Laporan Skripsi - 42330018 - I Nyoman Wahyu Permana - 2023 - 2026.docx
+++ b/NASKAH/Dokumen Laporan Skripsi - 42330018 - I Nyoman Wahyu Permana - 2023 - 2026.docx
@@ -29382,7 +29382,13 @@
         <w:rPr>
           <w:lang w:val="en-US"/>
         </w:rPr>
-        <w:t>rata di bawah 3 detik</w:t>
+        <w:t>rata di bawah 2</w:t>
+      </w:r>
+      <w:r>
+        <w:rPr>
+          <w:lang w:val="en-US"/>
+        </w:rPr>
+        <w:t xml:space="preserve"> detik</w:t>
       </w:r>
       <w:r>
         <w:rPr>
@@ -29424,15 +29430,7 @@
         <w:rPr>
           <w:lang w:val="en-US"/>
         </w:rPr>
-        <w:t>4.4</w:t>
-      </w:r>
-      <w:bookmarkStart w:id="75" w:name="_GoBack"/>
-      <w:bookmarkEnd w:id="75"/>
-      <w:r>
-        <w:rPr>
-          <w:lang w:val="en-US"/>
-        </w:rPr>
-        <w:t xml:space="preserve"> </w:t>
+        <w:t xml:space="preserve">4.4 </w:t>
       </w:r>
       <w:r>
         <w:rPr>
@@ -29451,7 +29449,7 @@
           <w:lang w:val="en-US"/>
         </w:rPr>
       </w:pPr>
-      <w:bookmarkStart w:id="76" w:name="_Toc225245272"/>
+      <w:bookmarkStart w:id="75" w:name="_Toc225245272"/>
       <w:r>
         <w:rPr>
           <w:lang w:val="en-US"/>
@@ -29465,7 +29463,7 @@
         </w:rPr>
         <w:t>Usability Testing</w:t>
       </w:r>
-      <w:bookmarkEnd w:id="76"/>
+      <w:bookmarkEnd w:id="75"/>
     </w:p>
     <w:p>
       <w:pPr>
@@ -29630,14 +29628,14 @@
         <w:rPr>
           <w:lang w:val="en-US"/>
         </w:rPr>
-        <w:t xml:space="preserve"> dinilai mudah digunakan, tidak membingungkan, dan petani merasa cukup percaya diri dalam mengoperasikannya tanpa memerlukan pendampingan </w:t>
+        <w:t xml:space="preserve"> dinilai mudah digunakan, tidak membingungkan, dan petani merasa cukup percaya diri dalam mengoperasikannya tanpa memerlukan pendampingan teknisi yang intensif. Secara kualitatif, responden memberikan umpan balik </w:t>
       </w:r>
       <w:r>
         <w:rPr>
           <w:lang w:val="en-US"/>
         </w:rPr>
         <w:lastRenderedPageBreak/>
-        <w:t>teknisi yang intensif. Secara kualitatif, responden memberikan umpan balik positif terhadap tampilan visual yang bersih, meskipun terdapat beberapa masukan minor terkait ukuran font grafik riwayat data yang perlu sedikit diperbesar agar lebih mudah dibaca di bawah sinar matahari langsung.</w:t>
+        <w:t>positif terhadap tampilan visual yang bersih, meskipun terdapat beberapa masukan minor terkait ukuran font grafik riwayat data yang perlu sedikit diperbesar agar lebih mudah dibaca di bawah sinar matahari langsung.</w:t>
       </w:r>
     </w:p>
     <w:p>
@@ -29648,14 +29646,14 @@
           <w:lang w:val="en-US"/>
         </w:rPr>
       </w:pPr>
-      <w:bookmarkStart w:id="77" w:name="_Toc225245273"/>
+      <w:bookmarkStart w:id="76" w:name="_Toc225245273"/>
       <w:r>
         <w:rPr>
           <w:lang w:val="en-US"/>
         </w:rPr>
         <w:t>4.2.3 Hasil Validasi Fungsi Deskriptif Gemini AI</w:t>
       </w:r>
-      <w:bookmarkEnd w:id="77"/>
+      <w:bookmarkEnd w:id="76"/>
     </w:p>
     <w:p>
       <w:pPr>
@@ -29707,7 +29705,102 @@
         <w:rPr>
           <w:lang w:val="en-US"/>
         </w:rPr>
-        <w:t xml:space="preserve"> (n/m * 100%), diperoleh tingkat keberhasilan integrasi </w:t>
+        <w:t xml:space="preserve"> </w:t>
+      </w:r>
+      <w:r>
+        <w:rPr>
+          <w:lang w:val="en-US"/>
+        </w:rPr>
+        <w:t>seperti berikut</w:t>
+      </w:r>
+    </w:p>
+    <w:p>
+      <w:pPr>
+        <w:pStyle w:val="ListParagraph"/>
+        <w:numPr>
+          <w:ilvl w:val="0"/>
+          <w:numId w:val="0"/>
+        </w:numPr>
+        <w:spacing w:before="240" w:after="200"/>
+        <w:ind w:left="720"/>
+        <w:jc w:val="center"/>
+        <w:rPr>
+          <w:rFonts w:eastAsiaTheme="minorEastAsia" w:cs="Arial"/>
+          <w:lang w:val="en-US"/>
+        </w:rPr>
+      </w:pPr>
+      <m:oMathPara>
+        <m:oMath>
+          <m:f>
+            <m:fPr>
+              <m:ctrlPr>
+                <w:rPr>
+                  <w:rFonts w:ascii="Cambria Math" w:hAnsi="Cambria Math"/>
+                </w:rPr>
+              </m:ctrlPr>
+            </m:fPr>
+            <m:num>
+              <m:r>
+                <m:rPr>
+                  <m:sty m:val="p"/>
+                </m:rPr>
+                <w:rPr>
+                  <w:rFonts w:ascii="Cambria Math" w:hAnsi="Cambria Math"/>
+                </w:rPr>
+                <m:t>n</m:t>
+              </m:r>
+            </m:num>
+            <m:den>
+              <m:r>
+                <m:rPr>
+                  <m:sty m:val="p"/>
+                </m:rPr>
+                <w:rPr>
+                  <w:rFonts w:ascii="Cambria Math" w:hAnsi="Cambria Math"/>
+                </w:rPr>
+                <m:t>m</m:t>
+              </m:r>
+            </m:den>
+          </m:f>
+          <m:r>
+            <m:rPr>
+              <m:sty m:val="p"/>
+            </m:rPr>
+            <w:rPr>
+              <w:rFonts w:ascii="Cambria Math" w:hAnsi="Cambria Math"/>
+            </w:rPr>
+            <m:t xml:space="preserve">* 100% = x% </m:t>
+          </m:r>
+        </m:oMath>
+      </m:oMathPara>
+    </w:p>
+    <w:p>
+      <w:pPr>
+        <w:ind w:left="709" w:firstLine="720"/>
+        <w:jc w:val="both"/>
+        <w:rPr>
+          <w:lang w:val="en-US"/>
+        </w:rPr>
+      </w:pPr>
+      <w:r>
+        <w:rPr>
+          <w:lang w:val="en-US"/>
+        </w:rPr>
+        <w:t>Berdasarkan rumus tersebut</w:t>
+      </w:r>
+      <w:bookmarkStart w:id="77" w:name="_GoBack"/>
+      <w:bookmarkEnd w:id="77"/>
+      <w:r>
+        <w:rPr>
+          <w:lang w:val="en-US"/>
+        </w:rPr>
+        <w:t xml:space="preserve"> </w:t>
+      </w:r>
+      <w:r>
+        <w:rPr>
+          <w:lang w:val="en-US"/>
+        </w:rPr>
+        <w:t xml:space="preserve">diperoleh tingkat keberhasilan integrasi </w:t>
       </w:r>
       <w:r>
         <w:rPr>
@@ -31469,7 +31562,7 @@
           <w:rPr>
             <w:noProof/>
           </w:rPr>
-          <w:t>vii</w:t>
+          <w:t>x</w:t>
         </w:r>
         <w:r>
           <w:rPr>
@@ -32732,7 +32825,7 @@
   <w:style w:type="paragraph" w:default="1" w:styleId="Normal">
     <w:name w:val="Normal"/>
     <w:qFormat/>
-    <w:rsid w:val="009E391D"/>
+    <w:rsid w:val="006B20D0"/>
     <w:pPr>
       <w:spacing w:after="0" w:line="360" w:lineRule="auto"/>
       <w:ind w:firstLine="709"/>
@@ -33539,7 +33632,7 @@
 </file>
 
 <file path=customXml/itemProps1.xml><?xml version="1.0" encoding="utf-8"?>
-<ds:datastoreItem xmlns:ds="http://schemas.openxmlformats.org/officeDocument/2006/customXml" ds:itemID="{71F51692-2798-4AF1-8CBE-3E7D779D5722}">
+<ds:datastoreItem xmlns:ds="http://schemas.openxmlformats.org/officeDocument/2006/customXml" ds:itemID="{C8063BB4-3E85-420B-B435-CF445C502D12}">
   <ds:schemaRefs>
     <ds:schemaRef ds:uri="http://schemas.openxmlformats.org/officeDocument/2006/bibliography"/>
   </ds:schemaRefs>

</xml_diff>

<commit_message>
Update thesis document for improved clarity and detail
</commit_message>
<xml_diff>
--- a/NASKAH/Dokumen Laporan Skripsi - 42330018 - I Nyoman Wahyu Permana - 2023 - 2026.docx
+++ b/NASKAH/Dokumen Laporan Skripsi - 42330018 - I Nyoman Wahyu Permana - 2023 - 2026.docx
@@ -1167,6 +1167,8 @@
       <w:bookmarkStart w:id="2" w:name="_Toc137038221"/>
       <w:bookmarkStart w:id="3" w:name="_Toc225245232"/>
       <w:bookmarkStart w:id="4" w:name="_Toc75025326"/>
+      <w:bookmarkStart w:id="5" w:name="_GoBack"/>
+      <w:bookmarkEnd w:id="5"/>
       <w:r>
         <w:lastRenderedPageBreak/>
         <w:t>HALAMAN PENGESAHAN</w:t>
@@ -3227,16 +3229,16 @@
       <w:pPr>
         <w:pStyle w:val="Heading1"/>
       </w:pPr>
-      <w:bookmarkStart w:id="5" w:name="_Toc106280385"/>
-      <w:bookmarkStart w:id="6" w:name="_Toc137038222"/>
-      <w:bookmarkStart w:id="7" w:name="_Toc225245233"/>
+      <w:bookmarkStart w:id="6" w:name="_Toc106280385"/>
+      <w:bookmarkStart w:id="7" w:name="_Toc137038222"/>
+      <w:bookmarkStart w:id="8" w:name="_Toc225245233"/>
       <w:r>
         <w:lastRenderedPageBreak/>
         <w:t>HALAMAN PENGESAHAN UJIAN SKRIPSI</w:t>
       </w:r>
-      <w:bookmarkEnd w:id="5"/>
       <w:bookmarkEnd w:id="6"/>
       <w:bookmarkEnd w:id="7"/>
+      <w:bookmarkEnd w:id="8"/>
     </w:p>
     <w:p>
       <w:pPr>
@@ -3993,16 +3995,16 @@
       <w:pPr>
         <w:pStyle w:val="Heading1"/>
       </w:pPr>
-      <w:bookmarkStart w:id="8" w:name="_Toc106280386"/>
-      <w:bookmarkStart w:id="9" w:name="_Toc137038223"/>
-      <w:bookmarkStart w:id="10" w:name="_Toc225245234"/>
+      <w:bookmarkStart w:id="9" w:name="_Toc106280386"/>
+      <w:bookmarkStart w:id="10" w:name="_Toc137038223"/>
+      <w:bookmarkStart w:id="11" w:name="_Toc225245234"/>
       <w:r>
         <w:lastRenderedPageBreak/>
         <w:t>KATA PENGANTAR</w:t>
       </w:r>
-      <w:bookmarkEnd w:id="8"/>
       <w:bookmarkEnd w:id="9"/>
       <w:bookmarkEnd w:id="10"/>
+      <w:bookmarkEnd w:id="11"/>
     </w:p>
     <w:p>
       <w:pPr>
@@ -4400,14 +4402,14 @@
       <w:pPr>
         <w:pStyle w:val="Heading1"/>
       </w:pPr>
-      <w:bookmarkStart w:id="11" w:name="_Toc137038224"/>
-      <w:bookmarkStart w:id="12" w:name="_Toc225245235"/>
+      <w:bookmarkStart w:id="12" w:name="_Toc137038224"/>
+      <w:bookmarkStart w:id="13" w:name="_Toc225245235"/>
       <w:r>
         <w:lastRenderedPageBreak/>
         <w:t>PERNYATAAN BEBAS PLAGIARISME</w:t>
       </w:r>
-      <w:bookmarkEnd w:id="11"/>
       <w:bookmarkEnd w:id="12"/>
+      <w:bookmarkEnd w:id="13"/>
     </w:p>
     <w:p>
       <w:pPr>
@@ -5127,13 +5129,13 @@
       <w:pPr>
         <w:pStyle w:val="Heading1"/>
       </w:pPr>
-      <w:bookmarkStart w:id="13" w:name="_Toc225245236"/>
+      <w:bookmarkStart w:id="14" w:name="_Toc225245236"/>
       <w:r>
         <w:lastRenderedPageBreak/>
         <w:t>DAFTAR ISI</w:t>
       </w:r>
       <w:bookmarkEnd w:id="4"/>
-      <w:bookmarkEnd w:id="13"/>
+      <w:bookmarkEnd w:id="14"/>
     </w:p>
     <w:p>
       <w:pPr>
@@ -8449,14 +8451,14 @@
       <w:pPr>
         <w:pStyle w:val="Heading1"/>
       </w:pPr>
-      <w:bookmarkStart w:id="14" w:name="_Toc75025327"/>
-      <w:bookmarkStart w:id="15" w:name="_Toc225245237"/>
+      <w:bookmarkStart w:id="15" w:name="_Toc75025327"/>
+      <w:bookmarkStart w:id="16" w:name="_Toc225245237"/>
       <w:r>
         <w:lastRenderedPageBreak/>
         <w:t>DAFTAR GAMBAR</w:t>
       </w:r>
-      <w:bookmarkEnd w:id="14"/>
       <w:bookmarkEnd w:id="15"/>
+      <w:bookmarkEnd w:id="16"/>
     </w:p>
     <w:p>
       <w:pPr>
@@ -8880,25 +8882,7 @@
             <w:noProof/>
             <w:lang w:val="en-US"/>
           </w:rPr>
-          <w:t>High Fidelity Protot</w:t>
-        </w:r>
-        <w:r>
-          <w:rPr>
-            <w:rStyle w:val="Hyperlink"/>
-            <w:i/>
-            <w:noProof/>
-            <w:lang w:val="en-US"/>
-          </w:rPr>
-          <w:t>y</w:t>
-        </w:r>
-        <w:r>
-          <w:rPr>
-            <w:rStyle w:val="Hyperlink"/>
-            <w:i/>
-            <w:noProof/>
-            <w:lang w:val="en-US"/>
-          </w:rPr>
-          <w:t>pe</w:t>
+          <w:t>High Fidelity Prototype</w:t>
         </w:r>
         <w:r>
           <w:rPr>
@@ -9149,14 +9133,14 @@
       <w:pPr>
         <w:pStyle w:val="Heading1"/>
       </w:pPr>
-      <w:bookmarkStart w:id="16" w:name="_Toc75025328"/>
-      <w:bookmarkStart w:id="17" w:name="_Toc225245238"/>
+      <w:bookmarkStart w:id="17" w:name="_Toc75025328"/>
+      <w:bookmarkStart w:id="18" w:name="_Toc225245238"/>
       <w:r>
         <w:lastRenderedPageBreak/>
         <w:t>DAFTAR TABEL</w:t>
       </w:r>
-      <w:bookmarkEnd w:id="16"/>
       <w:bookmarkEnd w:id="17"/>
+      <w:bookmarkEnd w:id="18"/>
     </w:p>
     <w:p>
       <w:pPr>
@@ -9849,16 +9833,16 @@
           <w:lang w:val="en-US"/>
         </w:rPr>
       </w:pPr>
-      <w:bookmarkStart w:id="18" w:name="_Toc106280390"/>
-      <w:bookmarkStart w:id="19" w:name="_Toc137038228"/>
-      <w:bookmarkStart w:id="20" w:name="_Toc225245239"/>
+      <w:bookmarkStart w:id="19" w:name="_Toc106280390"/>
+      <w:bookmarkStart w:id="20" w:name="_Toc137038228"/>
+      <w:bookmarkStart w:id="21" w:name="_Toc225245239"/>
       <w:r>
         <w:lastRenderedPageBreak/>
         <w:t>ABSTRAK</w:t>
       </w:r>
-      <w:bookmarkEnd w:id="18"/>
       <w:bookmarkEnd w:id="19"/>
       <w:bookmarkEnd w:id="20"/>
+      <w:bookmarkEnd w:id="21"/>
     </w:p>
     <w:p>
       <w:pPr>
@@ -10140,16 +10124,16 @@
           <w:lang w:val="en-US"/>
         </w:rPr>
       </w:pPr>
-      <w:bookmarkStart w:id="21" w:name="_Toc106280391"/>
-      <w:bookmarkStart w:id="22" w:name="_Toc137038229"/>
-      <w:bookmarkStart w:id="23" w:name="_Toc225245240"/>
+      <w:bookmarkStart w:id="22" w:name="_Toc106280391"/>
+      <w:bookmarkStart w:id="23" w:name="_Toc137038229"/>
+      <w:bookmarkStart w:id="24" w:name="_Toc225245240"/>
       <w:r>
         <w:lastRenderedPageBreak/>
         <w:t>ABSTRACT</w:t>
       </w:r>
-      <w:bookmarkEnd w:id="21"/>
       <w:bookmarkEnd w:id="22"/>
       <w:bookmarkEnd w:id="23"/>
+      <w:bookmarkEnd w:id="24"/>
     </w:p>
     <w:p>
       <w:pPr>
@@ -10262,26 +10246,26 @@
       <w:pPr>
         <w:pStyle w:val="Heading1"/>
       </w:pPr>
-      <w:bookmarkStart w:id="24" w:name="_Toc75025329"/>
-      <w:bookmarkStart w:id="25" w:name="_Toc225245241"/>
+      <w:bookmarkStart w:id="25" w:name="_Toc75025329"/>
+      <w:bookmarkStart w:id="26" w:name="_Toc225245241"/>
       <w:r>
         <w:lastRenderedPageBreak/>
         <w:t>BAB 1 PENDAHULUAN</w:t>
       </w:r>
-      <w:bookmarkEnd w:id="24"/>
       <w:bookmarkEnd w:id="25"/>
+      <w:bookmarkEnd w:id="26"/>
     </w:p>
     <w:p>
       <w:pPr>
         <w:pStyle w:val="Heading2"/>
       </w:pPr>
-      <w:bookmarkStart w:id="26" w:name="_Toc75025330"/>
-      <w:bookmarkStart w:id="27" w:name="_Toc225245242"/>
+      <w:bookmarkStart w:id="27" w:name="_Toc75025330"/>
+      <w:bookmarkStart w:id="28" w:name="_Toc225245242"/>
       <w:r>
         <w:t>1.1 Latar Belakang</w:t>
       </w:r>
-      <w:bookmarkEnd w:id="26"/>
       <w:bookmarkEnd w:id="27"/>
+      <w:bookmarkEnd w:id="28"/>
     </w:p>
     <w:p>
       <w:pPr>
@@ -11066,13 +11050,13 @@
       <w:pPr>
         <w:pStyle w:val="Heading2"/>
       </w:pPr>
-      <w:bookmarkStart w:id="28" w:name="_Toc75025331"/>
-      <w:bookmarkStart w:id="29" w:name="_Toc225245243"/>
+      <w:bookmarkStart w:id="29" w:name="_Toc75025331"/>
+      <w:bookmarkStart w:id="30" w:name="_Toc225245243"/>
       <w:r>
         <w:t>1.2 Rumusan Masalah</w:t>
       </w:r>
-      <w:bookmarkEnd w:id="28"/>
       <w:bookmarkEnd w:id="29"/>
+      <w:bookmarkEnd w:id="30"/>
     </w:p>
     <w:p>
       <w:pPr>
@@ -11219,13 +11203,13 @@
       <w:pPr>
         <w:pStyle w:val="Heading2"/>
       </w:pPr>
-      <w:bookmarkStart w:id="30" w:name="_Toc75025333"/>
-      <w:bookmarkStart w:id="31" w:name="_Toc225245244"/>
+      <w:bookmarkStart w:id="31" w:name="_Toc75025333"/>
+      <w:bookmarkStart w:id="32" w:name="_Toc225245244"/>
       <w:r>
         <w:t>1.3 Tujuan Penelitian</w:t>
       </w:r>
-      <w:bookmarkEnd w:id="30"/>
       <w:bookmarkEnd w:id="31"/>
+      <w:bookmarkEnd w:id="32"/>
     </w:p>
     <w:p>
       <w:pPr>
@@ -11416,11 +11400,11 @@
       <w:pPr>
         <w:pStyle w:val="Heading2"/>
       </w:pPr>
-      <w:bookmarkStart w:id="32" w:name="_Toc225245245"/>
+      <w:bookmarkStart w:id="33" w:name="_Toc225245245"/>
       <w:r>
         <w:t>1.4 Manfaat Penelitian</w:t>
       </w:r>
-      <w:bookmarkEnd w:id="32"/>
+      <w:bookmarkEnd w:id="33"/>
     </w:p>
     <w:p>
       <w:pPr>
@@ -11475,11 +11459,11 @@
       <w:pPr>
         <w:pStyle w:val="Heading2"/>
       </w:pPr>
-      <w:bookmarkStart w:id="33" w:name="_Toc225245246"/>
+      <w:bookmarkStart w:id="34" w:name="_Toc225245246"/>
       <w:r>
         <w:t>1.5 Batasan Masalah</w:t>
       </w:r>
-      <w:bookmarkEnd w:id="33"/>
+      <w:bookmarkEnd w:id="34"/>
     </w:p>
     <w:p>
       <w:pPr>
@@ -11739,22 +11723,22 @@
       <w:pPr>
         <w:pStyle w:val="Heading1"/>
       </w:pPr>
-      <w:bookmarkStart w:id="34" w:name="_Toc225245247"/>
+      <w:bookmarkStart w:id="35" w:name="_Toc225245247"/>
       <w:r>
         <w:lastRenderedPageBreak/>
         <w:t>BAB 2 TINJAUAN PUSTAKA</w:t>
       </w:r>
-      <w:bookmarkEnd w:id="34"/>
+      <w:bookmarkEnd w:id="35"/>
     </w:p>
     <w:p>
       <w:pPr>
         <w:pStyle w:val="Heading2"/>
       </w:pPr>
-      <w:bookmarkStart w:id="35" w:name="_Toc225245248"/>
+      <w:bookmarkStart w:id="36" w:name="_Toc225245248"/>
       <w:r>
         <w:t>2.1 Deskripsi Masalah</w:t>
       </w:r>
-      <w:bookmarkEnd w:id="35"/>
+      <w:bookmarkEnd w:id="36"/>
     </w:p>
     <w:p>
       <w:pPr>
@@ -12252,11 +12236,11 @@
       <w:pPr>
         <w:pStyle w:val="Heading2"/>
       </w:pPr>
-      <w:bookmarkStart w:id="36" w:name="_Toc225245249"/>
+      <w:bookmarkStart w:id="37" w:name="_Toc225245249"/>
       <w:r>
         <w:t>2.2 Metode Pendekatan Masalah</w:t>
       </w:r>
-      <w:bookmarkEnd w:id="36"/>
+      <w:bookmarkEnd w:id="37"/>
     </w:p>
     <w:p>
       <w:pPr>
@@ -12964,12 +12948,12 @@
       <w:pPr>
         <w:pStyle w:val="Heading2"/>
       </w:pPr>
-      <w:bookmarkStart w:id="37" w:name="_Toc225245250"/>
+      <w:bookmarkStart w:id="38" w:name="_Toc225245250"/>
       <w:r>
         <w:lastRenderedPageBreak/>
         <w:t>2.3 Teknologi dan Tools Pendukung Pembuatan Solusi</w:t>
       </w:r>
-      <w:bookmarkEnd w:id="37"/>
+      <w:bookmarkEnd w:id="38"/>
     </w:p>
     <w:p>
       <w:pPr>
@@ -15313,11 +15297,11 @@
       <w:pPr>
         <w:pStyle w:val="Heading2"/>
       </w:pPr>
-      <w:bookmarkStart w:id="38" w:name="_Toc225245251"/>
+      <w:bookmarkStart w:id="39" w:name="_Toc225245251"/>
       <w:r>
         <w:t>2.4 Metode Evaluasi dan Validasi Solusi</w:t>
       </w:r>
-      <w:bookmarkEnd w:id="38"/>
+      <w:bookmarkEnd w:id="39"/>
     </w:p>
     <w:p>
       <w:pPr>
@@ -15874,14 +15858,14 @@
       <w:pPr>
         <w:pStyle w:val="Heading2"/>
       </w:pPr>
-      <w:bookmarkStart w:id="39" w:name="_Toc225245252"/>
+      <w:bookmarkStart w:id="40" w:name="_Toc225245252"/>
       <w:r>
         <w:t xml:space="preserve">2.5 </w:t>
       </w:r>
       <w:r>
         <w:t>State of The Art</w:t>
       </w:r>
-      <w:bookmarkEnd w:id="39"/>
+      <w:bookmarkEnd w:id="40"/>
     </w:p>
     <w:p>
       <w:pPr>
@@ -15942,7 +15926,7 @@
           <w:lang w:val="en-US"/>
         </w:rPr>
       </w:pPr>
-      <w:bookmarkStart w:id="40" w:name="_Toc225967422"/>
+      <w:bookmarkStart w:id="41" w:name="_Toc225967422"/>
       <w:r>
         <w:t xml:space="preserve">Tabel </w:t>
       </w:r>
@@ -15992,7 +15976,7 @@
         </w:rPr>
         <w:t>State of The Art</w:t>
       </w:r>
-      <w:bookmarkEnd w:id="40"/>
+      <w:bookmarkEnd w:id="41"/>
     </w:p>
     <w:tbl>
       <w:tblPr>
@@ -17131,25 +17115,25 @@
       <w:pPr>
         <w:pStyle w:val="Heading1"/>
       </w:pPr>
-      <w:bookmarkStart w:id="41" w:name="_Toc225245253"/>
+      <w:bookmarkStart w:id="42" w:name="_Toc225245253"/>
       <w:r>
         <w:lastRenderedPageBreak/>
         <w:t>BAB 3 METODE PENELITIAN</w:t>
       </w:r>
-      <w:bookmarkEnd w:id="41"/>
+      <w:bookmarkEnd w:id="42"/>
     </w:p>
     <w:p>
       <w:pPr>
         <w:pStyle w:val="Heading2"/>
       </w:pPr>
-      <w:bookmarkStart w:id="42" w:name="_Toc225245254"/>
+      <w:bookmarkStart w:id="43" w:name="_Toc225245254"/>
       <w:r>
         <w:t xml:space="preserve">3.1 </w:t>
       </w:r>
       <w:r>
         <w:t>Jadwal, Lokasi, dan Alur Penelitian</w:t>
       </w:r>
-      <w:bookmarkEnd w:id="42"/>
+      <w:bookmarkEnd w:id="43"/>
     </w:p>
     <w:p>
       <w:pPr>
@@ -17227,7 +17211,7 @@
       <w:pPr>
         <w:pStyle w:val="Caption"/>
       </w:pPr>
-      <w:bookmarkStart w:id="43" w:name="_Toc225967423"/>
+      <w:bookmarkStart w:id="44" w:name="_Toc225967423"/>
       <w:r>
         <w:t xml:space="preserve">Tabel </w:t>
       </w:r>
@@ -17270,7 +17254,7 @@
       <w:r>
         <w:t>. Jadwal Pelaksanaan Penelitian</w:t>
       </w:r>
-      <w:bookmarkEnd w:id="43"/>
+      <w:bookmarkEnd w:id="44"/>
     </w:p>
     <w:tbl>
       <w:tblPr>
@@ -19040,7 +19024,7 @@
           <w:lang w:val="en-US"/>
         </w:rPr>
       </w:pPr>
-      <w:bookmarkStart w:id="44" w:name="_Toc227759829"/>
+      <w:bookmarkStart w:id="45" w:name="_Toc227759829"/>
       <w:r>
         <w:t xml:space="preserve">Gambar </w:t>
       </w:r>
@@ -19087,7 +19071,7 @@
         </w:rPr>
         <w:t>. Alur Penelitian</w:t>
       </w:r>
-      <w:bookmarkEnd w:id="44"/>
+      <w:bookmarkEnd w:id="45"/>
     </w:p>
     <w:p>
       <w:pPr>
@@ -19224,14 +19208,14 @@
       <w:pPr>
         <w:pStyle w:val="Heading2"/>
       </w:pPr>
-      <w:bookmarkStart w:id="45" w:name="_Toc225245255"/>
+      <w:bookmarkStart w:id="46" w:name="_Toc225245255"/>
       <w:r>
         <w:t xml:space="preserve">3.2 Gambaran Besar </w:t>
       </w:r>
       <w:r>
         <w:t>Solusi</w:t>
       </w:r>
-      <w:bookmarkEnd w:id="45"/>
+      <w:bookmarkEnd w:id="46"/>
     </w:p>
     <w:p>
       <w:pPr>
@@ -19353,7 +19337,7 @@
           <w:lang w:val="en-US"/>
         </w:rPr>
       </w:pPr>
-      <w:bookmarkStart w:id="46" w:name="_Toc227759830"/>
+      <w:bookmarkStart w:id="47" w:name="_Toc227759830"/>
       <w:r>
         <w:t xml:space="preserve">Gambar </w:t>
       </w:r>
@@ -19410,7 +19394,7 @@
         </w:rPr>
         <w:t>mode offline</w:t>
       </w:r>
-      <w:bookmarkEnd w:id="46"/>
+      <w:bookmarkEnd w:id="47"/>
     </w:p>
     <w:p>
       <w:pPr>
@@ -19531,7 +19515,7 @@
           <w:lang w:val="en-US"/>
         </w:rPr>
       </w:pPr>
-      <w:bookmarkStart w:id="47" w:name="_Toc227759831"/>
+      <w:bookmarkStart w:id="48" w:name="_Toc227759831"/>
       <w:r>
         <w:rPr>
           <w:noProof/>
@@ -19657,7 +19641,7 @@
         </w:rPr>
         <w:t>mode online</w:t>
       </w:r>
-      <w:bookmarkEnd w:id="47"/>
+      <w:bookmarkEnd w:id="48"/>
     </w:p>
     <w:p>
       <w:pPr>
@@ -20152,14 +20136,14 @@
       <w:pPr>
         <w:pStyle w:val="Heading2"/>
       </w:pPr>
-      <w:bookmarkStart w:id="48" w:name="_Toc225245256"/>
+      <w:bookmarkStart w:id="49" w:name="_Toc225245256"/>
       <w:r>
         <w:t xml:space="preserve">3.3 </w:t>
       </w:r>
       <w:r>
         <w:t>Tata Cara Implementasi Solusi</w:t>
       </w:r>
-      <w:bookmarkEnd w:id="48"/>
+      <w:bookmarkEnd w:id="49"/>
     </w:p>
     <w:p>
       <w:pPr>
@@ -20262,14 +20246,14 @@
           <w:lang w:val="en-US"/>
         </w:rPr>
       </w:pPr>
-      <w:bookmarkStart w:id="49" w:name="_Toc225245257"/>
+      <w:bookmarkStart w:id="50" w:name="_Toc225245257"/>
       <w:r>
         <w:rPr>
           <w:lang w:val="en-US"/>
         </w:rPr>
         <w:t>3.3.1 Tahap Perencanaan</w:t>
       </w:r>
-      <w:bookmarkEnd w:id="49"/>
+      <w:bookmarkEnd w:id="50"/>
     </w:p>
     <w:p>
       <w:pPr>
@@ -20353,7 +20337,7 @@
         <w:ind w:firstLine="709"/>
         <w:jc w:val="both"/>
       </w:pPr>
-      <w:bookmarkStart w:id="50" w:name="_Toc225245258"/>
+      <w:bookmarkStart w:id="51" w:name="_Toc225245258"/>
       <w:r>
         <w:rPr>
           <w:rFonts w:cs="Arial"/>
@@ -20362,7 +20346,7 @@
         <w:lastRenderedPageBreak/>
         <w:t>3.3.2 Tahap Perancangan</w:t>
       </w:r>
-      <w:bookmarkEnd w:id="50"/>
+      <w:bookmarkEnd w:id="51"/>
     </w:p>
     <w:p>
       <w:pPr>
@@ -20544,7 +20528,7 @@
         <w:ind w:firstLine="720"/>
         <w:jc w:val="both"/>
       </w:pPr>
-      <w:bookmarkStart w:id="51" w:name="_Toc225245259"/>
+      <w:bookmarkStart w:id="52" w:name="_Toc225245259"/>
       <w:r>
         <w:rPr>
           <w:rFonts w:cs="Arial"/>
@@ -20552,7 +20536,7 @@
         </w:rPr>
         <w:t>3.3.3 Tahap Implementasi Sistem</w:t>
       </w:r>
-      <w:bookmarkEnd w:id="51"/>
+      <w:bookmarkEnd w:id="52"/>
     </w:p>
     <w:p>
       <w:pPr>
@@ -20754,7 +20738,7 @@
         <w:ind w:left="720"/>
         <w:jc w:val="both"/>
       </w:pPr>
-      <w:bookmarkStart w:id="52" w:name="_Toc225245260"/>
+      <w:bookmarkStart w:id="53" w:name="_Toc225245260"/>
       <w:r>
         <w:rPr>
           <w:rFonts w:cs="Arial"/>
@@ -20762,7 +20746,7 @@
         </w:rPr>
         <w:t>3.3.4 Tahap Pengujian dan Evaluasi</w:t>
       </w:r>
-      <w:bookmarkEnd w:id="52"/>
+      <w:bookmarkEnd w:id="53"/>
     </w:p>
     <w:p>
       <w:pPr>
@@ -20917,7 +20901,7 @@
           <w:lang w:val="en-US"/>
         </w:rPr>
       </w:pPr>
-      <w:bookmarkStart w:id="53" w:name="_Toc225967424"/>
+      <w:bookmarkStart w:id="54" w:name="_Toc225967424"/>
       <w:r>
         <w:lastRenderedPageBreak/>
         <w:t xml:space="preserve">Tabel </w:t>
@@ -20967,7 +20951,7 @@
         </w:rPr>
         <w:t>Contoh data</w:t>
       </w:r>
-      <w:bookmarkEnd w:id="53"/>
+      <w:bookmarkEnd w:id="54"/>
     </w:p>
     <w:tbl>
       <w:tblPr>
@@ -22110,7 +22094,7 @@
           <w:rFonts w:ascii="Times New Roman" w:hAnsi="Times New Roman"/>
         </w:rPr>
       </w:pPr>
-      <w:bookmarkStart w:id="54" w:name="_Toc225245261"/>
+      <w:bookmarkStart w:id="55" w:name="_Toc225245261"/>
       <w:r>
         <w:rPr>
           <w:rFonts w:cs="Arial"/>
@@ -22118,7 +22102,7 @@
         </w:rPr>
         <w:t>3.3.5 Tahap Revisi dan Deploy</w:t>
       </w:r>
-      <w:bookmarkEnd w:id="54"/>
+      <w:bookmarkEnd w:id="55"/>
     </w:p>
     <w:p>
       <w:pPr>
@@ -22264,12 +22248,12 @@
           <w:rFonts w:ascii="Times New Roman" w:hAnsi="Times New Roman"/>
         </w:rPr>
       </w:pPr>
-      <w:bookmarkStart w:id="55" w:name="_Toc225245262"/>
+      <w:bookmarkStart w:id="56" w:name="_Toc225245262"/>
       <w:r>
         <w:lastRenderedPageBreak/>
         <w:t>3.4 Tata Cara Evaluasi dan Validasi Solusi</w:t>
       </w:r>
-      <w:bookmarkEnd w:id="55"/>
+      <w:bookmarkEnd w:id="56"/>
     </w:p>
     <w:p>
       <w:pPr>
@@ -22941,7 +22925,7 @@
           <w:lang w:val="en-US"/>
         </w:rPr>
       </w:pPr>
-      <w:bookmarkStart w:id="56" w:name="_Toc225967425"/>
+      <w:bookmarkStart w:id="57" w:name="_Toc225967425"/>
       <w:r>
         <w:t xml:space="preserve">Tabel </w:t>
       </w:r>
@@ -22990,7 +22974,7 @@
         </w:rPr>
         <w:t>Detail skala penelitian</w:t>
       </w:r>
-      <w:bookmarkEnd w:id="56"/>
+      <w:bookmarkEnd w:id="57"/>
     </w:p>
     <w:tbl>
       <w:tblPr>
@@ -23470,7 +23454,7 @@
           <w:lang w:val="en-US"/>
         </w:rPr>
       </w:pPr>
-      <w:bookmarkStart w:id="57" w:name="_Toc225967426"/>
+      <w:bookmarkStart w:id="58" w:name="_Toc225967426"/>
       <w:r>
         <w:t xml:space="preserve">Tabel </w:t>
       </w:r>
@@ -23526,7 +23510,7 @@
         </w:rPr>
         <w:t xml:space="preserve"> nilai SUS</w:t>
       </w:r>
-      <w:bookmarkEnd w:id="57"/>
+      <w:bookmarkEnd w:id="58"/>
     </w:p>
     <w:tbl>
       <w:tblPr>
@@ -24944,7 +24928,7 @@
           <w:lang w:val="en-US"/>
         </w:rPr>
       </w:pPr>
-      <w:bookmarkStart w:id="58" w:name="_Toc225967427"/>
+      <w:bookmarkStart w:id="59" w:name="_Toc225967427"/>
       <w:r>
         <w:t xml:space="preserve">Tabel </w:t>
       </w:r>
@@ -24993,7 +24977,7 @@
         </w:rPr>
         <w:t>Daftar pertanyaan SUS</w:t>
       </w:r>
-      <w:bookmarkEnd w:id="58"/>
+      <w:bookmarkEnd w:id="59"/>
     </w:p>
     <w:p>
       <w:pPr>
@@ -25649,8 +25633,8 @@
           <w:lang w:val="en-US"/>
         </w:rPr>
       </w:pPr>
-      <w:bookmarkStart w:id="59" w:name="_Toc137038247"/>
-      <w:bookmarkStart w:id="60" w:name="_Toc225245263"/>
+      <w:bookmarkStart w:id="60" w:name="_Toc137038247"/>
+      <w:bookmarkStart w:id="61" w:name="_Toc225245263"/>
       <w:r>
         <w:rPr>
           <w:lang w:val="en-US"/>
@@ -25658,20 +25642,20 @@
         <w:lastRenderedPageBreak/>
         <w:t>BAB 4. HASIL DAN PEMBAHASAN</w:t>
       </w:r>
-      <w:bookmarkEnd w:id="59"/>
       <w:bookmarkEnd w:id="60"/>
+      <w:bookmarkEnd w:id="61"/>
     </w:p>
     <w:p>
       <w:pPr>
         <w:pStyle w:val="Heading2"/>
       </w:pPr>
-      <w:bookmarkStart w:id="61" w:name="_Toc137038248"/>
-      <w:bookmarkStart w:id="62" w:name="_Toc225245264"/>
+      <w:bookmarkStart w:id="62" w:name="_Toc137038248"/>
+      <w:bookmarkStart w:id="63" w:name="_Toc225245264"/>
       <w:r>
         <w:t>4.1 Hasil Implementasi Solusi</w:t>
       </w:r>
-      <w:bookmarkEnd w:id="61"/>
       <w:bookmarkEnd w:id="62"/>
+      <w:bookmarkEnd w:id="63"/>
     </w:p>
     <w:p>
       <w:pPr>
@@ -25777,14 +25761,14 @@
           <w:lang w:val="en-US"/>
         </w:rPr>
       </w:pPr>
-      <w:bookmarkStart w:id="63" w:name="_Toc225245265"/>
+      <w:bookmarkStart w:id="64" w:name="_Toc225245265"/>
       <w:r>
         <w:rPr>
           <w:lang w:val="en-US"/>
         </w:rPr>
         <w:t>4.1.1 Implementasi Tahap Perencanaan</w:t>
       </w:r>
-      <w:bookmarkEnd w:id="63"/>
+      <w:bookmarkEnd w:id="64"/>
     </w:p>
     <w:p>
       <w:pPr>
@@ -26083,7 +26067,7 @@
           <w:lang w:val="en-US"/>
         </w:rPr>
       </w:pPr>
-      <w:bookmarkStart w:id="64" w:name="_Toc225967428"/>
+      <w:bookmarkStart w:id="65" w:name="_Toc225967428"/>
       <w:r>
         <w:t xml:space="preserve">Tabel </w:t>
       </w:r>
@@ -26108,7 +26092,7 @@
         </w:rPr>
         <w:t>Daftar Fitur</w:t>
       </w:r>
-      <w:bookmarkEnd w:id="64"/>
+      <w:bookmarkEnd w:id="65"/>
     </w:p>
     <w:tbl>
       <w:tblPr>
@@ -26894,14 +26878,14 @@
           <w:lang w:val="en-US"/>
         </w:rPr>
       </w:pPr>
-      <w:bookmarkStart w:id="65" w:name="_Toc225245266"/>
+      <w:bookmarkStart w:id="66" w:name="_Toc225245266"/>
       <w:r>
         <w:rPr>
           <w:lang w:val="en-US"/>
         </w:rPr>
         <w:t>4.1.2 Implementasi Tahap Perancangan</w:t>
       </w:r>
-      <w:bookmarkEnd w:id="65"/>
+      <w:bookmarkEnd w:id="66"/>
     </w:p>
     <w:p>
       <w:pPr>
@@ -27379,7 +27363,7 @@
           <w:lang w:val="en-US"/>
         </w:rPr>
       </w:pPr>
-      <w:bookmarkStart w:id="66" w:name="_Toc227759832"/>
+      <w:bookmarkStart w:id="67" w:name="_Toc227759832"/>
       <w:r>
         <w:rPr>
           <w:noProof/>
@@ -27550,7 +27534,7 @@
         </w:rPr>
         <w:t>Low Fidelity Prototype</w:t>
       </w:r>
-      <w:bookmarkEnd w:id="66"/>
+      <w:bookmarkEnd w:id="67"/>
     </w:p>
     <w:p>
       <w:pPr>
@@ -27560,7 +27544,7 @@
           <w:lang w:val="en-US"/>
         </w:rPr>
       </w:pPr>
-      <w:bookmarkStart w:id="67" w:name="_Toc227759833"/>
+      <w:bookmarkStart w:id="68" w:name="_Toc227759833"/>
       <w:r>
         <w:t xml:space="preserve">Gambar </w:t>
       </w:r>
@@ -27577,7 +27561,7 @@
         </w:rPr>
         <w:t>High Fidelity Prototype</w:t>
       </w:r>
-      <w:bookmarkEnd w:id="67"/>
+      <w:bookmarkEnd w:id="68"/>
     </w:p>
     <w:p>
       <w:pPr>
@@ -27587,14 +27571,14 @@
           <w:lang w:val="en-US"/>
         </w:rPr>
       </w:pPr>
-      <w:bookmarkStart w:id="68" w:name="_Toc225245267"/>
+      <w:bookmarkStart w:id="69" w:name="_Toc225245267"/>
       <w:r>
         <w:rPr>
           <w:lang w:val="en-US"/>
         </w:rPr>
         <w:t>4.1.3 Implementasi Tahap Sistem</w:t>
       </w:r>
-      <w:bookmarkEnd w:id="68"/>
+      <w:bookmarkEnd w:id="69"/>
     </w:p>
     <w:p>
       <w:pPr>
@@ -28237,6 +28221,7 @@
       </w:pPr>
       <w:r>
         <w:rPr>
+          <w:noProof/>
           <w:lang w:val="en-US"/>
         </w:rPr>
         <w:lastRenderedPageBreak/>
@@ -28299,7 +28284,7 @@
           <w:lang w:val="en-US"/>
         </w:rPr>
       </w:pPr>
-      <w:bookmarkStart w:id="69" w:name="_Toc227759834"/>
+      <w:bookmarkStart w:id="70" w:name="_Toc227759834"/>
       <w:r>
         <w:t xml:space="preserve">Gambar </w:t>
       </w:r>
@@ -28316,7 +28301,7 @@
         </w:rPr>
         <w:t>Gemini AI</w:t>
       </w:r>
-      <w:bookmarkEnd w:id="69"/>
+      <w:bookmarkEnd w:id="70"/>
     </w:p>
     <w:p>
       <w:pPr>
@@ -28326,7 +28311,7 @@
           <w:lang w:val="en-US"/>
         </w:rPr>
       </w:pPr>
-      <w:bookmarkStart w:id="70" w:name="_Toc225245269"/>
+      <w:bookmarkStart w:id="71" w:name="_Toc225245269"/>
       <w:r>
         <w:rPr>
           <w:lang w:val="en-US"/>
@@ -28352,7 +28337,7 @@
         </w:rPr>
         <w:t>Deploy</w:t>
       </w:r>
-      <w:bookmarkEnd w:id="70"/>
+      <w:bookmarkEnd w:id="71"/>
     </w:p>
     <w:p>
       <w:pPr>
@@ -29135,14 +29120,14 @@
       <w:pPr>
         <w:pStyle w:val="Heading2"/>
       </w:pPr>
-      <w:bookmarkStart w:id="71" w:name="_Toc137038249"/>
-      <w:bookmarkStart w:id="72" w:name="_Toc225245270"/>
+      <w:bookmarkStart w:id="72" w:name="_Toc137038249"/>
+      <w:bookmarkStart w:id="73" w:name="_Toc225245270"/>
       <w:r>
         <w:lastRenderedPageBreak/>
         <w:t>4.2 Hasil Evaluasi dan Validasi Solusi</w:t>
       </w:r>
-      <w:bookmarkEnd w:id="71"/>
       <w:bookmarkEnd w:id="72"/>
+      <w:bookmarkEnd w:id="73"/>
       <w:r>
         <w:t xml:space="preserve"> </w:t>
       </w:r>
@@ -29184,14 +29169,14 @@
           <w:lang w:val="en-US"/>
         </w:rPr>
       </w:pPr>
-      <w:bookmarkStart w:id="73" w:name="_Toc225245271"/>
+      <w:bookmarkStart w:id="74" w:name="_Toc225245271"/>
       <w:r>
         <w:rPr>
           <w:lang w:val="en-US"/>
         </w:rPr>
         <w:t>4.2.1 Hasil Pengujian Teknis Sistem</w:t>
       </w:r>
-      <w:bookmarkEnd w:id="73"/>
+      <w:bookmarkEnd w:id="74"/>
     </w:p>
     <w:p>
       <w:pPr>
@@ -29203,6 +29188,7 @@
       </w:pPr>
       <w:r>
         <w:rPr>
+          <w:noProof/>
           <w:lang w:val="en-US"/>
         </w:rPr>
         <w:drawing>
@@ -29422,7 +29408,7 @@
         </w:rPr>
         <w:tab/>
       </w:r>
-      <w:bookmarkStart w:id="74" w:name="_Toc227759835"/>
+      <w:bookmarkStart w:id="75" w:name="_Toc227759835"/>
       <w:r>
         <w:t xml:space="preserve">Gambar </w:t>
       </w:r>
@@ -29439,7 +29425,7 @@
         </w:rPr>
         <w:t>API Request Gemini</w:t>
       </w:r>
-      <w:bookmarkEnd w:id="74"/>
+      <w:bookmarkEnd w:id="75"/>
     </w:p>
     <w:p>
       <w:pPr>
@@ -29449,7 +29435,7 @@
           <w:lang w:val="en-US"/>
         </w:rPr>
       </w:pPr>
-      <w:bookmarkStart w:id="75" w:name="_Toc225245272"/>
+      <w:bookmarkStart w:id="76" w:name="_Toc225245272"/>
       <w:r>
         <w:rPr>
           <w:lang w:val="en-US"/>
@@ -29463,7 +29449,7 @@
         </w:rPr>
         <w:t>Usability Testing</w:t>
       </w:r>
-      <w:bookmarkEnd w:id="75"/>
+      <w:bookmarkEnd w:id="76"/>
     </w:p>
     <w:p>
       <w:pPr>
@@ -29589,7 +29575,33 @@
         <w:rPr>
           <w:lang w:val="en-US"/>
         </w:rPr>
-        <w:t xml:space="preserve"> berada pada rentang nilai Good - Excellent (≥ 70) dan masuk dalam kategori </w:t>
+        <w:t xml:space="preserve"> berada pada rentang nilai </w:t>
+      </w:r>
+      <w:r>
+        <w:rPr>
+          <w:i/>
+          <w:lang w:val="en-US"/>
+        </w:rPr>
+        <w:t>Good</w:t>
+      </w:r>
+      <w:r>
+        <w:rPr>
+          <w:lang w:val="en-US"/>
+        </w:rPr>
+        <w:t xml:space="preserve"> - </w:t>
+      </w:r>
+      <w:r>
+        <w:rPr>
+          <w:i/>
+          <w:lang w:val="en-US"/>
+        </w:rPr>
+        <w:t>Excellent</w:t>
+      </w:r>
+      <w:r>
+        <w:rPr>
+          <w:lang w:val="en-US"/>
+        </w:rPr>
+        <w:t xml:space="preserve"> (≥ 70) dan masuk dalam kategori </w:t>
       </w:r>
       <w:r>
         <w:rPr>
@@ -29646,14 +29658,14 @@
           <w:lang w:val="en-US"/>
         </w:rPr>
       </w:pPr>
-      <w:bookmarkStart w:id="76" w:name="_Toc225245273"/>
+      <w:bookmarkStart w:id="77" w:name="_Toc225245273"/>
       <w:r>
         <w:rPr>
           <w:lang w:val="en-US"/>
         </w:rPr>
         <w:t>4.2.3 Hasil Validasi Fungsi Deskriptif Gemini AI</w:t>
       </w:r>
-      <w:bookmarkEnd w:id="76"/>
+      <w:bookmarkEnd w:id="77"/>
     </w:p>
     <w:p>
       <w:pPr>
@@ -29788,8 +29800,6 @@
         </w:rPr>
         <w:t>Berdasarkan rumus tersebut</w:t>
       </w:r>
-      <w:bookmarkStart w:id="77" w:name="_GoBack"/>
-      <w:bookmarkEnd w:id="77"/>
       <w:r>
         <w:rPr>
           <w:lang w:val="en-US"/>
@@ -31533,7 +31543,6 @@
         <w:docPartUnique/>
       </w:docPartObj>
     </w:sdtPr>
-    <w:sdtEndPr/>
     <w:sdtContent>
       <w:p>
         <w:pPr>
@@ -31591,7 +31600,6 @@
         <w:docPartUnique/>
       </w:docPartObj>
     </w:sdtPr>
-    <w:sdtEndPr/>
     <w:sdtContent>
       <w:p>
         <w:pPr>
@@ -31620,7 +31628,7 @@
           <w:rPr>
             <w:noProof/>
           </w:rPr>
-          <w:t>20</w:t>
+          <w:t>8</w:t>
         </w:r>
         <w:r>
           <w:rPr>
@@ -31649,7 +31657,6 @@
         <w:docPartUnique/>
       </w:docPartObj>
     </w:sdtPr>
-    <w:sdtEndPr/>
     <w:sdtContent>
       <w:p>
         <w:pPr>
@@ -31678,7 +31685,7 @@
           <w:rPr>
             <w:noProof/>
           </w:rPr>
-          <w:t>34</w:t>
+          <w:t>29</w:t>
         </w:r>
         <w:r>
           <w:rPr>
@@ -33632,7 +33639,7 @@
 </file>
 
 <file path=customXml/itemProps1.xml><?xml version="1.0" encoding="utf-8"?>
-<ds:datastoreItem xmlns:ds="http://schemas.openxmlformats.org/officeDocument/2006/customXml" ds:itemID="{C8063BB4-3E85-420B-B435-CF445C502D12}">
+<ds:datastoreItem xmlns:ds="http://schemas.openxmlformats.org/officeDocument/2006/customXml" ds:itemID="{1A8EA798-A99F-4FDD-B14A-F4AC03E3375D}">
   <ds:schemaRefs>
     <ds:schemaRef ds:uri="http://schemas.openxmlformats.org/officeDocument/2006/bibliography"/>
   </ds:schemaRefs>

</xml_diff>

<commit_message>
Refine validation criteria and evaluation results for Gemini AI recommendations in thesis document
</commit_message>
<xml_diff>
--- a/NASKAH/Dokumen Laporan Skripsi - 42330018 - I Nyoman Wahyu Permana - 2023 - 2026.docx
+++ b/NASKAH/Dokumen Laporan Skripsi - 42330018 - I Nyoman Wahyu Permana - 2023 - 2026.docx
@@ -9647,23 +9647,7 @@
             <w:noProof/>
             <w:lang w:val="en-US"/>
           </w:rPr>
-          <w:t>4.2.1 Conto</w:t>
-        </w:r>
-        <w:r>
-          <w:rPr>
-            <w:rStyle w:val="Hyperlink"/>
-            <w:noProof/>
-            <w:lang w:val="en-US"/>
-          </w:rPr>
-          <w:t>h</w:t>
-        </w:r>
-        <w:r>
-          <w:rPr>
-            <w:rStyle w:val="Hyperlink"/>
-            <w:noProof/>
-            <w:lang w:val="en-US"/>
-          </w:rPr>
-          <w:t xml:space="preserve"> data pengujian</w:t>
+          <w:t>4.2.1 Contoh data pengujian</w:t>
         </w:r>
         <w:r>
           <w:rPr>
@@ -29549,6 +29533,7 @@
         <w:jc w:val="both"/>
         <w:rPr>
           <w:color w:val="FF0000"/>
+          <w:lang w:val="en-US"/>
         </w:rPr>
       </w:pPr>
       <w:r>
@@ -29581,7 +29566,20 @@
         <w:rPr>
           <w:lang w:val="en-US"/>
         </w:rPr>
-        <w:t>. Sebagai contoh, data sensor yang menunjukkan tegangan 280 Volt, frekuensi 58 Hz, dan beban 380 Watt akan diubah menjadi kalimat deskriptif yang menjelaskan kondisi sistem secara lengkap, kemudian dikirimkan ke Gemini AI untuk dianalisis.</w:t>
+        <w:t xml:space="preserve">. Sebagai contoh, data sensor yang menunjukkan tegangan 280 Volt, frekuensi 58 Hz, dan beban 380 Watt akan diubah menjadi kalimat deskriptif yang menjelaskan kondisi sistem secara lengkap, kemudian dikirimkan ke </w:t>
+      </w:r>
+      <w:r>
+        <w:rPr>
+          <w:i/>
+          <w:lang w:val="en-US"/>
+        </w:rPr>
+        <w:t>Gemini AI</w:t>
+      </w:r>
+      <w:r>
+        <w:rPr>
+          <w:lang w:val="en-US"/>
+        </w:rPr>
+        <w:t xml:space="preserve"> untuk dianalisis.</w:t>
       </w:r>
       <w:r>
         <w:rPr>
@@ -29590,31 +29588,21 @@
         <w:t xml:space="preserve"> </w:t>
       </w:r>
       <w:r>
-        <w:t xml:space="preserve">Contoh data </w:t>
-      </w:r>
-      <w:r>
-        <w:rPr>
-          <w:color w:val="FF0000"/>
-        </w:rPr>
-        <w:t>pengujian yang digunakan pada proses val</w:t>
-      </w:r>
-      <w:r>
-        <w:rPr>
-          <w:color w:val="FF0000"/>
-        </w:rPr>
+        <w:t xml:space="preserve">Contoh </w:t>
+      </w:r>
+      <w:r>
+        <w:t>data pengujian yang digunakan pada proses val</w:t>
+      </w:r>
+      <w:r>
         <w:t>idasi ditunjukkan pada Tabel 4.</w:t>
       </w:r>
       <w:r>
         <w:rPr>
-          <w:color w:val="FF0000"/>
           <w:lang w:val="en-US"/>
         </w:rPr>
         <w:t>2.1</w:t>
       </w:r>
       <w:r>
-        <w:rPr>
-          <w:color w:val="FF0000"/>
-        </w:rPr>
         <w:t>.</w:t>
       </w:r>
     </w:p>
@@ -30987,12 +30975,6 @@
         </w:rPr>
         <w:t xml:space="preserve">. </w:t>
       </w:r>
-      <w:r>
-        <w:rPr>
-          <w:lang w:val="en-US"/>
-        </w:rPr>
-        <w:t>Suatu rekomendasi dinyatakan valid apabila memenuhi sebagian besar indikator tersebut. Sebaliknya, jika rekomendasi terlalu umum, tidak sesuai dengan kondisi input, atau tidak memberikan tindakan yang jelas, maka hasil tersebut dinyatakan tidak valid.</w:t>
-      </w:r>
     </w:p>
     <w:p>
       <w:pPr>
@@ -31006,7 +30988,133 @@
         <w:rPr>
           <w:lang w:val="en-US"/>
         </w:rPr>
-        <w:t>Dari total 50 percobaan yang dilakukan, sebanyak 43 rekomendasi dinilai valid dan dapat diterapkan di lapangan. Sementara itu, 7 rekomendasi lainnya dinilai kurang optimal karena output yang dihasilkan masih terlalu umum atau kurang spesifik terhadap kondisi yang diberikan.</w:t>
+        <w:t xml:space="preserve">Pemilihan </w:t>
+      </w:r>
+      <w:r>
+        <w:rPr>
+          <w:lang w:val="en-US"/>
+        </w:rPr>
+        <w:t>ketiga</w:t>
+      </w:r>
+      <w:r>
+        <w:rPr>
+          <w:lang w:val="en-US"/>
+        </w:rPr>
+        <w:t xml:space="preserve"> indikator tersebut didasarkan pada karakteristik utama sistem </w:t>
+      </w:r>
+      <w:r>
+        <w:rPr>
+          <w:i/>
+          <w:lang w:val="en-US"/>
+        </w:rPr>
+        <w:t>Decision Support System</w:t>
+      </w:r>
+      <w:r>
+        <w:rPr>
+          <w:lang w:val="en-US"/>
+        </w:rPr>
+        <w:t xml:space="preserve"> berbasis kecerdasan buatan, di mana sistem tidak hanya dituntut menghasilkan jawaban yang benar, tetapi juga mampu memberikan rekomendasi yang relevan, mudah dipahami pengguna, dan dapat diter</w:t>
+      </w:r>
+      <w:r>
+        <w:rPr>
+          <w:lang w:val="en-US"/>
+        </w:rPr>
+        <w:t xml:space="preserve">apkan secara nyata di lapangan. </w:t>
+      </w:r>
+      <w:r>
+        <w:rPr>
+          <w:lang w:val="en-US"/>
+        </w:rPr>
+        <w:t xml:space="preserve">Indikator pertama, yaitu kesesuaian teknis, digunakan untuk menilai apakah rekomendasi yang diberikan </w:t>
+      </w:r>
+      <w:r>
+        <w:rPr>
+          <w:i/>
+          <w:lang w:val="en-US"/>
+        </w:rPr>
+        <w:t>AI</w:t>
+      </w:r>
+      <w:r>
+        <w:rPr>
+          <w:lang w:val="en-US"/>
+        </w:rPr>
+        <w:t xml:space="preserve"> sudah sesuai dengan kondisi teknis dan standar budidaya hortikultura. Aspek ini penting karena </w:t>
+      </w:r>
+      <w:r>
+        <w:rPr>
+          <w:i/>
+          <w:lang w:val="en-US"/>
+        </w:rPr>
+        <w:t>AI</w:t>
+      </w:r>
+      <w:r>
+        <w:rPr>
+          <w:lang w:val="en-US"/>
+        </w:rPr>
+        <w:t xml:space="preserve"> pada sistem </w:t>
+      </w:r>
+      <w:r>
+        <w:rPr>
+          <w:i/>
+          <w:lang w:val="en-US"/>
+        </w:rPr>
+        <w:t>DSS</w:t>
+      </w:r>
+      <w:r>
+        <w:rPr>
+          <w:lang w:val="en-US"/>
+        </w:rPr>
+        <w:t xml:space="preserve"> harus mampu menghasilkan analisis yang benar secara teknis agar tidak menimbulkan keputusan yang keliru. Pemilihan indikator ini merujuk pada penelitian terkait evaluasi sistem rekomendasi berbasis </w:t>
+      </w:r>
+      <w:r>
+        <w:rPr>
+          <w:i/>
+          <w:lang w:val="en-US"/>
+        </w:rPr>
+        <w:t>AI</w:t>
+      </w:r>
+      <w:r>
+        <w:rPr>
+          <w:lang w:val="en-US"/>
+        </w:rPr>
+        <w:t xml:space="preserve"> yang menekankan pentingnya akurasi dan </w:t>
+      </w:r>
+      <w:r>
+        <w:rPr>
+          <w:lang w:val="en-US"/>
+        </w:rPr>
+        <w:t xml:space="preserve">kebenaran dalam pengambilan keputusan. </w:t>
+      </w:r>
+      <w:r>
+        <w:rPr>
+          <w:lang w:val="en-US"/>
+        </w:rPr>
+        <w:t xml:space="preserve">Indikator kedua adalah relevansi, yang digunakan untuk menilai apakah rekomendasi yang dihasilkan sesuai dengan konteks data input yang diberikan. </w:t>
+      </w:r>
+      <w:r>
+        <w:rPr>
+          <w:lang w:val="en-US"/>
+        </w:rPr>
+        <w:t>R</w:t>
+      </w:r>
+      <w:r>
+        <w:rPr>
+          <w:lang w:val="en-US"/>
+        </w:rPr>
+        <w:t xml:space="preserve">elevansi menjadi indikator penting karena </w:t>
+      </w:r>
+      <w:r>
+        <w:rPr>
+          <w:i/>
+          <w:lang w:val="en-US"/>
+        </w:rPr>
+        <w:t>AI</w:t>
+      </w:r>
+      <w:r>
+        <w:rPr>
+          <w:lang w:val="en-US"/>
+        </w:rPr>
+        <w:t xml:space="preserve"> harus mampu memahami konteks permasalahan sebelum memberikan rekomendasi. Output yang benar secara teknis tetapi tidak sesuai konteks tetap dianggap kurang optimal dalam membantu pengguna.</w:t>
       </w:r>
       <w:r>
         <w:rPr>
@@ -31015,7 +31123,180 @@
         <w:t xml:space="preserve"> </w:t>
       </w:r>
       <w:r>
-        <w:t>Tingkat keberhasilan integrasi AI dihitung menggunakan rumus persentase sebagai berikut:</w:t>
+        <w:rPr>
+          <w:lang w:val="en-US"/>
+        </w:rPr>
+        <w:t xml:space="preserve">Indikator </w:t>
+      </w:r>
+      <w:r>
+        <w:rPr>
+          <w:lang w:val="en-US"/>
+        </w:rPr>
+        <w:lastRenderedPageBreak/>
+        <w:t xml:space="preserve">ketiga adalah mudah dipahami. Indikator ini dipilih karena pengguna utama sistem adalah petani yang sebagian besar bukan berasal dari latar belakang teknis. Oleh karena itu, rekomendasi yang dihasilkan </w:t>
+      </w:r>
+      <w:r>
+        <w:rPr>
+          <w:i/>
+          <w:lang w:val="en-US"/>
+        </w:rPr>
+        <w:t>AI</w:t>
+      </w:r>
+      <w:r>
+        <w:rPr>
+          <w:lang w:val="en-US"/>
+        </w:rPr>
+        <w:t xml:space="preserve"> harus menggunakan bahasa yang sederhana, komunikatif, dan mudah dimengerti. Pemilihan indikator ini didukung oleh penelitian </w:t>
+      </w:r>
+      <w:r>
+        <w:rPr>
+          <w:i/>
+          <w:lang w:val="en-US"/>
+        </w:rPr>
+        <w:t>usability dan Human Computer Interaction</w:t>
+      </w:r>
+      <w:r>
+        <w:rPr>
+          <w:lang w:val="en-US"/>
+        </w:rPr>
+        <w:t xml:space="preserve"> yang menyebutkan bahwa keterpahaman informasi menjadi faktor utama dalam penerimaan sistem oleh pengguna.</w:t>
+      </w:r>
+    </w:p>
+    <w:p>
+      <w:pPr>
+        <w:ind w:left="709" w:firstLine="720"/>
+        <w:jc w:val="both"/>
+        <w:rPr>
+          <w:lang w:val="en-US"/>
+        </w:rPr>
+      </w:pPr>
+      <w:r>
+        <w:rPr>
+          <w:lang w:val="en-US"/>
+        </w:rPr>
+        <w:t>Ketiga</w:t>
+      </w:r>
+      <w:r>
+        <w:rPr>
+          <w:lang w:val="en-US"/>
+        </w:rPr>
+        <w:t xml:space="preserve"> indikator tersebut kemudian digunakan secara bersamaan untuk mengevaluasi kualitas keluaran </w:t>
+      </w:r>
+      <w:r>
+        <w:rPr>
+          <w:i/>
+          <w:lang w:val="en-US"/>
+        </w:rPr>
+        <w:t>Gemini AI</w:t>
+      </w:r>
+      <w:r>
+        <w:rPr>
+          <w:lang w:val="en-US"/>
+        </w:rPr>
+        <w:t xml:space="preserve">. Output dinyatakan valid apabila memenuhi seluruh indikator evaluasi, karena setiap aspek dianggap memiliki peran penting dalam memastikan bahwa rekomendasi </w:t>
+      </w:r>
+      <w:r>
+        <w:rPr>
+          <w:i/>
+          <w:lang w:val="en-US"/>
+        </w:rPr>
+        <w:t>AI</w:t>
+      </w:r>
+      <w:r>
+        <w:rPr>
+          <w:lang w:val="en-US"/>
+        </w:rPr>
+        <w:t xml:space="preserve"> benar </w:t>
+      </w:r>
+      <w:r>
+        <w:rPr>
+          <w:lang w:val="en-US"/>
+        </w:rPr>
+        <w:t>benar layak digunakan pada lingkungan rumah kaca hortikultura.</w:t>
+      </w:r>
+    </w:p>
+    <w:p>
+      <w:pPr>
+        <w:ind w:left="709" w:firstLine="720"/>
+        <w:jc w:val="both"/>
+        <w:rPr>
+          <w:lang w:val="en-US"/>
+        </w:rPr>
+      </w:pPr>
+      <w:r>
+        <w:rPr>
+          <w:lang w:val="en-US"/>
+        </w:rPr>
+        <w:t xml:space="preserve">Suatu rekomendasi dinyatakan valid apabila memenuhi </w:t>
+      </w:r>
+      <w:r>
+        <w:rPr>
+          <w:lang w:val="en-US"/>
+        </w:rPr>
+        <w:t>semua</w:t>
+      </w:r>
+      <w:r>
+        <w:rPr>
+          <w:lang w:val="en-US"/>
+        </w:rPr>
+        <w:t xml:space="preserve"> indikator tersebut. Sebaliknya, jika rekomendasi terlalu umum, tidak sesuai dengan kondisi input, atau tidak memberikan tindakan yang jelas, maka hasil tersebut dinyatakan tidak valid.</w:t>
+      </w:r>
+    </w:p>
+    <w:p>
+      <w:pPr>
+        <w:ind w:left="709" w:firstLine="720"/>
+        <w:jc w:val="both"/>
+        <w:rPr>
+          <w:lang w:val="en-US"/>
+        </w:rPr>
+      </w:pPr>
+      <w:r>
+        <w:rPr>
+          <w:lang w:val="en-US"/>
+        </w:rPr>
+        <w:t>Dari total 50 perco</w:t>
+      </w:r>
+      <w:r>
+        <w:rPr>
+          <w:lang w:val="en-US"/>
+        </w:rPr>
+        <w:t>baan yang dilakukan, sebanyak 41</w:t>
+      </w:r>
+      <w:r>
+        <w:rPr>
+          <w:lang w:val="en-US"/>
+        </w:rPr>
+        <w:t xml:space="preserve"> rekomendasi dinilai valid dan dapat diterapk</w:t>
+      </w:r>
+      <w:r>
+        <w:rPr>
+          <w:lang w:val="en-US"/>
+        </w:rPr>
+        <w:t>an di lapangan. Sementara itu, 9</w:t>
+      </w:r>
+      <w:r>
+        <w:rPr>
+          <w:lang w:val="en-US"/>
+        </w:rPr>
+        <w:t xml:space="preserve"> rekomendasi lainnya dinilai kurang optimal karena output yang dihasilkan masih terlalu umum atau kurang spesifik terhadap kondisi yang diberikan.</w:t>
+      </w:r>
+      <w:r>
+        <w:rPr>
+          <w:lang w:val="en-US"/>
+        </w:rPr>
+        <w:t xml:space="preserve"> </w:t>
+      </w:r>
+      <w:r>
+        <w:t xml:space="preserve">Tingkat keberhasilan integrasi </w:t>
+      </w:r>
+      <w:r>
+        <w:rPr>
+          <w:i/>
+        </w:rPr>
+        <w:t>AI</w:t>
+      </w:r>
+      <w:r>
+        <w:t xml:space="preserve"> dihitung menggunakan rumus persentase sebagai berikut:</w:t>
       </w:r>
     </w:p>
     <w:p>
@@ -31124,7 +31405,16 @@
         <w:t>Gemini AI</w:t>
       </w:r>
       <w:r>
-        <w:t xml:space="preserve"> mencapai 86%. Nilai ini telah memenuhi dan melampaui standar minimal keberhasilan yang ditetapkan dalam penelitian ini, yaitu sebesar 80%. Dengan demikian, </w:t>
+        <w:t xml:space="preserve"> mencapai 8</w:t>
+      </w:r>
+      <w:r>
+        <w:rPr>
+          <w:lang w:val="en-US"/>
+        </w:rPr>
+        <w:t>2</w:t>
+      </w:r>
+      <w:r>
+        <w:t xml:space="preserve">%. Nilai ini telah memenuhi dan melampaui standar minimal keberhasilan yang ditetapkan dalam penelitian ini, yaitu sebesar 80%. Dengan demikian, </w:t>
       </w:r>
       <w:r>
         <w:rPr>
@@ -31133,11 +31423,7 @@
         <w:t>Gemini AI</w:t>
       </w:r>
       <w:r>
-        <w:t xml:space="preserve"> dinyatakan </w:t>
-      </w:r>
-      <w:r>
-        <w:lastRenderedPageBreak/>
-        <w:t xml:space="preserve">mampu memberikan rekomendasi yang cukup akurat dan layak digunakan sebagai bagian dari sistem </w:t>
+        <w:t xml:space="preserve"> dinyatakan mampu memberikan rekomendasi yang cukup akurat dan layak digunakan sebagai bagian dari sistem </w:t>
       </w:r>
       <w:r>
         <w:rPr>
@@ -31172,6 +31458,20 @@
       <w:r>
         <w:t xml:space="preserve"> berikut.</w:t>
       </w:r>
+    </w:p>
+    <w:p>
+      <w:pPr>
+        <w:ind w:left="709" w:firstLine="720"/>
+        <w:jc w:val="both"/>
+      </w:pPr>
+    </w:p>
+    <w:p>
+      <w:pPr>
+        <w:ind w:left="709" w:firstLine="720"/>
+        <w:jc w:val="both"/>
+      </w:pPr>
+      <w:bookmarkStart w:id="77" w:name="_GoBack"/>
+      <w:bookmarkEnd w:id="77"/>
     </w:p>
     <w:p>
       <w:pPr>
@@ -31182,9 +31482,10 @@
         </w:rPr>
       </w:pPr>
       <w:r>
+        <w:lastRenderedPageBreak/>
         <w:tab/>
       </w:r>
-      <w:bookmarkStart w:id="77" w:name="_Toc229568881"/>
+      <w:bookmarkStart w:id="78" w:name="_Toc229568881"/>
       <w:r>
         <w:t xml:space="preserve">Tabel </w:t>
       </w:r>
@@ -31194,7 +31495,7 @@
         </w:rPr>
         <w:t>4.2.2. Hasil Evaluasi Validasi</w:t>
       </w:r>
-      <w:bookmarkEnd w:id="77"/>
+      <w:bookmarkEnd w:id="78"/>
     </w:p>
     <w:tbl>
       <w:tblPr>
@@ -31956,7 +32257,13 @@
         <w:rPr>
           <w:lang w:val="en-US"/>
         </w:rPr>
-        <w:t xml:space="preserve"> sebesar 86% yang relevan dengan standar hortikultura. </w:t>
+        <w:t xml:space="preserve"> sebesar 82</w:t>
+      </w:r>
+      <w:r>
+        <w:rPr>
+          <w:lang w:val="en-US"/>
+        </w:rPr>
+        <w:t xml:space="preserve">% yang relevan dengan standar hortikultura. </w:t>
       </w:r>
       <w:r>
         <w:rPr>
@@ -31972,8 +32279,8 @@
           <w:lang w:val="en-US"/>
         </w:rPr>
       </w:pPr>
-      <w:bookmarkStart w:id="78" w:name="_Toc137038250"/>
-      <w:bookmarkStart w:id="79" w:name="_Toc225245274"/>
+      <w:bookmarkStart w:id="79" w:name="_Toc137038250"/>
+      <w:bookmarkStart w:id="80" w:name="_Toc225245274"/>
       <w:r>
         <w:rPr>
           <w:lang w:val="en-US"/>
@@ -31981,20 +32288,20 @@
         <w:lastRenderedPageBreak/>
         <w:t>BAB 5. KESIMPULAN DAN SARAN</w:t>
       </w:r>
-      <w:bookmarkEnd w:id="78"/>
       <w:bookmarkEnd w:id="79"/>
+      <w:bookmarkEnd w:id="80"/>
     </w:p>
     <w:p>
       <w:pPr>
         <w:pStyle w:val="Heading2"/>
       </w:pPr>
-      <w:bookmarkStart w:id="80" w:name="_Toc137038251"/>
-      <w:bookmarkStart w:id="81" w:name="_Toc225245275"/>
+      <w:bookmarkStart w:id="81" w:name="_Toc137038251"/>
+      <w:bookmarkStart w:id="82" w:name="_Toc225245275"/>
       <w:r>
         <w:t>5.1 Kesimpulan</w:t>
       </w:r>
-      <w:bookmarkEnd w:id="80"/>
       <w:bookmarkEnd w:id="81"/>
+      <w:bookmarkEnd w:id="82"/>
     </w:p>
     <w:p>
       <w:pPr>
@@ -32280,13 +32587,13 @@
       <w:pPr>
         <w:pStyle w:val="Heading2"/>
       </w:pPr>
-      <w:bookmarkStart w:id="82" w:name="_Toc137038252"/>
-      <w:bookmarkStart w:id="83" w:name="_Toc225245276"/>
+      <w:bookmarkStart w:id="83" w:name="_Toc137038252"/>
+      <w:bookmarkStart w:id="84" w:name="_Toc225245276"/>
       <w:r>
         <w:t>5.2 Saran</w:t>
       </w:r>
-      <w:bookmarkEnd w:id="82"/>
       <w:bookmarkEnd w:id="83"/>
+      <w:bookmarkEnd w:id="84"/>
     </w:p>
     <w:p>
       <w:pPr>
@@ -32341,12 +32648,12 @@
       <w:pPr>
         <w:pStyle w:val="Heading1"/>
       </w:pPr>
-      <w:bookmarkStart w:id="84" w:name="_Toc225245277"/>
+      <w:bookmarkStart w:id="85" w:name="_Toc225245277"/>
       <w:r>
         <w:lastRenderedPageBreak/>
         <w:t>DAFTAR PUSTAKA</w:t>
       </w:r>
-      <w:bookmarkEnd w:id="84"/>
+      <w:bookmarkEnd w:id="85"/>
     </w:p>
     <w:p>
       <w:pPr>
@@ -33436,14 +33743,14 @@
       <w:r>
         <w:fldChar w:fldCharType="end"/>
       </w:r>
-      <w:bookmarkStart w:id="85" w:name="_Toc225245278"/>
+      <w:bookmarkStart w:id="86" w:name="_Toc225245278"/>
       <w:r>
         <w:rPr>
           <w:lang w:val="en-US"/>
         </w:rPr>
         <w:t>LAMPIRAN</w:t>
       </w:r>
-      <w:bookmarkEnd w:id="85"/>
+      <w:bookmarkEnd w:id="86"/>
     </w:p>
     <w:tbl>
       <w:tblPr>
@@ -33459,22 +33766,22 @@
       </w:tblPr>
       <w:tblGrid>
         <w:gridCol w:w="289"/>
-        <w:gridCol w:w="339"/>
-        <w:gridCol w:w="537"/>
+        <w:gridCol w:w="340"/>
+        <w:gridCol w:w="540"/>
         <w:gridCol w:w="549"/>
         <w:gridCol w:w="900"/>
-        <w:gridCol w:w="809"/>
-        <w:gridCol w:w="1072"/>
+        <w:gridCol w:w="810"/>
+        <w:gridCol w:w="1079"/>
         <w:gridCol w:w="90"/>
-        <w:gridCol w:w="1511"/>
-        <w:gridCol w:w="323"/>
-        <w:gridCol w:w="1423"/>
-        <w:gridCol w:w="1957"/>
+        <w:gridCol w:w="1528"/>
+        <w:gridCol w:w="220"/>
+        <w:gridCol w:w="1439"/>
+        <w:gridCol w:w="1977"/>
         <w:gridCol w:w="80"/>
-        <w:gridCol w:w="1173"/>
-        <w:gridCol w:w="79"/>
-        <w:gridCol w:w="2226"/>
-        <w:gridCol w:w="79"/>
+        <w:gridCol w:w="1179"/>
+        <w:gridCol w:w="80"/>
+        <w:gridCol w:w="2256"/>
+        <w:gridCol w:w="80"/>
       </w:tblGrid>
       <w:tr>
         <w:trPr>
@@ -34257,7 +34564,7 @@
                 <w:szCs w:val="16"/>
                 <w:lang w:val="en-US"/>
               </w:rPr>
-              <w:t>✔️</w:t>
+              <w:t>✔</w:t>
             </w:r>
           </w:p>
         </w:tc>
@@ -34286,7 +34593,7 @@
                 <w:szCs w:val="16"/>
                 <w:lang w:val="en-US"/>
               </w:rPr>
-              <w:t>✔️</w:t>
+              <w:t>✔</w:t>
             </w:r>
           </w:p>
         </w:tc>
@@ -34626,7 +34933,7 @@
                 <w:szCs w:val="16"/>
                 <w:lang w:val="en-US"/>
               </w:rPr>
-              <w:t>✔️</w:t>
+              <w:t>✔</w:t>
             </w:r>
           </w:p>
         </w:tc>
@@ -34655,7 +34962,7 @@
                 <w:szCs w:val="16"/>
                 <w:lang w:val="en-US"/>
               </w:rPr>
-              <w:t>✔️</w:t>
+              <w:t>✔</w:t>
             </w:r>
           </w:p>
         </w:tc>
@@ -34995,7 +35302,7 @@
                 <w:szCs w:val="16"/>
                 <w:lang w:val="en-US"/>
               </w:rPr>
-              <w:t>✔️</w:t>
+              <w:t>✔</w:t>
             </w:r>
           </w:p>
         </w:tc>
@@ -35024,7 +35331,7 @@
                 <w:szCs w:val="16"/>
                 <w:lang w:val="en-US"/>
               </w:rPr>
-              <w:t>✔️</w:t>
+              <w:t>✔</w:t>
             </w:r>
           </w:p>
         </w:tc>
@@ -35364,7 +35671,7 @@
                 <w:szCs w:val="16"/>
                 <w:lang w:val="en-US"/>
               </w:rPr>
-              <w:t>✔️</w:t>
+              <w:t>✔</w:t>
             </w:r>
           </w:p>
         </w:tc>
@@ -35393,7 +35700,7 @@
                 <w:szCs w:val="16"/>
                 <w:lang w:val="en-US"/>
               </w:rPr>
-              <w:t>✔️</w:t>
+              <w:t>✔</w:t>
             </w:r>
           </w:p>
         </w:tc>
@@ -35733,7 +36040,7 @@
                 <w:szCs w:val="16"/>
                 <w:lang w:val="en-US"/>
               </w:rPr>
-              <w:t>✔️</w:t>
+              <w:t>✔</w:t>
             </w:r>
           </w:p>
         </w:tc>
@@ -35762,7 +36069,7 @@
                 <w:szCs w:val="16"/>
                 <w:lang w:val="en-US"/>
               </w:rPr>
-              <w:t>✔️</w:t>
+              <w:t>✔</w:t>
             </w:r>
           </w:p>
         </w:tc>
@@ -36102,7 +36409,7 @@
                 <w:szCs w:val="16"/>
                 <w:lang w:val="en-US"/>
               </w:rPr>
-              <w:t>✔️</w:t>
+              <w:t>✔</w:t>
             </w:r>
           </w:p>
         </w:tc>
@@ -36131,7 +36438,7 @@
                 <w:szCs w:val="16"/>
                 <w:lang w:val="en-US"/>
               </w:rPr>
-              <w:t>✔️</w:t>
+              <w:t>✔</w:t>
             </w:r>
           </w:p>
         </w:tc>
@@ -36840,7 +37147,7 @@
                 <w:szCs w:val="16"/>
                 <w:lang w:val="en-US"/>
               </w:rPr>
-              <w:t>✔️</w:t>
+              <w:t>✔</w:t>
             </w:r>
           </w:p>
         </w:tc>
@@ -36869,7 +37176,7 @@
                 <w:szCs w:val="16"/>
                 <w:lang w:val="en-US"/>
               </w:rPr>
-              <w:t>✔️</w:t>
+              <w:t>✔</w:t>
             </w:r>
           </w:p>
         </w:tc>
@@ -37209,7 +37516,7 @@
                 <w:szCs w:val="16"/>
                 <w:lang w:val="en-US"/>
               </w:rPr>
-              <w:t>✔️</w:t>
+              <w:t>✔</w:t>
             </w:r>
           </w:p>
         </w:tc>
@@ -37238,7 +37545,7 @@
                 <w:szCs w:val="16"/>
                 <w:lang w:val="en-US"/>
               </w:rPr>
-              <w:t>✔️</w:t>
+              <w:t>✔</w:t>
             </w:r>
           </w:p>
         </w:tc>
@@ -37578,7 +37885,7 @@
                 <w:szCs w:val="16"/>
                 <w:lang w:val="en-US"/>
               </w:rPr>
-              <w:t>✔️</w:t>
+              <w:t>✔</w:t>
             </w:r>
           </w:p>
         </w:tc>
@@ -37607,7 +37914,7 @@
                 <w:szCs w:val="16"/>
                 <w:lang w:val="en-US"/>
               </w:rPr>
-              <w:t>✔️</w:t>
+              <w:t>✔</w:t>
             </w:r>
           </w:p>
         </w:tc>
@@ -37947,7 +38254,7 @@
                 <w:szCs w:val="16"/>
                 <w:lang w:val="en-US"/>
               </w:rPr>
-              <w:t>✔️</w:t>
+              <w:t>✔</w:t>
             </w:r>
           </w:p>
         </w:tc>
@@ -37976,7 +38283,7 @@
                 <w:szCs w:val="16"/>
                 <w:lang w:val="en-US"/>
               </w:rPr>
-              <w:t>✔️</w:t>
+              <w:t>✔</w:t>
             </w:r>
           </w:p>
         </w:tc>
@@ -38316,7 +38623,7 @@
                 <w:szCs w:val="16"/>
                 <w:lang w:val="en-US"/>
               </w:rPr>
-              <w:t>✔️</w:t>
+              <w:t>✔</w:t>
             </w:r>
           </w:p>
         </w:tc>
@@ -38345,7 +38652,7 @@
                 <w:szCs w:val="16"/>
                 <w:lang w:val="en-US"/>
               </w:rPr>
-              <w:t>✔️</w:t>
+              <w:t>✔</w:t>
             </w:r>
           </w:p>
         </w:tc>
@@ -38685,7 +38992,7 @@
                 <w:szCs w:val="16"/>
                 <w:lang w:val="en-US"/>
               </w:rPr>
-              <w:t>✔️</w:t>
+              <w:t>✔</w:t>
             </w:r>
           </w:p>
         </w:tc>
@@ -38714,7 +39021,7 @@
                 <w:szCs w:val="16"/>
                 <w:lang w:val="en-US"/>
               </w:rPr>
-              <w:t>✔️</w:t>
+              <w:t>✔</w:t>
             </w:r>
           </w:p>
         </w:tc>
@@ -39054,7 +39361,7 @@
                 <w:szCs w:val="16"/>
                 <w:lang w:val="en-US"/>
               </w:rPr>
-              <w:t>✔️</w:t>
+              <w:t>✔</w:t>
             </w:r>
           </w:p>
         </w:tc>
@@ -39083,7 +39390,7 @@
                 <w:szCs w:val="16"/>
                 <w:lang w:val="en-US"/>
               </w:rPr>
-              <w:t>✔️</w:t>
+              <w:t>✔</w:t>
             </w:r>
           </w:p>
         </w:tc>
@@ -39423,7 +39730,7 @@
                 <w:szCs w:val="16"/>
                 <w:lang w:val="en-US"/>
               </w:rPr>
-              <w:t>✔️</w:t>
+              <w:t>✔</w:t>
             </w:r>
           </w:p>
         </w:tc>
@@ -39452,7 +39759,7 @@
                 <w:szCs w:val="16"/>
                 <w:lang w:val="en-US"/>
               </w:rPr>
-              <w:t>✔️</w:t>
+              <w:t>✔</w:t>
             </w:r>
           </w:p>
         </w:tc>
@@ -39792,7 +40099,7 @@
                 <w:szCs w:val="16"/>
                 <w:lang w:val="en-US"/>
               </w:rPr>
-              <w:t>✔️</w:t>
+              <w:t>✔</w:t>
             </w:r>
           </w:p>
         </w:tc>
@@ -39821,7 +40128,7 @@
                 <w:szCs w:val="16"/>
                 <w:lang w:val="en-US"/>
               </w:rPr>
-              <w:t>✔️</w:t>
+              <w:t>✔</w:t>
             </w:r>
           </w:p>
         </w:tc>
@@ -40161,7 +40468,7 @@
                 <w:szCs w:val="16"/>
                 <w:lang w:val="en-US"/>
               </w:rPr>
-              <w:t>✔️</w:t>
+              <w:t>✔</w:t>
             </w:r>
           </w:p>
         </w:tc>
@@ -40530,7 +40837,7 @@
                 <w:szCs w:val="16"/>
                 <w:lang w:val="en-US"/>
               </w:rPr>
-              <w:t>✔️</w:t>
+              <w:t>✔</w:t>
             </w:r>
           </w:p>
         </w:tc>
@@ -40559,7 +40866,7 @@
                 <w:szCs w:val="16"/>
                 <w:lang w:val="en-US"/>
               </w:rPr>
-              <w:t>✔️</w:t>
+              <w:t>✔</w:t>
             </w:r>
           </w:p>
         </w:tc>
@@ -40899,7 +41206,7 @@
                 <w:szCs w:val="16"/>
                 <w:lang w:val="en-US"/>
               </w:rPr>
-              <w:t>✔️</w:t>
+              <w:t>✔</w:t>
             </w:r>
           </w:p>
         </w:tc>
@@ -40928,7 +41235,7 @@
                 <w:szCs w:val="16"/>
                 <w:lang w:val="en-US"/>
               </w:rPr>
-              <w:t>✔️</w:t>
+              <w:t>✔</w:t>
             </w:r>
           </w:p>
         </w:tc>
@@ -41268,7 +41575,7 @@
                 <w:szCs w:val="16"/>
                 <w:lang w:val="en-US"/>
               </w:rPr>
-              <w:t>✔️</w:t>
+              <w:t>✔</w:t>
             </w:r>
           </w:p>
         </w:tc>
@@ -41297,7 +41604,7 @@
                 <w:szCs w:val="16"/>
                 <w:lang w:val="en-US"/>
               </w:rPr>
-              <w:t>✔️</w:t>
+              <w:t>✔</w:t>
             </w:r>
           </w:p>
         </w:tc>
@@ -41637,7 +41944,7 @@
                 <w:szCs w:val="16"/>
                 <w:lang w:val="en-US"/>
               </w:rPr>
-              <w:t>✔️</w:t>
+              <w:t>✔</w:t>
             </w:r>
           </w:p>
         </w:tc>
@@ -41666,7 +41973,7 @@
                 <w:szCs w:val="16"/>
                 <w:lang w:val="en-US"/>
               </w:rPr>
-              <w:t>✔️</w:t>
+              <w:t>✔</w:t>
             </w:r>
           </w:p>
         </w:tc>
@@ -42006,7 +42313,7 @@
                 <w:szCs w:val="16"/>
                 <w:lang w:val="en-US"/>
               </w:rPr>
-              <w:t>✔️</w:t>
+              <w:t>✔</w:t>
             </w:r>
           </w:p>
         </w:tc>
@@ -42035,7 +42342,7 @@
                 <w:szCs w:val="16"/>
                 <w:lang w:val="en-US"/>
               </w:rPr>
-              <w:t>✔️</w:t>
+              <w:t>✔</w:t>
             </w:r>
           </w:p>
         </w:tc>
@@ -42375,7 +42682,7 @@
                 <w:szCs w:val="16"/>
                 <w:lang w:val="en-US"/>
               </w:rPr>
-              <w:t>✔️</w:t>
+              <w:t>✔</w:t>
             </w:r>
           </w:p>
         </w:tc>
@@ -42404,7 +42711,7 @@
                 <w:szCs w:val="16"/>
                 <w:lang w:val="en-US"/>
               </w:rPr>
-              <w:t>✔️</w:t>
+              <w:t>✔</w:t>
             </w:r>
           </w:p>
         </w:tc>
@@ -42744,7 +43051,7 @@
                 <w:szCs w:val="16"/>
                 <w:lang w:val="en-US"/>
               </w:rPr>
-              <w:t>✔️</w:t>
+              <w:t>✔</w:t>
             </w:r>
           </w:p>
         </w:tc>
@@ -42773,7 +43080,7 @@
                 <w:szCs w:val="16"/>
                 <w:lang w:val="en-US"/>
               </w:rPr>
-              <w:t>✔️</w:t>
+              <w:t>✔</w:t>
             </w:r>
           </w:p>
         </w:tc>
@@ -43113,7 +43420,7 @@
                 <w:szCs w:val="16"/>
                 <w:lang w:val="en-US"/>
               </w:rPr>
-              <w:t>✔️</w:t>
+              <w:t>✔</w:t>
             </w:r>
           </w:p>
         </w:tc>
@@ -43142,7 +43449,7 @@
                 <w:szCs w:val="16"/>
                 <w:lang w:val="en-US"/>
               </w:rPr>
-              <w:t>✔️</w:t>
+              <w:t>✔</w:t>
             </w:r>
           </w:p>
         </w:tc>
@@ -43482,7 +43789,7 @@
                 <w:szCs w:val="16"/>
                 <w:lang w:val="en-US"/>
               </w:rPr>
-              <w:t>✔️</w:t>
+              <w:t>✔</w:t>
             </w:r>
           </w:p>
         </w:tc>
@@ -43511,7 +43818,7 @@
                 <w:szCs w:val="16"/>
                 <w:lang w:val="en-US"/>
               </w:rPr>
-              <w:t>✔️</w:t>
+              <w:t>✔</w:t>
             </w:r>
           </w:p>
         </w:tc>
@@ -43822,7 +44129,7 @@
                 <w:szCs w:val="16"/>
                 <w:lang w:val="en-US"/>
               </w:rPr>
-              <w:t>⚠</w:t>
+              <w:t>❌</w:t>
             </w:r>
           </w:p>
         </w:tc>
@@ -43936,7 +44243,6 @@
                 <w:lang w:val="en-US"/>
               </w:rPr>
             </w:pPr>
-            <w:bookmarkStart w:id="86" w:name="_GoBack" w:colFirst="10" w:colLast="10"/>
             <w:r>
               <w:rPr>
                 <w:rFonts w:eastAsia="Times New Roman" w:cs="Arial"/>
@@ -44222,7 +44528,7 @@
                 <w:szCs w:val="16"/>
                 <w:lang w:val="en-US"/>
               </w:rPr>
-              <w:t>✔️</w:t>
+              <w:t>✔</w:t>
             </w:r>
           </w:p>
         </w:tc>
@@ -44251,7 +44557,7 @@
                 <w:szCs w:val="16"/>
                 <w:lang w:val="en-US"/>
               </w:rPr>
-              <w:t>✔️</w:t>
+              <w:t>✔</w:t>
             </w:r>
           </w:p>
         </w:tc>
@@ -44591,7 +44897,7 @@
                 <w:szCs w:val="16"/>
                 <w:lang w:val="en-US"/>
               </w:rPr>
-              <w:t>✔️</w:t>
+              <w:t>✔</w:t>
             </w:r>
           </w:p>
         </w:tc>
@@ -44620,7 +44926,7 @@
                 <w:szCs w:val="16"/>
                 <w:lang w:val="en-US"/>
               </w:rPr>
-              <w:t>✔️</w:t>
+              <w:t>✔</w:t>
             </w:r>
           </w:p>
         </w:tc>
@@ -44960,7 +45266,7 @@
                 <w:szCs w:val="16"/>
                 <w:lang w:val="en-US"/>
               </w:rPr>
-              <w:t>✔️</w:t>
+              <w:t>✔</w:t>
             </w:r>
           </w:p>
         </w:tc>
@@ -45019,376 +45325,6 @@
                 <w:lang w:val="en-US"/>
               </w:rPr>
               <w:t>Tidak Valid</w:t>
-            </w:r>
-          </w:p>
-        </w:tc>
-      </w:tr>
-      <w:bookmarkEnd w:id="86"/>
-      <w:tr>
-        <w:trPr>
-          <w:tblCellSpacing w:w="15" w:type="dxa"/>
-        </w:trPr>
-        <w:tc>
-          <w:tcPr>
-            <w:tcW w:w="0" w:type="auto"/>
-            <w:vAlign w:val="center"/>
-            <w:hideMark/>
-          </w:tcPr>
-          <w:p>
-            <w:pPr>
-              <w:spacing w:line="240" w:lineRule="auto"/>
-              <w:ind w:firstLine="0"/>
-              <w:jc w:val="center"/>
-              <w:rPr>
-                <w:rFonts w:eastAsia="Times New Roman" w:cs="Arial"/>
-                <w:sz w:val="16"/>
-                <w:szCs w:val="16"/>
-                <w:lang w:val="en-US"/>
-              </w:rPr>
-            </w:pPr>
-            <w:r>
-              <w:rPr>
-                <w:rFonts w:eastAsia="Times New Roman" w:cs="Arial"/>
-                <w:sz w:val="16"/>
-                <w:szCs w:val="16"/>
-                <w:lang w:val="en-US"/>
-              </w:rPr>
-              <w:t>31</w:t>
-            </w:r>
-          </w:p>
-        </w:tc>
-        <w:tc>
-          <w:tcPr>
-            <w:tcW w:w="311" w:type="dxa"/>
-            <w:vAlign w:val="center"/>
-            <w:hideMark/>
-          </w:tcPr>
-          <w:p>
-            <w:pPr>
-              <w:spacing w:line="240" w:lineRule="auto"/>
-              <w:ind w:firstLine="0"/>
-              <w:jc w:val="center"/>
-              <w:rPr>
-                <w:rFonts w:eastAsia="Times New Roman" w:cs="Arial"/>
-                <w:sz w:val="16"/>
-                <w:szCs w:val="16"/>
-                <w:lang w:val="en-US"/>
-              </w:rPr>
-            </w:pPr>
-            <w:r>
-              <w:rPr>
-                <w:rFonts w:eastAsia="Times New Roman" w:cs="Arial"/>
-                <w:sz w:val="16"/>
-                <w:szCs w:val="16"/>
-                <w:lang w:val="en-US"/>
-              </w:rPr>
-              <w:t>52</w:t>
-            </w:r>
-          </w:p>
-        </w:tc>
-        <w:tc>
-          <w:tcPr>
-            <w:tcW w:w="510" w:type="dxa"/>
-            <w:vAlign w:val="center"/>
-            <w:hideMark/>
-          </w:tcPr>
-          <w:p>
-            <w:pPr>
-              <w:spacing w:line="240" w:lineRule="auto"/>
-              <w:ind w:firstLine="0"/>
-              <w:jc w:val="center"/>
-              <w:rPr>
-                <w:rFonts w:eastAsia="Times New Roman" w:cs="Arial"/>
-                <w:sz w:val="16"/>
-                <w:szCs w:val="16"/>
-                <w:lang w:val="en-US"/>
-              </w:rPr>
-            </w:pPr>
-            <w:r>
-              <w:rPr>
-                <w:rFonts w:eastAsia="Times New Roman" w:cs="Arial"/>
-                <w:sz w:val="16"/>
-                <w:szCs w:val="16"/>
-                <w:lang w:val="en-US"/>
-              </w:rPr>
-              <w:t>235</w:t>
-            </w:r>
-          </w:p>
-        </w:tc>
-        <w:tc>
-          <w:tcPr>
-            <w:tcW w:w="519" w:type="dxa"/>
-            <w:vAlign w:val="center"/>
-            <w:hideMark/>
-          </w:tcPr>
-          <w:p>
-            <w:pPr>
-              <w:spacing w:line="240" w:lineRule="auto"/>
-              <w:ind w:firstLine="0"/>
-              <w:jc w:val="center"/>
-              <w:rPr>
-                <w:rFonts w:eastAsia="Times New Roman" w:cs="Arial"/>
-                <w:sz w:val="16"/>
-                <w:szCs w:val="16"/>
-                <w:lang w:val="en-US"/>
-              </w:rPr>
-            </w:pPr>
-            <w:r>
-              <w:rPr>
-                <w:rFonts w:eastAsia="Times New Roman" w:cs="Arial"/>
-                <w:sz w:val="16"/>
-                <w:szCs w:val="16"/>
-                <w:lang w:val="en-US"/>
-              </w:rPr>
-              <w:t>330W</w:t>
-            </w:r>
-          </w:p>
-        </w:tc>
-        <w:tc>
-          <w:tcPr>
-            <w:tcW w:w="870" w:type="dxa"/>
-            <w:vAlign w:val="center"/>
-            <w:hideMark/>
-          </w:tcPr>
-          <w:p>
-            <w:pPr>
-              <w:spacing w:line="240" w:lineRule="auto"/>
-              <w:ind w:firstLine="0"/>
-              <w:jc w:val="center"/>
-              <w:rPr>
-                <w:rFonts w:eastAsia="Times New Roman" w:cs="Arial"/>
-                <w:sz w:val="16"/>
-                <w:szCs w:val="16"/>
-                <w:lang w:val="en-US"/>
-              </w:rPr>
-            </w:pPr>
-            <w:r>
-              <w:rPr>
-                <w:rFonts w:eastAsia="Times New Roman" w:cs="Arial"/>
-                <w:sz w:val="16"/>
-                <w:szCs w:val="16"/>
-                <w:lang w:val="en-US"/>
-              </w:rPr>
-              <w:t>350W</w:t>
-            </w:r>
-          </w:p>
-        </w:tc>
-        <w:tc>
-          <w:tcPr>
-            <w:tcW w:w="780" w:type="dxa"/>
-            <w:vAlign w:val="center"/>
-            <w:hideMark/>
-          </w:tcPr>
-          <w:p>
-            <w:pPr>
-              <w:spacing w:line="240" w:lineRule="auto"/>
-              <w:ind w:firstLine="0"/>
-              <w:jc w:val="center"/>
-              <w:rPr>
-                <w:rFonts w:eastAsia="Times New Roman" w:cs="Arial"/>
-                <w:sz w:val="16"/>
-                <w:szCs w:val="16"/>
-                <w:lang w:val="en-US"/>
-              </w:rPr>
-            </w:pPr>
-            <w:r>
-              <w:rPr>
-                <w:rFonts w:eastAsia="Times New Roman" w:cs="Arial"/>
-                <w:sz w:val="16"/>
-                <w:szCs w:val="16"/>
-                <w:lang w:val="en-US"/>
-              </w:rPr>
-              <w:t>Cabai</w:t>
-            </w:r>
-          </w:p>
-        </w:tc>
-        <w:tc>
-          <w:tcPr>
-            <w:tcW w:w="1050" w:type="dxa"/>
-            <w:vAlign w:val="center"/>
-            <w:hideMark/>
-          </w:tcPr>
-          <w:p>
-            <w:pPr>
-              <w:spacing w:line="240" w:lineRule="auto"/>
-              <w:ind w:firstLine="0"/>
-              <w:jc w:val="center"/>
-              <w:rPr>
-                <w:rFonts w:eastAsia="Times New Roman" w:cs="Arial"/>
-                <w:sz w:val="16"/>
-                <w:szCs w:val="16"/>
-                <w:lang w:val="en-US"/>
-              </w:rPr>
-            </w:pPr>
-            <w:r>
-              <w:rPr>
-                <w:rFonts w:eastAsia="Times New Roman" w:cs="Arial"/>
-                <w:sz w:val="16"/>
-                <w:szCs w:val="16"/>
-                <w:lang w:val="en-US"/>
-              </w:rPr>
-              <w:t>Normal</w:t>
-            </w:r>
-          </w:p>
-        </w:tc>
-        <w:tc>
-          <w:tcPr>
-            <w:tcW w:w="60" w:type="dxa"/>
-          </w:tcPr>
-          <w:p>
-            <w:pPr>
-              <w:spacing w:line="240" w:lineRule="auto"/>
-              <w:ind w:firstLine="0"/>
-              <w:jc w:val="center"/>
-              <w:rPr>
-                <w:rFonts w:eastAsia="Times New Roman" w:cs="Arial"/>
-                <w:sz w:val="16"/>
-                <w:szCs w:val="16"/>
-                <w:lang w:val="en-US"/>
-              </w:rPr>
-            </w:pPr>
-          </w:p>
-        </w:tc>
-        <w:tc>
-          <w:tcPr>
-            <w:tcW w:w="1500" w:type="dxa"/>
-            <w:vAlign w:val="center"/>
-          </w:tcPr>
-          <w:p>
-            <w:pPr>
-              <w:spacing w:line="240" w:lineRule="auto"/>
-              <w:ind w:firstLine="0"/>
-              <w:jc w:val="center"/>
-              <w:rPr>
-                <w:rFonts w:eastAsia="Times New Roman" w:cs="Arial"/>
-                <w:sz w:val="16"/>
-                <w:szCs w:val="16"/>
-                <w:lang w:val="en-US"/>
-              </w:rPr>
-            </w:pPr>
-            <w:r>
-              <w:rPr>
-                <w:rFonts w:ascii="Segoe UI Symbol" w:eastAsia="Times New Roman" w:hAnsi="Segoe UI Symbol" w:cs="Segoe UI Symbol"/>
-                <w:sz w:val="16"/>
-                <w:szCs w:val="16"/>
-                <w:lang w:val="en-US"/>
-              </w:rPr>
-              <w:t>✔</w:t>
-            </w:r>
-          </w:p>
-        </w:tc>
-        <w:tc>
-          <w:tcPr>
-            <w:tcW w:w="50" w:type="dxa"/>
-            <w:vAlign w:val="center"/>
-          </w:tcPr>
-          <w:p>
-            <w:pPr>
-              <w:spacing w:line="240" w:lineRule="auto"/>
-              <w:ind w:firstLine="0"/>
-              <w:jc w:val="center"/>
-              <w:rPr>
-                <w:rFonts w:eastAsia="Times New Roman" w:cs="Arial"/>
-                <w:sz w:val="16"/>
-                <w:szCs w:val="16"/>
-                <w:lang w:val="en-US"/>
-              </w:rPr>
-            </w:pPr>
-            <w:r>
-              <w:rPr>
-                <w:rFonts w:ascii="Segoe UI Symbol" w:eastAsia="Times New Roman" w:hAnsi="Segoe UI Symbol" w:cs="Segoe UI Symbol"/>
-                <w:sz w:val="16"/>
-                <w:szCs w:val="16"/>
-                <w:lang w:val="en-US"/>
-              </w:rPr>
-              <w:t>✔</w:t>
-            </w:r>
-          </w:p>
-        </w:tc>
-        <w:tc>
-          <w:tcPr>
-            <w:tcW w:w="3471" w:type="dxa"/>
-            <w:gridSpan w:val="3"/>
-            <w:vAlign w:val="center"/>
-          </w:tcPr>
-          <w:p>
-            <w:pPr>
-              <w:spacing w:line="240" w:lineRule="auto"/>
-              <w:ind w:firstLine="0"/>
-              <w:jc w:val="center"/>
-              <w:rPr>
-                <w:rFonts w:eastAsia="Times New Roman" w:cs="Arial"/>
-                <w:sz w:val="16"/>
-                <w:szCs w:val="16"/>
-                <w:lang w:val="en-US"/>
-              </w:rPr>
-            </w:pPr>
-            <w:r>
-              <w:rPr>
-                <w:rFonts w:ascii="Segoe UI Symbol" w:eastAsia="Times New Roman" w:hAnsi="Segoe UI Symbol" w:cs="Segoe UI Symbol"/>
-                <w:sz w:val="16"/>
-                <w:szCs w:val="16"/>
-                <w:lang w:val="en-US"/>
-              </w:rPr>
-              <w:t>✔️</w:t>
-            </w:r>
-          </w:p>
-        </w:tc>
-        <w:tc>
-          <w:tcPr>
-            <w:tcW w:w="1230" w:type="dxa"/>
-            <w:gridSpan w:val="2"/>
-            <w:vAlign w:val="center"/>
-          </w:tcPr>
-          <w:p>
-            <w:pPr>
-              <w:spacing w:line="240" w:lineRule="auto"/>
-              <w:ind w:firstLine="0"/>
-              <w:jc w:val="center"/>
-              <w:rPr>
-                <w:rFonts w:eastAsia="Times New Roman" w:cs="Arial"/>
-                <w:sz w:val="16"/>
-                <w:szCs w:val="16"/>
-                <w:lang w:val="en-US"/>
-              </w:rPr>
-            </w:pPr>
-            <w:r>
-              <w:rPr>
-                <w:rFonts w:ascii="Segoe UI Symbol" w:eastAsia="Times New Roman" w:hAnsi="Segoe UI Symbol" w:cs="Segoe UI Symbol"/>
-                <w:sz w:val="16"/>
-                <w:szCs w:val="16"/>
-                <w:lang w:val="en-US"/>
-              </w:rPr>
-              <w:t>✔️</w:t>
-            </w:r>
-          </w:p>
-        </w:tc>
-        <w:tc>
-          <w:tcPr>
-            <w:tcW w:w="2295" w:type="dxa"/>
-            <w:gridSpan w:val="2"/>
-            <w:vAlign w:val="center"/>
-          </w:tcPr>
-          <w:p>
-            <w:pPr>
-              <w:spacing w:line="240" w:lineRule="auto"/>
-              <w:ind w:firstLine="0"/>
-              <w:jc w:val="center"/>
-              <w:rPr>
-                <w:rFonts w:eastAsia="Times New Roman" w:cs="Arial"/>
-                <w:sz w:val="16"/>
-                <w:szCs w:val="16"/>
-                <w:lang w:val="en-US"/>
-              </w:rPr>
-            </w:pPr>
-            <w:r>
-              <w:rPr>
-                <w:rFonts w:eastAsia="Times New Roman" w:cs="Arial"/>
-                <w:sz w:val="16"/>
-                <w:szCs w:val="16"/>
-                <w:lang w:val="en-US"/>
-              </w:rPr>
-              <w:t>Valid</w:t>
             </w:r>
           </w:p>
         </w:tc>
@@ -45422,7 +45358,7 @@
                 <w:szCs w:val="16"/>
                 <w:lang w:val="en-US"/>
               </w:rPr>
-              <w:t>32</w:t>
+              <w:t>31</w:t>
             </w:r>
           </w:p>
         </w:tc>
@@ -45451,7 +45387,7 @@
                 <w:szCs w:val="16"/>
                 <w:lang w:val="en-US"/>
               </w:rPr>
-              <w:t>57</w:t>
+              <w:t>52</w:t>
             </w:r>
           </w:p>
         </w:tc>
@@ -45480,7 +45416,7 @@
                 <w:szCs w:val="16"/>
                 <w:lang w:val="en-US"/>
               </w:rPr>
-              <w:t>270</w:t>
+              <w:t>235</w:t>
             </w:r>
           </w:p>
         </w:tc>
@@ -45509,7 +45445,7 @@
                 <w:szCs w:val="16"/>
                 <w:lang w:val="en-US"/>
               </w:rPr>
-              <w:t>470W</w:t>
+              <w:t>330W</w:t>
             </w:r>
           </w:p>
         </w:tc>
@@ -45567,7 +45503,7 @@
                 <w:szCs w:val="16"/>
                 <w:lang w:val="en-US"/>
               </w:rPr>
-              <w:t>Kangkung</w:t>
+              <w:t>Cabai</w:t>
             </w:r>
           </w:p>
         </w:tc>
@@ -45596,7 +45532,7 @@
                 <w:szCs w:val="16"/>
                 <w:lang w:val="en-US"/>
               </w:rPr>
-              <w:t>Anomali</w:t>
+              <w:t>Normal</w:t>
             </w:r>
           </w:p>
         </w:tc>
@@ -45670,7 +45606,7 @@
                 <w:szCs w:val="16"/>
                 <w:lang w:val="en-US"/>
               </w:rPr>
-              <w:t>✔️</w:t>
+              <w:t>✔</w:t>
             </w:r>
           </w:p>
         </w:tc>
@@ -45699,7 +45635,7 @@
                 <w:szCs w:val="16"/>
                 <w:lang w:val="en-US"/>
               </w:rPr>
-              <w:t>✔️</w:t>
+              <w:t>✔</w:t>
             </w:r>
           </w:p>
         </w:tc>
@@ -45728,7 +45664,7 @@
                 <w:szCs w:val="16"/>
                 <w:lang w:val="en-US"/>
               </w:rPr>
-              <w:t>✔️</w:t>
+              <w:t>✔</w:t>
             </w:r>
           </w:p>
         </w:tc>
@@ -45791,7 +45727,7 @@
                 <w:szCs w:val="16"/>
                 <w:lang w:val="en-US"/>
               </w:rPr>
-              <w:t>33</w:t>
+              <w:t>32</w:t>
             </w:r>
           </w:p>
         </w:tc>
@@ -45820,7 +45756,7 @@
                 <w:szCs w:val="16"/>
                 <w:lang w:val="en-US"/>
               </w:rPr>
-              <w:t>48</w:t>
+              <w:t>57</w:t>
             </w:r>
           </w:p>
         </w:tc>
@@ -45849,7 +45785,7 @@
                 <w:szCs w:val="16"/>
                 <w:lang w:val="en-US"/>
               </w:rPr>
-              <w:t>180</w:t>
+              <w:t>270</w:t>
             </w:r>
           </w:p>
         </w:tc>
@@ -45878,7 +45814,7 @@
                 <w:szCs w:val="16"/>
                 <w:lang w:val="en-US"/>
               </w:rPr>
-              <w:t>420W</w:t>
+              <w:t>470W</w:t>
             </w:r>
           </w:p>
         </w:tc>
@@ -45907,7 +45843,7 @@
                 <w:szCs w:val="16"/>
                 <w:lang w:val="en-US"/>
               </w:rPr>
-              <w:t>300W</w:t>
+              <w:t>350W</w:t>
             </w:r>
           </w:p>
         </w:tc>
@@ -45936,7 +45872,7 @@
                 <w:szCs w:val="16"/>
                 <w:lang w:val="en-US"/>
               </w:rPr>
-              <w:t>Mentimun</w:t>
+              <w:t>Kangkung</w:t>
             </w:r>
           </w:p>
         </w:tc>
@@ -46039,7 +45975,7 @@
                 <w:szCs w:val="16"/>
                 <w:lang w:val="en-US"/>
               </w:rPr>
-              <w:t>✔️</w:t>
+              <w:t>✔</w:t>
             </w:r>
           </w:p>
         </w:tc>
@@ -46068,7 +46004,7 @@
                 <w:szCs w:val="16"/>
                 <w:lang w:val="en-US"/>
               </w:rPr>
-              <w:t>✔️</w:t>
+              <w:t>✔</w:t>
             </w:r>
           </w:p>
         </w:tc>
@@ -46097,7 +46033,7 @@
                 <w:szCs w:val="16"/>
                 <w:lang w:val="en-US"/>
               </w:rPr>
-              <w:t>✔️</w:t>
+              <w:t>✔</w:t>
             </w:r>
           </w:p>
         </w:tc>
@@ -46160,7 +46096,7 @@
                 <w:szCs w:val="16"/>
                 <w:lang w:val="en-US"/>
               </w:rPr>
-              <w:t>34</w:t>
+              <w:t>33</w:t>
             </w:r>
           </w:p>
         </w:tc>
@@ -46189,7 +46125,7 @@
                 <w:szCs w:val="16"/>
                 <w:lang w:val="en-US"/>
               </w:rPr>
-              <w:t>50</w:t>
+              <w:t>48</w:t>
             </w:r>
           </w:p>
         </w:tc>
@@ -46218,7 +46154,7 @@
                 <w:szCs w:val="16"/>
                 <w:lang w:val="en-US"/>
               </w:rPr>
-              <w:t>220</w:t>
+              <w:t>180</w:t>
             </w:r>
           </w:p>
         </w:tc>
@@ -46247,7 +46183,7 @@
                 <w:szCs w:val="16"/>
                 <w:lang w:val="en-US"/>
               </w:rPr>
-              <w:t>295W</w:t>
+              <w:t>420W</w:t>
             </w:r>
           </w:p>
         </w:tc>
@@ -46305,7 +46241,7 @@
                 <w:szCs w:val="16"/>
                 <w:lang w:val="en-US"/>
               </w:rPr>
-              <w:t>Selada</w:t>
+              <w:t>Mentimun</w:t>
             </w:r>
           </w:p>
         </w:tc>
@@ -46334,7 +46270,7 @@
                 <w:szCs w:val="16"/>
                 <w:lang w:val="en-US"/>
               </w:rPr>
-              <w:t>Normal</w:t>
+              <w:t>Anomali</w:t>
             </w:r>
           </w:p>
         </w:tc>
@@ -46408,7 +46344,7 @@
                 <w:szCs w:val="16"/>
                 <w:lang w:val="en-US"/>
               </w:rPr>
-              <w:t>✔️</w:t>
+              <w:t>✔</w:t>
             </w:r>
           </w:p>
         </w:tc>
@@ -46437,7 +46373,7 @@
                 <w:szCs w:val="16"/>
                 <w:lang w:val="en-US"/>
               </w:rPr>
-              <w:t>✔️</w:t>
+              <w:t>✔</w:t>
             </w:r>
           </w:p>
         </w:tc>
@@ -46466,7 +46402,7 @@
                 <w:szCs w:val="16"/>
                 <w:lang w:val="en-US"/>
               </w:rPr>
-              <w:t>✔️</w:t>
+              <w:t>✔</w:t>
             </w:r>
           </w:p>
         </w:tc>
@@ -46529,7 +46465,7 @@
                 <w:szCs w:val="16"/>
                 <w:lang w:val="en-US"/>
               </w:rPr>
-              <w:t>35</w:t>
+              <w:t>34</w:t>
             </w:r>
           </w:p>
         </w:tc>
@@ -46558,7 +46494,7 @@
                 <w:szCs w:val="16"/>
                 <w:lang w:val="en-US"/>
               </w:rPr>
-              <w:t>53</w:t>
+              <w:t>50</w:t>
             </w:r>
           </w:p>
         </w:tc>
@@ -46587,7 +46523,7 @@
                 <w:szCs w:val="16"/>
                 <w:lang w:val="en-US"/>
               </w:rPr>
-              <w:t>242</w:t>
+              <w:t>220</w:t>
             </w:r>
           </w:p>
         </w:tc>
@@ -46616,7 +46552,7 @@
                 <w:szCs w:val="16"/>
                 <w:lang w:val="en-US"/>
               </w:rPr>
-              <w:t>505W</w:t>
+              <w:t>295W</w:t>
             </w:r>
           </w:p>
         </w:tc>
@@ -46645,7 +46581,7 @@
                 <w:szCs w:val="16"/>
                 <w:lang w:val="en-US"/>
               </w:rPr>
-              <w:t>350W</w:t>
+              <w:t>300W</w:t>
             </w:r>
           </w:p>
         </w:tc>
@@ -46674,7 +46610,7 @@
                 <w:szCs w:val="16"/>
                 <w:lang w:val="en-US"/>
               </w:rPr>
-              <w:t>Tomat</w:t>
+              <w:t>Selada</w:t>
             </w:r>
           </w:p>
         </w:tc>
@@ -46703,7 +46639,7 @@
                 <w:szCs w:val="16"/>
                 <w:lang w:val="en-US"/>
               </w:rPr>
-              <w:t>Anomali</w:t>
+              <w:t>Normal</w:t>
             </w:r>
           </w:p>
         </w:tc>
@@ -46777,7 +46713,7 @@
                 <w:szCs w:val="16"/>
                 <w:lang w:val="en-US"/>
               </w:rPr>
-              <w:t>✔️</w:t>
+              <w:t>✔</w:t>
             </w:r>
           </w:p>
         </w:tc>
@@ -46806,7 +46742,7 @@
                 <w:szCs w:val="16"/>
                 <w:lang w:val="en-US"/>
               </w:rPr>
-              <w:t>✔️</w:t>
+              <w:t>✔</w:t>
             </w:r>
           </w:p>
         </w:tc>
@@ -46835,7 +46771,7 @@
                 <w:szCs w:val="16"/>
                 <w:lang w:val="en-US"/>
               </w:rPr>
-              <w:t>✔️</w:t>
+              <w:t>✔</w:t>
             </w:r>
           </w:p>
         </w:tc>
@@ -46898,7 +46834,7 @@
                 <w:szCs w:val="16"/>
                 <w:lang w:val="en-US"/>
               </w:rPr>
-              <w:t>36</w:t>
+              <w:t>35</w:t>
             </w:r>
           </w:p>
         </w:tc>
@@ -46927,7 +46863,7 @@
                 <w:szCs w:val="16"/>
                 <w:lang w:val="en-US"/>
               </w:rPr>
-              <w:t>49</w:t>
+              <w:t>53</w:t>
             </w:r>
           </w:p>
         </w:tc>
@@ -46956,7 +46892,7 @@
                 <w:szCs w:val="16"/>
                 <w:lang w:val="en-US"/>
               </w:rPr>
-              <w:t>214</w:t>
+              <w:t>242</w:t>
             </w:r>
           </w:p>
         </w:tc>
@@ -46985,7 +46921,7 @@
                 <w:szCs w:val="16"/>
                 <w:lang w:val="en-US"/>
               </w:rPr>
-              <w:t>302W</w:t>
+              <w:t>505W</w:t>
             </w:r>
           </w:p>
         </w:tc>
@@ -47014,7 +46950,7 @@
                 <w:szCs w:val="16"/>
                 <w:lang w:val="en-US"/>
               </w:rPr>
-              <w:t>300W</w:t>
+              <w:t>350W</w:t>
             </w:r>
           </w:p>
         </w:tc>
@@ -47043,7 +46979,7 @@
                 <w:szCs w:val="16"/>
                 <w:lang w:val="en-US"/>
               </w:rPr>
-              <w:t>Cabai</w:t>
+              <w:t>Tomat</w:t>
             </w:r>
           </w:p>
         </w:tc>
@@ -47072,7 +47008,7 @@
                 <w:szCs w:val="16"/>
                 <w:lang w:val="en-US"/>
               </w:rPr>
-              <w:t>Normal</w:t>
+              <w:t>Anomali</w:t>
             </w:r>
           </w:p>
         </w:tc>
@@ -47146,7 +47082,7 @@
                 <w:szCs w:val="16"/>
                 <w:lang w:val="en-US"/>
               </w:rPr>
-              <w:t>✔️</w:t>
+              <w:t>✔</w:t>
             </w:r>
           </w:p>
         </w:tc>
@@ -47175,7 +47111,7 @@
                 <w:szCs w:val="16"/>
                 <w:lang w:val="en-US"/>
               </w:rPr>
-              <w:t>✔️</w:t>
+              <w:t>✔</w:t>
             </w:r>
           </w:p>
         </w:tc>
@@ -47204,7 +47140,7 @@
                 <w:szCs w:val="16"/>
                 <w:lang w:val="en-US"/>
               </w:rPr>
-              <w:t>✔️</w:t>
+              <w:t>✔</w:t>
             </w:r>
           </w:p>
         </w:tc>
@@ -47267,7 +47203,7 @@
                 <w:szCs w:val="16"/>
                 <w:lang w:val="en-US"/>
               </w:rPr>
-              <w:t>37</w:t>
+              <w:t>36</w:t>
             </w:r>
           </w:p>
         </w:tc>
@@ -47296,7 +47232,7 @@
                 <w:szCs w:val="16"/>
                 <w:lang w:val="en-US"/>
               </w:rPr>
-              <w:t>59</w:t>
+              <w:t>49</w:t>
             </w:r>
           </w:p>
         </w:tc>
@@ -47325,7 +47261,7 @@
                 <w:szCs w:val="16"/>
                 <w:lang w:val="en-US"/>
               </w:rPr>
-              <w:t>288</w:t>
+              <w:t>214</w:t>
             </w:r>
           </w:p>
         </w:tc>
@@ -47354,7 +47290,7 @@
                 <w:szCs w:val="16"/>
                 <w:lang w:val="en-US"/>
               </w:rPr>
-              <w:t>545W</w:t>
+              <w:t>302W</w:t>
             </w:r>
           </w:p>
         </w:tc>
@@ -47383,7 +47319,7 @@
                 <w:szCs w:val="16"/>
                 <w:lang w:val="en-US"/>
               </w:rPr>
-              <w:t>350W</w:t>
+              <w:t>300W</w:t>
             </w:r>
           </w:p>
         </w:tc>
@@ -47412,7 +47348,7 @@
                 <w:szCs w:val="16"/>
                 <w:lang w:val="en-US"/>
               </w:rPr>
-              <w:t>Mentimun</w:t>
+              <w:t>Cabai</w:t>
             </w:r>
           </w:p>
         </w:tc>
@@ -47441,7 +47377,7 @@
                 <w:szCs w:val="16"/>
                 <w:lang w:val="en-US"/>
               </w:rPr>
-              <w:t>Anomali</w:t>
+              <w:t>Normal</w:t>
             </w:r>
           </w:p>
         </w:tc>
@@ -47487,7 +47423,7 @@
                 <w:szCs w:val="16"/>
                 <w:lang w:val="en-US"/>
               </w:rPr>
-              <w:t>❌</w:t>
+              <w:t>✔</w:t>
             </w:r>
           </w:p>
         </w:tc>
@@ -47515,7 +47451,7 @@
                 <w:szCs w:val="16"/>
                 <w:lang w:val="en-US"/>
               </w:rPr>
-              <w:t>⚠️</w:t>
+              <w:t>✔</w:t>
             </w:r>
           </w:p>
         </w:tc>
@@ -47544,7 +47480,7 @@
                 <w:szCs w:val="16"/>
                 <w:lang w:val="en-US"/>
               </w:rPr>
-              <w:t>❌</w:t>
+              <w:t>✔</w:t>
             </w:r>
           </w:p>
         </w:tc>
@@ -47573,7 +47509,7 @@
                 <w:szCs w:val="16"/>
                 <w:lang w:val="en-US"/>
               </w:rPr>
-              <w:t>❌</w:t>
+              <w:t>✔</w:t>
             </w:r>
           </w:p>
         </w:tc>
@@ -47602,7 +47538,7 @@
                 <w:szCs w:val="16"/>
                 <w:lang w:val="en-US"/>
               </w:rPr>
-              <w:t>Tidak Valid</w:t>
+              <w:t>Valid</w:t>
             </w:r>
           </w:p>
         </w:tc>
@@ -47636,7 +47572,7 @@
                 <w:szCs w:val="16"/>
                 <w:lang w:val="en-US"/>
               </w:rPr>
-              <w:t>38</w:t>
+              <w:t>37</w:t>
             </w:r>
           </w:p>
         </w:tc>
@@ -47665,7 +47601,7 @@
                 <w:szCs w:val="16"/>
                 <w:lang w:val="en-US"/>
               </w:rPr>
-              <w:t>50</w:t>
+              <w:t>59</w:t>
             </w:r>
           </w:p>
         </w:tc>
@@ -47694,7 +47630,7 @@
                 <w:szCs w:val="16"/>
                 <w:lang w:val="en-US"/>
               </w:rPr>
-              <w:t>220</w:t>
+              <w:t>288</w:t>
             </w:r>
           </w:p>
         </w:tc>
@@ -47723,7 +47659,7 @@
                 <w:szCs w:val="16"/>
                 <w:lang w:val="en-US"/>
               </w:rPr>
-              <w:t>308W</w:t>
+              <w:t>545W</w:t>
             </w:r>
           </w:p>
         </w:tc>
@@ -47781,7 +47717,7 @@
                 <w:szCs w:val="16"/>
                 <w:lang w:val="en-US"/>
               </w:rPr>
-              <w:t>Kangkung</w:t>
+              <w:t>Mentimun</w:t>
             </w:r>
           </w:p>
         </w:tc>
@@ -47810,7 +47746,7 @@
                 <w:szCs w:val="16"/>
                 <w:lang w:val="en-US"/>
               </w:rPr>
-              <w:t>Normal</w:t>
+              <w:t>Anomali</w:t>
             </w:r>
           </w:p>
         </w:tc>
@@ -47856,7 +47792,7 @@
                 <w:szCs w:val="16"/>
                 <w:lang w:val="en-US"/>
               </w:rPr>
-              <w:t>✔</w:t>
+              <w:t>❌</w:t>
             </w:r>
           </w:p>
         </w:tc>
@@ -47884,7 +47820,7 @@
                 <w:szCs w:val="16"/>
                 <w:lang w:val="en-US"/>
               </w:rPr>
-              <w:t>✔️</w:t>
+              <w:t>❌</w:t>
             </w:r>
           </w:p>
         </w:tc>
@@ -47913,7 +47849,7 @@
                 <w:szCs w:val="16"/>
                 <w:lang w:val="en-US"/>
               </w:rPr>
-              <w:t>✔️</w:t>
+              <w:t>❌</w:t>
             </w:r>
           </w:p>
         </w:tc>
@@ -47942,7 +47878,7 @@
                 <w:szCs w:val="16"/>
                 <w:lang w:val="en-US"/>
               </w:rPr>
-              <w:t>✔️</w:t>
+              <w:t>❌</w:t>
             </w:r>
           </w:p>
         </w:tc>
@@ -47971,7 +47907,7 @@
                 <w:szCs w:val="16"/>
                 <w:lang w:val="en-US"/>
               </w:rPr>
-              <w:t>Valid</w:t>
+              <w:t>Tidak Valid</w:t>
             </w:r>
           </w:p>
         </w:tc>
@@ -48005,7 +47941,7 @@
                 <w:szCs w:val="16"/>
                 <w:lang w:val="en-US"/>
               </w:rPr>
-              <w:t>39</w:t>
+              <w:t>38</w:t>
             </w:r>
           </w:p>
         </w:tc>
@@ -48034,7 +47970,7 @@
                 <w:szCs w:val="16"/>
                 <w:lang w:val="en-US"/>
               </w:rPr>
-              <w:t>47</w:t>
+              <w:t>50</w:t>
             </w:r>
           </w:p>
         </w:tc>
@@ -48063,7 +47999,7 @@
                 <w:szCs w:val="16"/>
                 <w:lang w:val="en-US"/>
               </w:rPr>
-              <w:t>172</w:t>
+              <w:t>220</w:t>
             </w:r>
           </w:p>
         </w:tc>
@@ -48092,7 +48028,7 @@
                 <w:szCs w:val="16"/>
                 <w:lang w:val="en-US"/>
               </w:rPr>
-              <w:t>455W</w:t>
+              <w:t>308W</w:t>
             </w:r>
           </w:p>
         </w:tc>
@@ -48121,7 +48057,7 @@
                 <w:szCs w:val="16"/>
                 <w:lang w:val="en-US"/>
               </w:rPr>
-              <w:t>300W</w:t>
+              <w:t>350W</w:t>
             </w:r>
           </w:p>
         </w:tc>
@@ -48150,7 +48086,7 @@
                 <w:szCs w:val="16"/>
                 <w:lang w:val="en-US"/>
               </w:rPr>
-              <w:t>Selada</w:t>
+              <w:t>Kangkung</w:t>
             </w:r>
           </w:p>
         </w:tc>
@@ -48179,7 +48115,7 @@
                 <w:szCs w:val="16"/>
                 <w:lang w:val="en-US"/>
               </w:rPr>
-              <w:t>Anomali</w:t>
+              <w:t>Normal</w:t>
             </w:r>
           </w:p>
         </w:tc>
@@ -48253,7 +48189,7 @@
                 <w:szCs w:val="16"/>
                 <w:lang w:val="en-US"/>
               </w:rPr>
-              <w:t>✔️</w:t>
+              <w:t>✔</w:t>
             </w:r>
           </w:p>
         </w:tc>
@@ -48282,7 +48218,7 @@
                 <w:szCs w:val="16"/>
                 <w:lang w:val="en-US"/>
               </w:rPr>
-              <w:t>✔️</w:t>
+              <w:t>✔</w:t>
             </w:r>
           </w:p>
         </w:tc>
@@ -48311,7 +48247,7 @@
                 <w:szCs w:val="16"/>
                 <w:lang w:val="en-US"/>
               </w:rPr>
-              <w:t>✔️</w:t>
+              <w:t>✔</w:t>
             </w:r>
           </w:p>
         </w:tc>
@@ -48374,7 +48310,7 @@
                 <w:szCs w:val="16"/>
                 <w:lang w:val="en-US"/>
               </w:rPr>
-              <w:t>40</w:t>
+              <w:t>39</w:t>
             </w:r>
           </w:p>
         </w:tc>
@@ -48403,7 +48339,7 @@
                 <w:szCs w:val="16"/>
                 <w:lang w:val="en-US"/>
               </w:rPr>
-              <w:t>50</w:t>
+              <w:t>47</w:t>
             </w:r>
           </w:p>
         </w:tc>
@@ -48432,7 +48368,7 @@
                 <w:szCs w:val="16"/>
                 <w:lang w:val="en-US"/>
               </w:rPr>
-              <w:t>220</w:t>
+              <w:t>172</w:t>
             </w:r>
           </w:p>
         </w:tc>
@@ -48461,7 +48397,7 @@
                 <w:szCs w:val="16"/>
                 <w:lang w:val="en-US"/>
               </w:rPr>
-              <w:t>287W</w:t>
+              <w:t>455W</w:t>
             </w:r>
           </w:p>
         </w:tc>
@@ -48519,7 +48455,7 @@
                 <w:szCs w:val="16"/>
                 <w:lang w:val="en-US"/>
               </w:rPr>
-              <w:t>Tomat</w:t>
+              <w:t>Selada</w:t>
             </w:r>
           </w:p>
         </w:tc>
@@ -48548,7 +48484,7 @@
                 <w:szCs w:val="16"/>
                 <w:lang w:val="en-US"/>
               </w:rPr>
-              <w:t>Normal</w:t>
+              <w:t>Anomali</w:t>
             </w:r>
           </w:p>
         </w:tc>
@@ -48622,7 +48558,7 @@
                 <w:szCs w:val="16"/>
                 <w:lang w:val="en-US"/>
               </w:rPr>
-              <w:t>✔️</w:t>
+              <w:t>✔</w:t>
             </w:r>
           </w:p>
         </w:tc>
@@ -48651,7 +48587,7 @@
                 <w:szCs w:val="16"/>
                 <w:lang w:val="en-US"/>
               </w:rPr>
-              <w:t>✔️</w:t>
+              <w:t>✔</w:t>
             </w:r>
           </w:p>
         </w:tc>
@@ -48680,7 +48616,7 @@
                 <w:szCs w:val="16"/>
                 <w:lang w:val="en-US"/>
               </w:rPr>
-              <w:t>✔️</w:t>
+              <w:t>✔</w:t>
             </w:r>
           </w:p>
         </w:tc>
@@ -48743,7 +48679,7 @@
                 <w:szCs w:val="16"/>
                 <w:lang w:val="en-US"/>
               </w:rPr>
-              <w:t>41</w:t>
+              <w:t>40</w:t>
             </w:r>
           </w:p>
         </w:tc>
@@ -48772,7 +48708,7 @@
                 <w:szCs w:val="16"/>
                 <w:lang w:val="en-US"/>
               </w:rPr>
-              <w:t>51</w:t>
+              <w:t>50</w:t>
             </w:r>
           </w:p>
         </w:tc>
@@ -48801,7 +48737,7 @@
                 <w:szCs w:val="16"/>
                 <w:lang w:val="en-US"/>
               </w:rPr>
-              <w:t>228</w:t>
+              <w:t>220</w:t>
             </w:r>
           </w:p>
         </w:tc>
@@ -48830,7 +48766,7 @@
                 <w:szCs w:val="16"/>
                 <w:lang w:val="en-US"/>
               </w:rPr>
-              <w:t>318W</w:t>
+              <w:t>287W</w:t>
             </w:r>
           </w:p>
         </w:tc>
@@ -48859,7 +48795,7 @@
                 <w:szCs w:val="16"/>
                 <w:lang w:val="en-US"/>
               </w:rPr>
-              <w:t>350W</w:t>
+              <w:t>300W</w:t>
             </w:r>
           </w:p>
         </w:tc>
@@ -48888,7 +48824,7 @@
                 <w:szCs w:val="16"/>
                 <w:lang w:val="en-US"/>
               </w:rPr>
-              <w:t>Cabai</w:t>
+              <w:t>Tomat</w:t>
             </w:r>
           </w:p>
         </w:tc>
@@ -48991,7 +48927,7 @@
                 <w:szCs w:val="16"/>
                 <w:lang w:val="en-US"/>
               </w:rPr>
-              <w:t>✔️</w:t>
+              <w:t>✔</w:t>
             </w:r>
           </w:p>
         </w:tc>
@@ -49020,7 +48956,7 @@
                 <w:szCs w:val="16"/>
                 <w:lang w:val="en-US"/>
               </w:rPr>
-              <w:t>✔️</w:t>
+              <w:t>✔</w:t>
             </w:r>
           </w:p>
         </w:tc>
@@ -49049,7 +48985,7 @@
                 <w:szCs w:val="16"/>
                 <w:lang w:val="en-US"/>
               </w:rPr>
-              <w:t>✔️</w:t>
+              <w:t>✔</w:t>
             </w:r>
           </w:p>
         </w:tc>
@@ -49112,7 +49048,7 @@
                 <w:szCs w:val="16"/>
                 <w:lang w:val="en-US"/>
               </w:rPr>
-              <w:t>42</w:t>
+              <w:t>41</w:t>
             </w:r>
           </w:p>
         </w:tc>
@@ -49141,7 +49077,7 @@
                 <w:szCs w:val="16"/>
                 <w:lang w:val="en-US"/>
               </w:rPr>
-              <w:t>58</w:t>
+              <w:t>51</w:t>
             </w:r>
           </w:p>
         </w:tc>
@@ -49170,7 +49106,7 @@
                 <w:szCs w:val="16"/>
                 <w:lang w:val="en-US"/>
               </w:rPr>
-              <w:t>276</w:t>
+              <w:t>228</w:t>
             </w:r>
           </w:p>
         </w:tc>
@@ -49199,7 +49135,7 @@
                 <w:szCs w:val="16"/>
                 <w:lang w:val="en-US"/>
               </w:rPr>
-              <w:t>485W</w:t>
+              <w:t>318W</w:t>
             </w:r>
           </w:p>
         </w:tc>
@@ -49257,7 +49193,7 @@
                 <w:szCs w:val="16"/>
                 <w:lang w:val="en-US"/>
               </w:rPr>
-              <w:t>Kangkung</w:t>
+              <w:t>Cabai</w:t>
             </w:r>
           </w:p>
         </w:tc>
@@ -49286,7 +49222,7 @@
                 <w:szCs w:val="16"/>
                 <w:lang w:val="en-US"/>
               </w:rPr>
-              <w:t>Anomali</w:t>
+              <w:t>Normal</w:t>
             </w:r>
           </w:p>
         </w:tc>
@@ -49360,7 +49296,7 @@
                 <w:szCs w:val="16"/>
                 <w:lang w:val="en-US"/>
               </w:rPr>
-              <w:t>✔️</w:t>
+              <w:t>✔</w:t>
             </w:r>
           </w:p>
         </w:tc>
@@ -49389,7 +49325,7 @@
                 <w:szCs w:val="16"/>
                 <w:lang w:val="en-US"/>
               </w:rPr>
-              <w:t>✔️</w:t>
+              <w:t>✔</w:t>
             </w:r>
           </w:p>
         </w:tc>
@@ -49418,7 +49354,7 @@
                 <w:szCs w:val="16"/>
                 <w:lang w:val="en-US"/>
               </w:rPr>
-              <w:t>✔️</w:t>
+              <w:t>✔</w:t>
             </w:r>
           </w:p>
         </w:tc>
@@ -49481,7 +49417,7 @@
                 <w:szCs w:val="16"/>
                 <w:lang w:val="en-US"/>
               </w:rPr>
-              <w:t>43</w:t>
+              <w:t>42</w:t>
             </w:r>
           </w:p>
         </w:tc>
@@ -49510,7 +49446,7 @@
                 <w:szCs w:val="16"/>
                 <w:lang w:val="en-US"/>
               </w:rPr>
-              <w:t>48</w:t>
+              <w:t>58</w:t>
             </w:r>
           </w:p>
         </w:tc>
@@ -49539,7 +49475,7 @@
                 <w:szCs w:val="16"/>
                 <w:lang w:val="en-US"/>
               </w:rPr>
-              <w:t>183</w:t>
+              <w:t>276</w:t>
             </w:r>
           </w:p>
         </w:tc>
@@ -49568,7 +49504,7 @@
                 <w:szCs w:val="16"/>
                 <w:lang w:val="en-US"/>
               </w:rPr>
-              <w:t>425W</w:t>
+              <w:t>485W</w:t>
             </w:r>
           </w:p>
         </w:tc>
@@ -49597,7 +49533,7 @@
                 <w:szCs w:val="16"/>
                 <w:lang w:val="en-US"/>
               </w:rPr>
-              <w:t>300W</w:t>
+              <w:t>350W</w:t>
             </w:r>
           </w:p>
         </w:tc>
@@ -49626,7 +49562,7 @@
                 <w:szCs w:val="16"/>
                 <w:lang w:val="en-US"/>
               </w:rPr>
-              <w:t>Mentimun</w:t>
+              <w:t>Kangkung</w:t>
             </w:r>
           </w:p>
         </w:tc>
@@ -49729,7 +49665,7 @@
                 <w:szCs w:val="16"/>
                 <w:lang w:val="en-US"/>
               </w:rPr>
-              <w:t>✔️</w:t>
+              <w:t>✔</w:t>
             </w:r>
           </w:p>
         </w:tc>
@@ -49758,7 +49694,7 @@
                 <w:szCs w:val="16"/>
                 <w:lang w:val="en-US"/>
               </w:rPr>
-              <w:t>✔️</w:t>
+              <w:t>✔</w:t>
             </w:r>
           </w:p>
         </w:tc>
@@ -49787,7 +49723,7 @@
                 <w:szCs w:val="16"/>
                 <w:lang w:val="en-US"/>
               </w:rPr>
-              <w:t>✔️</w:t>
+              <w:t>✔</w:t>
             </w:r>
           </w:p>
         </w:tc>
@@ -49850,7 +49786,7 @@
                 <w:szCs w:val="16"/>
                 <w:lang w:val="en-US"/>
               </w:rPr>
-              <w:t>44</w:t>
+              <w:t>43</w:t>
             </w:r>
           </w:p>
         </w:tc>
@@ -49879,7 +49815,7 @@
                 <w:szCs w:val="16"/>
                 <w:lang w:val="en-US"/>
               </w:rPr>
-              <w:t>50</w:t>
+              <w:t>48</w:t>
             </w:r>
           </w:p>
         </w:tc>
@@ -49908,7 +49844,7 @@
                 <w:szCs w:val="16"/>
                 <w:lang w:val="en-US"/>
               </w:rPr>
-              <w:t>220</w:t>
+              <w:t>183</w:t>
             </w:r>
           </w:p>
         </w:tc>
@@ -49937,7 +49873,7 @@
                 <w:szCs w:val="16"/>
                 <w:lang w:val="en-US"/>
               </w:rPr>
-              <w:t>292W</w:t>
+              <w:t>425W</w:t>
             </w:r>
           </w:p>
         </w:tc>
@@ -49995,7 +49931,7 @@
                 <w:szCs w:val="16"/>
                 <w:lang w:val="en-US"/>
               </w:rPr>
-              <w:t>Selada</w:t>
+              <w:t>Mentimun</w:t>
             </w:r>
           </w:p>
         </w:tc>
@@ -50024,7 +49960,7 @@
                 <w:szCs w:val="16"/>
                 <w:lang w:val="en-US"/>
               </w:rPr>
-              <w:t>Normal</w:t>
+              <w:t>Anomali</w:t>
             </w:r>
           </w:p>
         </w:tc>
@@ -50098,7 +50034,7 @@
                 <w:szCs w:val="16"/>
                 <w:lang w:val="en-US"/>
               </w:rPr>
-              <w:t>✔️</w:t>
+              <w:t>✔</w:t>
             </w:r>
           </w:p>
         </w:tc>
@@ -50127,7 +50063,7 @@
                 <w:szCs w:val="16"/>
                 <w:lang w:val="en-US"/>
               </w:rPr>
-              <w:t>✔️</w:t>
+              <w:t>✔</w:t>
             </w:r>
           </w:p>
         </w:tc>
@@ -50156,7 +50092,7 @@
                 <w:szCs w:val="16"/>
                 <w:lang w:val="en-US"/>
               </w:rPr>
-              <w:t>✔️</w:t>
+              <w:t>✔</w:t>
             </w:r>
           </w:p>
         </w:tc>
@@ -50219,7 +50155,7 @@
                 <w:szCs w:val="16"/>
                 <w:lang w:val="en-US"/>
               </w:rPr>
-              <w:t>45</w:t>
+              <w:t>44</w:t>
             </w:r>
           </w:p>
         </w:tc>
@@ -50248,7 +50184,7 @@
                 <w:szCs w:val="16"/>
                 <w:lang w:val="en-US"/>
               </w:rPr>
-              <w:t>54</w:t>
+              <w:t>50</w:t>
             </w:r>
           </w:p>
         </w:tc>
@@ -50277,7 +50213,7 @@
                 <w:szCs w:val="16"/>
                 <w:lang w:val="en-US"/>
               </w:rPr>
-              <w:t>248</w:t>
+              <w:t>220</w:t>
             </w:r>
           </w:p>
         </w:tc>
@@ -50306,7 +50242,7 @@
                 <w:szCs w:val="16"/>
                 <w:lang w:val="en-US"/>
               </w:rPr>
-              <w:t>515W</w:t>
+              <w:t>292W</w:t>
             </w:r>
           </w:p>
         </w:tc>
@@ -50335,7 +50271,7 @@
                 <w:szCs w:val="16"/>
                 <w:lang w:val="en-US"/>
               </w:rPr>
-              <w:t>350W</w:t>
+              <w:t>300W</w:t>
             </w:r>
           </w:p>
         </w:tc>
@@ -50364,7 +50300,7 @@
                 <w:szCs w:val="16"/>
                 <w:lang w:val="en-US"/>
               </w:rPr>
-              <w:t>Tomat</w:t>
+              <w:t>Selada</w:t>
             </w:r>
           </w:p>
         </w:tc>
@@ -50393,7 +50329,7 @@
                 <w:szCs w:val="16"/>
                 <w:lang w:val="en-US"/>
               </w:rPr>
-              <w:t>Anomali</w:t>
+              <w:t>Normal</w:t>
             </w:r>
           </w:p>
         </w:tc>
@@ -50467,7 +50403,7 @@
                 <w:szCs w:val="16"/>
                 <w:lang w:val="en-US"/>
               </w:rPr>
-              <w:t>✔️</w:t>
+              <w:t>✔</w:t>
             </w:r>
           </w:p>
         </w:tc>
@@ -50496,7 +50432,7 @@
                 <w:szCs w:val="16"/>
                 <w:lang w:val="en-US"/>
               </w:rPr>
-              <w:t>✔️</w:t>
+              <w:t>✔</w:t>
             </w:r>
           </w:p>
         </w:tc>
@@ -50525,7 +50461,376 @@
                 <w:szCs w:val="16"/>
                 <w:lang w:val="en-US"/>
               </w:rPr>
-              <w:t>✔️</w:t>
+              <w:t>✔</w:t>
+            </w:r>
+          </w:p>
+        </w:tc>
+        <w:tc>
+          <w:tcPr>
+            <w:tcW w:w="2295" w:type="dxa"/>
+            <w:gridSpan w:val="2"/>
+            <w:vAlign w:val="center"/>
+          </w:tcPr>
+          <w:p>
+            <w:pPr>
+              <w:spacing w:line="240" w:lineRule="auto"/>
+              <w:ind w:firstLine="0"/>
+              <w:jc w:val="center"/>
+              <w:rPr>
+                <w:rFonts w:eastAsia="Times New Roman" w:cs="Arial"/>
+                <w:sz w:val="16"/>
+                <w:szCs w:val="16"/>
+                <w:lang w:val="en-US"/>
+              </w:rPr>
+            </w:pPr>
+            <w:r>
+              <w:rPr>
+                <w:rFonts w:eastAsia="Times New Roman" w:cs="Arial"/>
+                <w:sz w:val="16"/>
+                <w:szCs w:val="16"/>
+                <w:lang w:val="en-US"/>
+              </w:rPr>
+              <w:t>Valid</w:t>
+            </w:r>
+          </w:p>
+        </w:tc>
+      </w:tr>
+      <w:tr>
+        <w:trPr>
+          <w:tblCellSpacing w:w="15" w:type="dxa"/>
+        </w:trPr>
+        <w:tc>
+          <w:tcPr>
+            <w:tcW w:w="0" w:type="auto"/>
+            <w:vAlign w:val="center"/>
+            <w:hideMark/>
+          </w:tcPr>
+          <w:p>
+            <w:pPr>
+              <w:spacing w:line="240" w:lineRule="auto"/>
+              <w:ind w:firstLine="0"/>
+              <w:jc w:val="center"/>
+              <w:rPr>
+                <w:rFonts w:eastAsia="Times New Roman" w:cs="Arial"/>
+                <w:sz w:val="16"/>
+                <w:szCs w:val="16"/>
+                <w:lang w:val="en-US"/>
+              </w:rPr>
+            </w:pPr>
+            <w:r>
+              <w:rPr>
+                <w:rFonts w:eastAsia="Times New Roman" w:cs="Arial"/>
+                <w:sz w:val="16"/>
+                <w:szCs w:val="16"/>
+                <w:lang w:val="en-US"/>
+              </w:rPr>
+              <w:t>45</w:t>
+            </w:r>
+          </w:p>
+        </w:tc>
+        <w:tc>
+          <w:tcPr>
+            <w:tcW w:w="311" w:type="dxa"/>
+            <w:vAlign w:val="center"/>
+            <w:hideMark/>
+          </w:tcPr>
+          <w:p>
+            <w:pPr>
+              <w:spacing w:line="240" w:lineRule="auto"/>
+              <w:ind w:firstLine="0"/>
+              <w:jc w:val="center"/>
+              <w:rPr>
+                <w:rFonts w:eastAsia="Times New Roman" w:cs="Arial"/>
+                <w:sz w:val="16"/>
+                <w:szCs w:val="16"/>
+                <w:lang w:val="en-US"/>
+              </w:rPr>
+            </w:pPr>
+            <w:r>
+              <w:rPr>
+                <w:rFonts w:eastAsia="Times New Roman" w:cs="Arial"/>
+                <w:sz w:val="16"/>
+                <w:szCs w:val="16"/>
+                <w:lang w:val="en-US"/>
+              </w:rPr>
+              <w:t>54</w:t>
+            </w:r>
+          </w:p>
+        </w:tc>
+        <w:tc>
+          <w:tcPr>
+            <w:tcW w:w="510" w:type="dxa"/>
+            <w:vAlign w:val="center"/>
+            <w:hideMark/>
+          </w:tcPr>
+          <w:p>
+            <w:pPr>
+              <w:spacing w:line="240" w:lineRule="auto"/>
+              <w:ind w:firstLine="0"/>
+              <w:jc w:val="center"/>
+              <w:rPr>
+                <w:rFonts w:eastAsia="Times New Roman" w:cs="Arial"/>
+                <w:sz w:val="16"/>
+                <w:szCs w:val="16"/>
+                <w:lang w:val="en-US"/>
+              </w:rPr>
+            </w:pPr>
+            <w:r>
+              <w:rPr>
+                <w:rFonts w:eastAsia="Times New Roman" w:cs="Arial"/>
+                <w:sz w:val="16"/>
+                <w:szCs w:val="16"/>
+                <w:lang w:val="en-US"/>
+              </w:rPr>
+              <w:t>248</w:t>
+            </w:r>
+          </w:p>
+        </w:tc>
+        <w:tc>
+          <w:tcPr>
+            <w:tcW w:w="519" w:type="dxa"/>
+            <w:vAlign w:val="center"/>
+            <w:hideMark/>
+          </w:tcPr>
+          <w:p>
+            <w:pPr>
+              <w:spacing w:line="240" w:lineRule="auto"/>
+              <w:ind w:firstLine="0"/>
+              <w:jc w:val="center"/>
+              <w:rPr>
+                <w:rFonts w:eastAsia="Times New Roman" w:cs="Arial"/>
+                <w:sz w:val="16"/>
+                <w:szCs w:val="16"/>
+                <w:lang w:val="en-US"/>
+              </w:rPr>
+            </w:pPr>
+            <w:r>
+              <w:rPr>
+                <w:rFonts w:eastAsia="Times New Roman" w:cs="Arial"/>
+                <w:sz w:val="16"/>
+                <w:szCs w:val="16"/>
+                <w:lang w:val="en-US"/>
+              </w:rPr>
+              <w:t>515W</w:t>
+            </w:r>
+          </w:p>
+        </w:tc>
+        <w:tc>
+          <w:tcPr>
+            <w:tcW w:w="870" w:type="dxa"/>
+            <w:vAlign w:val="center"/>
+            <w:hideMark/>
+          </w:tcPr>
+          <w:p>
+            <w:pPr>
+              <w:spacing w:line="240" w:lineRule="auto"/>
+              <w:ind w:firstLine="0"/>
+              <w:jc w:val="center"/>
+              <w:rPr>
+                <w:rFonts w:eastAsia="Times New Roman" w:cs="Arial"/>
+                <w:sz w:val="16"/>
+                <w:szCs w:val="16"/>
+                <w:lang w:val="en-US"/>
+              </w:rPr>
+            </w:pPr>
+            <w:r>
+              <w:rPr>
+                <w:rFonts w:eastAsia="Times New Roman" w:cs="Arial"/>
+                <w:sz w:val="16"/>
+                <w:szCs w:val="16"/>
+                <w:lang w:val="en-US"/>
+              </w:rPr>
+              <w:t>350W</w:t>
+            </w:r>
+          </w:p>
+        </w:tc>
+        <w:tc>
+          <w:tcPr>
+            <w:tcW w:w="780" w:type="dxa"/>
+            <w:vAlign w:val="center"/>
+            <w:hideMark/>
+          </w:tcPr>
+          <w:p>
+            <w:pPr>
+              <w:spacing w:line="240" w:lineRule="auto"/>
+              <w:ind w:firstLine="0"/>
+              <w:jc w:val="center"/>
+              <w:rPr>
+                <w:rFonts w:eastAsia="Times New Roman" w:cs="Arial"/>
+                <w:sz w:val="16"/>
+                <w:szCs w:val="16"/>
+                <w:lang w:val="en-US"/>
+              </w:rPr>
+            </w:pPr>
+            <w:r>
+              <w:rPr>
+                <w:rFonts w:eastAsia="Times New Roman" w:cs="Arial"/>
+                <w:sz w:val="16"/>
+                <w:szCs w:val="16"/>
+                <w:lang w:val="en-US"/>
+              </w:rPr>
+              <w:t>Tomat</w:t>
+            </w:r>
+          </w:p>
+        </w:tc>
+        <w:tc>
+          <w:tcPr>
+            <w:tcW w:w="1050" w:type="dxa"/>
+            <w:vAlign w:val="center"/>
+            <w:hideMark/>
+          </w:tcPr>
+          <w:p>
+            <w:pPr>
+              <w:spacing w:line="240" w:lineRule="auto"/>
+              <w:ind w:firstLine="0"/>
+              <w:jc w:val="center"/>
+              <w:rPr>
+                <w:rFonts w:eastAsia="Times New Roman" w:cs="Arial"/>
+                <w:sz w:val="16"/>
+                <w:szCs w:val="16"/>
+                <w:lang w:val="en-US"/>
+              </w:rPr>
+            </w:pPr>
+            <w:r>
+              <w:rPr>
+                <w:rFonts w:eastAsia="Times New Roman" w:cs="Arial"/>
+                <w:sz w:val="16"/>
+                <w:szCs w:val="16"/>
+                <w:lang w:val="en-US"/>
+              </w:rPr>
+              <w:t>Anomali</w:t>
+            </w:r>
+          </w:p>
+        </w:tc>
+        <w:tc>
+          <w:tcPr>
+            <w:tcW w:w="60" w:type="dxa"/>
+          </w:tcPr>
+          <w:p>
+            <w:pPr>
+              <w:spacing w:line="240" w:lineRule="auto"/>
+              <w:ind w:firstLine="0"/>
+              <w:jc w:val="center"/>
+              <w:rPr>
+                <w:rFonts w:eastAsia="Times New Roman" w:cs="Arial"/>
+                <w:sz w:val="16"/>
+                <w:szCs w:val="16"/>
+                <w:lang w:val="en-US"/>
+              </w:rPr>
+            </w:pPr>
+          </w:p>
+        </w:tc>
+        <w:tc>
+          <w:tcPr>
+            <w:tcW w:w="1500" w:type="dxa"/>
+            <w:vAlign w:val="center"/>
+          </w:tcPr>
+          <w:p>
+            <w:pPr>
+              <w:spacing w:line="240" w:lineRule="auto"/>
+              <w:ind w:firstLine="0"/>
+              <w:jc w:val="center"/>
+              <w:rPr>
+                <w:rFonts w:eastAsia="Times New Roman" w:cs="Arial"/>
+                <w:sz w:val="16"/>
+                <w:szCs w:val="16"/>
+                <w:lang w:val="en-US"/>
+              </w:rPr>
+            </w:pPr>
+            <w:r>
+              <w:rPr>
+                <w:rFonts w:ascii="Segoe UI Symbol" w:eastAsia="Times New Roman" w:hAnsi="Segoe UI Symbol" w:cs="Segoe UI Symbol"/>
+                <w:sz w:val="16"/>
+                <w:szCs w:val="16"/>
+                <w:lang w:val="en-US"/>
+              </w:rPr>
+              <w:t>✔</w:t>
+            </w:r>
+          </w:p>
+        </w:tc>
+        <w:tc>
+          <w:tcPr>
+            <w:tcW w:w="50" w:type="dxa"/>
+            <w:vAlign w:val="center"/>
+          </w:tcPr>
+          <w:p>
+            <w:pPr>
+              <w:spacing w:line="240" w:lineRule="auto"/>
+              <w:ind w:firstLine="0"/>
+              <w:jc w:val="center"/>
+              <w:rPr>
+                <w:rFonts w:eastAsia="Times New Roman" w:cs="Arial"/>
+                <w:sz w:val="16"/>
+                <w:szCs w:val="16"/>
+                <w:lang w:val="en-US"/>
+              </w:rPr>
+            </w:pPr>
+            <w:r>
+              <w:rPr>
+                <w:rFonts w:ascii="Segoe UI Symbol" w:eastAsia="Times New Roman" w:hAnsi="Segoe UI Symbol" w:cs="Segoe UI Symbol"/>
+                <w:sz w:val="16"/>
+                <w:szCs w:val="16"/>
+                <w:lang w:val="en-US"/>
+              </w:rPr>
+              <w:t>✔</w:t>
+            </w:r>
+          </w:p>
+        </w:tc>
+        <w:tc>
+          <w:tcPr>
+            <w:tcW w:w="3471" w:type="dxa"/>
+            <w:gridSpan w:val="3"/>
+            <w:vAlign w:val="center"/>
+          </w:tcPr>
+          <w:p>
+            <w:pPr>
+              <w:spacing w:line="240" w:lineRule="auto"/>
+              <w:ind w:firstLine="0"/>
+              <w:jc w:val="center"/>
+              <w:rPr>
+                <w:rFonts w:eastAsia="Times New Roman" w:cs="Arial"/>
+                <w:sz w:val="16"/>
+                <w:szCs w:val="16"/>
+                <w:lang w:val="en-US"/>
+              </w:rPr>
+            </w:pPr>
+            <w:r>
+              <w:rPr>
+                <w:rFonts w:ascii="Segoe UI Symbol" w:eastAsia="Times New Roman" w:hAnsi="Segoe UI Symbol" w:cs="Segoe UI Symbol"/>
+                <w:sz w:val="16"/>
+                <w:szCs w:val="16"/>
+                <w:lang w:val="en-US"/>
+              </w:rPr>
+              <w:t>✔</w:t>
+            </w:r>
+          </w:p>
+        </w:tc>
+        <w:tc>
+          <w:tcPr>
+            <w:tcW w:w="1230" w:type="dxa"/>
+            <w:gridSpan w:val="2"/>
+            <w:vAlign w:val="center"/>
+          </w:tcPr>
+          <w:p>
+            <w:pPr>
+              <w:spacing w:line="240" w:lineRule="auto"/>
+              <w:ind w:firstLine="0"/>
+              <w:jc w:val="center"/>
+              <w:rPr>
+                <w:rFonts w:eastAsia="Times New Roman" w:cs="Arial"/>
+                <w:sz w:val="16"/>
+                <w:szCs w:val="16"/>
+                <w:lang w:val="en-US"/>
+              </w:rPr>
+            </w:pPr>
+            <w:r>
+              <w:rPr>
+                <w:rFonts w:ascii="Segoe UI Symbol" w:eastAsia="Times New Roman" w:hAnsi="Segoe UI Symbol" w:cs="Segoe UI Symbol"/>
+                <w:sz w:val="16"/>
+                <w:szCs w:val="16"/>
+                <w:lang w:val="en-US"/>
+              </w:rPr>
+              <w:t>✔</w:t>
             </w:r>
           </w:p>
         </w:tc>
@@ -52641,7 +52946,7 @@
           <w:rPr>
             <w:noProof/>
           </w:rPr>
-          <w:t>42</w:t>
+          <w:t>35</w:t>
         </w:r>
         <w:r>
           <w:rPr>
@@ -54595,7 +54900,7 @@
 </file>
 
 <file path=customXml/itemProps1.xml><?xml version="1.0" encoding="utf-8"?>
-<ds:datastoreItem xmlns:ds="http://schemas.openxmlformats.org/officeDocument/2006/customXml" ds:itemID="{6F18F678-5E05-4B7E-904A-95CFD13CF6C5}">
+<ds:datastoreItem xmlns:ds="http://schemas.openxmlformats.org/officeDocument/2006/customXml" ds:itemID="{7F75F075-D323-4317-B1FB-02B5A720E99E}">
   <ds:schemaRefs>
     <ds:schemaRef ds:uri="http://schemas.openxmlformats.org/officeDocument/2006/bibliography"/>
   </ds:schemaRefs>

</xml_diff>